<commit_message>
Aggiornamento della documentazione e delle risorse del progetto HealthCare Plus: - Revisione e ampliamento della sezione "Risorse Utilizzate" con dettagli sulle tecnologie adottate e le loro versioni. - Aggiornamento della sezione "Valutazione dei Risultati" con analisi critica degli obiettivi raggiunti, punti di forza e limiti noti. - Modifiche al "README" per riflettere le ultime informazioni sul progetto e aggiunta di un indice dettagliato. - Aggiunta di nuove immagini per illustrare le funzionalità dell'applicazione. - Aggiornamento dei test del componente di login per includere il router nel TestBed.
</commit_message>
<xml_diff>
--- a/HealthCarePlus_ProjectWork_L31.docx
+++ b/HealthCarePlus_ProjectWork_L31.docx
@@ -125,7 +125,7 @@
                 <wp:inline distT="0" distB="0" distL="0" distR="0" wp14:anchorId="689D8EB0" wp14:editId="7F77DF6F">
                   <wp:extent cx="1285875" cy="444876"/>
                   <wp:effectExtent l="0" t="0" r="0" b="0"/>
-                  <wp:docPr id="1307913340" name="Immagine 5" descr="Immagine che contiene Carattere, testo, bianco, logo&#10;&#10;Il contenuto generato dall'IA potrebbe non essere corretto."/>
+                  <wp:docPr id="1307913340" name="Immagine 5" descr="Immagine che contiene Carattere, testo, bianco, logo  Il contenuto generato dall'IA potrebbe non essere corretto."/>
                   <wp:cNvGraphicFramePr>
                     <a:graphicFrameLocks xmlns:a="http://schemas.openxmlformats.org/drawingml/2006/main" noChangeAspect="1"/>
                   </wp:cNvGraphicFramePr>
@@ -133,7 +133,7 @@
                     <a:graphicData uri="http://schemas.openxmlformats.org/drawingml/2006/picture">
                       <pic:pic xmlns:pic="http://schemas.openxmlformats.org/drawingml/2006/picture">
                         <pic:nvPicPr>
-                          <pic:cNvPr id="1307913340" name="Immagine 5" descr="Immagine che contiene Carattere, testo, bianco, logo&#10;&#10;Il contenuto generato dall'IA potrebbe non essere corretto."/>
+                          <pic:cNvPr id="1307913340" name="Immagine 5" descr="Immagine che contiene Carattere, testo, bianco, logo  Il contenuto generato dall'IA potrebbe non essere corretto."/>
                           <pic:cNvPicPr/>
                         </pic:nvPicPr>
                         <pic:blipFill>
@@ -784,7 +784,7 @@
                 <wp:inline distT="0" distB="0" distL="0" distR="0" wp14:anchorId="077319E4" wp14:editId="5105738E">
                   <wp:extent cx="1907381" cy="320568"/>
                   <wp:effectExtent l="0" t="0" r="0" b="0"/>
-                  <wp:docPr id="225245255" name="Immagine 9" descr="Immagine che contiene testo, Carattere, bianco, tipografia&#10;&#10;Il contenuto generato dall'IA potrebbe non essere corretto."/>
+                  <wp:docPr id="225245255" name="Immagine 9" descr="Immagine che contiene testo, Carattere, bianco, tipografia  Il contenuto generato dall'IA potrebbe non essere corretto."/>
                   <wp:cNvGraphicFramePr>
                     <a:graphicFrameLocks xmlns:a="http://schemas.openxmlformats.org/drawingml/2006/main" noChangeAspect="1"/>
                   </wp:cNvGraphicFramePr>
@@ -792,7 +792,7 @@
                     <a:graphicData uri="http://schemas.openxmlformats.org/drawingml/2006/picture">
                       <pic:pic xmlns:pic="http://schemas.openxmlformats.org/drawingml/2006/picture">
                         <pic:nvPicPr>
-                          <pic:cNvPr id="225245255" name="Immagine 9" descr="Immagine che contiene testo, Carattere, bianco, tipografia&#10;&#10;Il contenuto generato dall'IA potrebbe non essere corretto."/>
+                          <pic:cNvPr id="225245255" name="Immagine 9" descr="Immagine che contiene testo, Carattere, bianco, tipografia  Il contenuto generato dall'IA potrebbe non essere corretto."/>
                           <pic:cNvPicPr/>
                         </pic:nvPicPr>
                         <pic:blipFill>
@@ -872,7 +872,7 @@
                 <wp:inline distT="0" distB="0" distL="0" distR="0" wp14:anchorId="42BA503A" wp14:editId="6C9107F5">
                   <wp:extent cx="1807210" cy="310274"/>
                   <wp:effectExtent l="0" t="0" r="0" b="0"/>
-                  <wp:docPr id="1413765635" name="Immagine 10" descr="Immagine che contiene testo, Carattere, bianco, tipografia&#10;&#10;Il contenuto generato dall'IA potrebbe non essere corretto."/>
+                  <wp:docPr id="1413765635" name="Immagine 10" descr="Immagine che contiene testo, Carattere, bianco, tipografia  Il contenuto generato dall'IA potrebbe non essere corretto."/>
                   <wp:cNvGraphicFramePr>
                     <a:graphicFrameLocks xmlns:a="http://schemas.openxmlformats.org/drawingml/2006/main" noChangeAspect="1"/>
                   </wp:cNvGraphicFramePr>
@@ -880,7 +880,7 @@
                     <a:graphicData uri="http://schemas.openxmlformats.org/drawingml/2006/picture">
                       <pic:pic xmlns:pic="http://schemas.openxmlformats.org/drawingml/2006/picture">
                         <pic:nvPicPr>
-                          <pic:cNvPr id="1413765635" name="Immagine 10" descr="Immagine che contiene testo, Carattere, bianco, tipografia&#10;&#10;Il contenuto generato dall'IA potrebbe non essere corretto."/>
+                          <pic:cNvPr id="1413765635" name="Immagine 10" descr="Immagine che contiene testo, Carattere, bianco, tipografia  Il contenuto generato dall'IA potrebbe non essere corretto."/>
                           <pic:cNvPicPr/>
                         </pic:nvPicPr>
                         <pic:blipFill>
@@ -960,7 +960,7 @@
                 <wp:inline distT="0" distB="0" distL="0" distR="0" wp14:anchorId="2482CC9A" wp14:editId="7F6FA84F">
                   <wp:extent cx="2107565" cy="304903"/>
                   <wp:effectExtent l="0" t="0" r="635" b="0"/>
-                  <wp:docPr id="1477292010" name="Immagine 11" descr="Immagine che contiene testo, Carattere, bianco, tipografia&#10;&#10;Il contenuto generato dall'IA potrebbe non essere corretto."/>
+                  <wp:docPr id="1477292010" name="Immagine 11" descr="Immagine che contiene testo, Carattere, bianco, tipografia  Il contenuto generato dall'IA potrebbe non essere corretto."/>
                   <wp:cNvGraphicFramePr>
                     <a:graphicFrameLocks xmlns:a="http://schemas.openxmlformats.org/drawingml/2006/main" noChangeAspect="1"/>
                   </wp:cNvGraphicFramePr>
@@ -968,7 +968,7 @@
                     <a:graphicData uri="http://schemas.openxmlformats.org/drawingml/2006/picture">
                       <pic:pic xmlns:pic="http://schemas.openxmlformats.org/drawingml/2006/picture">
                         <pic:nvPicPr>
-                          <pic:cNvPr id="1477292010" name="Immagine 11" descr="Immagine che contiene testo, Carattere, bianco, tipografia&#10;&#10;Il contenuto generato dall'IA potrebbe non essere corretto."/>
+                          <pic:cNvPr id="1477292010" name="Immagine 11" descr="Immagine che contiene testo, Carattere, bianco, tipografia  Il contenuto generato dall'IA potrebbe non essere corretto."/>
                           <pic:cNvPicPr/>
                         </pic:nvPicPr>
                         <pic:blipFill>
@@ -1048,7 +1048,7 @@
                 <wp:inline distT="0" distB="0" distL="0" distR="0" wp14:anchorId="05F24657" wp14:editId="7AEBC495">
                   <wp:extent cx="2064385" cy="333695"/>
                   <wp:effectExtent l="0" t="0" r="0" b="0"/>
-                  <wp:docPr id="558078330" name="Immagine 12" descr="Immagine che contiene testo, Carattere, bianco, tipografia&#10;&#10;Il contenuto generato dall'IA potrebbe non essere corretto."/>
+                  <wp:docPr id="558078330" name="Immagine 12" descr="Immagine che contiene testo, Carattere, bianco, tipografia  Il contenuto generato dall'IA potrebbe non essere corretto."/>
                   <wp:cNvGraphicFramePr>
                     <a:graphicFrameLocks xmlns:a="http://schemas.openxmlformats.org/drawingml/2006/main" noChangeAspect="1"/>
                   </wp:cNvGraphicFramePr>
@@ -1056,7 +1056,7 @@
                     <a:graphicData uri="http://schemas.openxmlformats.org/drawingml/2006/picture">
                       <pic:pic xmlns:pic="http://schemas.openxmlformats.org/drawingml/2006/picture">
                         <pic:nvPicPr>
-                          <pic:cNvPr id="558078330" name="Immagine 12" descr="Immagine che contiene testo, Carattere, bianco, tipografia&#10;&#10;Il contenuto generato dall'IA potrebbe non essere corretto."/>
+                          <pic:cNvPr id="558078330" name="Immagine 12" descr="Immagine che contiene testo, Carattere, bianco, tipografia  Il contenuto generato dall'IA potrebbe non essere corretto."/>
                           <pic:cNvPicPr/>
                         </pic:nvPicPr>
                         <pic:blipFill>
@@ -1138,7 +1138,7 @@
                 <wp:inline distT="0" distB="0" distL="0" distR="0" wp14:anchorId="4B66C616" wp14:editId="40CA1973">
                   <wp:extent cx="2107844" cy="491466"/>
                   <wp:effectExtent l="0" t="0" r="635" b="4445"/>
-                  <wp:docPr id="421488763" name="Immagine 1" descr="Immagine che contiene testo, Carattere, bianco&#10;&#10;Il contenuto generato dall'IA potrebbe non essere corretto."/>
+                  <wp:docPr id="421488763" name="Immagine 1" descr="Immagine che contiene testo, Carattere, bianco  Il contenuto generato dall'IA potrebbe non essere corretto."/>
                   <wp:cNvGraphicFramePr>
                     <a:graphicFrameLocks xmlns:a="http://schemas.openxmlformats.org/drawingml/2006/main" noChangeAspect="1"/>
                   </wp:cNvGraphicFramePr>
@@ -1146,7 +1146,7 @@
                     <a:graphicData uri="http://schemas.openxmlformats.org/drawingml/2006/picture">
                       <pic:pic xmlns:pic="http://schemas.openxmlformats.org/drawingml/2006/picture">
                         <pic:nvPicPr>
-                          <pic:cNvPr id="421488763" name="Immagine 1" descr="Immagine che contiene testo, Carattere, bianco&#10;&#10;Il contenuto generato dall'IA potrebbe non essere corretto."/>
+                          <pic:cNvPr id="421488763" name="Immagine 1" descr="Immagine che contiene testo, Carattere, bianco  Il contenuto generato dall'IA potrebbe non essere corretto."/>
                           <pic:cNvPicPr/>
                         </pic:nvPicPr>
                         <pic:blipFill>
@@ -1474,7 +1474,7 @@
                 <w:szCs w:val="28"/>
                 <w:lang w:val="it-IT"/>
               </w:rPr>
-              <w:t xml:space="preserve">Infine, dagli insegnamenti di metodologie di sviluppo Agile ho ripreso l’approccio incrementale a fasi verificabili, con l’adozione di una pipeline di integrazione continua (GitHub Actions) che automatizza build e test ad ogni modifica, e l’abitudine a mantenere allineati codice e documentazione ad ogni cambiamento significativo: quest’ultima abitudine si è rivelata particolarmente utile quando ho rimosso un intero modulo applicativo (l’assistente virtuale, descritto più avanti), poiché mi ha imposto di verificare sistematicamente, file per file, quali altre parti del sistema referenziassero quel modulo prima di poterlo considerare rimosso senza lasciare riferimenti pendenti.</w:t>
+              <w:t xml:space="preserve">Infine, dagli insegnamenti di metodologie di sviluppo Agile ho ripreso l’approccio incrementale a fasi verificabili, con l’adozione di una pipeline di integrazione continua (GitHub Actions) che automatizza build e test ad ogni modifica, e l’abitudine a mantenere allineati codice e documentazione ad ogni cambiamento significativo: quest’ultima abitudine si è rivelata particolarmente utile quando ho rimosso un’integrazione esterna non più necessaria (descritta più avanti), poiché mi ha imposto di verificare sistematicamente, file per file, quali altre parti del sistema la referenziassero prima di poterla considerare rimossa senza lasciare riferimenti pendenti.</w:t>
             </w:r>
           </w:p>
           <w:p>
@@ -1666,7 +1666,7 @@
                 <w:szCs w:val="28"/>
                 <w:lang w:val="it-IT"/>
               </w:rPr>
-              <w:t xml:space="preserve">Fase 3 – Frontend Angular (8 giorni): ho realizzato la Single Page Application con componenti standalone, routing protetto da guardie di autenticazione e di ruolo, dashboard differenziate per Paziente, Medico e Supporto, e interceptor HTTP per l’autenticazione, la gestione centralizzata degli errori (con logout automatico alla scadenza del token) e il debounce dello spinner di caricamento globale.</w:t>
+              <w:t xml:space="preserve">Fase 3 – Frontend Angular (8 giorni): ho realizzato la Single Page Application con componenti standalone, routing protetto da guardie di autenticazione e di ruolo, dashboard differenziate per Paziente, Medico e Supporto, e interceptor HTTP per l’autenticazione, la gestione centralizzata degli errori (con notifiche Toast al posto degli alert di sistema e logout automatico previsto sullo stato 401) e il debounce dello spinner di caricamento globale.</w:t>
             </w:r>
           </w:p>
           <w:p>
@@ -1687,7 +1687,7 @@
                 <w:szCs w:val="28"/>
                 <w:lang w:val="it-IT"/>
               </w:rPr>
-              <w:t xml:space="preserve">Fase 4 – Test e qualità (5 giorni): ho scritto la suite di test unitari e di integrazione lato backend con JUnit e Mockito, misurandone la copertura tramite JaCoCo, e la suite di test lato frontend con Karma e Jasmine, entrambe integrate nella pipeline di integrazione continua così da bloccare automaticamente l’introduzione di regressioni ad ogni push. In questa fase ho utilizzato Claude come assistente per velocizzare la stesura materiale dei test a partire dai casi che avevo individuato (percorso positivo, input non validi, accessi non autorizzati), rivedendo ogni test generato prima di includerlo nella suite. Al termine di questa fase la suite di backend conta 137 test automatici, tutti superati, mentre quella di frontend ne conta 99, anch’essi tutti superati.</w:t>
+              <w:t xml:space="preserve">Fase 4 – Test e qualità (5 giorni): ho scritto la suite di test unitari e di integrazione lato backend con JUnit e Mockito, misurandone la copertura tramite JaCoCo, e la suite di test lato frontend con Karma e Jasmine, entrambe integrate nella pipeline di integrazione continua così da bloccare automaticamente l’introduzione di regressioni ad ogni push. In questa fase ho utilizzato Claude come assistente per velocizzare la stesura materiale dei test a partire dai casi che avevo individuato (percorso positivo, input non validi, accessi non autorizzati), rivedendo ogni test generato prima di includerlo nella suite. Al termine di questa fase la suite di backend conta 137 test automatici, tutti superati, mentre quella di frontend ne conta 99, anch’essi tutti superati. Alla verifica finale la copertura misurata è dell’82,3 % delle righe sul backend (JaCoCo) e del 38,6 % sul frontend, concentrata su servizi, guardie e interceptor più che sui componenti di presentazione; in quell’occasione ho anche corretto quattro test del frontend che fallivano dopo l’ultima revisione grafica della schermata di login.</w:t>
             </w:r>
           </w:p>
           <w:p>
@@ -1708,7 +1708,7 @@
                 <w:szCs w:val="28"/>
                 <w:lang w:val="it-IT"/>
               </w:rPr>
-              <w:t xml:space="preserve">Fase 5 – Documentazione finale (3 giorni): ho scritto la relazione tecnica completa (i nove capitoli disponibili in doc/) e ho effettuato una revisione di coerenza tra la documentazione e il codice realmente presente nel repository, correggendo alcuni riferimenti che nel frattempo erano diventati obsoleti a seguito delle modifiche descritte più avanti.</w:t>
+              <w:t xml:space="preserve">Fase 5 – Documentazione finale (3 giorni): ho scritto la relazione tecnica completa (i nove capitoli disponibili in doc/) e ho effettuato una revisione di coerenza tra la documentazione e il codice realmente presente nel repository, correggendo alcuni riferimenti che nel frattempo erano diventati obsoleti a seguito delle modifiche descritte più avanti. Un ultimo aggiornamento, il 20 settembre 2026, ha ripetuto le verifiche sull’applicazione in esecuzione (test automatici, 45 chiamate end-to-end con utenti di ruoli diversi, screenshot reali) e ha portato alla luce alcuni difetti, descritti tra i limiti nella sezione finale.</w:t>
             </w:r>
           </w:p>
           <w:p>
@@ -1729,7 +1729,7 @@
                 <w:szCs w:val="28"/>
                 <w:lang w:val="it-IT"/>
               </w:rPr>
-              <w:t xml:space="preserve">Sul metodo di test adottato nella Fase 4 vale la pena una precisazione, poiché riflette una scelta consapevole e non un’omissione: i test dei controller (@WebMvcTest) verificano il comportamento REST — codici di stato, corpo della risposta, validazione dei DTO in ingresso — con i filtri di Spring Security disattivati (addFilters = false), mentre le regole di autorizzazione (@PreAuthorize) non vengono verificate tramite MockMvc in nessun test del progetto. Ho scelto di rispettare questa convenzione, già presente in modo uniforme su tutti i test dei controller esistenti, invece di introdurre uno stile di test differente e inconsistente solo per il controller che ho modificato: la verifica delle regole di autorizzazione resta quindi affidata a test manuali end-to-end (login con utenti di ruoli diversi, tentativo di accesso a risorse altrui), coerentemente con l’approccio già in uso nel resto del progetto.</w:t>
+              <w:t xml:space="preserve">Sul metodo di test adottato nella Fase 4 vale la pena una precisazione, poiché riflette una scelta consapevole e non un’omissione: i test dei controller (@WebMvcTest) verificano il comportamento REST — codici di stato, corpo della risposta, validazione dei DTO in ingresso — con i filtri di Spring Security disattivati (addFilters = false), quindi non valutano le regole di autorizzazione (@PreAuthorize). Ho mantenuto questa convenzione, uniforme su tutti i test dei controller, e ho compensato la lacuna in due modi: una classe di test di integrazione (SecurityRbacIntegrationTest, 9 test con contesto Spring completo, filtro di sicurezza e method security attivi) che verifica accesso senza token, ruolo errato, ownership e rotte pubbliche, e verifiche end-to-end eseguite chiamando l’API reale con utenti di ruoli diversi, che tentano di accedere a risorse altrui (45 verifiche, riassunte nella sezione dei test funzionali). Una copertura automatica sistematica di tutte le regole @PreAuthorize resta un’estensione naturale.</w:t>
             </w:r>
           </w:p>
           <w:p>
@@ -1750,7 +1750,7 @@
                 <w:szCs w:val="28"/>
                 <w:lang w:val="it-IT"/>
               </w:rPr>
-              <w:t xml:space="preserve">La difficoltà più significativa incontrata durante lo sviluppo è stata di natura architetturale piuttosto che puramente implementativa: nelle fasi iniziali del progetto avevo previsto anche un servizio di assistente virtuale conversazionale, pensato per rispondere alle domande frequenti dei pazienti e aprire automaticamente un ticket di supporto quando non riusciva a risolvere una richiesta. Per permettere a questo servizio esterno di aprire ticket per conto dell’utente senza propagare un token JWT delegato, l’endpoint POST /api/tickets era stato lasciato volutamente privo di qualunque restrizione di ruolo (nessuna annotazione @PreAuthorize).</w:t>
+              <w:t xml:space="preserve">La difficoltà più significativa incontrata durante lo sviluppo è stata di natura architetturale piuttosto che puramente implementativa: nelle fasi iniziali del progetto avevo previsto anche un’integrazione con un servizio esterno, incaricato di aprire automaticamente ticket di supporto per conto dell’utente. Per permettere a questo servizio esterno di aprire ticket per conto dell’utente senza propagare un token JWT delegato, l’endpoint POST /api/tickets era stato lasciato volutamente privo di qualunque restrizione di ruolo (nessuna annotazione @PreAuthorize).</w:t>
             </w:r>
           </w:p>
           <w:p>
@@ -1771,7 +1771,7 @@
                 <w:szCs w:val="28"/>
                 <w:lang w:val="it-IT"/>
               </w:rPr>
-              <w:t xml:space="preserve">Ho successivamente deciso di rimuovere l’intero modulo dell’assistente per concentrare l’elaborato sul nucleo RESTful e di sicurezza effettivamente richiesto dalla traccia, evitando di disperdere l’attenzione della relazione su una funzionalità accessoria. La rimozione ha però reso evidente che quell’endpoint sarebbe rimasto un varco di scrittura non autenticato, utilizzabile da chiunque per creare ticket a nome di un paziente qualsiasi: un rischio concreto che prima era “nascosto” dal fatto che, nella pratica, solo l’assistente lo chiamava. Ho risolto il problema ripristinando un controllo di autorizzazione esplicito (@PreAuthorize con verifica di ownership, descritto nel dettaglio nella Parte Seconda), un intervento che mi ha insegnato quanto un’eccezione di sicurezza introdotta per accomodare un’integrazione esterna debba sempre essere rivista non appena quell’integrazione cambia forma o viene rimossa, e non lasciata semplicemente “com’era”.</w:t>
+              <w:t xml:space="preserve">Ho successivamente deciso di rimuovere quell’integrazione per concentrare l’elaborato sul nucleo RESTful e di sicurezza effettivamente richiesto dalla traccia, evitando di disperdere l’attenzione della relazione su una funzionalità accessoria. La rimozione ha però reso evidente che quell’endpoint sarebbe rimasto un varco di scrittura non autenticato, utilizzabile da chiunque per creare ticket a nome di un paziente qualsiasi: un rischio concreto che prima era “nascosto” dal fatto che, nella pratica, solo quel servizio lo chiamava. Ho risolto il problema ripristinando un controllo di autorizzazione esplicito (@PreAuthorize con verifica di ownership, descritto nel dettaglio nella Parte Seconda), un intervento che mi ha insegnato quanto un’eccezione di sicurezza introdotta per accomodare un’integrazione esterna debba sempre essere rivista non appena quell’integrazione cambia forma o viene rimossa, e non lasciata semplicemente “com’era”.</w:t>
             </w:r>
           </w:p>
           <w:p>
@@ -1946,16 +1946,95 @@
                 <w:szCs w:val="28"/>
                 <w:lang w:val="it-IT"/>
               </w:rPr>
-              <w:t xml:space="preserve">– </w:t>
-            </w:r>
-            <w:r>
-              <w:rPr>
-                <w:rFonts w:ascii="Times New Roman" w:hAnsi="Times New Roman" w:cs="Times New Roman"/>
-                <w:sz w:val="28"/>
-                <w:szCs w:val="28"/>
-                <w:lang w:val="it-IT"/>
-              </w:rPr>
-              <w:t xml:space="preserve">Spring Boot 3.2.4 e Java 21 (LTS): standard di mercato per API RESTful enterprise-grade, scelto per la maturità dell’ecosistema di sicurezza (Spring Security) e persistenza (Spring Data JPA) e per il supporto a lungo termine della versione del linguaggio.</w:t>
+              <w:t xml:space="preserve">– Spring Boot 3.2.4 e Java 21 (LTS): standard di mercato per API RESTful enterprise-grade, scelto per la maturità dell’ecosistema di sicurezza (Spring Security) e persistenza (Spring Data JPA) e per il supporto a lungo termine della versione del linguaggio. Riferimenti: </w:t>
+            </w:r>
+            <w:hyperlink r:id="rId31" w:history="1">
+              <w:r>
+                <w:rPr>
+                  <w:rFonts w:ascii="Times New Roman" w:hAnsi="Times New Roman" w:cs="Times New Roman"/>
+                  <w:color w:val="0563C1"/>
+                  <w:sz w:val="28"/>
+                  <w:szCs w:val="28"/>
+                  <w:u w:val="single"/>
+                  <w:lang w:val="it-IT"/>
+                </w:rPr>
+                <w:t xml:space="preserve">https://spring.io/projects/spring-boot</w:t>
+              </w:r>
+            </w:hyperlink>
+            <w:r>
+              <w:rPr>
+                <w:rFonts w:ascii="Times New Roman" w:hAnsi="Times New Roman" w:cs="Times New Roman"/>
+                <w:sz w:val="28"/>
+                <w:szCs w:val="28"/>
+                <w:lang w:val="it-IT"/>
+              </w:rPr>
+              <w:t xml:space="preserve">; </w:t>
+            </w:r>
+            <w:hyperlink r:id="rId32" w:history="1">
+              <w:r>
+                <w:rPr>
+                  <w:rFonts w:ascii="Times New Roman" w:hAnsi="Times New Roman" w:cs="Times New Roman"/>
+                  <w:color w:val="0563C1"/>
+                  <w:sz w:val="28"/>
+                  <w:szCs w:val="28"/>
+                  <w:u w:val="single"/>
+                  <w:lang w:val="it-IT"/>
+                </w:rPr>
+                <w:t xml:space="preserve">https://openjdk.org/projects/jdk/21/</w:t>
+              </w:r>
+            </w:hyperlink>
+            <w:r>
+              <w:rPr>
+                <w:rFonts w:ascii="Times New Roman" w:hAnsi="Times New Roman" w:cs="Times New Roman"/>
+                <w:sz w:val="28"/>
+                <w:szCs w:val="28"/>
+                <w:lang w:val="it-IT"/>
+              </w:rPr>
+              <w:t xml:space="preserve">; </w:t>
+            </w:r>
+            <w:hyperlink r:id="rId33" w:history="1">
+              <w:r>
+                <w:rPr>
+                  <w:rFonts w:ascii="Times New Roman" w:hAnsi="Times New Roman" w:cs="Times New Roman"/>
+                  <w:color w:val="0563C1"/>
+                  <w:sz w:val="28"/>
+                  <w:szCs w:val="28"/>
+                  <w:u w:val="single"/>
+                  <w:lang w:val="it-IT"/>
+                </w:rPr>
+                <w:t xml:space="preserve">https://spring.io/projects/spring-security</w:t>
+              </w:r>
+            </w:hyperlink>
+            <w:r>
+              <w:rPr>
+                <w:rFonts w:ascii="Times New Roman" w:hAnsi="Times New Roman" w:cs="Times New Roman"/>
+                <w:sz w:val="28"/>
+                <w:szCs w:val="28"/>
+                <w:lang w:val="it-IT"/>
+              </w:rPr>
+              <w:t xml:space="preserve">; </w:t>
+            </w:r>
+            <w:hyperlink r:id="rId34" w:history="1">
+              <w:r>
+                <w:rPr>
+                  <w:rFonts w:ascii="Times New Roman" w:hAnsi="Times New Roman" w:cs="Times New Roman"/>
+                  <w:color w:val="0563C1"/>
+                  <w:sz w:val="28"/>
+                  <w:szCs w:val="28"/>
+                  <w:u w:val="single"/>
+                  <w:lang w:val="it-IT"/>
+                </w:rPr>
+                <w:t xml:space="preserve">https://spring.io/projects/spring-data-jpa</w:t>
+              </w:r>
+            </w:hyperlink>
+            <w:r>
+              <w:rPr>
+                <w:rFonts w:ascii="Times New Roman" w:hAnsi="Times New Roman" w:cs="Times New Roman"/>
+                <w:sz w:val="28"/>
+                <w:szCs w:val="28"/>
+                <w:lang w:val="it-IT"/>
+              </w:rPr>
+              <w:t xml:space="preserve">.</w:t>
             </w:r>
           </w:p>
           <w:p>
@@ -1977,16 +2056,51 @@
                 <w:szCs w:val="28"/>
                 <w:lang w:val="it-IT"/>
               </w:rPr>
-              <w:t xml:space="preserve">– </w:t>
-            </w:r>
-            <w:r>
-              <w:rPr>
-                <w:rFonts w:ascii="Times New Roman" w:hAnsi="Times New Roman" w:cs="Times New Roman"/>
-                <w:sz w:val="28"/>
-                <w:szCs w:val="28"/>
-                <w:lang w:val="it-IT"/>
-              </w:rPr>
-              <w:t xml:space="preserve">MapStruct 1.5.5, in coppia con Lombok e lombok-mapstruct-binding: mapping DTO↔Entity generato a compile-time (costo zero a runtime), che evita di scrivere manualmente decine di metodi di conversione ripetitivi ed error-prone. Ho sfruttato la composizione di mapper (uses = {...}) per esporre nello stesso DTO sia gli ID piatti (utili in scrittura) sia gli oggetti nidificati completi (utili in lettura sul client).</w:t>
+              <w:t xml:space="preserve">– MapStruct 1.5.5, in coppia con Lombok e lombok-mapstruct-binding: mapping DTO↔Entity generato a compile-time (costo zero a runtime), che evita di scrivere manualmente decine di metodi di conversione ripetitivi ed error-prone. Ho sfruttato la composizione di mapper (uses = {...}) per esporre nello stesso DTO sia gli ID piatti (utili in scrittura) sia gli oggetti nidificati completi (utili in lettura sul client). Riferimenti: </w:t>
+            </w:r>
+            <w:hyperlink r:id="rId35" w:history="1">
+              <w:r>
+                <w:rPr>
+                  <w:rFonts w:ascii="Times New Roman" w:hAnsi="Times New Roman" w:cs="Times New Roman"/>
+                  <w:color w:val="0563C1"/>
+                  <w:sz w:val="28"/>
+                  <w:szCs w:val="28"/>
+                  <w:u w:val="single"/>
+                  <w:lang w:val="it-IT"/>
+                </w:rPr>
+                <w:t xml:space="preserve">https://mapstruct.org</w:t>
+              </w:r>
+            </w:hyperlink>
+            <w:r>
+              <w:rPr>
+                <w:rFonts w:ascii="Times New Roman" w:hAnsi="Times New Roman" w:cs="Times New Roman"/>
+                <w:sz w:val="28"/>
+                <w:szCs w:val="28"/>
+                <w:lang w:val="it-IT"/>
+              </w:rPr>
+              <w:t xml:space="preserve">; </w:t>
+            </w:r>
+            <w:hyperlink r:id="rId36" w:history="1">
+              <w:r>
+                <w:rPr>
+                  <w:rFonts w:ascii="Times New Roman" w:hAnsi="Times New Roman" w:cs="Times New Roman"/>
+                  <w:color w:val="0563C1"/>
+                  <w:sz w:val="28"/>
+                  <w:szCs w:val="28"/>
+                  <w:u w:val="single"/>
+                  <w:lang w:val="it-IT"/>
+                </w:rPr>
+                <w:t xml:space="preserve">https://projectlombok.org</w:t>
+              </w:r>
+            </w:hyperlink>
+            <w:r>
+              <w:rPr>
+                <w:rFonts w:ascii="Times New Roman" w:hAnsi="Times New Roman" w:cs="Times New Roman"/>
+                <w:sz w:val="28"/>
+                <w:szCs w:val="28"/>
+                <w:lang w:val="it-IT"/>
+              </w:rPr>
+              <w:t xml:space="preserve">.</w:t>
             </w:r>
           </w:p>
           <w:p>
@@ -2008,16 +2122,73 @@
                 <w:szCs w:val="28"/>
                 <w:lang w:val="it-IT"/>
               </w:rPr>
-              <w:t xml:space="preserve">– </w:t>
-            </w:r>
-            <w:r>
-              <w:rPr>
-                <w:rFonts w:ascii="Times New Roman" w:hAnsi="Times New Roman" w:cs="Times New Roman"/>
-                <w:sz w:val="28"/>
-                <w:szCs w:val="28"/>
-                <w:lang w:val="it-IT"/>
-              </w:rPr>
-              <w:t xml:space="preserve">jjwt 0.12.5 per la gestione stateless dei token JWT (nessuna sessione lato server, quindi scalabilità orizzontale immediata) e totp-spring-boot-starter 1.7.1 per l’autenticazione a due fattori, con endpoint separati di setup e verifica così da rendere la 2FA opzionale per singolo utente.</w:t>
+              <w:t xml:space="preserve">– jjwt 0.12.5 per la gestione stateless dei token JWT (nessuna sessione lato server, quindi scalabilità orizzontale immediata) e totp-spring-boot-starter 1.7.1 per l’autenticazione a due fattori, con endpoint separati di setup e verifica così da rendere la 2FA opzionale per singolo utente. Riferimenti: </w:t>
+            </w:r>
+            <w:hyperlink r:id="rId37" w:history="1">
+              <w:r>
+                <w:rPr>
+                  <w:rFonts w:ascii="Times New Roman" w:hAnsi="Times New Roman" w:cs="Times New Roman"/>
+                  <w:color w:val="0563C1"/>
+                  <w:sz w:val="28"/>
+                  <w:szCs w:val="28"/>
+                  <w:u w:val="single"/>
+                  <w:lang w:val="it-IT"/>
+                </w:rPr>
+                <w:t xml:space="preserve">https://github.com/jwtk/jjwt</w:t>
+              </w:r>
+            </w:hyperlink>
+            <w:r>
+              <w:rPr>
+                <w:rFonts w:ascii="Times New Roman" w:hAnsi="Times New Roman" w:cs="Times New Roman"/>
+                <w:sz w:val="28"/>
+                <w:szCs w:val="28"/>
+                <w:lang w:val="it-IT"/>
+              </w:rPr>
+              <w:t xml:space="preserve">; </w:t>
+            </w:r>
+            <w:hyperlink r:id="rId38" w:history="1">
+              <w:r>
+                <w:rPr>
+                  <w:rFonts w:ascii="Times New Roman" w:hAnsi="Times New Roman" w:cs="Times New Roman"/>
+                  <w:color w:val="0563C1"/>
+                  <w:sz w:val="28"/>
+                  <w:szCs w:val="28"/>
+                  <w:u w:val="single"/>
+                  <w:lang w:val="it-IT"/>
+                </w:rPr>
+                <w:t xml:space="preserve">https://github.com/samdjstevens/java-totp</w:t>
+              </w:r>
+            </w:hyperlink>
+            <w:r>
+              <w:rPr>
+                <w:rFonts w:ascii="Times New Roman" w:hAnsi="Times New Roman" w:cs="Times New Roman"/>
+                <w:sz w:val="28"/>
+                <w:szCs w:val="28"/>
+                <w:lang w:val="it-IT"/>
+              </w:rPr>
+              <w:t xml:space="preserve">; </w:t>
+            </w:r>
+            <w:hyperlink r:id="rId39" w:history="1">
+              <w:r>
+                <w:rPr>
+                  <w:rFonts w:ascii="Times New Roman" w:hAnsi="Times New Roman" w:cs="Times New Roman"/>
+                  <w:color w:val="0563C1"/>
+                  <w:sz w:val="28"/>
+                  <w:szCs w:val="28"/>
+                  <w:u w:val="single"/>
+                  <w:lang w:val="it-IT"/>
+                </w:rPr>
+                <w:t xml:space="preserve">https://datatracker.ietf.org/doc/html/rfc6238</w:t>
+              </w:r>
+            </w:hyperlink>
+            <w:r>
+              <w:rPr>
+                <w:rFonts w:ascii="Times New Roman" w:hAnsi="Times New Roman" w:cs="Times New Roman"/>
+                <w:sz w:val="28"/>
+                <w:szCs w:val="28"/>
+                <w:lang w:val="it-IT"/>
+              </w:rPr>
+              <w:t xml:space="preserve">.</w:t>
             </w:r>
           </w:p>
           <w:p>
@@ -2039,16 +2210,51 @@
                 <w:szCs w:val="28"/>
                 <w:lang w:val="it-IT"/>
               </w:rPr>
-              <w:t xml:space="preserve">– </w:t>
-            </w:r>
-            <w:r>
-              <w:rPr>
-                <w:rFonts w:ascii="Times New Roman" w:hAnsi="Times New Roman" w:cs="Times New Roman"/>
-                <w:sz w:val="28"/>
-                <w:szCs w:val="28"/>
-                <w:lang w:val="it-IT"/>
-              </w:rPr>
-              <w:t xml:space="preserve">springdoc-openapi 2.5.0 per generare la documentazione OpenAPI 3.0 analizzando a runtime le annotazioni dei controller, evitando la manutenzione manuale di una specifica Swagger separata dal codice e quindi soggetta a disallineamento.</w:t>
+              <w:t xml:space="preserve">– springdoc-openapi 2.5.0 per generare la documentazione OpenAPI 3.0 analizzando a runtime le annotazioni dei controller, evitando la manutenzione manuale di una specifica Swagger separata dal codice e quindi soggetta a disallineamento. Riferimenti: </w:t>
+            </w:r>
+            <w:hyperlink r:id="rId40" w:history="1">
+              <w:r>
+                <w:rPr>
+                  <w:rFonts w:ascii="Times New Roman" w:hAnsi="Times New Roman" w:cs="Times New Roman"/>
+                  <w:color w:val="0563C1"/>
+                  <w:sz w:val="28"/>
+                  <w:szCs w:val="28"/>
+                  <w:u w:val="single"/>
+                  <w:lang w:val="it-IT"/>
+                </w:rPr>
+                <w:t xml:space="preserve">https://springdoc.org</w:t>
+              </w:r>
+            </w:hyperlink>
+            <w:r>
+              <w:rPr>
+                <w:rFonts w:ascii="Times New Roman" w:hAnsi="Times New Roman" w:cs="Times New Roman"/>
+                <w:sz w:val="28"/>
+                <w:szCs w:val="28"/>
+                <w:lang w:val="it-IT"/>
+              </w:rPr>
+              <w:t xml:space="preserve">; </w:t>
+            </w:r>
+            <w:hyperlink r:id="rId41" w:history="1">
+              <w:r>
+                <w:rPr>
+                  <w:rFonts w:ascii="Times New Roman" w:hAnsi="Times New Roman" w:cs="Times New Roman"/>
+                  <w:color w:val="0563C1"/>
+                  <w:sz w:val="28"/>
+                  <w:szCs w:val="28"/>
+                  <w:u w:val="single"/>
+                  <w:lang w:val="it-IT"/>
+                </w:rPr>
+                <w:t xml:space="preserve">https://www.openapis.org</w:t>
+              </w:r>
+            </w:hyperlink>
+            <w:r>
+              <w:rPr>
+                <w:rFonts w:ascii="Times New Roman" w:hAnsi="Times New Roman" w:cs="Times New Roman"/>
+                <w:sz w:val="28"/>
+                <w:szCs w:val="28"/>
+                <w:lang w:val="it-IT"/>
+              </w:rPr>
+              <w:t xml:space="preserve">.</w:t>
             </w:r>
           </w:p>
           <w:p>
@@ -2070,16 +2276,29 @@
                 <w:szCs w:val="28"/>
                 <w:lang w:val="it-IT"/>
               </w:rPr>
-              <w:t xml:space="preserve">– </w:t>
-            </w:r>
-            <w:r>
-              <w:rPr>
-                <w:rFonts w:ascii="Times New Roman" w:hAnsi="Times New Roman" w:cs="Times New Roman"/>
-                <w:sz w:val="28"/>
-                <w:szCs w:val="28"/>
-                <w:lang w:val="it-IT"/>
-              </w:rPr>
-              <w:t xml:space="preserve">Database H2 in-memory per azzerare l’attrito di setup in fase di valutazione (nessuna installazione richiesta da chi esamina l’elaborato), a fronte del limite, discusso nella sezione di valutazione, di non garantire la persistenza dei dati tra un riavvio e l’altro.</w:t>
+              <w:t xml:space="preserve">– Database H2 in-memory per azzerare l’attrito di setup in fase di valutazione (nessuna installazione richiesta da chi esamina l’elaborato), a fronte del limite, discusso nella sezione di valutazione, di non garantire la persistenza dei dati tra un riavvio e l’altro. Riferimenti: </w:t>
+            </w:r>
+            <w:hyperlink r:id="rId42" w:history="1">
+              <w:r>
+                <w:rPr>
+                  <w:rFonts w:ascii="Times New Roman" w:hAnsi="Times New Roman" w:cs="Times New Roman"/>
+                  <w:color w:val="0563C1"/>
+                  <w:sz w:val="28"/>
+                  <w:szCs w:val="28"/>
+                  <w:u w:val="single"/>
+                  <w:lang w:val="it-IT"/>
+                </w:rPr>
+                <w:t xml:space="preserve">https://www.h2database.com</w:t>
+              </w:r>
+            </w:hyperlink>
+            <w:r>
+              <w:rPr>
+                <w:rFonts w:ascii="Times New Roman" w:hAnsi="Times New Roman" w:cs="Times New Roman"/>
+                <w:sz w:val="28"/>
+                <w:szCs w:val="28"/>
+                <w:lang w:val="it-IT"/>
+              </w:rPr>
+              <w:t xml:space="preserve">.</w:t>
             </w:r>
           </w:p>
           <w:p>
@@ -2101,16 +2320,29 @@
                 <w:szCs w:val="28"/>
                 <w:lang w:val="it-IT"/>
               </w:rPr>
-              <w:t xml:space="preserve">– </w:t>
-            </w:r>
-            <w:r>
-              <w:rPr>
-                <w:rFonts w:ascii="Times New Roman" w:hAnsi="Times New Roman" w:cs="Times New Roman"/>
-                <w:sz w:val="28"/>
-                <w:szCs w:val="28"/>
-                <w:lang w:val="it-IT"/>
-              </w:rPr>
-              <w:t xml:space="preserve">JaCoCo 0.8.12, integrato nella fase test del ciclo di vita Maven, per una misura oggettiva della copertura dei test invece di una semplice dichiarazione di intenti.</w:t>
+              <w:t xml:space="preserve">– JaCoCo 0.8.12, integrato nella fase test del ciclo di vita Maven, per una misura oggettiva della copertura dei test invece di una semplice dichiarazione di intenti. Riferimenti: </w:t>
+            </w:r>
+            <w:hyperlink r:id="rId43" w:history="1">
+              <w:r>
+                <w:rPr>
+                  <w:rFonts w:ascii="Times New Roman" w:hAnsi="Times New Roman" w:cs="Times New Roman"/>
+                  <w:color w:val="0563C1"/>
+                  <w:sz w:val="28"/>
+                  <w:szCs w:val="28"/>
+                  <w:u w:val="single"/>
+                  <w:lang w:val="it-IT"/>
+                </w:rPr>
+                <w:t xml:space="preserve">https://www.jacoco.org/jacoco/</w:t>
+              </w:r>
+            </w:hyperlink>
+            <w:r>
+              <w:rPr>
+                <w:rFonts w:ascii="Times New Roman" w:hAnsi="Times New Roman" w:cs="Times New Roman"/>
+                <w:sz w:val="28"/>
+                <w:szCs w:val="28"/>
+                <w:lang w:val="it-IT"/>
+              </w:rPr>
+              <w:t xml:space="preserve">.</w:t>
             </w:r>
           </w:p>
           <w:p>
@@ -2154,16 +2386,29 @@
                 <w:szCs w:val="28"/>
                 <w:lang w:val="it-IT"/>
               </w:rPr>
-              <w:t xml:space="preserve">– </w:t>
-            </w:r>
-            <w:r>
-              <w:rPr>
-                <w:rFonts w:ascii="Times New Roman" w:hAnsi="Times New Roman" w:cs="Times New Roman"/>
-                <w:sz w:val="28"/>
-                <w:szCs w:val="28"/>
-                <w:lang w:val="it-IT"/>
-              </w:rPr>
-              <w:t xml:space="preserve">Angular 19.2 con componenti standalone: coerente con l’uso di TypeScript fortemente tipizzato e con un’architettura component-based moderna, senza il boilerplate dei NgModule delle versioni precedenti del framework.</w:t>
+              <w:t xml:space="preserve">– Angular 19.2 con componenti standalone: coerente con l’uso di TypeScript fortemente tipizzato e con un’architettura component-based moderna, senza il boilerplate dei NgModule delle versioni precedenti del framework. Riferimenti: </w:t>
+            </w:r>
+            <w:hyperlink r:id="rId44" w:history="1">
+              <w:r>
+                <w:rPr>
+                  <w:rFonts w:ascii="Times New Roman" w:hAnsi="Times New Roman" w:cs="Times New Roman"/>
+                  <w:color w:val="0563C1"/>
+                  <w:sz w:val="28"/>
+                  <w:szCs w:val="28"/>
+                  <w:u w:val="single"/>
+                  <w:lang w:val="it-IT"/>
+                </w:rPr>
+                <w:t xml:space="preserve">https://angular.dev</w:t>
+              </w:r>
+            </w:hyperlink>
+            <w:r>
+              <w:rPr>
+                <w:rFonts w:ascii="Times New Roman" w:hAnsi="Times New Roman" w:cs="Times New Roman"/>
+                <w:sz w:val="28"/>
+                <w:szCs w:val="28"/>
+                <w:lang w:val="it-IT"/>
+              </w:rPr>
+              <w:t xml:space="preserve">.</w:t>
             </w:r>
           </w:p>
           <w:p>
@@ -2185,16 +2430,29 @@
                 <w:szCs w:val="28"/>
                 <w:lang w:val="it-IT"/>
               </w:rPr>
-              <w:t xml:space="preserve">– </w:t>
-            </w:r>
-            <w:r>
-              <w:rPr>
-                <w:rFonts w:ascii="Times New Roman" w:hAnsi="Times New Roman" w:cs="Times New Roman"/>
-                <w:sz w:val="28"/>
-                <w:szCs w:val="28"/>
-                <w:lang w:val="it-IT"/>
-              </w:rPr>
-              <w:t xml:space="preserve">RxJS 7.8 per la gestione reattiva delle chiamate HTTP e dello stato applicativo condiviso, con un BehaviorSubject dedicato al conteggio delle richieste attive nel LoadingService, così da coordinare correttamente lo spinner anche quando più chiamate sono in corso contemporaneamente.</w:t>
+              <w:t xml:space="preserve">– RxJS 7.8 per la gestione reattiva delle chiamate HTTP e dello stato applicativo condiviso, con un BehaviorSubject dedicato al conteggio delle richieste attive nel LoadingService, così da coordinare correttamente lo spinner anche quando più chiamate sono in corso contemporaneamente. Riferimenti: </w:t>
+            </w:r>
+            <w:hyperlink r:id="rId45" w:history="1">
+              <w:r>
+                <w:rPr>
+                  <w:rFonts w:ascii="Times New Roman" w:hAnsi="Times New Roman" w:cs="Times New Roman"/>
+                  <w:color w:val="0563C1"/>
+                  <w:sz w:val="28"/>
+                  <w:szCs w:val="28"/>
+                  <w:u w:val="single"/>
+                  <w:lang w:val="it-IT"/>
+                </w:rPr>
+                <w:t xml:space="preserve">https://rxjs.dev</w:t>
+              </w:r>
+            </w:hyperlink>
+            <w:r>
+              <w:rPr>
+                <w:rFonts w:ascii="Times New Roman" w:hAnsi="Times New Roman" w:cs="Times New Roman"/>
+                <w:sz w:val="28"/>
+                <w:szCs w:val="28"/>
+                <w:lang w:val="it-IT"/>
+              </w:rPr>
+              <w:t xml:space="preserve">.</w:t>
             </w:r>
           </w:p>
           <w:p>
@@ -2216,16 +2474,29 @@
                 <w:szCs w:val="28"/>
                 <w:lang w:val="it-IT"/>
               </w:rPr>
-              <w:t xml:space="preserve">– </w:t>
-            </w:r>
-            <w:r>
-              <w:rPr>
-                <w:rFonts w:ascii="Times New Roman" w:hAnsi="Times New Roman" w:cs="Times New Roman"/>
-                <w:sz w:val="28"/>
-                <w:szCs w:val="28"/>
-                <w:lang w:val="it-IT"/>
-              </w:rPr>
-              <w:t xml:space="preserve">HttpInterceptorFn nativo di Angular per l’intercettazione centralizzata di autenticazione ed errori: un interceptor allega il token JWT alle sole richieste dirette al backend, un secondo intercetta le risposte 401 per disconnettere automaticamente l’utente con un token scaduto, mostrando un messaggio Toast al posto dei tradizionali alert() di sistema.</w:t>
+              <w:t xml:space="preserve">– HttpInterceptorFn nativo di Angular per l’intercettazione centralizzata di autenticazione ed errori: un interceptor allega il token JWT alle sole richieste dirette al backend, un secondo intercetta le risposte di errore mostrando un messaggio Toast al posto dei tradizionali alert() di sistema e prevede il logout automatico sullo status 401 (il backend, però, oggi risponde 403 per token assente o scaduto: si veda la sezione finale). Riferimenti: </w:t>
+            </w:r>
+            <w:hyperlink r:id="rId46" w:history="1">
+              <w:r>
+                <w:rPr>
+                  <w:rFonts w:ascii="Times New Roman" w:hAnsi="Times New Roman" w:cs="Times New Roman"/>
+                  <w:color w:val="0563C1"/>
+                  <w:sz w:val="28"/>
+                  <w:szCs w:val="28"/>
+                  <w:u w:val="single"/>
+                  <w:lang w:val="it-IT"/>
+                </w:rPr>
+                <w:t xml:space="preserve">https://angular.dev/guide/http/interceptors</w:t>
+              </w:r>
+            </w:hyperlink>
+            <w:r>
+              <w:rPr>
+                <w:rFonts w:ascii="Times New Roman" w:hAnsi="Times New Roman" w:cs="Times New Roman"/>
+                <w:sz w:val="28"/>
+                <w:szCs w:val="28"/>
+                <w:lang w:val="it-IT"/>
+              </w:rPr>
+              <w:t xml:space="preserve">.</w:t>
             </w:r>
           </w:p>
           <w:p>
@@ -2269,16 +2540,73 @@
                 <w:szCs w:val="28"/>
                 <w:lang w:val="it-IT"/>
               </w:rPr>
-              <w:t xml:space="preserve">– </w:t>
-            </w:r>
-            <w:r>
-              <w:rPr>
-                <w:rFonts w:ascii="Times New Roman" w:hAnsi="Times New Roman" w:cs="Times New Roman"/>
-                <w:sz w:val="28"/>
-                <w:szCs w:val="28"/>
-                <w:lang w:val="it-IT"/>
-              </w:rPr>
-              <w:t xml:space="preserve">Docker con build multi-stage: ciascun servizio (backend, frontend) ha un proprio Dockerfile con uno stage test dedicato al calcolo del code coverage, separato dallo stage runtime finale, così che l’immagine di produzione non porti con sé le dipendenze di test.</w:t>
+              <w:t xml:space="preserve">– Docker con build multi-stage: ciascun servizio (backend, frontend) ha un proprio Dockerfile con uno stage test dedicato al calcolo del code coverage, separato dallo stage runtime finale, così che l’immagine di produzione non porti con sé le dipendenze di test. Un docker-compose.yml orchestra backend e frontend (servito da Nginx) e un Dockerfile in radice produce un’unica immagine in cui il backend serve anche la SPA incorporata. Riferimenti: </w:t>
+            </w:r>
+            <w:hyperlink r:id="rId47" w:history="1">
+              <w:r>
+                <w:rPr>
+                  <w:rFonts w:ascii="Times New Roman" w:hAnsi="Times New Roman" w:cs="Times New Roman"/>
+                  <w:color w:val="0563C1"/>
+                  <w:sz w:val="28"/>
+                  <w:szCs w:val="28"/>
+                  <w:u w:val="single"/>
+                  <w:lang w:val="it-IT"/>
+                </w:rPr>
+                <w:t xml:space="preserve">https://www.docker.com</w:t>
+              </w:r>
+            </w:hyperlink>
+            <w:r>
+              <w:rPr>
+                <w:rFonts w:ascii="Times New Roman" w:hAnsi="Times New Roman" w:cs="Times New Roman"/>
+                <w:sz w:val="28"/>
+                <w:szCs w:val="28"/>
+                <w:lang w:val="it-IT"/>
+              </w:rPr>
+              <w:t xml:space="preserve">; </w:t>
+            </w:r>
+            <w:hyperlink r:id="rId48" w:history="1">
+              <w:r>
+                <w:rPr>
+                  <w:rFonts w:ascii="Times New Roman" w:hAnsi="Times New Roman" w:cs="Times New Roman"/>
+                  <w:color w:val="0563C1"/>
+                  <w:sz w:val="28"/>
+                  <w:szCs w:val="28"/>
+                  <w:u w:val="single"/>
+                  <w:lang w:val="it-IT"/>
+                </w:rPr>
+                <w:t xml:space="preserve">https://docs.docker.com/compose/</w:t>
+              </w:r>
+            </w:hyperlink>
+            <w:r>
+              <w:rPr>
+                <w:rFonts w:ascii="Times New Roman" w:hAnsi="Times New Roman" w:cs="Times New Roman"/>
+                <w:sz w:val="28"/>
+                <w:szCs w:val="28"/>
+                <w:lang w:val="it-IT"/>
+              </w:rPr>
+              <w:t xml:space="preserve">; </w:t>
+            </w:r>
+            <w:hyperlink r:id="rId49" w:history="1">
+              <w:r>
+                <w:rPr>
+                  <w:rFonts w:ascii="Times New Roman" w:hAnsi="Times New Roman" w:cs="Times New Roman"/>
+                  <w:color w:val="0563C1"/>
+                  <w:sz w:val="28"/>
+                  <w:szCs w:val="28"/>
+                  <w:u w:val="single"/>
+                  <w:lang w:val="it-IT"/>
+                </w:rPr>
+                <w:t xml:space="preserve">https://nginx.org</w:t>
+              </w:r>
+            </w:hyperlink>
+            <w:r>
+              <w:rPr>
+                <w:rFonts w:ascii="Times New Roman" w:hAnsi="Times New Roman" w:cs="Times New Roman"/>
+                <w:sz w:val="28"/>
+                <w:szCs w:val="28"/>
+                <w:lang w:val="it-IT"/>
+              </w:rPr>
+              <w:t xml:space="preserve">.</w:t>
             </w:r>
           </w:p>
           <w:p>
@@ -2300,47 +2628,51 @@
                 <w:szCs w:val="28"/>
                 <w:lang w:val="it-IT"/>
               </w:rPr>
-              <w:t xml:space="preserve">– </w:t>
-            </w:r>
-            <w:r>
-              <w:rPr>
-                <w:rFonts w:ascii="Times New Roman" w:hAnsi="Times New Roman" w:cs="Times New Roman"/>
-                <w:sz w:val="28"/>
-                <w:szCs w:val="28"/>
-                <w:lang w:val="it-IT"/>
-              </w:rPr>
-              <w:t xml:space="preserve">GitHub Actions per l’integrazione continua, definita in .github/workflows/ci.yml: un job iniziale (basato su dorny/paths-filter) rileva quali moduli sono stati modificati, così che backend e frontend procedano in build → test → release in modo indipendente e solo quando contengono effettivamente modifiche, evitando esecuzioni superflue della pipeline.</w:t>
-            </w:r>
-          </w:p>
-          <w:p>
-            <w:pPr>
-              <w:spacing w:after="80"/>
-              <w:ind w:left="360" w:hanging="360"/>
-              <w:jc w:val="both"/>
-              <w:rPr>
-                <w:rFonts w:ascii="Times New Roman" w:hAnsi="Times New Roman" w:cs="Times New Roman"/>
-                <w:sz w:val="28"/>
-                <w:szCs w:val="28"/>
-                <w:lang w:val="it-IT"/>
-              </w:rPr>
-            </w:pPr>
-            <w:r>
-              <w:rPr>
-                <w:rFonts w:ascii="Times New Roman" w:hAnsi="Times New Roman" w:cs="Times New Roman"/>
-                <w:sz w:val="28"/>
-                <w:szCs w:val="28"/>
-                <w:lang w:val="it-IT"/>
-              </w:rPr>
-              <w:t xml:space="preserve">– </w:t>
-            </w:r>
-            <w:r>
-              <w:rPr>
-                <w:rFonts w:ascii="Times New Roman" w:hAnsi="Times New Roman" w:cs="Times New Roman"/>
-                <w:sz w:val="28"/>
-                <w:szCs w:val="28"/>
-                <w:lang w:val="it-IT"/>
-              </w:rPr>
-              <w:t xml:space="preserve">SonarQube, configurato in sonar-project.properties per un’analisi statica multi-modulo (Java e TypeScript) in un’unica dashboard, importando i report di copertura nativi di ciascun linguaggio (JaCoCo XML per il backend, lcov per il frontend) invece di ripetere l’esecuzione dei test.</w:t>
+              <w:t xml:space="preserve">– GitHub Actions per l’integrazione continua, definita in .github/workflows/ci.yml: un job iniziale (basato su dorny/paths-filter) rileva quali moduli sono stati modificati, così che backend e frontend procedano in build → test → release in modo indipendente e solo quando contengono effettivamente modifiche, evitando esecuzioni superflue della pipeline. Riferimenti: </w:t>
+            </w:r>
+            <w:hyperlink r:id="rId50" w:history="1">
+              <w:r>
+                <w:rPr>
+                  <w:rFonts w:ascii="Times New Roman" w:hAnsi="Times New Roman" w:cs="Times New Roman"/>
+                  <w:color w:val="0563C1"/>
+                  <w:sz w:val="28"/>
+                  <w:szCs w:val="28"/>
+                  <w:u w:val="single"/>
+                  <w:lang w:val="it-IT"/>
+                </w:rPr>
+                <w:t xml:space="preserve">https://docs.github.com/actions</w:t>
+              </w:r>
+            </w:hyperlink>
+            <w:r>
+              <w:rPr>
+                <w:rFonts w:ascii="Times New Roman" w:hAnsi="Times New Roman" w:cs="Times New Roman"/>
+                <w:sz w:val="28"/>
+                <w:szCs w:val="28"/>
+                <w:lang w:val="it-IT"/>
+              </w:rPr>
+              <w:t xml:space="preserve">; </w:t>
+            </w:r>
+            <w:hyperlink r:id="rId51" w:history="1">
+              <w:r>
+                <w:rPr>
+                  <w:rFonts w:ascii="Times New Roman" w:hAnsi="Times New Roman" w:cs="Times New Roman"/>
+                  <w:color w:val="0563C1"/>
+                  <w:sz w:val="28"/>
+                  <w:szCs w:val="28"/>
+                  <w:u w:val="single"/>
+                  <w:lang w:val="it-IT"/>
+                </w:rPr>
+                <w:t xml:space="preserve">https://github.com/dorny/paths-filter</w:t>
+              </w:r>
+            </w:hyperlink>
+            <w:r>
+              <w:rPr>
+                <w:rFonts w:ascii="Times New Roman" w:hAnsi="Times New Roman" w:cs="Times New Roman"/>
+                <w:sz w:val="28"/>
+                <w:szCs w:val="28"/>
+                <w:lang w:val="it-IT"/>
+              </w:rPr>
+              <w:t xml:space="preserve">.</w:t>
             </w:r>
           </w:p>
           <w:p>
@@ -2384,17 +2716,1640 @@
                 <w:szCs w:val="28"/>
                 <w:lang w:val="it-IT"/>
               </w:rPr>
-              <w:t xml:space="preserve">– </w:t>
-            </w:r>
-            <w:r>
-              <w:rPr>
-                <w:rFonts w:ascii="Times New Roman" w:hAnsi="Times New Roman" w:cs="Times New Roman"/>
-                <w:sz w:val="28"/>
-                <w:szCs w:val="28"/>
-                <w:lang w:val="it-IT"/>
-              </w:rPr>
-              <w:t xml:space="preserve">Claude (Anthropic), utilizzato come assistente di pair-programming per velocizzare la scrittura di codice ripetitivo e a basso rischio (DTO, mapper, configurazione boilerplate) e per la stesura della suite di test JUnit e Karma/Jasmine a partire dai casi di test che ho individuato io stesso: le decisioni di architettura, design pattern, modellazione del dominio e le scelte di sicurezza restano mie, mentre lo strumento ha permesso di dedicare più tempo a queste ultime riducendo il tempo speso a scrivere codice ripetitivo. Ogni suggerimento generato è stato rivisto e compreso prima di essere integrato, ed è proprio in questa fase di revisione che ho individuato la lacuna di sicurezza sull’endpoint dei ticket descritta nella Parte Seconda.</w:t>
-            </w:r>
+              <w:t xml:space="preserve">– Claude (Anthropic), utilizzato come assistente di pair-programming per velocizzare la scrittura di codice ripetitivo e a basso rischio (DTO, mapper, configurazione boilerplate) e per la stesura della suite di test JUnit e Karma/Jasmine a partire dai casi di test che ho individuato io stesso: le decisioni di architettura, design pattern, modellazione del dominio e le scelte di sicurezza restano mie, mentre lo strumento ha permesso di dedicare più tempo a queste ultime riducendo il tempo speso a scrivere codice ripetitivo. Ogni suggerimento generato è stato rivisto e compreso prima di essere integrato, ed è proprio in questa fase di revisione che ho individuato la lacuna di sicurezza sull’endpoint dei ticket descritta nella Parte Seconda. Riferimenti: </w:t>
+            </w:r>
+            <w:hyperlink r:id="rId53" w:history="1">
+              <w:r>
+                <w:rPr>
+                  <w:rFonts w:ascii="Times New Roman" w:hAnsi="Times New Roman" w:cs="Times New Roman"/>
+                  <w:color w:val="0563C1"/>
+                  <w:sz w:val="28"/>
+                  <w:szCs w:val="28"/>
+                  <w:u w:val="single"/>
+                  <w:lang w:val="it-IT"/>
+                </w:rPr>
+                <w:t xml:space="preserve">https://www.anthropic.com/claude</w:t>
+              </w:r>
+            </w:hyperlink>
+            <w:r>
+              <w:rPr>
+                <w:rFonts w:ascii="Times New Roman" w:hAnsi="Times New Roman" w:cs="Times New Roman"/>
+                <w:sz w:val="28"/>
+                <w:szCs w:val="28"/>
+                <w:lang w:val="it-IT"/>
+              </w:rPr>
+              <w:t xml:space="preserve">.</w:t>
+            </w:r>
+          </w:p>
+          <w:p>
+            <w:pPr>
+              <w:spacing w:before="120" w:after="80"/>
+              <w:rPr>
+                <w:rFonts w:ascii="Times New Roman" w:hAnsi="Times New Roman" w:cs="Times New Roman"/>
+                <w:b/>
+                <w:sz w:val="26"/>
+                <w:szCs w:val="26"/>
+                <w:lang w:val="it-IT"/>
+              </w:rPr>
+            </w:pPr>
+            <w:r>
+              <w:rPr>
+                <w:rFonts w:ascii="Times New Roman" w:hAnsi="Times New Roman" w:cs="Times New Roman"/>
+                <w:b/>
+                <w:sz w:val="26"/>
+                <w:szCs w:val="26"/>
+                <w:lang w:val="it-IT"/>
+              </w:rPr>
+              <w:t xml:space="preserve">Sitografia: siti ufficiali delle tecnologie utilizzate</w:t>
+            </w:r>
+          </w:p>
+          <w:p>
+            <w:pPr>
+              <w:spacing w:after="160"/>
+              <w:jc w:val="both"/>
+              <w:rPr>
+                <w:rFonts w:ascii="Times New Roman" w:hAnsi="Times New Roman" w:cs="Times New Roman"/>
+                <w:sz w:val="28"/>
+                <w:szCs w:val="28"/>
+                <w:lang w:val="it-IT"/>
+              </w:rPr>
+            </w:pPr>
+            <w:r>
+              <w:rPr>
+                <w:rFonts w:ascii="Times New Roman" w:hAnsi="Times New Roman" w:cs="Times New Roman"/>
+                <w:sz w:val="28"/>
+                <w:szCs w:val="28"/>
+                <w:lang w:val="it-IT"/>
+              </w:rPr>
+              <w:t xml:space="preserve">Di seguito i riferimenti web ufficiali delle tecnologie, degli standard e degli strumenti citati nell’elaborato, raggruppati per area. Gli indirizzi sono stati verificati il 20 settembre 2026.</w:t>
+            </w:r>
+          </w:p>
+          <w:p>
+            <w:pPr>
+              <w:spacing w:before="120" w:after="80"/>
+              <w:rPr>
+                <w:rFonts w:ascii="Times New Roman" w:hAnsi="Times New Roman" w:cs="Times New Roman"/>
+                <w:b/>
+                <w:sz w:val="26"/>
+                <w:szCs w:val="26"/>
+                <w:lang w:val="it-IT"/>
+              </w:rPr>
+            </w:pPr>
+            <w:r>
+              <w:rPr>
+                <w:rFonts w:ascii="Times New Roman" w:hAnsi="Times New Roman" w:cs="Times New Roman"/>
+                <w:b/>
+                <w:sz w:val="26"/>
+                <w:szCs w:val="26"/>
+                <w:lang w:val="it-IT"/>
+              </w:rPr>
+              <w:t xml:space="preserve">Backend (Java)</w:t>
+            </w:r>
+          </w:p>
+          <w:p>
+            <w:pPr>
+              <w:spacing w:after="80"/>
+              <w:ind w:left="360" w:hanging="360"/>
+              <w:jc w:val="both"/>
+              <w:rPr>
+                <w:rFonts w:ascii="Times New Roman" w:hAnsi="Times New Roman" w:cs="Times New Roman"/>
+                <w:sz w:val="28"/>
+                <w:szCs w:val="28"/>
+                <w:lang w:val="it-IT"/>
+              </w:rPr>
+            </w:pPr>
+            <w:r>
+              <w:rPr>
+                <w:rFonts w:ascii="Times New Roman" w:hAnsi="Times New Roman" w:cs="Times New Roman"/>
+                <w:sz w:val="28"/>
+                <w:szCs w:val="28"/>
+                <w:lang w:val="it-IT"/>
+              </w:rPr>
+              <w:t xml:space="preserve">– OpenJDK 21: </w:t>
+            </w:r>
+            <w:hyperlink r:id="rId32" w:history="1">
+              <w:r>
+                <w:rPr>
+                  <w:rFonts w:ascii="Times New Roman" w:hAnsi="Times New Roman" w:cs="Times New Roman"/>
+                  <w:color w:val="0563C1"/>
+                  <w:sz w:val="28"/>
+                  <w:szCs w:val="28"/>
+                  <w:u w:val="single"/>
+                  <w:lang w:val="it-IT"/>
+                </w:rPr>
+                <w:t xml:space="preserve">https://openjdk.org/projects/jdk/21/</w:t>
+              </w:r>
+            </w:hyperlink>
+          </w:p>
+          <w:p>
+            <w:pPr>
+              <w:spacing w:after="80"/>
+              <w:ind w:left="360" w:hanging="360"/>
+              <w:jc w:val="both"/>
+              <w:rPr>
+                <w:rFonts w:ascii="Times New Roman" w:hAnsi="Times New Roman" w:cs="Times New Roman"/>
+                <w:sz w:val="28"/>
+                <w:szCs w:val="28"/>
+                <w:lang w:val="it-IT"/>
+              </w:rPr>
+            </w:pPr>
+            <w:r>
+              <w:rPr>
+                <w:rFonts w:ascii="Times New Roman" w:hAnsi="Times New Roman" w:cs="Times New Roman"/>
+                <w:sz w:val="28"/>
+                <w:szCs w:val="28"/>
+                <w:lang w:val="it-IT"/>
+              </w:rPr>
+              <w:t xml:space="preserve">– Spring Boot: </w:t>
+            </w:r>
+            <w:hyperlink r:id="rId31" w:history="1">
+              <w:r>
+                <w:rPr>
+                  <w:rFonts w:ascii="Times New Roman" w:hAnsi="Times New Roman" w:cs="Times New Roman"/>
+                  <w:color w:val="0563C1"/>
+                  <w:sz w:val="28"/>
+                  <w:szCs w:val="28"/>
+                  <w:u w:val="single"/>
+                  <w:lang w:val="it-IT"/>
+                </w:rPr>
+                <w:t xml:space="preserve">https://spring.io/projects/spring-boot</w:t>
+              </w:r>
+            </w:hyperlink>
+          </w:p>
+          <w:p>
+            <w:pPr>
+              <w:spacing w:after="80"/>
+              <w:ind w:left="360" w:hanging="360"/>
+              <w:jc w:val="both"/>
+              <w:rPr>
+                <w:rFonts w:ascii="Times New Roman" w:hAnsi="Times New Roman" w:cs="Times New Roman"/>
+                <w:sz w:val="28"/>
+                <w:szCs w:val="28"/>
+                <w:lang w:val="it-IT"/>
+              </w:rPr>
+            </w:pPr>
+            <w:r>
+              <w:rPr>
+                <w:rFonts w:ascii="Times New Roman" w:hAnsi="Times New Roman" w:cs="Times New Roman"/>
+                <w:sz w:val="28"/>
+                <w:szCs w:val="28"/>
+                <w:lang w:val="it-IT"/>
+              </w:rPr>
+              <w:t xml:space="preserve">– Spring Security: </w:t>
+            </w:r>
+            <w:hyperlink r:id="rId33" w:history="1">
+              <w:r>
+                <w:rPr>
+                  <w:rFonts w:ascii="Times New Roman" w:hAnsi="Times New Roman" w:cs="Times New Roman"/>
+                  <w:color w:val="0563C1"/>
+                  <w:sz w:val="28"/>
+                  <w:szCs w:val="28"/>
+                  <w:u w:val="single"/>
+                  <w:lang w:val="it-IT"/>
+                </w:rPr>
+                <w:t xml:space="preserve">https://spring.io/projects/spring-security</w:t>
+              </w:r>
+            </w:hyperlink>
+          </w:p>
+          <w:p>
+            <w:pPr>
+              <w:spacing w:after="80"/>
+              <w:ind w:left="360" w:hanging="360"/>
+              <w:jc w:val="both"/>
+              <w:rPr>
+                <w:rFonts w:ascii="Times New Roman" w:hAnsi="Times New Roman" w:cs="Times New Roman"/>
+                <w:sz w:val="28"/>
+                <w:szCs w:val="28"/>
+                <w:lang w:val="it-IT"/>
+              </w:rPr>
+            </w:pPr>
+            <w:r>
+              <w:rPr>
+                <w:rFonts w:ascii="Times New Roman" w:hAnsi="Times New Roman" w:cs="Times New Roman"/>
+                <w:sz w:val="28"/>
+                <w:szCs w:val="28"/>
+                <w:lang w:val="it-IT"/>
+              </w:rPr>
+              <w:t xml:space="preserve">– Spring Data JPA: </w:t>
+            </w:r>
+            <w:hyperlink r:id="rId34" w:history="1">
+              <w:r>
+                <w:rPr>
+                  <w:rFonts w:ascii="Times New Roman" w:hAnsi="Times New Roman" w:cs="Times New Roman"/>
+                  <w:color w:val="0563C1"/>
+                  <w:sz w:val="28"/>
+                  <w:szCs w:val="28"/>
+                  <w:u w:val="single"/>
+                  <w:lang w:val="it-IT"/>
+                </w:rPr>
+                <w:t xml:space="preserve">https://spring.io/projects/spring-data-jpa</w:t>
+              </w:r>
+            </w:hyperlink>
+          </w:p>
+          <w:p>
+            <w:pPr>
+              <w:spacing w:after="80"/>
+              <w:ind w:left="360" w:hanging="360"/>
+              <w:jc w:val="both"/>
+              <w:rPr>
+                <w:rFonts w:ascii="Times New Roman" w:hAnsi="Times New Roman" w:cs="Times New Roman"/>
+                <w:sz w:val="28"/>
+                <w:szCs w:val="28"/>
+                <w:lang w:val="it-IT"/>
+              </w:rPr>
+            </w:pPr>
+            <w:r>
+              <w:rPr>
+                <w:rFonts w:ascii="Times New Roman" w:hAnsi="Times New Roman" w:cs="Times New Roman"/>
+                <w:sz w:val="28"/>
+                <w:szCs w:val="28"/>
+                <w:lang w:val="it-IT"/>
+              </w:rPr>
+              <w:t xml:space="preserve">– Hibernate ORM: </w:t>
+            </w:r>
+            <w:hyperlink r:id="rId54" w:history="1">
+              <w:r>
+                <w:rPr>
+                  <w:rFonts w:ascii="Times New Roman" w:hAnsi="Times New Roman" w:cs="Times New Roman"/>
+                  <w:color w:val="0563C1"/>
+                  <w:sz w:val="28"/>
+                  <w:szCs w:val="28"/>
+                  <w:u w:val="single"/>
+                  <w:lang w:val="it-IT"/>
+                </w:rPr>
+                <w:t xml:space="preserve">https://hibernate.org/orm/</w:t>
+              </w:r>
+            </w:hyperlink>
+          </w:p>
+          <w:p>
+            <w:pPr>
+              <w:spacing w:after="80"/>
+              <w:ind w:left="360" w:hanging="360"/>
+              <w:jc w:val="both"/>
+              <w:rPr>
+                <w:rFonts w:ascii="Times New Roman" w:hAnsi="Times New Roman" w:cs="Times New Roman"/>
+                <w:sz w:val="28"/>
+                <w:szCs w:val="28"/>
+                <w:lang w:val="it-IT"/>
+              </w:rPr>
+            </w:pPr>
+            <w:r>
+              <w:rPr>
+                <w:rFonts w:ascii="Times New Roman" w:hAnsi="Times New Roman" w:cs="Times New Roman"/>
+                <w:sz w:val="28"/>
+                <w:szCs w:val="28"/>
+                <w:lang w:val="it-IT"/>
+              </w:rPr>
+              <w:t xml:space="preserve">– MapStruct: </w:t>
+            </w:r>
+            <w:hyperlink r:id="rId35" w:history="1">
+              <w:r>
+                <w:rPr>
+                  <w:rFonts w:ascii="Times New Roman" w:hAnsi="Times New Roman" w:cs="Times New Roman"/>
+                  <w:color w:val="0563C1"/>
+                  <w:sz w:val="28"/>
+                  <w:szCs w:val="28"/>
+                  <w:u w:val="single"/>
+                  <w:lang w:val="it-IT"/>
+                </w:rPr>
+                <w:t xml:space="preserve">https://mapstruct.org</w:t>
+              </w:r>
+            </w:hyperlink>
+          </w:p>
+          <w:p>
+            <w:pPr>
+              <w:spacing w:after="80"/>
+              <w:ind w:left="360" w:hanging="360"/>
+              <w:jc w:val="both"/>
+              <w:rPr>
+                <w:rFonts w:ascii="Times New Roman" w:hAnsi="Times New Roman" w:cs="Times New Roman"/>
+                <w:sz w:val="28"/>
+                <w:szCs w:val="28"/>
+                <w:lang w:val="it-IT"/>
+              </w:rPr>
+            </w:pPr>
+            <w:r>
+              <w:rPr>
+                <w:rFonts w:ascii="Times New Roman" w:hAnsi="Times New Roman" w:cs="Times New Roman"/>
+                <w:sz w:val="28"/>
+                <w:szCs w:val="28"/>
+                <w:lang w:val="it-IT"/>
+              </w:rPr>
+              <w:t xml:space="preserve">– Project Lombok: </w:t>
+            </w:r>
+            <w:hyperlink r:id="rId36" w:history="1">
+              <w:r>
+                <w:rPr>
+                  <w:rFonts w:ascii="Times New Roman" w:hAnsi="Times New Roman" w:cs="Times New Roman"/>
+                  <w:color w:val="0563C1"/>
+                  <w:sz w:val="28"/>
+                  <w:szCs w:val="28"/>
+                  <w:u w:val="single"/>
+                  <w:lang w:val="it-IT"/>
+                </w:rPr>
+                <w:t xml:space="preserve">https://projectlombok.org</w:t>
+              </w:r>
+            </w:hyperlink>
+          </w:p>
+          <w:p>
+            <w:pPr>
+              <w:spacing w:after="80"/>
+              <w:ind w:left="360" w:hanging="360"/>
+              <w:jc w:val="both"/>
+              <w:rPr>
+                <w:rFonts w:ascii="Times New Roman" w:hAnsi="Times New Roman" w:cs="Times New Roman"/>
+                <w:sz w:val="28"/>
+                <w:szCs w:val="28"/>
+                <w:lang w:val="it-IT"/>
+              </w:rPr>
+            </w:pPr>
+            <w:r>
+              <w:rPr>
+                <w:rFonts w:ascii="Times New Roman" w:hAnsi="Times New Roman" w:cs="Times New Roman"/>
+                <w:sz w:val="28"/>
+                <w:szCs w:val="28"/>
+                <w:lang w:val="it-IT"/>
+              </w:rPr>
+              <w:t xml:space="preserve">– springdoc-openapi: </w:t>
+            </w:r>
+            <w:hyperlink r:id="rId40" w:history="1">
+              <w:r>
+                <w:rPr>
+                  <w:rFonts w:ascii="Times New Roman" w:hAnsi="Times New Roman" w:cs="Times New Roman"/>
+                  <w:color w:val="0563C1"/>
+                  <w:sz w:val="28"/>
+                  <w:szCs w:val="28"/>
+                  <w:u w:val="single"/>
+                  <w:lang w:val="it-IT"/>
+                </w:rPr>
+                <w:t xml:space="preserve">https://springdoc.org</w:t>
+              </w:r>
+            </w:hyperlink>
+          </w:p>
+          <w:p>
+            <w:pPr>
+              <w:spacing w:after="80"/>
+              <w:ind w:left="360" w:hanging="360"/>
+              <w:jc w:val="both"/>
+              <w:rPr>
+                <w:rFonts w:ascii="Times New Roman" w:hAnsi="Times New Roman" w:cs="Times New Roman"/>
+                <w:sz w:val="28"/>
+                <w:szCs w:val="28"/>
+                <w:lang w:val="it-IT"/>
+              </w:rPr>
+            </w:pPr>
+            <w:r>
+              <w:rPr>
+                <w:rFonts w:ascii="Times New Roman" w:hAnsi="Times New Roman" w:cs="Times New Roman"/>
+                <w:sz w:val="28"/>
+                <w:szCs w:val="28"/>
+                <w:lang w:val="it-IT"/>
+              </w:rPr>
+              <w:t xml:space="preserve">– OpenAPI Initiative: </w:t>
+            </w:r>
+            <w:hyperlink r:id="rId41" w:history="1">
+              <w:r>
+                <w:rPr>
+                  <w:rFonts w:ascii="Times New Roman" w:hAnsi="Times New Roman" w:cs="Times New Roman"/>
+                  <w:color w:val="0563C1"/>
+                  <w:sz w:val="28"/>
+                  <w:szCs w:val="28"/>
+                  <w:u w:val="single"/>
+                  <w:lang w:val="it-IT"/>
+                </w:rPr>
+                <w:t xml:space="preserve">https://www.openapis.org</w:t>
+              </w:r>
+            </w:hyperlink>
+          </w:p>
+          <w:p>
+            <w:pPr>
+              <w:spacing w:after="80"/>
+              <w:ind w:left="360" w:hanging="360"/>
+              <w:jc w:val="both"/>
+              <w:rPr>
+                <w:rFonts w:ascii="Times New Roman" w:hAnsi="Times New Roman" w:cs="Times New Roman"/>
+                <w:sz w:val="28"/>
+                <w:szCs w:val="28"/>
+                <w:lang w:val="it-IT"/>
+              </w:rPr>
+            </w:pPr>
+            <w:r>
+              <w:rPr>
+                <w:rFonts w:ascii="Times New Roman" w:hAnsi="Times New Roman" w:cs="Times New Roman"/>
+                <w:sz w:val="28"/>
+                <w:szCs w:val="28"/>
+                <w:lang w:val="it-IT"/>
+              </w:rPr>
+              <w:t xml:space="preserve">– Swagger UI: </w:t>
+            </w:r>
+            <w:hyperlink r:id="rId55" w:history="1">
+              <w:r>
+                <w:rPr>
+                  <w:rFonts w:ascii="Times New Roman" w:hAnsi="Times New Roman" w:cs="Times New Roman"/>
+                  <w:color w:val="0563C1"/>
+                  <w:sz w:val="28"/>
+                  <w:szCs w:val="28"/>
+                  <w:u w:val="single"/>
+                  <w:lang w:val="it-IT"/>
+                </w:rPr>
+                <w:t xml:space="preserve">https://swagger.io/tools/swagger-ui/</w:t>
+              </w:r>
+            </w:hyperlink>
+          </w:p>
+          <w:p>
+            <w:pPr>
+              <w:spacing w:after="80"/>
+              <w:ind w:left="360" w:hanging="360"/>
+              <w:jc w:val="both"/>
+              <w:rPr>
+                <w:rFonts w:ascii="Times New Roman" w:hAnsi="Times New Roman" w:cs="Times New Roman"/>
+                <w:sz w:val="28"/>
+                <w:szCs w:val="28"/>
+                <w:lang w:val="it-IT"/>
+              </w:rPr>
+            </w:pPr>
+            <w:r>
+              <w:rPr>
+                <w:rFonts w:ascii="Times New Roman" w:hAnsi="Times New Roman" w:cs="Times New Roman"/>
+                <w:sz w:val="28"/>
+                <w:szCs w:val="28"/>
+                <w:lang w:val="it-IT"/>
+              </w:rPr>
+              <w:t xml:space="preserve">– jjwt (JSON Web Token per Java): </w:t>
+            </w:r>
+            <w:hyperlink r:id="rId37" w:history="1">
+              <w:r>
+                <w:rPr>
+                  <w:rFonts w:ascii="Times New Roman" w:hAnsi="Times New Roman" w:cs="Times New Roman"/>
+                  <w:color w:val="0563C1"/>
+                  <w:sz w:val="28"/>
+                  <w:szCs w:val="28"/>
+                  <w:u w:val="single"/>
+                  <w:lang w:val="it-IT"/>
+                </w:rPr>
+                <w:t xml:space="preserve">https://github.com/jwtk/jjwt</w:t>
+              </w:r>
+            </w:hyperlink>
+          </w:p>
+          <w:p>
+            <w:pPr>
+              <w:spacing w:after="80"/>
+              <w:ind w:left="360" w:hanging="360"/>
+              <w:jc w:val="both"/>
+              <w:rPr>
+                <w:rFonts w:ascii="Times New Roman" w:hAnsi="Times New Roman" w:cs="Times New Roman"/>
+                <w:sz w:val="28"/>
+                <w:szCs w:val="28"/>
+                <w:lang w:val="it-IT"/>
+              </w:rPr>
+            </w:pPr>
+            <w:r>
+              <w:rPr>
+                <w:rFonts w:ascii="Times New Roman" w:hAnsi="Times New Roman" w:cs="Times New Roman"/>
+                <w:sz w:val="28"/>
+                <w:szCs w:val="28"/>
+                <w:lang w:val="it-IT"/>
+              </w:rPr>
+              <w:t xml:space="preserve">– java-totp (libreria alla base di totp-spring-boot-starter): </w:t>
+            </w:r>
+            <w:hyperlink r:id="rId38" w:history="1">
+              <w:r>
+                <w:rPr>
+                  <w:rFonts w:ascii="Times New Roman" w:hAnsi="Times New Roman" w:cs="Times New Roman"/>
+                  <w:color w:val="0563C1"/>
+                  <w:sz w:val="28"/>
+                  <w:szCs w:val="28"/>
+                  <w:u w:val="single"/>
+                  <w:lang w:val="it-IT"/>
+                </w:rPr>
+                <w:t xml:space="preserve">https://github.com/samdjstevens/java-totp</w:t>
+              </w:r>
+            </w:hyperlink>
+          </w:p>
+          <w:p>
+            <w:pPr>
+              <w:spacing w:after="80"/>
+              <w:ind w:left="360" w:hanging="360"/>
+              <w:jc w:val="both"/>
+              <w:rPr>
+                <w:rFonts w:ascii="Times New Roman" w:hAnsi="Times New Roman" w:cs="Times New Roman"/>
+                <w:sz w:val="28"/>
+                <w:szCs w:val="28"/>
+                <w:lang w:val="it-IT"/>
+              </w:rPr>
+            </w:pPr>
+            <w:r>
+              <w:rPr>
+                <w:rFonts w:ascii="Times New Roman" w:hAnsi="Times New Roman" w:cs="Times New Roman"/>
+                <w:sz w:val="28"/>
+                <w:szCs w:val="28"/>
+                <w:lang w:val="it-IT"/>
+              </w:rPr>
+              <w:t xml:space="preserve">– H2 Database: </w:t>
+            </w:r>
+            <w:hyperlink r:id="rId42" w:history="1">
+              <w:r>
+                <w:rPr>
+                  <w:rFonts w:ascii="Times New Roman" w:hAnsi="Times New Roman" w:cs="Times New Roman"/>
+                  <w:color w:val="0563C1"/>
+                  <w:sz w:val="28"/>
+                  <w:szCs w:val="28"/>
+                  <w:u w:val="single"/>
+                  <w:lang w:val="it-IT"/>
+                </w:rPr>
+                <w:t xml:space="preserve">https://www.h2database.com</w:t>
+              </w:r>
+            </w:hyperlink>
+          </w:p>
+          <w:p>
+            <w:pPr>
+              <w:spacing w:after="80"/>
+              <w:ind w:left="360" w:hanging="360"/>
+              <w:jc w:val="both"/>
+              <w:rPr>
+                <w:rFonts w:ascii="Times New Roman" w:hAnsi="Times New Roman" w:cs="Times New Roman"/>
+                <w:sz w:val="28"/>
+                <w:szCs w:val="28"/>
+                <w:lang w:val="it-IT"/>
+              </w:rPr>
+            </w:pPr>
+            <w:r>
+              <w:rPr>
+                <w:rFonts w:ascii="Times New Roman" w:hAnsi="Times New Roman" w:cs="Times New Roman"/>
+                <w:sz w:val="28"/>
+                <w:szCs w:val="28"/>
+                <w:lang w:val="it-IT"/>
+              </w:rPr>
+              <w:t xml:space="preserve">– Apache Maven: </w:t>
+            </w:r>
+            <w:hyperlink r:id="rId56" w:history="1">
+              <w:r>
+                <w:rPr>
+                  <w:rFonts w:ascii="Times New Roman" w:hAnsi="Times New Roman" w:cs="Times New Roman"/>
+                  <w:color w:val="0563C1"/>
+                  <w:sz w:val="28"/>
+                  <w:szCs w:val="28"/>
+                  <w:u w:val="single"/>
+                  <w:lang w:val="it-IT"/>
+                </w:rPr>
+                <w:t xml:space="preserve">https://maven.apache.org</w:t>
+              </w:r>
+            </w:hyperlink>
+          </w:p>
+          <w:p>
+            <w:pPr>
+              <w:spacing w:before="120" w:after="80"/>
+              <w:rPr>
+                <w:rFonts w:ascii="Times New Roman" w:hAnsi="Times New Roman" w:cs="Times New Roman"/>
+                <w:b/>
+                <w:sz w:val="26"/>
+                <w:szCs w:val="26"/>
+                <w:lang w:val="it-IT"/>
+              </w:rPr>
+            </w:pPr>
+            <w:r>
+              <w:rPr>
+                <w:rFonts w:ascii="Times New Roman" w:hAnsi="Times New Roman" w:cs="Times New Roman"/>
+                <w:b/>
+                <w:sz w:val="26"/>
+                <w:szCs w:val="26"/>
+                <w:lang w:val="it-IT"/>
+              </w:rPr>
+              <w:t xml:space="preserve">Standard e specifiche</w:t>
+            </w:r>
+          </w:p>
+          <w:p>
+            <w:pPr>
+              <w:spacing w:after="80"/>
+              <w:ind w:left="360" w:hanging="360"/>
+              <w:jc w:val="both"/>
+              <w:rPr>
+                <w:rFonts w:ascii="Times New Roman" w:hAnsi="Times New Roman" w:cs="Times New Roman"/>
+                <w:sz w:val="28"/>
+                <w:szCs w:val="28"/>
+                <w:lang w:val="it-IT"/>
+              </w:rPr>
+            </w:pPr>
+            <w:r>
+              <w:rPr>
+                <w:rFonts w:ascii="Times New Roman" w:hAnsi="Times New Roman" w:cs="Times New Roman"/>
+                <w:sz w:val="28"/>
+                <w:szCs w:val="28"/>
+                <w:lang w:val="it-IT"/>
+              </w:rPr>
+              <w:t xml:space="preserve">– RFC 7519 – JSON Web Token (JWT): </w:t>
+            </w:r>
+            <w:hyperlink r:id="rId57" w:history="1">
+              <w:r>
+                <w:rPr>
+                  <w:rFonts w:ascii="Times New Roman" w:hAnsi="Times New Roman" w:cs="Times New Roman"/>
+                  <w:color w:val="0563C1"/>
+                  <w:sz w:val="28"/>
+                  <w:szCs w:val="28"/>
+                  <w:u w:val="single"/>
+                  <w:lang w:val="it-IT"/>
+                </w:rPr>
+                <w:t xml:space="preserve">https://datatracker.ietf.org/doc/html/rfc7519</w:t>
+              </w:r>
+            </w:hyperlink>
+          </w:p>
+          <w:p>
+            <w:pPr>
+              <w:spacing w:after="80"/>
+              <w:ind w:left="360" w:hanging="360"/>
+              <w:jc w:val="both"/>
+              <w:rPr>
+                <w:rFonts w:ascii="Times New Roman" w:hAnsi="Times New Roman" w:cs="Times New Roman"/>
+                <w:sz w:val="28"/>
+                <w:szCs w:val="28"/>
+                <w:lang w:val="it-IT"/>
+              </w:rPr>
+            </w:pPr>
+            <w:r>
+              <w:rPr>
+                <w:rFonts w:ascii="Times New Roman" w:hAnsi="Times New Roman" w:cs="Times New Roman"/>
+                <w:sz w:val="28"/>
+                <w:szCs w:val="28"/>
+                <w:lang w:val="it-IT"/>
+              </w:rPr>
+              <w:t xml:space="preserve">– RFC 6238 – TOTP: </w:t>
+            </w:r>
+            <w:hyperlink r:id="rId39" w:history="1">
+              <w:r>
+                <w:rPr>
+                  <w:rFonts w:ascii="Times New Roman" w:hAnsi="Times New Roman" w:cs="Times New Roman"/>
+                  <w:color w:val="0563C1"/>
+                  <w:sz w:val="28"/>
+                  <w:szCs w:val="28"/>
+                  <w:u w:val="single"/>
+                  <w:lang w:val="it-IT"/>
+                </w:rPr>
+                <w:t xml:space="preserve">https://datatracker.ietf.org/doc/html/rfc6238</w:t>
+              </w:r>
+            </w:hyperlink>
+          </w:p>
+          <w:p>
+            <w:pPr>
+              <w:spacing w:after="80"/>
+              <w:ind w:left="360" w:hanging="360"/>
+              <w:jc w:val="both"/>
+              <w:rPr>
+                <w:rFonts w:ascii="Times New Roman" w:hAnsi="Times New Roman" w:cs="Times New Roman"/>
+                <w:sz w:val="28"/>
+                <w:szCs w:val="28"/>
+                <w:lang w:val="it-IT"/>
+              </w:rPr>
+            </w:pPr>
+            <w:r>
+              <w:rPr>
+                <w:rFonts w:ascii="Times New Roman" w:hAnsi="Times New Roman" w:cs="Times New Roman"/>
+                <w:sz w:val="28"/>
+                <w:szCs w:val="28"/>
+                <w:lang w:val="it-IT"/>
+              </w:rPr>
+              <w:t xml:space="preserve">– RFC 7807 – Problem Details for HTTP APIs: </w:t>
+            </w:r>
+            <w:hyperlink r:id="rId58" w:history="1">
+              <w:r>
+                <w:rPr>
+                  <w:rFonts w:ascii="Times New Roman" w:hAnsi="Times New Roman" w:cs="Times New Roman"/>
+                  <w:color w:val="0563C1"/>
+                  <w:sz w:val="28"/>
+                  <w:szCs w:val="28"/>
+                  <w:u w:val="single"/>
+                  <w:lang w:val="it-IT"/>
+                </w:rPr>
+                <w:t xml:space="preserve">https://datatracker.ietf.org/doc/html/rfc7807</w:t>
+              </w:r>
+            </w:hyperlink>
+          </w:p>
+          <w:p>
+            <w:pPr>
+              <w:spacing w:before="120" w:after="80"/>
+              <w:rPr>
+                <w:rFonts w:ascii="Times New Roman" w:hAnsi="Times New Roman" w:cs="Times New Roman"/>
+                <w:b/>
+                <w:sz w:val="26"/>
+                <w:szCs w:val="26"/>
+                <w:lang w:val="it-IT"/>
+              </w:rPr>
+            </w:pPr>
+            <w:r>
+              <w:rPr>
+                <w:rFonts w:ascii="Times New Roman" w:hAnsi="Times New Roman" w:cs="Times New Roman"/>
+                <w:b/>
+                <w:sz w:val="26"/>
+                <w:szCs w:val="26"/>
+                <w:lang w:val="it-IT"/>
+              </w:rPr>
+              <w:t xml:space="preserve">Test e qualità</w:t>
+            </w:r>
+          </w:p>
+          <w:p>
+            <w:pPr>
+              <w:spacing w:after="80"/>
+              <w:ind w:left="360" w:hanging="360"/>
+              <w:jc w:val="both"/>
+              <w:rPr>
+                <w:rFonts w:ascii="Times New Roman" w:hAnsi="Times New Roman" w:cs="Times New Roman"/>
+                <w:sz w:val="28"/>
+                <w:szCs w:val="28"/>
+                <w:lang w:val="it-IT"/>
+              </w:rPr>
+            </w:pPr>
+            <w:r>
+              <w:rPr>
+                <w:rFonts w:ascii="Times New Roman" w:hAnsi="Times New Roman" w:cs="Times New Roman"/>
+                <w:sz w:val="28"/>
+                <w:szCs w:val="28"/>
+                <w:lang w:val="it-IT"/>
+              </w:rPr>
+              <w:t xml:space="preserve">– JUnit 5: </w:t>
+            </w:r>
+            <w:hyperlink r:id="rId59" w:history="1">
+              <w:r>
+                <w:rPr>
+                  <w:rFonts w:ascii="Times New Roman" w:hAnsi="Times New Roman" w:cs="Times New Roman"/>
+                  <w:color w:val="0563C1"/>
+                  <w:sz w:val="28"/>
+                  <w:szCs w:val="28"/>
+                  <w:u w:val="single"/>
+                  <w:lang w:val="it-IT"/>
+                </w:rPr>
+                <w:t xml:space="preserve">https://junit.org/junit5/</w:t>
+              </w:r>
+            </w:hyperlink>
+          </w:p>
+          <w:p>
+            <w:pPr>
+              <w:spacing w:after="80"/>
+              <w:ind w:left="360" w:hanging="360"/>
+              <w:jc w:val="both"/>
+              <w:rPr>
+                <w:rFonts w:ascii="Times New Roman" w:hAnsi="Times New Roman" w:cs="Times New Roman"/>
+                <w:sz w:val="28"/>
+                <w:szCs w:val="28"/>
+                <w:lang w:val="it-IT"/>
+              </w:rPr>
+            </w:pPr>
+            <w:r>
+              <w:rPr>
+                <w:rFonts w:ascii="Times New Roman" w:hAnsi="Times New Roman" w:cs="Times New Roman"/>
+                <w:sz w:val="28"/>
+                <w:szCs w:val="28"/>
+                <w:lang w:val="it-IT"/>
+              </w:rPr>
+              <w:t xml:space="preserve">– Mockito: </w:t>
+            </w:r>
+            <w:hyperlink r:id="rId60" w:history="1">
+              <w:r>
+                <w:rPr>
+                  <w:rFonts w:ascii="Times New Roman" w:hAnsi="Times New Roman" w:cs="Times New Roman"/>
+                  <w:color w:val="0563C1"/>
+                  <w:sz w:val="28"/>
+                  <w:szCs w:val="28"/>
+                  <w:u w:val="single"/>
+                  <w:lang w:val="it-IT"/>
+                </w:rPr>
+                <w:t xml:space="preserve">https://site.mockito.org</w:t>
+              </w:r>
+            </w:hyperlink>
+          </w:p>
+          <w:p>
+            <w:pPr>
+              <w:spacing w:after="80"/>
+              <w:ind w:left="360" w:hanging="360"/>
+              <w:jc w:val="both"/>
+              <w:rPr>
+                <w:rFonts w:ascii="Times New Roman" w:hAnsi="Times New Roman" w:cs="Times New Roman"/>
+                <w:sz w:val="28"/>
+                <w:szCs w:val="28"/>
+                <w:lang w:val="it-IT"/>
+              </w:rPr>
+            </w:pPr>
+            <w:r>
+              <w:rPr>
+                <w:rFonts w:ascii="Times New Roman" w:hAnsi="Times New Roman" w:cs="Times New Roman"/>
+                <w:sz w:val="28"/>
+                <w:szCs w:val="28"/>
+                <w:lang w:val="it-IT"/>
+              </w:rPr>
+              <w:t xml:space="preserve">– JaCoCo: </w:t>
+            </w:r>
+            <w:hyperlink r:id="rId43" w:history="1">
+              <w:r>
+                <w:rPr>
+                  <w:rFonts w:ascii="Times New Roman" w:hAnsi="Times New Roman" w:cs="Times New Roman"/>
+                  <w:color w:val="0563C1"/>
+                  <w:sz w:val="28"/>
+                  <w:szCs w:val="28"/>
+                  <w:u w:val="single"/>
+                  <w:lang w:val="it-IT"/>
+                </w:rPr>
+                <w:t xml:space="preserve">https://www.jacoco.org/jacoco/</w:t>
+              </w:r>
+            </w:hyperlink>
+          </w:p>
+          <w:p>
+            <w:pPr>
+              <w:spacing w:after="80"/>
+              <w:ind w:left="360" w:hanging="360"/>
+              <w:jc w:val="both"/>
+              <w:rPr>
+                <w:rFonts w:ascii="Times New Roman" w:hAnsi="Times New Roman" w:cs="Times New Roman"/>
+                <w:sz w:val="28"/>
+                <w:szCs w:val="28"/>
+                <w:lang w:val="it-IT"/>
+              </w:rPr>
+            </w:pPr>
+            <w:r>
+              <w:rPr>
+                <w:rFonts w:ascii="Times New Roman" w:hAnsi="Times New Roman" w:cs="Times New Roman"/>
+                <w:sz w:val="28"/>
+                <w:szCs w:val="28"/>
+                <w:lang w:val="it-IT"/>
+              </w:rPr>
+              <w:t xml:space="preserve">– Karma: </w:t>
+            </w:r>
+            <w:hyperlink r:id="rId61" w:history="1">
+              <w:r>
+                <w:rPr>
+                  <w:rFonts w:ascii="Times New Roman" w:hAnsi="Times New Roman" w:cs="Times New Roman"/>
+                  <w:color w:val="0563C1"/>
+                  <w:sz w:val="28"/>
+                  <w:szCs w:val="28"/>
+                  <w:u w:val="single"/>
+                  <w:lang w:val="it-IT"/>
+                </w:rPr>
+                <w:t xml:space="preserve">https://karma-runner.github.io</w:t>
+              </w:r>
+            </w:hyperlink>
+          </w:p>
+          <w:p>
+            <w:pPr>
+              <w:spacing w:after="80"/>
+              <w:ind w:left="360" w:hanging="360"/>
+              <w:jc w:val="both"/>
+              <w:rPr>
+                <w:rFonts w:ascii="Times New Roman" w:hAnsi="Times New Roman" w:cs="Times New Roman"/>
+                <w:sz w:val="28"/>
+                <w:szCs w:val="28"/>
+                <w:lang w:val="it-IT"/>
+              </w:rPr>
+            </w:pPr>
+            <w:r>
+              <w:rPr>
+                <w:rFonts w:ascii="Times New Roman" w:hAnsi="Times New Roman" w:cs="Times New Roman"/>
+                <w:sz w:val="28"/>
+                <w:szCs w:val="28"/>
+                <w:lang w:val="it-IT"/>
+              </w:rPr>
+              <w:t xml:space="preserve">– Jasmine: </w:t>
+            </w:r>
+            <w:hyperlink r:id="rId62" w:history="1">
+              <w:r>
+                <w:rPr>
+                  <w:rFonts w:ascii="Times New Roman" w:hAnsi="Times New Roman" w:cs="Times New Roman"/>
+                  <w:color w:val="0563C1"/>
+                  <w:sz w:val="28"/>
+                  <w:szCs w:val="28"/>
+                  <w:u w:val="single"/>
+                  <w:lang w:val="it-IT"/>
+                </w:rPr>
+                <w:t xml:space="preserve">https://jasmine.github.io</w:t>
+              </w:r>
+            </w:hyperlink>
+          </w:p>
+          <w:p>
+            <w:pPr>
+              <w:spacing w:before="120" w:after="80"/>
+              <w:rPr>
+                <w:rFonts w:ascii="Times New Roman" w:hAnsi="Times New Roman" w:cs="Times New Roman"/>
+                <w:b/>
+                <w:sz w:val="26"/>
+                <w:szCs w:val="26"/>
+                <w:lang w:val="it-IT"/>
+              </w:rPr>
+            </w:pPr>
+            <w:r>
+              <w:rPr>
+                <w:rFonts w:ascii="Times New Roman" w:hAnsi="Times New Roman" w:cs="Times New Roman"/>
+                <w:b/>
+                <w:sz w:val="26"/>
+                <w:szCs w:val="26"/>
+                <w:lang w:val="it-IT"/>
+              </w:rPr>
+              <w:t xml:space="preserve">Frontend (Angular)</w:t>
+            </w:r>
+          </w:p>
+          <w:p>
+            <w:pPr>
+              <w:spacing w:after="80"/>
+              <w:ind w:left="360" w:hanging="360"/>
+              <w:jc w:val="both"/>
+              <w:rPr>
+                <w:rFonts w:ascii="Times New Roman" w:hAnsi="Times New Roman" w:cs="Times New Roman"/>
+                <w:sz w:val="28"/>
+                <w:szCs w:val="28"/>
+                <w:lang w:val="it-IT"/>
+              </w:rPr>
+            </w:pPr>
+            <w:r>
+              <w:rPr>
+                <w:rFonts w:ascii="Times New Roman" w:hAnsi="Times New Roman" w:cs="Times New Roman"/>
+                <w:sz w:val="28"/>
+                <w:szCs w:val="28"/>
+                <w:lang w:val="it-IT"/>
+              </w:rPr>
+              <w:t xml:space="preserve">– Angular: </w:t>
+            </w:r>
+            <w:hyperlink r:id="rId44" w:history="1">
+              <w:r>
+                <w:rPr>
+                  <w:rFonts w:ascii="Times New Roman" w:hAnsi="Times New Roman" w:cs="Times New Roman"/>
+                  <w:color w:val="0563C1"/>
+                  <w:sz w:val="28"/>
+                  <w:szCs w:val="28"/>
+                  <w:u w:val="single"/>
+                  <w:lang w:val="it-IT"/>
+                </w:rPr>
+                <w:t xml:space="preserve">https://angular.dev</w:t>
+              </w:r>
+            </w:hyperlink>
+          </w:p>
+          <w:p>
+            <w:pPr>
+              <w:spacing w:after="80"/>
+              <w:ind w:left="360" w:hanging="360"/>
+              <w:jc w:val="both"/>
+              <w:rPr>
+                <w:rFonts w:ascii="Times New Roman" w:hAnsi="Times New Roman" w:cs="Times New Roman"/>
+                <w:sz w:val="28"/>
+                <w:szCs w:val="28"/>
+                <w:lang w:val="it-IT"/>
+              </w:rPr>
+            </w:pPr>
+            <w:r>
+              <w:rPr>
+                <w:rFonts w:ascii="Times New Roman" w:hAnsi="Times New Roman" w:cs="Times New Roman"/>
+                <w:sz w:val="28"/>
+                <w:szCs w:val="28"/>
+                <w:lang w:val="it-IT"/>
+              </w:rPr>
+              <w:t xml:space="preserve">– Angular – HTTP interceptor: </w:t>
+            </w:r>
+            <w:hyperlink r:id="rId46" w:history="1">
+              <w:r>
+                <w:rPr>
+                  <w:rFonts w:ascii="Times New Roman" w:hAnsi="Times New Roman" w:cs="Times New Roman"/>
+                  <w:color w:val="0563C1"/>
+                  <w:sz w:val="28"/>
+                  <w:szCs w:val="28"/>
+                  <w:u w:val="single"/>
+                  <w:lang w:val="it-IT"/>
+                </w:rPr>
+                <w:t xml:space="preserve">https://angular.dev/guide/http/interceptors</w:t>
+              </w:r>
+            </w:hyperlink>
+          </w:p>
+          <w:p>
+            <w:pPr>
+              <w:spacing w:after="80"/>
+              <w:ind w:left="360" w:hanging="360"/>
+              <w:jc w:val="both"/>
+              <w:rPr>
+                <w:rFonts w:ascii="Times New Roman" w:hAnsi="Times New Roman" w:cs="Times New Roman"/>
+                <w:sz w:val="28"/>
+                <w:szCs w:val="28"/>
+                <w:lang w:val="it-IT"/>
+              </w:rPr>
+            </w:pPr>
+            <w:r>
+              <w:rPr>
+                <w:rFonts w:ascii="Times New Roman" w:hAnsi="Times New Roman" w:cs="Times New Roman"/>
+                <w:sz w:val="28"/>
+                <w:szCs w:val="28"/>
+                <w:lang w:val="it-IT"/>
+              </w:rPr>
+              <w:t xml:space="preserve">– TypeScript: </w:t>
+            </w:r>
+            <w:hyperlink r:id="rId63" w:history="1">
+              <w:r>
+                <w:rPr>
+                  <w:rFonts w:ascii="Times New Roman" w:hAnsi="Times New Roman" w:cs="Times New Roman"/>
+                  <w:color w:val="0563C1"/>
+                  <w:sz w:val="28"/>
+                  <w:szCs w:val="28"/>
+                  <w:u w:val="single"/>
+                  <w:lang w:val="it-IT"/>
+                </w:rPr>
+                <w:t xml:space="preserve">https://www.typescriptlang.org</w:t>
+              </w:r>
+            </w:hyperlink>
+          </w:p>
+          <w:p>
+            <w:pPr>
+              <w:spacing w:after="80"/>
+              <w:ind w:left="360" w:hanging="360"/>
+              <w:jc w:val="both"/>
+              <w:rPr>
+                <w:rFonts w:ascii="Times New Roman" w:hAnsi="Times New Roman" w:cs="Times New Roman"/>
+                <w:sz w:val="28"/>
+                <w:szCs w:val="28"/>
+                <w:lang w:val="it-IT"/>
+              </w:rPr>
+            </w:pPr>
+            <w:r>
+              <w:rPr>
+                <w:rFonts w:ascii="Times New Roman" w:hAnsi="Times New Roman" w:cs="Times New Roman"/>
+                <w:sz w:val="28"/>
+                <w:szCs w:val="28"/>
+                <w:lang w:val="it-IT"/>
+              </w:rPr>
+              <w:t xml:space="preserve">– RxJS: </w:t>
+            </w:r>
+            <w:hyperlink r:id="rId45" w:history="1">
+              <w:r>
+                <w:rPr>
+                  <w:rFonts w:ascii="Times New Roman" w:hAnsi="Times New Roman" w:cs="Times New Roman"/>
+                  <w:color w:val="0563C1"/>
+                  <w:sz w:val="28"/>
+                  <w:szCs w:val="28"/>
+                  <w:u w:val="single"/>
+                  <w:lang w:val="it-IT"/>
+                </w:rPr>
+                <w:t xml:space="preserve">https://rxjs.dev</w:t>
+              </w:r>
+            </w:hyperlink>
+          </w:p>
+          <w:p>
+            <w:pPr>
+              <w:spacing w:after="80"/>
+              <w:ind w:left="360" w:hanging="360"/>
+              <w:jc w:val="both"/>
+              <w:rPr>
+                <w:rFonts w:ascii="Times New Roman" w:hAnsi="Times New Roman" w:cs="Times New Roman"/>
+                <w:sz w:val="28"/>
+                <w:szCs w:val="28"/>
+                <w:lang w:val="it-IT"/>
+              </w:rPr>
+            </w:pPr>
+            <w:r>
+              <w:rPr>
+                <w:rFonts w:ascii="Times New Roman" w:hAnsi="Times New Roman" w:cs="Times New Roman"/>
+                <w:sz w:val="28"/>
+                <w:szCs w:val="28"/>
+                <w:lang w:val="it-IT"/>
+              </w:rPr>
+              <w:t xml:space="preserve">– Tailwind CSS: </w:t>
+            </w:r>
+            <w:hyperlink r:id="rId64" w:history="1">
+              <w:r>
+                <w:rPr>
+                  <w:rFonts w:ascii="Times New Roman" w:hAnsi="Times New Roman" w:cs="Times New Roman"/>
+                  <w:color w:val="0563C1"/>
+                  <w:sz w:val="28"/>
+                  <w:szCs w:val="28"/>
+                  <w:u w:val="single"/>
+                  <w:lang w:val="it-IT"/>
+                </w:rPr>
+                <w:t xml:space="preserve">https://tailwindcss.com</w:t>
+              </w:r>
+            </w:hyperlink>
+          </w:p>
+          <w:p>
+            <w:pPr>
+              <w:spacing w:after="80"/>
+              <w:ind w:left="360" w:hanging="360"/>
+              <w:jc w:val="both"/>
+              <w:rPr>
+                <w:rFonts w:ascii="Times New Roman" w:hAnsi="Times New Roman" w:cs="Times New Roman"/>
+                <w:sz w:val="28"/>
+                <w:szCs w:val="28"/>
+                <w:lang w:val="it-IT"/>
+              </w:rPr>
+            </w:pPr>
+            <w:r>
+              <w:rPr>
+                <w:rFonts w:ascii="Times New Roman" w:hAnsi="Times New Roman" w:cs="Times New Roman"/>
+                <w:sz w:val="28"/>
+                <w:szCs w:val="28"/>
+                <w:lang w:val="it-IT"/>
+              </w:rPr>
+              <w:t xml:space="preserve">– Google Fonts: </w:t>
+            </w:r>
+            <w:hyperlink r:id="rId65" w:history="1">
+              <w:r>
+                <w:rPr>
+                  <w:rFonts w:ascii="Times New Roman" w:hAnsi="Times New Roman" w:cs="Times New Roman"/>
+                  <w:color w:val="0563C1"/>
+                  <w:sz w:val="28"/>
+                  <w:szCs w:val="28"/>
+                  <w:u w:val="single"/>
+                  <w:lang w:val="it-IT"/>
+                </w:rPr>
+                <w:t xml:space="preserve">https://fonts.google.com</w:t>
+              </w:r>
+            </w:hyperlink>
+          </w:p>
+          <w:p>
+            <w:pPr>
+              <w:spacing w:after="80"/>
+              <w:ind w:left="360" w:hanging="360"/>
+              <w:jc w:val="both"/>
+              <w:rPr>
+                <w:rFonts w:ascii="Times New Roman" w:hAnsi="Times New Roman" w:cs="Times New Roman"/>
+                <w:sz w:val="28"/>
+                <w:szCs w:val="28"/>
+                <w:lang w:val="it-IT"/>
+              </w:rPr>
+            </w:pPr>
+            <w:r>
+              <w:rPr>
+                <w:rFonts w:ascii="Times New Roman" w:hAnsi="Times New Roman" w:cs="Times New Roman"/>
+                <w:sz w:val="28"/>
+                <w:szCs w:val="28"/>
+                <w:lang w:val="it-IT"/>
+              </w:rPr>
+              <w:t xml:space="preserve">– Node.js: </w:t>
+            </w:r>
+            <w:hyperlink r:id="rId66" w:history="1">
+              <w:r>
+                <w:rPr>
+                  <w:rFonts w:ascii="Times New Roman" w:hAnsi="Times New Roman" w:cs="Times New Roman"/>
+                  <w:color w:val="0563C1"/>
+                  <w:sz w:val="28"/>
+                  <w:szCs w:val="28"/>
+                  <w:u w:val="single"/>
+                  <w:lang w:val="it-IT"/>
+                </w:rPr>
+                <w:t xml:space="preserve">https://nodejs.org</w:t>
+              </w:r>
+            </w:hyperlink>
+          </w:p>
+          <w:p>
+            <w:pPr>
+              <w:spacing w:before="120" w:after="80"/>
+              <w:rPr>
+                <w:rFonts w:ascii="Times New Roman" w:hAnsi="Times New Roman" w:cs="Times New Roman"/>
+                <w:b/>
+                <w:sz w:val="26"/>
+                <w:szCs w:val="26"/>
+                <w:lang w:val="it-IT"/>
+              </w:rPr>
+            </w:pPr>
+            <w:r>
+              <w:rPr>
+                <w:rFonts w:ascii="Times New Roman" w:hAnsi="Times New Roman" w:cs="Times New Roman"/>
+                <w:b/>
+                <w:sz w:val="26"/>
+                <w:szCs w:val="26"/>
+                <w:lang w:val="it-IT"/>
+              </w:rPr>
+              <w:t xml:space="preserve">DevOps e versionamento</w:t>
+            </w:r>
+          </w:p>
+          <w:p>
+            <w:pPr>
+              <w:spacing w:after="80"/>
+              <w:ind w:left="360" w:hanging="360"/>
+              <w:jc w:val="both"/>
+              <w:rPr>
+                <w:rFonts w:ascii="Times New Roman" w:hAnsi="Times New Roman" w:cs="Times New Roman"/>
+                <w:sz w:val="28"/>
+                <w:szCs w:val="28"/>
+                <w:lang w:val="it-IT"/>
+              </w:rPr>
+            </w:pPr>
+            <w:r>
+              <w:rPr>
+                <w:rFonts w:ascii="Times New Roman" w:hAnsi="Times New Roman" w:cs="Times New Roman"/>
+                <w:sz w:val="28"/>
+                <w:szCs w:val="28"/>
+                <w:lang w:val="it-IT"/>
+              </w:rPr>
+              <w:t xml:space="preserve">– Docker: </w:t>
+            </w:r>
+            <w:hyperlink r:id="rId47" w:history="1">
+              <w:r>
+                <w:rPr>
+                  <w:rFonts w:ascii="Times New Roman" w:hAnsi="Times New Roman" w:cs="Times New Roman"/>
+                  <w:color w:val="0563C1"/>
+                  <w:sz w:val="28"/>
+                  <w:szCs w:val="28"/>
+                  <w:u w:val="single"/>
+                  <w:lang w:val="it-IT"/>
+                </w:rPr>
+                <w:t xml:space="preserve">https://www.docker.com</w:t>
+              </w:r>
+            </w:hyperlink>
+          </w:p>
+          <w:p>
+            <w:pPr>
+              <w:spacing w:after="80"/>
+              <w:ind w:left="360" w:hanging="360"/>
+              <w:jc w:val="both"/>
+              <w:rPr>
+                <w:rFonts w:ascii="Times New Roman" w:hAnsi="Times New Roman" w:cs="Times New Roman"/>
+                <w:sz w:val="28"/>
+                <w:szCs w:val="28"/>
+                <w:lang w:val="it-IT"/>
+              </w:rPr>
+            </w:pPr>
+            <w:r>
+              <w:rPr>
+                <w:rFonts w:ascii="Times New Roman" w:hAnsi="Times New Roman" w:cs="Times New Roman"/>
+                <w:sz w:val="28"/>
+                <w:szCs w:val="28"/>
+                <w:lang w:val="it-IT"/>
+              </w:rPr>
+              <w:t xml:space="preserve">– Docker – build multi-stage: </w:t>
+            </w:r>
+            <w:hyperlink r:id="rId67" w:history="1">
+              <w:r>
+                <w:rPr>
+                  <w:rFonts w:ascii="Times New Roman" w:hAnsi="Times New Roman" w:cs="Times New Roman"/>
+                  <w:color w:val="0563C1"/>
+                  <w:sz w:val="28"/>
+                  <w:szCs w:val="28"/>
+                  <w:u w:val="single"/>
+                  <w:lang w:val="it-IT"/>
+                </w:rPr>
+                <w:t xml:space="preserve">https://docs.docker.com/build/building/multi-stage/</w:t>
+              </w:r>
+            </w:hyperlink>
+          </w:p>
+          <w:p>
+            <w:pPr>
+              <w:spacing w:after="80"/>
+              <w:ind w:left="360" w:hanging="360"/>
+              <w:jc w:val="both"/>
+              <w:rPr>
+                <w:rFonts w:ascii="Times New Roman" w:hAnsi="Times New Roman" w:cs="Times New Roman"/>
+                <w:sz w:val="28"/>
+                <w:szCs w:val="28"/>
+                <w:lang w:val="it-IT"/>
+              </w:rPr>
+            </w:pPr>
+            <w:r>
+              <w:rPr>
+                <w:rFonts w:ascii="Times New Roman" w:hAnsi="Times New Roman" w:cs="Times New Roman"/>
+                <w:sz w:val="28"/>
+                <w:szCs w:val="28"/>
+                <w:lang w:val="it-IT"/>
+              </w:rPr>
+              <w:t xml:space="preserve">– Docker Compose: </w:t>
+            </w:r>
+            <w:hyperlink r:id="rId48" w:history="1">
+              <w:r>
+                <w:rPr>
+                  <w:rFonts w:ascii="Times New Roman" w:hAnsi="Times New Roman" w:cs="Times New Roman"/>
+                  <w:color w:val="0563C1"/>
+                  <w:sz w:val="28"/>
+                  <w:szCs w:val="28"/>
+                  <w:u w:val="single"/>
+                  <w:lang w:val="it-IT"/>
+                </w:rPr>
+                <w:t xml:space="preserve">https://docs.docker.com/compose/</w:t>
+              </w:r>
+            </w:hyperlink>
+          </w:p>
+          <w:p>
+            <w:pPr>
+              <w:spacing w:after="80"/>
+              <w:ind w:left="360" w:hanging="360"/>
+              <w:jc w:val="both"/>
+              <w:rPr>
+                <w:rFonts w:ascii="Times New Roman" w:hAnsi="Times New Roman" w:cs="Times New Roman"/>
+                <w:sz w:val="28"/>
+                <w:szCs w:val="28"/>
+                <w:lang w:val="it-IT"/>
+              </w:rPr>
+            </w:pPr>
+            <w:r>
+              <w:rPr>
+                <w:rFonts w:ascii="Times New Roman" w:hAnsi="Times New Roman" w:cs="Times New Roman"/>
+                <w:sz w:val="28"/>
+                <w:szCs w:val="28"/>
+                <w:lang w:val="it-IT"/>
+              </w:rPr>
+              <w:t xml:space="preserve">– Nginx: </w:t>
+            </w:r>
+            <w:hyperlink r:id="rId49" w:history="1">
+              <w:r>
+                <w:rPr>
+                  <w:rFonts w:ascii="Times New Roman" w:hAnsi="Times New Roman" w:cs="Times New Roman"/>
+                  <w:color w:val="0563C1"/>
+                  <w:sz w:val="28"/>
+                  <w:szCs w:val="28"/>
+                  <w:u w:val="single"/>
+                  <w:lang w:val="it-IT"/>
+                </w:rPr>
+                <w:t xml:space="preserve">https://nginx.org</w:t>
+              </w:r>
+            </w:hyperlink>
+          </w:p>
+          <w:p>
+            <w:pPr>
+              <w:spacing w:after="80"/>
+              <w:ind w:left="360" w:hanging="360"/>
+              <w:jc w:val="both"/>
+              <w:rPr>
+                <w:rFonts w:ascii="Times New Roman" w:hAnsi="Times New Roman" w:cs="Times New Roman"/>
+                <w:sz w:val="28"/>
+                <w:szCs w:val="28"/>
+                <w:lang w:val="it-IT"/>
+              </w:rPr>
+            </w:pPr>
+            <w:r>
+              <w:rPr>
+                <w:rFonts w:ascii="Times New Roman" w:hAnsi="Times New Roman" w:cs="Times New Roman"/>
+                <w:sz w:val="28"/>
+                <w:szCs w:val="28"/>
+                <w:lang w:val="it-IT"/>
+              </w:rPr>
+              <w:t xml:space="preserve">– GitHub Actions: </w:t>
+            </w:r>
+            <w:hyperlink r:id="rId50" w:history="1">
+              <w:r>
+                <w:rPr>
+                  <w:rFonts w:ascii="Times New Roman" w:hAnsi="Times New Roman" w:cs="Times New Roman"/>
+                  <w:color w:val="0563C1"/>
+                  <w:sz w:val="28"/>
+                  <w:szCs w:val="28"/>
+                  <w:u w:val="single"/>
+                  <w:lang w:val="it-IT"/>
+                </w:rPr>
+                <w:t xml:space="preserve">https://docs.github.com/actions</w:t>
+              </w:r>
+            </w:hyperlink>
+          </w:p>
+          <w:p>
+            <w:pPr>
+              <w:spacing w:after="80"/>
+              <w:ind w:left="360" w:hanging="360"/>
+              <w:jc w:val="both"/>
+              <w:rPr>
+                <w:rFonts w:ascii="Times New Roman" w:hAnsi="Times New Roman" w:cs="Times New Roman"/>
+                <w:sz w:val="28"/>
+                <w:szCs w:val="28"/>
+                <w:lang w:val="it-IT"/>
+              </w:rPr>
+            </w:pPr>
+            <w:r>
+              <w:rPr>
+                <w:rFonts w:ascii="Times New Roman" w:hAnsi="Times New Roman" w:cs="Times New Roman"/>
+                <w:sz w:val="28"/>
+                <w:szCs w:val="28"/>
+                <w:lang w:val="it-IT"/>
+              </w:rPr>
+              <w:t xml:space="preserve">– dorny/paths-filter: </w:t>
+            </w:r>
+            <w:hyperlink r:id="rId51" w:history="1">
+              <w:r>
+                <w:rPr>
+                  <w:rFonts w:ascii="Times New Roman" w:hAnsi="Times New Roman" w:cs="Times New Roman"/>
+                  <w:color w:val="0563C1"/>
+                  <w:sz w:val="28"/>
+                  <w:szCs w:val="28"/>
+                  <w:u w:val="single"/>
+                  <w:lang w:val="it-IT"/>
+                </w:rPr>
+                <w:t xml:space="preserve">https://github.com/dorny/paths-filter</w:t>
+              </w:r>
+            </w:hyperlink>
+          </w:p>
+          <w:p>
+            <w:pPr>
+              <w:spacing w:after="80"/>
+              <w:ind w:left="360" w:hanging="360"/>
+              <w:jc w:val="both"/>
+              <w:rPr>
+                <w:rFonts w:ascii="Times New Roman" w:hAnsi="Times New Roman" w:cs="Times New Roman"/>
+                <w:sz w:val="28"/>
+                <w:szCs w:val="28"/>
+                <w:lang w:val="it-IT"/>
+              </w:rPr>
+            </w:pPr>
+            <w:r>
+              <w:rPr>
+                <w:rFonts w:ascii="Times New Roman" w:hAnsi="Times New Roman" w:cs="Times New Roman"/>
+                <w:sz w:val="28"/>
+                <w:szCs w:val="28"/>
+                <w:lang w:val="it-IT"/>
+              </w:rPr>
+              <w:t xml:space="preserve">– frontend-maven-plugin: </w:t>
+            </w:r>
+            <w:hyperlink r:id="rId68" w:history="1">
+              <w:r>
+                <w:rPr>
+                  <w:rFonts w:ascii="Times New Roman" w:hAnsi="Times New Roman" w:cs="Times New Roman"/>
+                  <w:color w:val="0563C1"/>
+                  <w:sz w:val="28"/>
+                  <w:szCs w:val="28"/>
+                  <w:u w:val="single"/>
+                  <w:lang w:val="it-IT"/>
+                </w:rPr>
+                <w:t xml:space="preserve">https://github.com/eirslett/frontend-maven-plugin</w:t>
+              </w:r>
+            </w:hyperlink>
+          </w:p>
+          <w:p>
+            <w:pPr>
+              <w:spacing w:after="80"/>
+              <w:ind w:left="360" w:hanging="360"/>
+              <w:jc w:val="both"/>
+              <w:rPr>
+                <w:rFonts w:ascii="Times New Roman" w:hAnsi="Times New Roman" w:cs="Times New Roman"/>
+                <w:sz w:val="28"/>
+                <w:szCs w:val="28"/>
+                <w:lang w:val="it-IT"/>
+              </w:rPr>
+            </w:pPr>
+            <w:r>
+              <w:rPr>
+                <w:rFonts w:ascii="Times New Roman" w:hAnsi="Times New Roman" w:cs="Times New Roman"/>
+                <w:sz w:val="28"/>
+                <w:szCs w:val="28"/>
+                <w:lang w:val="it-IT"/>
+              </w:rPr>
+              <w:t xml:space="preserve">– Git: </w:t>
+            </w:r>
+            <w:hyperlink r:id="rId69" w:history="1">
+              <w:r>
+                <w:rPr>
+                  <w:rFonts w:ascii="Times New Roman" w:hAnsi="Times New Roman" w:cs="Times New Roman"/>
+                  <w:color w:val="0563C1"/>
+                  <w:sz w:val="28"/>
+                  <w:szCs w:val="28"/>
+                  <w:u w:val="single"/>
+                  <w:lang w:val="it-IT"/>
+                </w:rPr>
+                <w:t xml:space="preserve">https://git-scm.com</w:t>
+              </w:r>
+            </w:hyperlink>
+          </w:p>
+          <w:p>
+            <w:pPr>
+              <w:spacing w:after="80"/>
+              <w:ind w:left="360" w:hanging="360"/>
+              <w:jc w:val="both"/>
+              <w:rPr>
+                <w:rFonts w:ascii="Times New Roman" w:hAnsi="Times New Roman" w:cs="Times New Roman"/>
+                <w:sz w:val="28"/>
+                <w:szCs w:val="28"/>
+                <w:lang w:val="it-IT"/>
+              </w:rPr>
+            </w:pPr>
+            <w:r>
+              <w:rPr>
+                <w:rFonts w:ascii="Times New Roman" w:hAnsi="Times New Roman" w:cs="Times New Roman"/>
+                <w:sz w:val="28"/>
+                <w:szCs w:val="28"/>
+                <w:lang w:val="it-IT"/>
+              </w:rPr>
+              <w:t xml:space="preserve">– GitHub: </w:t>
+            </w:r>
+            <w:hyperlink r:id="rId70" w:history="1">
+              <w:r>
+                <w:rPr>
+                  <w:rFonts w:ascii="Times New Roman" w:hAnsi="Times New Roman" w:cs="Times New Roman"/>
+                  <w:color w:val="0563C1"/>
+                  <w:sz w:val="28"/>
+                  <w:szCs w:val="28"/>
+                  <w:u w:val="single"/>
+                  <w:lang w:val="it-IT"/>
+                </w:rPr>
+                <w:t xml:space="preserve">https://github.com</w:t>
+              </w:r>
+            </w:hyperlink>
+          </w:p>
+          <w:p>
+            <w:pPr>
+              <w:spacing w:before="120" w:after="80"/>
+              <w:rPr>
+                <w:rFonts w:ascii="Times New Roman" w:hAnsi="Times New Roman" w:cs="Times New Roman"/>
+                <w:b/>
+                <w:sz w:val="26"/>
+                <w:szCs w:val="26"/>
+                <w:lang w:val="it-IT"/>
+              </w:rPr>
+            </w:pPr>
+            <w:r>
+              <w:rPr>
+                <w:rFonts w:ascii="Times New Roman" w:hAnsi="Times New Roman" w:cs="Times New Roman"/>
+                <w:b/>
+                <w:sz w:val="26"/>
+                <w:szCs w:val="26"/>
+                <w:lang w:val="it-IT"/>
+              </w:rPr>
+              <w:t xml:space="preserve">Assistente AI e strumenti di documentazione</w:t>
+            </w:r>
+          </w:p>
+          <w:p>
+            <w:pPr>
+              <w:spacing w:after="80"/>
+              <w:ind w:left="360" w:hanging="360"/>
+              <w:jc w:val="both"/>
+              <w:rPr>
+                <w:rFonts w:ascii="Times New Roman" w:hAnsi="Times New Roman" w:cs="Times New Roman"/>
+                <w:sz w:val="28"/>
+                <w:szCs w:val="28"/>
+                <w:lang w:val="it-IT"/>
+              </w:rPr>
+            </w:pPr>
+            <w:r>
+              <w:rPr>
+                <w:rFonts w:ascii="Times New Roman" w:hAnsi="Times New Roman" w:cs="Times New Roman"/>
+                <w:sz w:val="28"/>
+                <w:szCs w:val="28"/>
+                <w:lang w:val="it-IT"/>
+              </w:rPr>
+              <w:t xml:space="preserve">– Claude (Anthropic): </w:t>
+            </w:r>
+            <w:hyperlink r:id="rId53" w:history="1">
+              <w:r>
+                <w:rPr>
+                  <w:rFonts w:ascii="Times New Roman" w:hAnsi="Times New Roman" w:cs="Times New Roman"/>
+                  <w:color w:val="0563C1"/>
+                  <w:sz w:val="28"/>
+                  <w:szCs w:val="28"/>
+                  <w:u w:val="single"/>
+                  <w:lang w:val="it-IT"/>
+                </w:rPr>
+                <w:t xml:space="preserve">https://www.anthropic.com/claude</w:t>
+              </w:r>
+            </w:hyperlink>
+          </w:p>
+          <w:p>
+            <w:pPr>
+              <w:spacing w:after="80"/>
+              <w:ind w:left="360" w:hanging="360"/>
+              <w:jc w:val="both"/>
+              <w:rPr>
+                <w:rFonts w:ascii="Times New Roman" w:hAnsi="Times New Roman" w:cs="Times New Roman"/>
+                <w:sz w:val="28"/>
+                <w:szCs w:val="28"/>
+                <w:lang w:val="it-IT"/>
+              </w:rPr>
+            </w:pPr>
+            <w:r>
+              <w:rPr>
+                <w:rFonts w:ascii="Times New Roman" w:hAnsi="Times New Roman" w:cs="Times New Roman"/>
+                <w:sz w:val="28"/>
+                <w:szCs w:val="28"/>
+                <w:lang w:val="it-IT"/>
+              </w:rPr>
+              <w:t xml:space="preserve">– Mermaid (diagrammi della documentazione): </w:t>
+            </w:r>
+            <w:hyperlink r:id="rId71" w:history="1">
+              <w:r>
+                <w:rPr>
+                  <w:rFonts w:ascii="Times New Roman" w:hAnsi="Times New Roman" w:cs="Times New Roman"/>
+                  <w:color w:val="0563C1"/>
+                  <w:sz w:val="28"/>
+                  <w:szCs w:val="28"/>
+                  <w:u w:val="single"/>
+                  <w:lang w:val="it-IT"/>
+                </w:rPr>
+                <w:t xml:space="preserve">https://github.com/mermaid-js/mermaid</w:t>
+              </w:r>
+            </w:hyperlink>
+          </w:p>
+          <w:p>
+            <w:pPr>
+              <w:spacing w:after="80"/>
+              <w:ind w:left="360" w:hanging="360"/>
+              <w:jc w:val="both"/>
+              <w:rPr>
+                <w:rFonts w:ascii="Times New Roman" w:hAnsi="Times New Roman" w:cs="Times New Roman"/>
+                <w:sz w:val="28"/>
+                <w:szCs w:val="28"/>
+                <w:lang w:val="it-IT"/>
+              </w:rPr>
+            </w:pPr>
+            <w:r>
+              <w:rPr>
+                <w:rFonts w:ascii="Times New Roman" w:hAnsi="Times New Roman" w:cs="Times New Roman"/>
+                <w:sz w:val="28"/>
+                <w:szCs w:val="28"/>
+                <w:lang w:val="it-IT"/>
+              </w:rPr>
+              <w:t xml:space="preserve">– Playwright (acquisizione degli screenshot): </w:t>
+            </w:r>
+            <w:hyperlink r:id="rId72" w:history="1">
+              <w:r>
+                <w:rPr>
+                  <w:rFonts w:ascii="Times New Roman" w:hAnsi="Times New Roman" w:cs="Times New Roman"/>
+                  <w:color w:val="0563C1"/>
+                  <w:sz w:val="28"/>
+                  <w:szCs w:val="28"/>
+                  <w:u w:val="single"/>
+                  <w:lang w:val="it-IT"/>
+                </w:rPr>
+                <w:t xml:space="preserve">https://playwright.dev</w:t>
+              </w:r>
+            </w:hyperlink>
           </w:p>
         </w:tc>
       </w:tr>
@@ -2613,16 +4568,7 @@
                 <w:szCs w:val="28"/>
                 <w:lang w:val="it-IT"/>
               </w:rPr>
-              <w:t xml:space="preserve">– </w:t>
-            </w:r>
-            <w:r>
-              <w:rPr>
-                <w:rFonts w:ascii="Times New Roman" w:hAnsi="Times New Roman" w:cs="Times New Roman"/>
-                <w:sz w:val="28"/>
-                <w:szCs w:val="28"/>
-                <w:lang w:val="it-IT"/>
-              </w:rPr>
-              <w:t xml:space="preserve">1) Esporre un’API RESTful completa, coerente nella struttura degli endpoint (risorsa → verbo HTTP → codice di stato) e documentata automaticamente tramite Swagger/OpenAPI, verificabile raggiungendo l’interfaccia interattiva su /swagger-ui.html a backend avviato.</w:t>
+              <w:t xml:space="preserve">– 1) Esporre un’API RESTful completa, coerente nella struttura degli endpoint (risorsa → verbo HTTP → codice di stato) e documentata automaticamente tramite Swagger/OpenAPI, verificabile raggiungendo l’interfaccia interattiva su /swagger-ui.html a backend avviato.</w:t>
             </w:r>
           </w:p>
           <w:p>
@@ -2644,16 +4590,7 @@
                 <w:szCs w:val="28"/>
                 <w:lang w:val="it-IT"/>
               </w:rPr>
-              <w:t xml:space="preserve">– </w:t>
-            </w:r>
-            <w:r>
-              <w:rPr>
-                <w:rFonts w:ascii="Times New Roman" w:hAnsi="Times New Roman" w:cs="Times New Roman"/>
-                <w:sz w:val="28"/>
-                <w:szCs w:val="28"/>
-                <w:lang w:val="it-IT"/>
-              </w:rPr>
-              <w:t xml:space="preserve">2) Garantire che ogni endpoint sensibile richieda un’autenticazione JWT valida e rispetti sia il ruolo sia la titolarità (ownership) della risorsa richiesta, così che un Paziente autenticato possa leggere e modificare esclusivamente le proprie risorse (appuntamenti, ticket, referti, terapie) e non quelle di altri pazienti.</w:t>
+              <w:t xml:space="preserve">– 2) Garantire che ogni endpoint sensibile richieda un’autenticazione JWT valida e rispetti sia il ruolo sia la titolarità (ownership) della risorsa richiesta, così che un Paziente autenticato possa leggere e modificare esclusivamente le proprie risorse (appuntamenti, ticket, referti, terapie) e non quelle di altri pazienti.</w:t>
             </w:r>
           </w:p>
           <w:p>
@@ -2675,16 +4612,7 @@
                 <w:szCs w:val="28"/>
                 <w:lang w:val="it-IT"/>
               </w:rPr>
-              <w:t xml:space="preserve">– </w:t>
-            </w:r>
-            <w:r>
-              <w:rPr>
-                <w:rFonts w:ascii="Times New Roman" w:hAnsi="Times New Roman" w:cs="Times New Roman"/>
-                <w:sz w:val="28"/>
-                <w:szCs w:val="28"/>
-                <w:lang w:val="it-IT"/>
-              </w:rPr>
-              <w:t xml:space="preserve">3) Fornire un’interfaccia utente funzionale per prenotare visite in base alla disponibilità reale del medico, consultare la propria dashboard clinica (visite, terapie, referti, segnalazioni) e gestire il proprio profilo, senza richiedere competenze tecniche all’utente finale, verificato tramite un flusso di prenotazione completabile senza errori dall’apertura del form alla conferma.</w:t>
+              <w:t xml:space="preserve">– 3) Fornire un’interfaccia utente funzionale per prenotare visite in base alla disponibilità reale del medico, consultare la propria dashboard clinica (visite, terapie, referti, segnalazioni) e gestire il proprio profilo, senza richiedere competenze tecniche all’utente finale, verificato tramite un flusso di prenotazione completabile senza errori dall’apertura del form alla conferma.</w:t>
             </w:r>
           </w:p>
           <w:p>
@@ -2706,16 +4634,7 @@
                 <w:szCs w:val="28"/>
                 <w:lang w:val="it-IT"/>
               </w:rPr>
-              <w:t xml:space="preserve">– </w:t>
-            </w:r>
-            <w:r>
-              <w:rPr>
-                <w:rFonts w:ascii="Times New Roman" w:hAnsi="Times New Roman" w:cs="Times New Roman"/>
-                <w:sz w:val="28"/>
-                <w:szCs w:val="28"/>
-                <w:lang w:val="it-IT"/>
-              </w:rPr>
-              <w:t xml:space="preserve">4) Raggiungere una copertura di test misurabile, non solo dichiarata, sia sul backend sia sul frontend, così da poter affermare con evidenza oggettiva (report JaCoCo, suite Karma/Jasmine) che le funzionalità principali sono effettivamente verificate e non solo implementate.</w:t>
+              <w:t xml:space="preserve">– 4) Raggiungere una copertura di test misurabile, non solo dichiarata, sia sul backend sia sul frontend, così da poter affermare con evidenza oggettiva (report JaCoCo, suite Karma/Jasmine) che le funzionalità principali sono effettivamente verificate e non solo implementate. Le misure effettive, riportate nella sezione finale, sono l’82,3 % di copertura delle righe sul backend e il 38,6 % sul frontend.</w:t>
             </w:r>
           </w:p>
           <w:p>
@@ -2737,16 +4656,7 @@
                 <w:szCs w:val="28"/>
                 <w:lang w:val="it-IT"/>
               </w:rPr>
-              <w:t xml:space="preserve">– </w:t>
-            </w:r>
-            <w:r>
-              <w:rPr>
-                <w:rFonts w:ascii="Times New Roman" w:hAnsi="Times New Roman" w:cs="Times New Roman"/>
-                <w:sz w:val="28"/>
-                <w:szCs w:val="28"/>
-                <w:lang w:val="it-IT"/>
-              </w:rPr>
-              <w:t xml:space="preserve">5) Produrre una relazione tracciabile 1:1 rispetto al codice realmente presente nel repository, senza funzionalità dichiarate ma non implementate né riferimenti a componenti nel frattempo rimossi — un vincolo che, come descritto più avanti, mi ha imposto una revisione sistematica della documentazione a seguito della rimozione del modulo dell’assistente virtuale.</w:t>
+              <w:t xml:space="preserve">– 5) Produrre una relazione tracciabile 1:1 rispetto al codice realmente presente nel repository, senza funzionalità dichiarate ma non implementate né riferimenti a componenti nel frattempo rimossi — un vincolo che, come descritto più avanti, mi ha imposto una revisione sistematica della documentazione a seguito della rimozione di un’integrazione esterna non più necessaria.</w:t>
             </w:r>
           </w:p>
           <w:p>
@@ -3050,7 +4960,7 @@
                 <w:szCs w:val="28"/>
                 <w:lang w:val="it-IT"/>
               </w:rPr>
-              <w:t xml:space="preserve">L’elaborato realizzato è HealthCare Plus, un’applicazione full-stack composta da un backend RESTful in Java 21/Spring Boot 3 e da una Single Page Application in Angular 19, con persistenza su database relazionale tramite Spring Data JPA. Il backend espone sette gruppi principali di endpoint (autenticazione, appuntamenti, referti medici, ticket di supporto, slot orari, terapie e pazienti/medici), tutti documentati automaticamente tramite Swagger/OpenAPI e tutti protetti da autenticazione JWT tranne le rotte esplicitamente pubbliche (registrazione, login, verifica 2FA).</w:t>
+              <w:t xml:space="preserve">L’elaborato realizzato è HealthCare Plus, un’applicazione full-stack composta da un backend RESTful in Java 21/Spring Boot 3 e da una Single Page Application in Angular 19, con persistenza su database relazionale tramite Spring Data JPA. Il backend espone nove controller (autenticazione, appuntamenti, medici, pazienti, referti medici, ticket di supporto, slot orari, terapie e statistiche della dashboard) per un totale di 40 operazioni, tutte documentate automaticamente tramite Swagger/OpenAPI e tutte protette da autenticazione JWT tranne le rotte esplicitamente pubbliche (registrazione, login, verifica 2FA).</w:t>
             </w:r>
           </w:p>
           <w:p>
@@ -3092,36 +5002,78 @@
                 <w:szCs w:val="28"/>
                 <w:lang w:val="it-IT"/>
               </w:rPr>
-              <w:t xml:space="preserve">Nel concreto, i controller REST del backend si articolano in sei gruppi: AuthController (/api/auth) per registrazione, login, verifica del secondo fattore e cambio password; AppointmentController (/api/appointments) per la creazione, modifica, cambio di stato ed eliminazione delle visite; MedicalReportController (/api/reports) per il caricamento e il download dei referti in formato PDF; TicketController (/api/tickets) per l’apertura e la gestione delle segnalazioni tecniche; SlotController (/api/slots) per la dichiarazione della disponibilità oraria dei medici, singola o in batch; TherapyController (/api/therapies) per la prescrizione delle terapie. Ciascun controller applica le proprie regole di autorizzazione tramite @PreAuthorize, e l’insieme di queste regole è riassunto nella tabella di dettaglio disponibile in doc/3-API_Swagger.md.</w:t>
-            </w:r>
-          </w:p>
-          <w:p>
-            <w:pPr>
-              <w:spacing w:after="0"/>
-            </w:pPr>
-          </w:p>
-          <w:p>
-            <w:pPr>
-              <w:shd w:val="clear" w:color="auto" w:fill="FFF2CC"/>
+              <w:t xml:space="preserve">Nel concreto, i controller REST del backend si articolano in nove gruppi: AuthController (/api/auth) per registrazione, login, verifica del secondo fattore e cambio password; AppointmentController (/api/appointments) per la creazione, modifica, cambio di stato ed eliminazione delle visite; DoctorController (/api/doctors) e PatientController (/api/patients) per la gestione dei profili; MedicalReportController (/api/reports) per il caricamento dei referti in formato PDF da parte del paziente, l’aggiunta delle note del medico e il download; TicketController (/api/tickets) per l’apertura e la gestione delle segnalazioni tecniche; SlotController (/api/slots) per la dichiarazione della disponibilità oraria dei medici, singola o in batch; TherapyController (/api/therapies) per la prescrizione delle terapie; DashboardController (/api/dashboard) per le statistiche riservate a medici e supporto. Ciascun controller applica le proprie regole di autorizzazione tramite @PreAuthorize, e l’insieme di queste regole è riassunto nella matrice dei permessi disponibile in doc/3-API_Swagger.md.</w:t>
+            </w:r>
+          </w:p>
+          <w:p>
+            <w:pPr>
+              <w:spacing w:after="0"/>
+            </w:pPr>
+          </w:p>
+          <w:p>
+            <w:pPr>
+              <w:keepNext/>
+              <w:spacing w:before="120" w:after="0"/>
               <w:jc w:val="center"/>
-              <w:rPr>
-                <w:rFonts w:ascii="Times New Roman" w:hAnsi="Times New Roman" w:cs="Times New Roman"/>
-                <w:b/>
-                <w:sz w:val="24"/>
-                <w:szCs w:val="24"/>
-                <w:lang w:val="it-IT"/>
-              </w:rPr>
-            </w:pPr>
-            <w:r>
-              <w:rPr>
-                <w:rFonts w:ascii="Times New Roman" w:hAnsi="Times New Roman" w:cs="Times New Roman"/>
-                <w:b/>
-                <w:color w:val="C00000"/>
-                <w:sz w:val="24"/>
-                <w:szCs w:val="24"/>
-                <w:lang w:val="it-IT"/>
-              </w:rPr>
-              <w:t xml:space="preserve">[INSERIRE QUI IMMAGINE — Diagramma Entità-Relazione (ER) del database, già disponibile in doc/2-Design_Architetturale.md §2.1]</w:t>
+            </w:pPr>
+            <w:r>
+              <w:drawing>
+                <wp:inline distT="0" distB="0" distL="0" distR="0">
+                  <wp:extent cx="5200000" cy="4840807"/>
+                  <wp:effectExtent l="0" t="0" r="0" b="0"/>
+                  <wp:docPr id="5001" name="Immagine 5001" descr="Diagramma ER del database di HealthCare Plus"/>
+                  <wp:cNvGraphicFramePr>
+                    <a:graphicFrameLocks xmlns:a="http://schemas.openxmlformats.org/drawingml/2006/main" noChangeAspect="1"/>
+                  </wp:cNvGraphicFramePr>
+                  <a:graphic xmlns:a="http://schemas.openxmlformats.org/drawingml/2006/main">
+                    <a:graphicData uri="http://schemas.openxmlformats.org/drawingml/2006/picture">
+                      <pic:pic xmlns:pic="http://schemas.openxmlformats.org/drawingml/2006/picture">
+                        <pic:nvPicPr>
+                          <pic:cNvPr id="0" name="image26.png"/>
+                          <pic:cNvPicPr/>
+                        </pic:nvPicPr>
+                        <pic:blipFill>
+                          <a:blip r:embed="rId73"/>
+                          <a:stretch>
+                            <a:fillRect/>
+                          </a:stretch>
+                        </pic:blipFill>
+                        <pic:spPr>
+                          <a:xfrm>
+                            <a:off x="0" y="0"/>
+                            <a:ext cx="5200000" cy="4840807"/>
+                          </a:xfrm>
+                          <a:prstGeom prst="rect">
+                            <a:avLst/>
+                          </a:prstGeom>
+                        </pic:spPr>
+                      </pic:pic>
+                    </a:graphicData>
+                  </a:graphic>
+                </wp:inline>
+              </w:drawing>
+            </w:r>
+          </w:p>
+          <w:p>
+            <w:pPr>
+              <w:spacing w:before="40" w:after="200"/>
+              <w:rPr>
+                <w:rFonts w:ascii="Times New Roman" w:hAnsi="Times New Roman" w:cs="Times New Roman"/>
+                <w:i/>
+                <w:sz w:val="22"/>
+                <w:szCs w:val="22"/>
+                <w:lang w:val="it-IT"/>
+              </w:rPr>
+            </w:pPr>
+            <w:r>
+              <w:rPr>
+                <w:rFonts w:ascii="Times New Roman" w:hAnsi="Times New Roman" w:cs="Times New Roman"/>
+                <w:i/>
+                <w:sz w:val="22"/>
+                <w:szCs w:val="22"/>
+                <w:lang w:val="it-IT"/>
+              </w:rPr>
+              <w:t xml:space="preserve">Diagramma Entità-Relazione del database (attributi principali). Le associazioni tra Patient, Doctor, Appointment, MedicalReport, Therapy, Ticket e Slot sono persistite con chiavi esterne; AppUser è collegato a Patient e Doctor tramite l’email, non con una chiave esterna. Il diagramma completo con tutti gli attributi è in doc/2-Design_Architetturale.md.</w:t>
             </w:r>
           </w:p>
           <w:p>
@@ -3178,26 +5130,68 @@
           </w:p>
           <w:p>
             <w:pPr>
-              <w:shd w:val="clear" w:color="auto" w:fill="FFF2CC"/>
+              <w:keepNext/>
+              <w:spacing w:before="120" w:after="0"/>
               <w:jc w:val="center"/>
-              <w:rPr>
-                <w:rFonts w:ascii="Times New Roman" w:hAnsi="Times New Roman" w:cs="Times New Roman"/>
-                <w:b/>
-                <w:sz w:val="24"/>
-                <w:szCs w:val="24"/>
-                <w:lang w:val="it-IT"/>
-              </w:rPr>
-            </w:pPr>
-            <w:r>
-              <w:rPr>
-                <w:rFonts w:ascii="Times New Roman" w:hAnsi="Times New Roman" w:cs="Times New Roman"/>
-                <w:b/>
-                <w:color w:val="C00000"/>
-                <w:sz w:val="24"/>
-                <w:szCs w:val="24"/>
-                <w:lang w:val="it-IT"/>
-              </w:rPr>
-              <w:t xml:space="preserve">[INSERIRE QUI IMMAGINE — Diagramma di sequenza UML del flusso di prenotazione, già disponibile in doc/2-Design_Architetturale.md §2.2]</w:t>
+            </w:pPr>
+            <w:r>
+              <w:drawing>
+                <wp:inline distT="0" distB="0" distL="0" distR="0">
+                  <wp:extent cx="5500000" cy="5482722"/>
+                  <wp:effectExtent l="0" t="0" r="0" b="0"/>
+                  <wp:docPr id="5002" name="Immagine 5002" descr="Diagramma di sequenza della prenotazione"/>
+                  <wp:cNvGraphicFramePr>
+                    <a:graphicFrameLocks xmlns:a="http://schemas.openxmlformats.org/drawingml/2006/main" noChangeAspect="1"/>
+                  </wp:cNvGraphicFramePr>
+                  <a:graphic xmlns:a="http://schemas.openxmlformats.org/drawingml/2006/main">
+                    <a:graphicData uri="http://schemas.openxmlformats.org/drawingml/2006/picture">
+                      <pic:pic xmlns:pic="http://schemas.openxmlformats.org/drawingml/2006/picture">
+                        <pic:nvPicPr>
+                          <pic:cNvPr id="0" name="image27.png"/>
+                          <pic:cNvPicPr/>
+                        </pic:nvPicPr>
+                        <pic:blipFill>
+                          <a:blip r:embed="rId74"/>
+                          <a:stretch>
+                            <a:fillRect/>
+                          </a:stretch>
+                        </pic:blipFill>
+                        <pic:spPr>
+                          <a:xfrm>
+                            <a:off x="0" y="0"/>
+                            <a:ext cx="5500000" cy="5482722"/>
+                          </a:xfrm>
+                          <a:prstGeom prst="rect">
+                            <a:avLst/>
+                          </a:prstGeom>
+                        </pic:spPr>
+                      </pic:pic>
+                    </a:graphicData>
+                  </a:graphic>
+                </wp:inline>
+              </w:drawing>
+            </w:r>
+          </w:p>
+          <w:p>
+            <w:pPr>
+              <w:spacing w:before="40" w:after="200"/>
+              <w:rPr>
+                <w:rFonts w:ascii="Times New Roman" w:hAnsi="Times New Roman" w:cs="Times New Roman"/>
+                <w:i/>
+                <w:sz w:val="22"/>
+                <w:szCs w:val="22"/>
+                <w:lang w:val="it-IT"/>
+              </w:rPr>
+            </w:pPr>
+            <w:r>
+              <w:rPr>
+                <w:rFonts w:ascii="Times New Roman" w:hAnsi="Times New Roman" w:cs="Times New Roman"/>
+                <w:i/>
+                <w:sz w:val="22"/>
+                <w:szCs w:val="22"/>
+                <w:lang w:val="it-IT"/>
+              </w:rPr>
+              <w:t xml:space="preserve">Diagramma di sequenza della prenotazione di una visita: il paziente sceglie il medico, la data e uno slot libero; il backend verifica ruolo e proprietà e registra l’appuntamento.</w:t>
             </w:r>
           </w:p>
           <w:p>
@@ -3233,26 +5227,68 @@
           </w:p>
           <w:p>
             <w:pPr>
-              <w:shd w:val="clear" w:color="auto" w:fill="FFF2CC"/>
+              <w:keepNext/>
+              <w:spacing w:before="120" w:after="0"/>
               <w:jc w:val="center"/>
-              <w:rPr>
-                <w:rFonts w:ascii="Times New Roman" w:hAnsi="Times New Roman" w:cs="Times New Roman"/>
-                <w:b/>
-                <w:sz w:val="24"/>
-                <w:szCs w:val="24"/>
-                <w:lang w:val="it-IT"/>
-              </w:rPr>
-            </w:pPr>
-            <w:r>
-              <w:rPr>
-                <w:rFonts w:ascii="Times New Roman" w:hAnsi="Times New Roman" w:cs="Times New Roman"/>
-                <w:b/>
-                <w:color w:val="C00000"/>
-                <w:sz w:val="24"/>
-                <w:szCs w:val="24"/>
-                <w:lang w:val="it-IT"/>
-              </w:rPr>
-              <w:t xml:space="preserve">[INSERIRE QUI IMMAGINE — Diagramma di sequenza: apertura di un ticket con verifica di ownership, già disponibile in REPORT.md §2.3]</w:t>
+            </w:pPr>
+            <w:r>
+              <w:drawing>
+                <wp:inline distT="0" distB="0" distL="0" distR="0">
+                  <wp:extent cx="5500000" cy="2537005"/>
+                  <wp:effectExtent l="0" t="0" r="0" b="0"/>
+                  <wp:docPr id="5003" name="Immagine 5003" descr="Diagramma di sequenza dell’apertura di un ticket"/>
+                  <wp:cNvGraphicFramePr>
+                    <a:graphicFrameLocks xmlns:a="http://schemas.openxmlformats.org/drawingml/2006/main" noChangeAspect="1"/>
+                  </wp:cNvGraphicFramePr>
+                  <a:graphic xmlns:a="http://schemas.openxmlformats.org/drawingml/2006/main">
+                    <a:graphicData uri="http://schemas.openxmlformats.org/drawingml/2006/picture">
+                      <pic:pic xmlns:pic="http://schemas.openxmlformats.org/drawingml/2006/picture">
+                        <pic:nvPicPr>
+                          <pic:cNvPr id="0" name="image28.png"/>
+                          <pic:cNvPicPr/>
+                        </pic:nvPicPr>
+                        <pic:blipFill>
+                          <a:blip r:embed="rId75"/>
+                          <a:stretch>
+                            <a:fillRect/>
+                          </a:stretch>
+                        </pic:blipFill>
+                        <pic:spPr>
+                          <a:xfrm>
+                            <a:off x="0" y="0"/>
+                            <a:ext cx="5500000" cy="2537005"/>
+                          </a:xfrm>
+                          <a:prstGeom prst="rect">
+                            <a:avLst/>
+                          </a:prstGeom>
+                        </pic:spPr>
+                      </pic:pic>
+                    </a:graphicData>
+                  </a:graphic>
+                </wp:inline>
+              </w:drawing>
+            </w:r>
+          </w:p>
+          <w:p>
+            <w:pPr>
+              <w:spacing w:before="40" w:after="200"/>
+              <w:rPr>
+                <w:rFonts w:ascii="Times New Roman" w:hAnsi="Times New Roman" w:cs="Times New Roman"/>
+                <w:i/>
+                <w:sz w:val="22"/>
+                <w:szCs w:val="22"/>
+                <w:lang w:val="it-IT"/>
+              </w:rPr>
+            </w:pPr>
+            <w:r>
+              <w:rPr>
+                <w:rFonts w:ascii="Times New Roman" w:hAnsi="Times New Roman" w:cs="Times New Roman"/>
+                <w:i/>
+                <w:sz w:val="22"/>
+                <w:szCs w:val="22"/>
+                <w:lang w:val="it-IT"/>
+              </w:rPr>
+              <w:t xml:space="preserve">Diagramma di sequenza dell’apertura di un ticket con verifica di ownership: se il patientId non coincide con l’utente autenticato il backend risponde 403.</w:t>
             </w:r>
           </w:p>
           <w:p>
@@ -3288,26 +5324,68 @@
           </w:p>
           <w:p>
             <w:pPr>
-              <w:shd w:val="clear" w:color="auto" w:fill="FFF2CC"/>
+              <w:keepNext/>
+              <w:spacing w:before="120" w:after="0"/>
               <w:jc w:val="center"/>
-              <w:rPr>
-                <w:rFonts w:ascii="Times New Roman" w:hAnsi="Times New Roman" w:cs="Times New Roman"/>
-                <w:b/>
-                <w:sz w:val="24"/>
-                <w:szCs w:val="24"/>
-                <w:lang w:val="it-IT"/>
-              </w:rPr>
-            </w:pPr>
-            <w:r>
-              <w:rPr>
-                <w:rFonts w:ascii="Times New Roman" w:hAnsi="Times New Roman" w:cs="Times New Roman"/>
-                <w:b/>
-                <w:color w:val="C00000"/>
-                <w:sz w:val="24"/>
-                <w:szCs w:val="24"/>
-                <w:lang w:val="it-IT"/>
-              </w:rPr>
-              <w:t xml:space="preserve">[INSERIRE QUI IMMAGINE — Diagramma di sequenza: login in due passaggi con verifica del codice TOTP (2FA)]</w:t>
+            </w:pPr>
+            <w:r>
+              <w:drawing>
+                <wp:inline distT="0" distB="0" distL="0" distR="0">
+                  <wp:extent cx="5500000" cy="4871428"/>
+                  <wp:effectExtent l="0" t="0" r="0" b="0"/>
+                  <wp:docPr id="5004" name="Immagine 5004" descr="Diagramma di sequenza del login con 2FA"/>
+                  <wp:cNvGraphicFramePr>
+                    <a:graphicFrameLocks xmlns:a="http://schemas.openxmlformats.org/drawingml/2006/main" noChangeAspect="1"/>
+                  </wp:cNvGraphicFramePr>
+                  <a:graphic xmlns:a="http://schemas.openxmlformats.org/drawingml/2006/main">
+                    <a:graphicData uri="http://schemas.openxmlformats.org/drawingml/2006/picture">
+                      <pic:pic xmlns:pic="http://schemas.openxmlformats.org/drawingml/2006/picture">
+                        <pic:nvPicPr>
+                          <pic:cNvPr id="0" name="image29.png"/>
+                          <pic:cNvPicPr/>
+                        </pic:nvPicPr>
+                        <pic:blipFill>
+                          <a:blip r:embed="rId76"/>
+                          <a:stretch>
+                            <a:fillRect/>
+                          </a:stretch>
+                        </pic:blipFill>
+                        <pic:spPr>
+                          <a:xfrm>
+                            <a:off x="0" y="0"/>
+                            <a:ext cx="5500000" cy="4871428"/>
+                          </a:xfrm>
+                          <a:prstGeom prst="rect">
+                            <a:avLst/>
+                          </a:prstGeom>
+                        </pic:spPr>
+                      </pic:pic>
+                    </a:graphicData>
+                  </a:graphic>
+                </wp:inline>
+              </w:drawing>
+            </w:r>
+          </w:p>
+          <w:p>
+            <w:pPr>
+              <w:spacing w:before="40" w:after="200"/>
+              <w:rPr>
+                <w:rFonts w:ascii="Times New Roman" w:hAnsi="Times New Roman" w:cs="Times New Roman"/>
+                <w:i/>
+                <w:sz w:val="22"/>
+                <w:szCs w:val="22"/>
+                <w:lang w:val="it-IT"/>
+              </w:rPr>
+            </w:pPr>
+            <w:r>
+              <w:rPr>
+                <w:rFonts w:ascii="Times New Roman" w:hAnsi="Times New Roman" w:cs="Times New Roman"/>
+                <w:i/>
+                <w:sz w:val="22"/>
+                <w:szCs w:val="22"/>
+                <w:lang w:val="it-IT"/>
+              </w:rPr>
+              <w:t xml:space="preserve">Diagramma di sequenza del login in due passaggi con autenticazione a due fattori: il primo passaggio non emette alcun token, il secondo verifica il codice TOTP ed emette il JWT.</w:t>
             </w:r>
           </w:p>
           <w:p>
@@ -3354,7 +5432,7 @@
                 <w:szCs w:val="28"/>
                 <w:lang w:val="it-IT"/>
               </w:rPr>
-              <w:t xml:space="preserve">Sempre lato frontend, la gestione centralizzata degli errori tramite HttpInterceptorFn mi ha permesso di eliminare completamente l’uso di alert() nativi del browser, sostituiti da un componente Toast condiviso: un interceptor intercetta ogni risposta HTTP in errore, distingue il caso di token scaduto (status 401, che comporta un logout automatico e il reindirizzamento al login) dagli altri errori applicativi (che vengono mostrati come notifica non bloccante), evitando così di dover gestire singolarmente ogni possibile fallimento in ciascun componente che effettua una chiamata HTTP.</w:t>
+              <w:t xml:space="preserve">Sempre lato frontend, la gestione centralizzata degli errori tramite HttpInterceptorFn mi ha permesso di sostituire gli alert() nativi del browser con un componente Toast condiviso per gli errori HTTP (restano solo alcuni alert() di conferma in tre componenti): un interceptor intercetta ogni risposta HTTP in errore, prevede il logout automatico e il reindirizzamento al login per lo status 401 e mostra gli altri errori applicativi come notifica non bloccante, evitando di dover gestire singolarmente ogni possibile fallimento in ciascun componente. La verifica finale ha però mostrato che Spring Security risponde 403, e non 401, in caso di token assente o scaduto: il logout automatico, così com’è, non si attiva. La correzione (un AuthenticationEntryPoint che risponda 401) è indicata tra i limiti.</w:t>
             </w:r>
           </w:p>
           <w:p>
@@ -3418,7 +5496,7 @@
                 <w:szCs w:val="28"/>
                 <w:lang w:val="it-IT"/>
               </w:rPr>
-              <w:t xml:space="preserve">Sia gli appuntamenti sia i ticket attraversano un piccolo ciclo di stati (ad es. SCHEDULED → COMPLETED / CANCELLED per gli appuntamenti, OPEN ↔ CLOSED per i ticket), e a ogni transizione è associata una logica specifica (ad esempio, quando un appuntamento viene segnato come completato, si abilita il caricamento del referto; quando viene cancellato, si libera lo slot corrispondente). La prima versione di questa logica, scritta durante la Fase 1, era effettivamente un metodo con una catena di if/else sullo stato in ingresso: funzionava, ma ogni nuovo stato avrebbe richiesto di modificare quello stesso metodo, con il rischio di introdurre una regressione su uno stato già esistente e già testato.</w:t>
+              <w:t xml:space="preserve">Sia gli appuntamenti sia i ticket attraversano un piccolo ciclo di stati (ad es. SCHEDULED → COMPLETED / CANCELLED per gli appuntamenti, OPEN ↔ CLOSED per i ticket), e a ogni transizione deve poter essere associata una logica specifica (ad esempio avvisare il paziente quando una visita viene annullata o un ticket viene chiuso). La prima versione di questa logica, scritta durante la Fase 1, era effettivamente un metodo con una catena di if/else sullo stato in ingresso: funzionava, ma ogni nuovo stato avrebbe richiesto di modificare quello stesso metodo, con il rischio di introdurre una regressione su uno stato già esistente e già testato.</w:t>
             </w:r>
           </w:p>
           <w:p>
@@ -3884,7 +5962,7 @@
                 <w:szCs w:val="28"/>
                 <w:lang w:val="it-IT"/>
               </w:rPr>
-              <w:t xml:space="preserve">Il vantaggio pratico di questa scelta è diretto e verificabile: aggiungere un nuovo stato in futuro (ad esempio un ipotetico stato NO_SHOW per un paziente che non si presenta alla visita) richiederebbe solo di scrivere una nuova classe che implementa l’interfaccia e di annotarla come @Component, senza toccare il codice già esistente e già coperto da test — il che è esattamente l’Open/Closed Principle applicato a un caso reale, e non solo enunciato in astratto come principio teorico. La suite di test dedicata a questo package (AppointmentStrategyFactoryTest, CancelledAppointmentStrategyTest, CompletedAppointmentStrategyTest e gli analoghi per i ticket) verifica esattamente questa proprietà: che la Factory restituisca sempre la strategia corretta per ciascuno stato supportato.</w:t>
+              <w:t xml:space="preserve">Il vantaggio pratico di questa scelta è diretto e verificabile: aggiungere un nuovo stato in futuro (ad esempio un ipotetico stato NO_SHOW per un paziente che non si presenta alla visita) richiederebbe solo di scrivere una nuova classe che implementa l’interfaccia e di annotarla come @Component, senza toccare il codice già esistente e già coperto da test — il che è esattamente l’Open/Closed Principle applicato a un caso reale, e non solo enunciato in astratto come principio teorico. La suite di test dedicata a questo package (AppointmentStrategyFactoryTest, CancelledAppointmentStrategyTest, CompletedAppointmentStrategyTest e gli analoghi per i ticket) verifica esattamente questa proprietà: che la Factory restituisca sempre la strategia corretta per ciascuno stato supportato. Per onestà va precisato che, allo stato attuale, le strategie implementate sono punti di estensione che registrano un log e riportano in commento la logica ancora da realizzare (notifiche al paziente, ecc.): la struttura è predisposta, il comportamento di business associato non è ancora implementato. Lo slot di un appuntamento annullato si libera invece già oggi, ma per un altro motivo: la disponibilità è calcolata a lettura.</w:t>
             </w:r>
           </w:p>
           <w:p>
@@ -4336,7 +6414,7 @@
                 <w:szCs w:val="28"/>
                 <w:lang w:val="it-IT"/>
               </w:rPr>
-              <w:t xml:space="preserve">Il caso più istruttivo di logica complessa su cui mi sono dovuto confrontare a fondo riguarda proprio l’endpoint di creazione dei ticket. Nella versione iniziale del progetto avevo previsto un assistente virtuale in grado di aprire un ticket per conto dell’utente chiamando direttamente l’endpoint POST /api/tickets in modo server-to-server, senza propagare un token JWT delegato dall’utente originale (una scelta comune quando un servizio esterno agisce per conto di un utente ma non può o non deve maneggiarne le credenziali). Per permetterlo, avevo lasciato l’endpoint volutamente privo di qualunque restrizione di ruolo: una decisione consapevole in quel contesto, ma che presupponeva l’esistenza dell’assistente come unico chiamante reale.</w:t>
+              <w:t xml:space="preserve">Il caso più istruttivo di logica complessa su cui mi sono dovuto confrontare a fondo riguarda proprio l’endpoint di creazione dei ticket. Nella versione iniziale del progetto avevo previsto un’integrazione esterna in grado di aprire un ticket per conto dell’utente chiamando direttamente l’endpoint POST /api/tickets in modo server-to-server, senza propagare un token JWT delegato dall’utente originale (una scelta comune quando un servizio esterno agisce per conto di un utente ma non può o non deve maneggiarne le credenziali). Per permetterlo, avevo lasciato l’endpoint volutamente privo di qualunque restrizione di ruolo: una decisione consapevole in quel contesto, ma che presupponeva l’esistenza di quel servizio come unico chiamante reale.</w:t>
             </w:r>
           </w:p>
           <w:p>
@@ -4374,7 +6452,7 @@
                 <w:sz w:val="18"/>
                 <w:szCs w:val="18"/>
               </w:rPr>
-              <w:t xml:space="preserve">// dell'assistente virtuale senza un token JWT delegato):</w:t>
+              <w:t xml:space="preserve">// dell'integrazione esterna senza un token JWT delegato):</w:t>
             </w:r>
           </w:p>
           <w:p>
@@ -4531,26 +6609,26 @@
                 <w:szCs w:val="28"/>
                 <w:lang w:val="it-IT"/>
               </w:rPr>
-              <w:t xml:space="preserve">Quando ho deciso di rimuovere l’assistente virtuale per concentrare l’elaborato sul nucleo RESTful richiesto dalla traccia, quella premessa è venuta meno — ma il codice, se lasciato invariato, sarebbe rimasto un endpoint di scrittura completamente aperto, utilizzabile da chiunque conoscesse l’URL per creare un ticket a nome di un paziente qualsiasi, semplicemente indicandone l’ID nel corpo della richiesta. Ho quindi ripristinato un controllo esplicito, riutilizzando lo stesso OwnershipService già impiegato negli altri controller, così da mantenere coerenza con il resto del sistema invece di introdurre un meccanismo di controllo ad hoc solo per questo endpoint:</w:t>
-            </w:r>
-          </w:p>
-          <w:p>
-            <w:pPr>
-              <w:shd w:val="clear" w:color="auto" w:fill="F2F2F2"/>
-              <w:spacing w:after="0"/>
-              <w:rPr>
-                <w:rFonts w:ascii="Consolas" w:hAnsi="Consolas" w:cs="Consolas"/>
-                <w:sz w:val="18"/>
-                <w:szCs w:val="18"/>
-              </w:rPr>
-            </w:pPr>
-            <w:r>
-              <w:rPr>
-                <w:rFonts w:ascii="Consolas" w:hAnsi="Consolas" w:cs="Consolas"/>
-                <w:sz w:val="18"/>
-                <w:szCs w:val="18"/>
-              </w:rPr>
-              <w:t xml:space="preserve">// DOPO (rimosso l'assistente virtuale: l'endpoint torna a richiedere</w:t>
+              <w:t xml:space="preserve">Quando ho deciso di rimuovere l’integrazione esterna per concentrare l’elaborato sul nucleo RESTful richiesto dalla traccia, quella premessa è venuta meno — ma il codice, se lasciato invariato, sarebbe rimasto un endpoint di scrittura completamente aperto, utilizzabile da chiunque conoscesse l’URL per creare un ticket a nome di un paziente qualsiasi, semplicemente indicandone l’ID nel corpo della richiesta. Ho quindi ripristinato un controllo esplicito, riutilizzando lo stesso OwnershipService già impiegato negli altri controller, così da mantenere coerenza con il resto del sistema invece di introdurre un meccanismo di controllo ad hoc solo per questo endpoint:</w:t>
+            </w:r>
+          </w:p>
+          <w:p>
+            <w:pPr>
+              <w:shd w:val="clear" w:color="auto" w:fill="F2F2F2"/>
+              <w:spacing w:after="0"/>
+              <w:rPr>
+                <w:rFonts w:ascii="Consolas" w:hAnsi="Consolas" w:cs="Consolas"/>
+                <w:sz w:val="18"/>
+                <w:szCs w:val="18"/>
+              </w:rPr>
+            </w:pPr>
+            <w:r>
+              <w:rPr>
+                <w:rFonts w:ascii="Consolas" w:hAnsi="Consolas" w:cs="Consolas"/>
+                <w:sz w:val="18"/>
+                <w:szCs w:val="18"/>
+              </w:rPr>
+              <w:t xml:space="preserve">// DOPO (rimossa l'integrazione esterna: l'endpoint torna a richiedere</w:t>
             </w:r>
           </w:p>
           <w:p>
@@ -4743,7 +6821,7 @@
                 <w:szCs w:val="22"/>
                 <w:lang w:val="it-IT"/>
               </w:rPr>
-              <w:t xml:space="preserve">TicketController.java, versione corrente: ownership ripristinata dopo la rimozione dell'assistente virtuale.</w:t>
+              <w:t xml:space="preserve">TicketController.java, versione corrente: ownership ripristinata dopo la rimozione dell'integrazione esterna.</w:t>
             </w:r>
           </w:p>
           <w:p>
@@ -7282,36 +9360,56 @@
                 <w:szCs w:val="28"/>
                 <w:lang w:val="it-IT"/>
               </w:rPr>
-              <w:t xml:space="preserve">A completamento della descrizione degli aspetti progettuali, riporto di seguito l’evidenza visiva del corretto funzionamento dei flussi principali dell’applicazione, sia lato frontend Angular sia lato documentazione API in Swagger, così come richiesto dalla traccia. Gli screenshot che seguono sono stati acquisiti eseguendo realmente i passi descritti in ciascuna didascalia sull’applicazione avviata in locale (backend su porta 8080, frontend su porta 4200), non simulati o disegnati a scopo illustrativo.</w:t>
-            </w:r>
-          </w:p>
-          <w:p>
-            <w:pPr>
-              <w:spacing w:after="0"/>
-            </w:pPr>
-          </w:p>
-          <w:p>
-            <w:pPr>
-              <w:shd w:val="clear" w:color="auto" w:fill="FFF2CC"/>
+              <w:t xml:space="preserve">A completamento della descrizione degli aspetti progettuali, riporto di seguito l’evidenza visiva del corretto funzionamento dei flussi principali dell’applicazione, sia lato frontend Angular sia lato documentazione API in Swagger, così come richiesto dalla traccia. Gli screenshot che seguono sono stati acquisiti eseguendo realmente i passi descritti in ciascuna didascalia sull’applicazione avviata in locale (backend su porta 8080, frontend su porta 4200), non simulati o disegnati a scopo illustrativo. Gli screenshot sono stati acquisiti il 20 settembre 2026.</w:t>
+            </w:r>
+          </w:p>
+          <w:p>
+            <w:pPr>
+              <w:spacing w:after="0"/>
+            </w:pPr>
+          </w:p>
+          <w:p>
+            <w:pPr>
+              <w:keepNext/>
+              <w:spacing w:before="120" w:after="0"/>
               <w:jc w:val="center"/>
-              <w:rPr>
-                <w:rFonts w:ascii="Times New Roman" w:hAnsi="Times New Roman" w:cs="Times New Roman"/>
-                <w:b/>
-                <w:sz w:val="24"/>
-                <w:szCs w:val="24"/>
-                <w:lang w:val="it-IT"/>
-              </w:rPr>
-            </w:pPr>
-            <w:r>
-              <w:rPr>
-                <w:rFonts w:ascii="Times New Roman" w:hAnsi="Times New Roman" w:cs="Times New Roman"/>
-                <w:b/>
-                <w:color w:val="C00000"/>
-                <w:sz w:val="24"/>
-                <w:szCs w:val="24"/>
-                <w:lang w:val="it-IT"/>
-              </w:rPr>
-              <w:t xml:space="preserve">[INSERIRE QUI SCREENSHOT — Schermata di login/registrazione]</w:t>
+            </w:pPr>
+            <w:r>
+              <w:drawing>
+                <wp:inline distT="0" distB="0" distL="0" distR="0">
+                  <wp:extent cx="5400000" cy="3375000"/>
+                  <wp:effectExtent l="0" t="0" r="0" b="0"/>
+                  <wp:docPr id="5005" name="Immagine 5005" descr="Schermata di login con credenziali errate"/>
+                  <wp:cNvGraphicFramePr>
+                    <a:graphicFrameLocks xmlns:a="http://schemas.openxmlformats.org/drawingml/2006/main" noChangeAspect="1"/>
+                  </wp:cNvGraphicFramePr>
+                  <a:graphic xmlns:a="http://schemas.openxmlformats.org/drawingml/2006/main">
+                    <a:graphicData uri="http://schemas.openxmlformats.org/drawingml/2006/picture">
+                      <pic:pic xmlns:pic="http://schemas.openxmlformats.org/drawingml/2006/picture">
+                        <pic:nvPicPr>
+                          <pic:cNvPr id="0" name="image30.png"/>
+                          <pic:cNvPicPr/>
+                        </pic:nvPicPr>
+                        <pic:blipFill>
+                          <a:blip r:embed="rId77"/>
+                          <a:stretch>
+                            <a:fillRect/>
+                          </a:stretch>
+                        </pic:blipFill>
+                        <pic:spPr>
+                          <a:xfrm>
+                            <a:off x="0" y="0"/>
+                            <a:ext cx="5400000" cy="3375000"/>
+                          </a:xfrm>
+                          <a:prstGeom prst="rect">
+                            <a:avLst/>
+                          </a:prstGeom>
+                        </pic:spPr>
+                      </pic:pic>
+                    </a:graphicData>
+                  </a:graphic>
+                </wp:inline>
+              </w:drawing>
             </w:r>
           </w:p>
           <w:p>
@@ -7333,36 +9431,56 @@
                 <w:szCs w:val="22"/>
                 <w:lang w:val="it-IT"/>
               </w:rPr>
-              <w:t xml:space="preserve">Accesso e registrazione. Viene testata la validazione delle credenziali (gestione sicura via JWT) e il controllo degli errori (es. utente non trovato o password errata), con il feedback mostrato tramite il componente Toast invece dei tradizionali alert() di sistema.</w:t>
-            </w:r>
-          </w:p>
-          <w:p>
-            <w:pPr>
-              <w:spacing w:after="0"/>
-            </w:pPr>
-          </w:p>
-          <w:p>
-            <w:pPr>
-              <w:shd w:val="clear" w:color="auto" w:fill="FFF2CC"/>
+              <w:t xml:space="preserve">Accesso con credenziali errate. Viene testata la validazione delle credenziali (gestione sicura via JWT) e il controllo degli errori: il messaggio compare accanto ai campi del form e non tramite alert() di sistema.</w:t>
+            </w:r>
+          </w:p>
+          <w:p>
+            <w:pPr>
+              <w:spacing w:after="0"/>
+            </w:pPr>
+          </w:p>
+          <w:p>
+            <w:pPr>
+              <w:keepNext/>
+              <w:spacing w:before="120" w:after="0"/>
               <w:jc w:val="center"/>
-              <w:rPr>
-                <w:rFonts w:ascii="Times New Roman" w:hAnsi="Times New Roman" w:cs="Times New Roman"/>
-                <w:b/>
-                <w:sz w:val="24"/>
-                <w:szCs w:val="24"/>
-                <w:lang w:val="it-IT"/>
-              </w:rPr>
-            </w:pPr>
-            <w:r>
-              <w:rPr>
-                <w:rFonts w:ascii="Times New Roman" w:hAnsi="Times New Roman" w:cs="Times New Roman"/>
-                <w:b/>
-                <w:color w:val="C00000"/>
-                <w:sz w:val="24"/>
-                <w:szCs w:val="24"/>
-                <w:lang w:val="it-IT"/>
-              </w:rPr>
-              <w:t xml:space="preserve">[INSERIRE QUI SCREENSHOT — Form di prenotazione di una visita]</w:t>
+            </w:pPr>
+            <w:r>
+              <w:drawing>
+                <wp:inline distT="0" distB="0" distL="0" distR="0">
+                  <wp:extent cx="5400000" cy="3375000"/>
+                  <wp:effectExtent l="0" t="0" r="0" b="0"/>
+                  <wp:docPr id="5006" name="Immagine 5006" descr="Form di prenotazione con slot"/>
+                  <wp:cNvGraphicFramePr>
+                    <a:graphicFrameLocks xmlns:a="http://schemas.openxmlformats.org/drawingml/2006/main" noChangeAspect="1"/>
+                  </wp:cNvGraphicFramePr>
+                  <a:graphic xmlns:a="http://schemas.openxmlformats.org/drawingml/2006/main">
+                    <a:graphicData uri="http://schemas.openxmlformats.org/drawingml/2006/picture">
+                      <pic:pic xmlns:pic="http://schemas.openxmlformats.org/drawingml/2006/picture">
+                        <pic:nvPicPr>
+                          <pic:cNvPr id="0" name="image31.png"/>
+                          <pic:cNvPicPr/>
+                        </pic:nvPicPr>
+                        <pic:blipFill>
+                          <a:blip r:embed="rId78"/>
+                          <a:stretch>
+                            <a:fillRect/>
+                          </a:stretch>
+                        </pic:blipFill>
+                        <pic:spPr>
+                          <a:xfrm>
+                            <a:off x="0" y="0"/>
+                            <a:ext cx="5400000" cy="3375000"/>
+                          </a:xfrm>
+                          <a:prstGeom prst="rect">
+                            <a:avLst/>
+                          </a:prstGeom>
+                        </pic:spPr>
+                      </pic:pic>
+                    </a:graphicData>
+                  </a:graphic>
+                </wp:inline>
+              </w:drawing>
             </w:r>
           </w:p>
           <w:p>
@@ -7384,36 +9502,56 @@
                 <w:szCs w:val="22"/>
                 <w:lang w:val="it-IT"/>
               </w:rPr>
-              <w:t xml:space="preserve">Prenotazione di una visita (vista Paziente). Test del form di prenotazione: selezione del medico specialista caricato dinamicamente tramite API REST, scelta di uno slot orario tra quelli realmente disponibili per la data selezionata e inserimento del motivo della visita.</w:t>
-            </w:r>
-          </w:p>
-          <w:p>
-            <w:pPr>
-              <w:spacing w:after="0"/>
-            </w:pPr>
-          </w:p>
-          <w:p>
-            <w:pPr>
-              <w:shd w:val="clear" w:color="auto" w:fill="FFF2CC"/>
+              <w:t xml:space="preserve">Prenotazione di una visita (vista Paziente). Test del form di prenotazione: scelta della data e di uno slot orario tra quelli dichiarati dal medico; le fasce già prenotate risultano «Occupato» e non sono selezionabili. Seguono il motivo della visita, le note e un documento facoltativo.</w:t>
+            </w:r>
+          </w:p>
+          <w:p>
+            <w:pPr>
+              <w:spacing w:after="0"/>
+            </w:pPr>
+          </w:p>
+          <w:p>
+            <w:pPr>
+              <w:keepNext/>
+              <w:spacing w:before="120" w:after="0"/>
               <w:jc w:val="center"/>
-              <w:rPr>
-                <w:rFonts w:ascii="Times New Roman" w:hAnsi="Times New Roman" w:cs="Times New Roman"/>
-                <w:b/>
-                <w:sz w:val="24"/>
-                <w:szCs w:val="24"/>
-                <w:lang w:val="it-IT"/>
-              </w:rPr>
-            </w:pPr>
-            <w:r>
-              <w:rPr>
-                <w:rFonts w:ascii="Times New Roman" w:hAnsi="Times New Roman" w:cs="Times New Roman"/>
-                <w:b/>
-                <w:color w:val="C00000"/>
-                <w:sz w:val="24"/>
-                <w:szCs w:val="24"/>
-                <w:lang w:val="it-IT"/>
-              </w:rPr>
-              <w:t xml:space="preserve">[INSERIRE QUI SCREENSHOT — Dashboard del Paziente con segnalazioni]</w:t>
+            </w:pPr>
+            <w:r>
+              <w:drawing>
+                <wp:inline distT="0" distB="0" distL="0" distR="0">
+                  <wp:extent cx="5400000" cy="3435000"/>
+                  <wp:effectExtent l="0" t="0" r="0" b="0"/>
+                  <wp:docPr id="5007" name="Immagine 5007" descr="Dashboard del paziente"/>
+                  <wp:cNvGraphicFramePr>
+                    <a:graphicFrameLocks xmlns:a="http://schemas.openxmlformats.org/drawingml/2006/main" noChangeAspect="1"/>
+                  </wp:cNvGraphicFramePr>
+                  <a:graphic xmlns:a="http://schemas.openxmlformats.org/drawingml/2006/main">
+                    <a:graphicData uri="http://schemas.openxmlformats.org/drawingml/2006/picture">
+                      <pic:pic xmlns:pic="http://schemas.openxmlformats.org/drawingml/2006/picture">
+                        <pic:nvPicPr>
+                          <pic:cNvPr id="0" name="image32.png"/>
+                          <pic:cNvPicPr/>
+                        </pic:nvPicPr>
+                        <pic:blipFill>
+                          <a:blip r:embed="rId79"/>
+                          <a:stretch>
+                            <a:fillRect/>
+                          </a:stretch>
+                        </pic:blipFill>
+                        <pic:spPr>
+                          <a:xfrm>
+                            <a:off x="0" y="0"/>
+                            <a:ext cx="5400000" cy="3435000"/>
+                          </a:xfrm>
+                          <a:prstGeom prst="rect">
+                            <a:avLst/>
+                          </a:prstGeom>
+                        </pic:spPr>
+                      </pic:pic>
+                    </a:graphicData>
+                  </a:graphic>
+                </wp:inline>
+              </w:drawing>
             </w:r>
           </w:p>
           <w:p>
@@ -7435,36 +9573,56 @@
                 <w:szCs w:val="22"/>
                 <w:lang w:val="it-IT"/>
               </w:rPr>
-              <w:t xml:space="preserve">Dashboard del Paziente. Vengono mostrati gli appuntamenti programmati, i referti disponibili e le segnalazioni tecniche aperte tramite il form “Nuova segnalazione”, verificando che la segnalazione compaia immediatamente nella tabella dopo l’invio, senza necessità di ricaricare manualmente la pagina.</w:t>
-            </w:r>
-          </w:p>
-          <w:p>
-            <w:pPr>
-              <w:spacing w:after="0"/>
-            </w:pPr>
-          </w:p>
-          <w:p>
-            <w:pPr>
-              <w:shd w:val="clear" w:color="auto" w:fill="FFF2CC"/>
+              <w:t xml:space="preserve">Dashboard del Paziente. Contatori di sintesi (prossime visite, visite completate, segnalazioni aperte, referti disponibili) e appuntamenti con le azioni «Modifica», «Cancella» e «Referto»; dalla stessa schermata si prenota una visita o si esporta la cartella clinica in formato stampabile.</w:t>
+            </w:r>
+          </w:p>
+          <w:p>
+            <w:pPr>
+              <w:spacing w:after="0"/>
+            </w:pPr>
+          </w:p>
+          <w:p>
+            <w:pPr>
+              <w:keepNext/>
+              <w:spacing w:before="120" w:after="0"/>
               <w:jc w:val="center"/>
-              <w:rPr>
-                <w:rFonts w:ascii="Times New Roman" w:hAnsi="Times New Roman" w:cs="Times New Roman"/>
-                <w:b/>
-                <w:sz w:val="24"/>
-                <w:szCs w:val="24"/>
-                <w:lang w:val="it-IT"/>
-              </w:rPr>
-            </w:pPr>
-            <w:r>
-              <w:rPr>
-                <w:rFonts w:ascii="Times New Roman" w:hAnsi="Times New Roman" w:cs="Times New Roman"/>
-                <w:b/>
-                <w:color w:val="C00000"/>
-                <w:sz w:val="24"/>
-                <w:szCs w:val="24"/>
-                <w:lang w:val="it-IT"/>
-              </w:rPr>
-              <w:t xml:space="preserve">[INSERIRE QUI SCREENSHOT — Calendario/dashboard del Medico]</w:t>
+            </w:pPr>
+            <w:r>
+              <w:drawing>
+                <wp:inline distT="0" distB="0" distL="0" distR="0">
+                  <wp:extent cx="5400000" cy="3435000"/>
+                  <wp:effectExtent l="0" t="0" r="0" b="0"/>
+                  <wp:docPr id="5008" name="Immagine 5008" descr="Dashboard del medico"/>
+                  <wp:cNvGraphicFramePr>
+                    <a:graphicFrameLocks xmlns:a="http://schemas.openxmlformats.org/drawingml/2006/main" noChangeAspect="1"/>
+                  </wp:cNvGraphicFramePr>
+                  <a:graphic xmlns:a="http://schemas.openxmlformats.org/drawingml/2006/main">
+                    <a:graphicData uri="http://schemas.openxmlformats.org/drawingml/2006/picture">
+                      <pic:pic xmlns:pic="http://schemas.openxmlformats.org/drawingml/2006/picture">
+                        <pic:nvPicPr>
+                          <pic:cNvPr id="0" name="image33.png"/>
+                          <pic:cNvPicPr/>
+                        </pic:nvPicPr>
+                        <pic:blipFill>
+                          <a:blip r:embed="rId80"/>
+                          <a:stretch>
+                            <a:fillRect/>
+                          </a:stretch>
+                        </pic:blipFill>
+                        <pic:spPr>
+                          <a:xfrm>
+                            <a:off x="0" y="0"/>
+                            <a:ext cx="5400000" cy="3435000"/>
+                          </a:xfrm>
+                          <a:prstGeom prst="rect">
+                            <a:avLst/>
+                          </a:prstGeom>
+                        </pic:spPr>
+                      </pic:pic>
+                    </a:graphicData>
+                  </a:graphic>
+                </wp:inline>
+              </w:drawing>
             </w:r>
           </w:p>
           <w:p>
@@ -7486,36 +9644,56 @@
                 <w:szCs w:val="22"/>
                 <w:lang w:val="it-IT"/>
               </w:rPr>
-              <w:t xml:space="preserve">Gestione del calendario (vista Medico). Il medico accede con i propri privilegi (RBAC in Spring Security) e visualizza esclusivamente gli appuntamenti a lui assegnati, con la possibilità di aggiornarne lo stato a “Completato” e di caricare il referto corrispondente.</w:t>
-            </w:r>
-          </w:p>
-          <w:p>
-            <w:pPr>
-              <w:spacing w:after="0"/>
-            </w:pPr>
-          </w:p>
-          <w:p>
-            <w:pPr>
-              <w:shd w:val="clear" w:color="auto" w:fill="FFF2CC"/>
+              <w:t xml:space="preserve">Gestione del calendario (vista Medico). Il medico accede con i propri privilegi (RBAC in Spring Security) e visualizza esclusivamente gli appuntamenti a lui assegnati, con la possibilità di completarli, annullarli, modificarli e prescrivere una terapia. Il referto è caricato dal paziente: il medico ne consulta i dati e aggiunge le note conclusive, con le quali la visita risulta completata. Sotto, la sezione «I miei slot» per dichiarare la propria disponibilità.</w:t>
+            </w:r>
+          </w:p>
+          <w:p>
+            <w:pPr>
+              <w:spacing w:after="0"/>
+            </w:pPr>
+          </w:p>
+          <w:p>
+            <w:pPr>
+              <w:keepNext/>
+              <w:spacing w:before="120" w:after="0"/>
               <w:jc w:val="center"/>
-              <w:rPr>
-                <w:rFonts w:ascii="Times New Roman" w:hAnsi="Times New Roman" w:cs="Times New Roman"/>
-                <w:b/>
-                <w:sz w:val="24"/>
-                <w:szCs w:val="24"/>
-                <w:lang w:val="it-IT"/>
-              </w:rPr>
-            </w:pPr>
-            <w:r>
-              <w:rPr>
-                <w:rFonts w:ascii="Times New Roman" w:hAnsi="Times New Roman" w:cs="Times New Roman"/>
-                <w:b/>
-                <w:color w:val="C00000"/>
-                <w:sz w:val="24"/>
-                <w:szCs w:val="24"/>
-                <w:lang w:val="it-IT"/>
-              </w:rPr>
-              <w:t xml:space="preserve">[INSERIRE QUI SCREENSHOT — Interfaccia Swagger UI con endpoint testati]</w:t>
+            </w:pPr>
+            <w:r>
+              <w:drawing>
+                <wp:inline distT="0" distB="0" distL="0" distR="0">
+                  <wp:extent cx="5400000" cy="3750000"/>
+                  <wp:effectExtent l="0" t="0" r="0" b="0"/>
+                  <wp:docPr id="5009" name="Immagine 5009" descr="Swagger UI"/>
+                  <wp:cNvGraphicFramePr>
+                    <a:graphicFrameLocks xmlns:a="http://schemas.openxmlformats.org/drawingml/2006/main" noChangeAspect="1"/>
+                  </wp:cNvGraphicFramePr>
+                  <a:graphic xmlns:a="http://schemas.openxmlformats.org/drawingml/2006/main">
+                    <a:graphicData uri="http://schemas.openxmlformats.org/drawingml/2006/picture">
+                      <pic:pic xmlns:pic="http://schemas.openxmlformats.org/drawingml/2006/picture">
+                        <pic:nvPicPr>
+                          <pic:cNvPr id="0" name="image34.png"/>
+                          <pic:cNvPicPr/>
+                        </pic:nvPicPr>
+                        <pic:blipFill>
+                          <a:blip r:embed="rId81"/>
+                          <a:stretch>
+                            <a:fillRect/>
+                          </a:stretch>
+                        </pic:blipFill>
+                        <pic:spPr>
+                          <a:xfrm>
+                            <a:off x="0" y="0"/>
+                            <a:ext cx="5400000" cy="3750000"/>
+                          </a:xfrm>
+                          <a:prstGeom prst="rect">
+                            <a:avLst/>
+                          </a:prstGeom>
+                        </pic:spPr>
+                      </pic:pic>
+                    </a:graphicData>
+                  </a:graphic>
+                </wp:inline>
+              </w:drawing>
             </w:r>
           </w:p>
           <w:p>
@@ -7537,7 +9715,226 @@
                 <w:szCs w:val="22"/>
                 <w:lang w:val="it-IT"/>
               </w:rPr>
-              <w:t xml:space="preserve">Test delle API (Swagger UI). Le API sono state testate direttamente dall’interfaccia interattiva esposta su /swagger-ui.html: lo screenshot documenta la creazione di una risorsa e il recupero dei dati correlati, a conferma che la documentazione generata automaticamente corrisponde esattamente al comportamento reale degli endpoint.</w:t>
+              <w:t xml:space="preserve">Documentazione delle API (Swagger UI), generata a runtime: un gruppo per ciascuno dei nove controller (40 operazioni). Poiché il documento OpenAPI non dichiara uno schema di sicurezza, dalla UI non è possibile inviare il token JWT: gli endpoint protetti sono stati verificati con chiamate HTTP dirette (45 verifiche con utenti di ruoli diversi, tra cui i casi negativi di accesso a risorse altrui e i due passaggi della 2FA).</w:t>
+            </w:r>
+          </w:p>
+          <w:p>
+            <w:pPr>
+              <w:keepNext/>
+              <w:spacing w:before="120" w:after="0"/>
+              <w:jc w:val="center"/>
+            </w:pPr>
+            <w:r>
+              <w:drawing>
+                <wp:inline distT="0" distB="0" distL="0" distR="0">
+                  <wp:extent cx="5400000" cy="3435000"/>
+                  <wp:effectExtent l="0" t="0" r="0" b="0"/>
+                  <wp:docPr id="5010" name="Immagine 5010" descr="Area assistenza del paziente"/>
+                  <wp:cNvGraphicFramePr>
+                    <a:graphicFrameLocks xmlns:a="http://schemas.openxmlformats.org/drawingml/2006/main" noChangeAspect="1"/>
+                  </wp:cNvGraphicFramePr>
+                  <a:graphic xmlns:a="http://schemas.openxmlformats.org/drawingml/2006/main">
+                    <a:graphicData uri="http://schemas.openxmlformats.org/drawingml/2006/picture">
+                      <pic:pic xmlns:pic="http://schemas.openxmlformats.org/drawingml/2006/picture">
+                        <pic:nvPicPr>
+                          <pic:cNvPr id="0" name="image35.png"/>
+                          <pic:cNvPicPr/>
+                        </pic:nvPicPr>
+                        <pic:blipFill>
+                          <a:blip r:embed="rId82"/>
+                          <a:stretch>
+                            <a:fillRect/>
+                          </a:stretch>
+                        </pic:blipFill>
+                        <pic:spPr>
+                          <a:xfrm>
+                            <a:off x="0" y="0"/>
+                            <a:ext cx="5400000" cy="3435000"/>
+                          </a:xfrm>
+                          <a:prstGeom prst="rect">
+                            <a:avLst/>
+                          </a:prstGeom>
+                        </pic:spPr>
+                      </pic:pic>
+                    </a:graphicData>
+                  </a:graphic>
+                </wp:inline>
+              </w:drawing>
+            </w:r>
+          </w:p>
+          <w:p>
+            <w:pPr>
+              <w:spacing w:before="40" w:after="200"/>
+              <w:rPr>
+                <w:rFonts w:ascii="Times New Roman" w:hAnsi="Times New Roman" w:cs="Times New Roman"/>
+                <w:i/>
+                <w:sz w:val="22"/>
+                <w:szCs w:val="22"/>
+                <w:lang w:val="it-IT"/>
+              </w:rPr>
+            </w:pPr>
+            <w:r>
+              <w:rPr>
+                <w:rFonts w:ascii="Times New Roman" w:hAnsi="Times New Roman" w:cs="Times New Roman"/>
+                <w:i/>
+                <w:sz w:val="22"/>
+                <w:szCs w:val="22"/>
+                <w:lang w:val="it-IT"/>
+              </w:rPr>
+              <w:t xml:space="preserve">Area «Assistenza» (vista Paziente): il form «Nuova segnalazione» e l’elenco dei ticket già aperti con il relativo stato.</w:t>
+            </w:r>
+          </w:p>
+          <w:p>
+            <w:pPr>
+              <w:keepNext/>
+              <w:spacing w:before="120" w:after="0"/>
+              <w:jc w:val="center"/>
+            </w:pPr>
+            <w:r>
+              <w:drawing>
+                <wp:inline distT="0" distB="0" distL="0" distR="0">
+                  <wp:extent cx="3600000" cy="3736526"/>
+                  <wp:effectExtent l="0" t="0" r="0" b="0"/>
+                  <wp:docPr id="5011" name="Immagine 5011" descr="Dati estratti e note del medico"/>
+                  <wp:cNvGraphicFramePr>
+                    <a:graphicFrameLocks xmlns:a="http://schemas.openxmlformats.org/drawingml/2006/main" noChangeAspect="1"/>
+                  </wp:cNvGraphicFramePr>
+                  <a:graphic xmlns:a="http://schemas.openxmlformats.org/drawingml/2006/main">
+                    <a:graphicData uri="http://schemas.openxmlformats.org/drawingml/2006/picture">
+                      <pic:pic xmlns:pic="http://schemas.openxmlformats.org/drawingml/2006/picture">
+                        <pic:nvPicPr>
+                          <pic:cNvPr id="0" name="image36.png"/>
+                          <pic:cNvPicPr/>
+                        </pic:nvPicPr>
+                        <pic:blipFill>
+                          <a:blip r:embed="rId83"/>
+                          <a:stretch>
+                            <a:fillRect/>
+                          </a:stretch>
+                        </pic:blipFill>
+                        <pic:spPr>
+                          <a:xfrm>
+                            <a:off x="0" y="0"/>
+                            <a:ext cx="3600000" cy="3736526"/>
+                          </a:xfrm>
+                          <a:prstGeom prst="rect">
+                            <a:avLst/>
+                          </a:prstGeom>
+                        </pic:spPr>
+                      </pic:pic>
+                    </a:graphicData>
+                  </a:graphic>
+                </wp:inline>
+              </w:drawing>
+            </w:r>
+          </w:p>
+          <w:p>
+            <w:pPr>
+              <w:spacing w:before="40" w:after="200"/>
+              <w:rPr>
+                <w:rFonts w:ascii="Times New Roman" w:hAnsi="Times New Roman" w:cs="Times New Roman"/>
+                <w:i/>
+                <w:sz w:val="22"/>
+                <w:szCs w:val="22"/>
+                <w:lang w:val="it-IT"/>
+              </w:rPr>
+            </w:pPr>
+            <w:r>
+              <w:rPr>
+                <w:rFonts w:ascii="Times New Roman" w:hAnsi="Times New Roman" w:cs="Times New Roman"/>
+                <w:i/>
+                <w:sz w:val="22"/>
+                <w:szCs w:val="22"/>
+                <w:lang w:val="it-IT"/>
+              </w:rPr>
+              <w:t xml:space="preserve">Referto di una visita completata: dati estratti dall’agente (simulati, come discusso tra i limiti) e note conclusive del medico. Nella schermata reale l’anteprima del PDF, a sinistra, non è funzionante ed è stata esclusa dall’immagine.</w:t>
+            </w:r>
+          </w:p>
+          <w:p>
+            <w:pPr>
+              <w:keepNext/>
+              <w:spacing w:before="120" w:after="0"/>
+              <w:jc w:val="center"/>
+            </w:pPr>
+            <w:r>
+              <w:drawing>
+                <wp:inline distT="0" distB="0" distL="0" distR="0">
+                  <wp:extent cx="5400000" cy="3435000"/>
+                  <wp:effectExtent l="0" t="0" r="0" b="0"/>
+                  <wp:docPr id="5012" name="Immagine 5012" descr="Pannello di supporto"/>
+                  <wp:cNvGraphicFramePr>
+                    <a:graphicFrameLocks xmlns:a="http://schemas.openxmlformats.org/drawingml/2006/main" noChangeAspect="1"/>
+                  </wp:cNvGraphicFramePr>
+                  <a:graphic xmlns:a="http://schemas.openxmlformats.org/drawingml/2006/main">
+                    <a:graphicData uri="http://schemas.openxmlformats.org/drawingml/2006/picture">
+                      <pic:pic xmlns:pic="http://schemas.openxmlformats.org/drawingml/2006/picture">
+                        <pic:nvPicPr>
+                          <pic:cNvPr id="0" name="image37.png"/>
+                          <pic:cNvPicPr/>
+                        </pic:nvPicPr>
+                        <pic:blipFill>
+                          <a:blip r:embed="rId84"/>
+                          <a:stretch>
+                            <a:fillRect/>
+                          </a:stretch>
+                        </pic:blipFill>
+                        <pic:spPr>
+                          <a:xfrm>
+                            <a:off x="0" y="0"/>
+                            <a:ext cx="5400000" cy="3435000"/>
+                          </a:xfrm>
+                          <a:prstGeom prst="rect">
+                            <a:avLst/>
+                          </a:prstGeom>
+                        </pic:spPr>
+                      </pic:pic>
+                    </a:graphicData>
+                  </a:graphic>
+                </wp:inline>
+              </w:drawing>
+            </w:r>
+          </w:p>
+          <w:p>
+            <w:pPr>
+              <w:spacing w:before="40" w:after="200"/>
+              <w:rPr>
+                <w:rFonts w:ascii="Times New Roman" w:hAnsi="Times New Roman" w:cs="Times New Roman"/>
+                <w:i/>
+                <w:sz w:val="22"/>
+                <w:szCs w:val="22"/>
+                <w:lang w:val="it-IT"/>
+              </w:rPr>
+            </w:pPr>
+            <w:r>
+              <w:rPr>
+                <w:rFonts w:ascii="Times New Roman" w:hAnsi="Times New Roman" w:cs="Times New Roman"/>
+                <w:i/>
+                <w:sz w:val="22"/>
+                <w:szCs w:val="22"/>
+                <w:lang w:val="it-IT"/>
+              </w:rPr>
+              <w:t xml:space="preserve">Pannello di supporto (vista Supporto): statistiche globali, gestione di tutti gli appuntamenti e dei ticket con filtri per stato.</w:t>
+            </w:r>
+          </w:p>
+          <w:p>
+            <w:pPr>
+              <w:spacing w:after="160"/>
+              <w:jc w:val="both"/>
+              <w:rPr>
+                <w:rFonts w:ascii="Times New Roman" w:hAnsi="Times New Roman" w:cs="Times New Roman"/>
+                <w:sz w:val="28"/>
+                <w:szCs w:val="28"/>
+                <w:lang w:val="it-IT"/>
+              </w:rPr>
+            </w:pPr>
+            <w:r>
+              <w:rPr>
+                <w:rFonts w:ascii="Times New Roman" w:hAnsi="Times New Roman" w:cs="Times New Roman"/>
+                <w:sz w:val="28"/>
+                <w:szCs w:val="28"/>
+                <w:lang w:val="it-IT"/>
+              </w:rPr>
+              <w:t xml:space="preserve">Verifiche end-to-end sull’API. Oltre agli screenshot ho eseguito 45 chiamate HTTP contro il backend reale con utenti di ruoli diversi, usando uno script che calcola anche il codice TOTP secondo RFC 6238 per esercitare davvero i due passaggi della 2FA. 44 verifiche hanno prodotto l’esito previsto e una un codice di stato diverso da quello atteso (la creazione di una terapia risponde 200 anziché 201). Tra i casi verificati: un paziente non può leggere le visite di un altro paziente, aprire ticket a nome altrui né scaricare referti altrui (403); un medico non può scaricare il referto di una visita non sua né creare slot a nome di un altro medico (403); un paziente può cancellare la propria visita ma non segnarla come completata; il caricamento di un file che non è un PDF è rifiutato (400); un batch di slot sovrapposto a slot esistenti ne crea 2 e ne segnala 2 come saltati; il login con 2FA richiede due passaggi, il primo senza token e il secondo con un codice TOTP valido, e rifiuta un codice errato (400). Il dettaglio è nel capitolo 6 della documentazione tecnica (doc/6-Test_Funzionali.md).</w:t>
             </w:r>
           </w:p>
           <w:p>
@@ -7857,7 +10254,7 @@
                 <w:szCs w:val="28"/>
                 <w:lang w:val="it-IT"/>
               </w:rPr>
-              <w:t xml:space="preserve">Il progetto raggiunge gli obiettivi specifici definiti in fase di pianificazione: l’API RESTful è completa e documentata automaticamente, ogni endpoint sensibile richiede autenticazione e verifica di ownership (incluso l’endpoint di creazione dei ticket, corretto come descritto nella Parte Seconda), l’interfaccia utente copre l’intero flusso di prenotazione senza richiedere competenze tecniche, e la copertura di test è misurata oggettivamente anziché semplicemente dichiarata: al momento della stesura di questa relazione la suite di backend conta 137 test JUnit e la suite di frontend 99 test Karma/Jasmine, tutti superati.</w:t>
+              <w:t xml:space="preserve">Il progetto raggiunge gli obiettivi specifici definiti in fase di pianificazione: l’API RESTful è completa e documentata automaticamente, ogni endpoint sensibile richiede autenticazione e verifica di ownership (incluso l’endpoint di creazione dei ticket, corretto come descritto nella Parte Seconda), l’interfaccia utente copre l’intero flusso di prenotazione senza richiedere competenze tecniche, e la copertura di test è misurata oggettivamente anziché semplicemente dichiarata: al momento della stesura di questa relazione la suite di backend conta 137 test JUnit e la suite di frontend 99 test Karma/Jasmine, tutti superati. Le coperture misurate sono dell’82,3 % delle righe sul backend e del 38,6 % sul frontend.</w:t>
             </w:r>
           </w:p>
           <w:p>
@@ -7920,7 +10317,7 @@
                 <w:szCs w:val="28"/>
                 <w:lang w:val="it-IT"/>
               </w:rPr>
-              <w:t xml:space="preserve">Un terzo limite riguarda la containerizzazione: il Dockerfile combinato mantenuto in root espone esclusivamente il jar Spring Boot su porta 8080, mentre il build Angular non viene copiato in un’immagine servita staticamente (ad esempio tramite Nginx). I due Dockerfile dedicati (backend/Dockerfile e frontend/Dockerfile) risolvono singolarmente questo limite, ma un deployment realmente “a container” dell’intero stack richiederebbe di orchestrarli insieme tramite docker-compose, come già previsto nel repository per l’ambiente di test.</w:t>
+              <w:t xml:space="preserve">Un terzo limite riguarda il deployment. Sono disponibili tre modalità di esecuzione: sviluppo con backend e frontend separati, Docker Compose con il frontend servito da Nginx e un’immagine unica in cui il backend serve anche la SPA incorporata. Le due configurazioni Docker sono state rilette e allineate al codice ma non ricostruite durante la verifica finale (Docker non era disponibile nell’ambiente), e l’immagine unica non gestisce il refresh del browser sulle rotte profonde di Angular, che richiederebbe un forward lato Spring o una regola di rewrite.</w:t>
             </w:r>
           </w:p>
           <w:p>
@@ -7962,7 +10359,28 @@
                 <w:szCs w:val="28"/>
                 <w:lang w:val="it-IT"/>
               </w:rPr>
-              <w:t xml:space="preserve">Nel complesso, ritengo che il prodotto rispetti ed estenda le richieste essenziali della traccia, aggiungendo un livello di sicurezza (autenticazione a due fattori, RBAC con ownership a grana fine) superiore al minimo richiesto dalla consegna, e che i limiti individuati siano per lo più conseguenze consapevoli di scelte di scope appropriate a un progetto universitario (database in-memory, mock di estrazione dati, assenza di deploy continuo) piuttosto che difetti di progettazione. Ho scelto di dichiararli esplicitamente in questa sezione, invece di ometterli, proprio per dimostrare la consapevolezza critica maturata rispetto al lavoro svolto: riconoscere i limiti di ciò che si è realizzato è parte integrante, a mio avviso, della competenza tecnica che questo Project Work intende valutare.</w:t>
+              <w:t xml:space="preserve">Durante la verifica finale, eseguendo l’applicazione e non solo i test, sono emersi anche difetti che vanno dichiarati come tali e non presentati come scelte progettuali. Primo: Spring Security risponde 403 anziché 401 per un token assente o scaduto, per cui il logout automatico dell’interceptor Angular non si attiva. Secondo: l’anteprima e il download del PDF del referto dal browser non funzionano, perché puntano direttamente all’URL dell’endpoint, che richiede l’header Authorization che una semplice navigazione non invia. Terzo: la creazione di un appuntamento non impedisce la doppia prenotazione dello stesso orario, perché la disponibilità degli slot è controllata solo in lettura. Quarto: la generazione del segreto della 2FA sostituisce quello esistente senza richiedere il codice corrente e la 2FA non può essere disattivata. Si aggiunge che la configurazione è quella di sviluppo (CORS aperto a qualunque origine, chiave di firma JWT di default, console H2 raggiungibile) e va resa più rigorosa prima di un uso reale. Ciascun difetto ha una correzione circoscritta, descritta con la relativa gravità nel capitolo 9 della documentazione tecnica (doc/9-Valutazione_Risultati.md).</w:t>
+            </w:r>
+          </w:p>
+          <w:p>
+            <w:pPr>
+              <w:spacing w:after="160"/>
+              <w:jc w:val="both"/>
+              <w:rPr>
+                <w:rFonts w:ascii="Times New Roman" w:hAnsi="Times New Roman" w:cs="Times New Roman"/>
+                <w:sz w:val="28"/>
+                <w:szCs w:val="28"/>
+                <w:lang w:val="it-IT"/>
+              </w:rPr>
+            </w:pPr>
+            <w:r>
+              <w:rPr>
+                <w:rFonts w:ascii="Times New Roman" w:hAnsi="Times New Roman" w:cs="Times New Roman"/>
+                <w:sz w:val="28"/>
+                <w:szCs w:val="28"/>
+                <w:lang w:val="it-IT"/>
+              </w:rPr>
+              <w:t xml:space="preserve">Nel complesso, ritengo che il prodotto rispetti ed estenda le richieste essenziali della traccia, aggiungendo un livello di sicurezza (autenticazione a due fattori, RBAC con ownership a grana fine) superiore al minimo richiesto dalla consegna, e che i limiti individuati siano per lo più conseguenze consapevoli di scelte di scope appropriate a un progetto universitario (database in-memory, mock di estrazione dati, assenza di deploy continuo) piuttosto che difetti di progettazione. Ho scelto di dichiararli esplicitamente in questa sezione, invece di ometterli, proprio per dimostrare la consapevolezza critica maturata rispetto al lavoro svolto: riconoscere i limiti di ciò che si è realizzato è parte integrante, a mio avviso, della competenza tecnica che questo Project Work intende valutare. Fanno eccezione i difetti elencati poco sopra, emersi solo eseguendo l’applicazione: sono errori da correggere, non scelte di scope.</w:t>
             </w:r>
           </w:p>
         </w:tc>

</xml_diff>

<commit_message>
Aggiornata la documentazione del progetto HealthCare Plus: rimosso REPORT.md, aggiunti dettagli sulla digitalizzazione dell'impresa e valore per l'organizzazione in 1-Contesto_e_Servizi.md, chiarito il design UML e ER in 2-Design_Architetturale.md, specificato il repository Git in 4-Repository_Git.md, descritte le risorse utilizzate in 8-Risorse_Utilizzate.md, e aggiunta la rispondenza alla traccia in 9-Valutazione_Risultati.md. Rimosso pom.xml non più necessario.
</commit_message>
<xml_diff>
--- a/HealthCarePlus_ProjectWork_L31.docx
+++ b/HealthCarePlus_ProjectWork_L31.docx
@@ -836,12 +836,12 @@
             <w:r>
               <w:rPr>
                 <w:rFonts w:ascii="Times New Roman" w:hAnsi="Times New Roman" w:cs="Times New Roman"/>
-                <w:color w:val="FF0000"/>
+                <w:color w:val="000000"/>
                 <w:sz w:val="24"/>
                 <w:szCs w:val="24"/>
                 <w:lang w:val="it-IT"/>
               </w:rPr>
-              <w:t xml:space="preserve">[INSERIRE NUMERO TEMA]</w:t>
+              <w:t xml:space="preserve">1</w:t>
             </w:r>
           </w:p>
         </w:tc>
@@ -924,12 +924,12 @@
             <w:r>
               <w:rPr>
                 <w:rFonts w:ascii="Times New Roman" w:hAnsi="Times New Roman" w:cs="Times New Roman"/>
-                <w:color w:val="FF0000"/>
+                <w:color w:val="000000"/>
                 <w:sz w:val="24"/>
                 <w:szCs w:val="24"/>
                 <w:lang w:val="it-IT"/>
               </w:rPr>
-              <w:t xml:space="preserve">[INSERIRE TITOLO DEL TEMA]</w:t>
+              <w:t xml:space="preserve">La digitalizzazione dell’impresa</w:t>
             </w:r>
           </w:p>
         </w:tc>
@@ -1100,12 +1100,12 @@
             <w:r>
               <w:rPr>
                 <w:rFonts w:ascii="Times New Roman" w:hAnsi="Times New Roman" w:cs="Times New Roman"/>
-                <w:color w:val="FF0000"/>
+                <w:color w:val="000000"/>
                 <w:sz w:val="24"/>
                 <w:szCs w:val="24"/>
                 <w:lang w:val="it-IT"/>
               </w:rPr>
-              <w:t xml:space="preserve">[DA CONFERMARE] Progettazione e sviluppo di un servizio digitale per un’organizzazione operante nel settore sanitario</w:t>
+              <w:t xml:space="preserve">Sviluppo di una applicazione full-stack API-based per un’organizzazione del settore sanitario</w:t>
             </w:r>
           </w:p>
         </w:tc>
@@ -1369,112 +1369,253 @@
                 <w:szCs w:val="28"/>
                 <w:lang w:val="it-IT"/>
               </w:rPr>
-              <w:t xml:space="preserve">Per la realizzazione dell’elaborato ho attinto in modo trasversale alle conoscenze e alle abilità maturate lungo l’intero percorso di studio, integrandole però in larga parte con competenze pratiche di progettazione del software, sviluppo frontend e sicurezza informatica già consolidate nella mia attività lavorativa: il percorso universitario mi ha fornito soprattutto le basi teoriche e il linguaggio comune per inquadrare correttamente scelte che, nella pratica quotidiana di lavoro, avevo già imparato a fare per necessità operativa. Il risultato è un prodotto funzionante e non un semplice esercizio didattico isolato, proprio perché costruito con lo stesso approccio che utilizzo abitualmente in un contesto professionale.</w:t>
-            </w:r>
-          </w:p>
-          <w:p>
-            <w:pPr>
-              <w:spacing w:after="160"/>
-              <w:jc w:val="both"/>
-              <w:rPr>
-                <w:rFonts w:ascii="Times New Roman" w:hAnsi="Times New Roman" w:cs="Times New Roman"/>
-                <w:sz w:val="28"/>
-                <w:szCs w:val="28"/>
-                <w:lang w:val="it-IT"/>
-              </w:rPr>
-            </w:pPr>
-            <w:r>
-              <w:rPr>
-                <w:rFonts w:ascii="Times New Roman" w:hAnsi="Times New Roman" w:cs="Times New Roman"/>
-                <w:sz w:val="28"/>
-                <w:szCs w:val="28"/>
-                <w:lang w:val="it-IT"/>
-              </w:rPr>
-              <w:t xml:space="preserve">L’approccio alla progettazione a livelli (Controller → Service → Repository, con i Data Transfer Object come confine esplicito tra livello REST e livello di persistenza) e l’uso consapevole dei design pattern object-oriented sono competenze che ho consolidato soprattutto lavorando su codebase reali in ambito professionale, dove l’assenza di questi confini architetturali si paga rapidamente in termini di manutenibilità: nel backend ho applicato lo Strategy Pattern per gestire le transizioni di stato di appuntamenti e ticket, evitando catene di if/else e rendendo il sistema aperto all’estensione (Open/Closed Principle) senza dover modificare il codice esistente ad ogni nuovo stato introdotto. La stessa esperienza mi ha guidato nella scelta di centralizzare in un unico bean (OwnershipService) le regole di autorizzazione a grana fine, invece di duplicarle in ogni singolo metodo di servizio.</w:t>
-            </w:r>
-          </w:p>
-          <w:p>
-            <w:pPr>
-              <w:spacing w:after="160"/>
-              <w:jc w:val="both"/>
-              <w:rPr>
-                <w:rFonts w:ascii="Times New Roman" w:hAnsi="Times New Roman" w:cs="Times New Roman"/>
-                <w:sz w:val="28"/>
-                <w:szCs w:val="28"/>
-                <w:lang w:val="it-IT"/>
-              </w:rPr>
-            </w:pPr>
-            <w:r>
-              <w:rPr>
-                <w:rFonts w:ascii="Times New Roman" w:hAnsi="Times New Roman" w:cs="Times New Roman"/>
-                <w:sz w:val="28"/>
-                <w:szCs w:val="28"/>
-                <w:lang w:val="it-IT"/>
-              </w:rPr>
-              <w:t xml:space="preserve">Dagli insegnamenti di Basi di Dati ho applicato le tecniche di modellazione Entità-Relazione per rappresentare correttamente il dominio clinico (pazienti, medici, appuntamenti, referti, terapie, ticket, slot orari) e i relativi vincoli di integrità referenziale, poi tradotti in entità JPA con Spring Data. In particolare ho dovuto ragionare sulla cardinalità opzionale tra Therapy e Appointment (una terapia può nascere da una visita specifica oppure essere assegnata direttamente, senza passare da un appuntamento puntuale), un caso che in fase di analisi avevo inizialmente modellato come relazione obbligatoria e che ho dovuto rivedere confrontandomi con un caso d’uso reale mancante.</w:t>
-            </w:r>
-          </w:p>
-          <w:p>
-            <w:pPr>
-              <w:spacing w:after="160"/>
-              <w:jc w:val="both"/>
-              <w:rPr>
-                <w:rFonts w:ascii="Times New Roman" w:hAnsi="Times New Roman" w:cs="Times New Roman"/>
-                <w:sz w:val="28"/>
-                <w:szCs w:val="28"/>
-                <w:lang w:val="it-IT"/>
-              </w:rPr>
-            </w:pPr>
-            <w:r>
-              <w:rPr>
-                <w:rFonts w:ascii="Times New Roman" w:hAnsi="Times New Roman" w:cs="Times New Roman"/>
-                <w:sz w:val="28"/>
-                <w:szCs w:val="28"/>
-                <w:lang w:val="it-IT"/>
-              </w:rPr>
-              <w:t xml:space="preserve">Sul fronte della sicurezza, i concetti applicati (autenticazione stateless tramite JSON Web Token, autenticazione a due fattori con TOTP secondo RFC 6238, controllo degli accessi basato sui ruoli e sua estensione con un controllo di ownership a grana fine) derivano solo in parte dagli insegnamenti universitari di base: la capacità di applicarli correttamente in un caso reale come questo l’ho maturata soprattutto nella mia attività lavorativa, dove mi confronto quotidianamente con problemi di autenticazione e autorizzazione su sistemi in produzione. È stata proprio questa esperienza professionale, più che la sola teoria accademica, a permettermi di riconoscere, durante una successiva revisione del codice, un endpoint di scrittura rimasto privo di controlli di autorizzazione: l’episodio è descritto in dettaglio nella Parte Seconda, poiché ritengo sia l’esempio più concreto di come le conoscenze di sicurezza maturate sul lavoro si siano tradotte in una capacità pratica di individuare vulnerabilità nel proprio stesso codice, invece di limitarsi a un elenco di buone pratiche imparate a memoria.</w:t>
-            </w:r>
-          </w:p>
-          <w:p>
-            <w:pPr>
-              <w:spacing w:after="160"/>
-              <w:jc w:val="both"/>
-              <w:rPr>
-                <w:rFonts w:ascii="Times New Roman" w:hAnsi="Times New Roman" w:cs="Times New Roman"/>
-                <w:sz w:val="28"/>
-                <w:szCs w:val="28"/>
-                <w:lang w:val="it-IT"/>
-              </w:rPr>
-            </w:pPr>
-            <w:r>
-              <w:rPr>
-                <w:rFonts w:ascii="Times New Roman" w:hAnsi="Times New Roman" w:cs="Times New Roman"/>
-                <w:sz w:val="28"/>
-                <w:szCs w:val="28"/>
-                <w:lang w:val="it-IT"/>
-              </w:rPr>
-              <w:t xml:space="preserve">Anche l’architettura a componenti standalone di Angular (senza NgModule legacy), la programmazione reattiva con RxJS e soprattutto il pattern degli interceptor HTTP per centralizzare la gestione di autenticazione, errori e stato di caricamento sono competenze che uso quotidianamente al lavoro più che concetti appresi per la prima volta durante il corso di studi: la gestione lato client del token JWT (dove allegarlo, come intercettare una risposta 401 e disconnettere l’utente, come evitare di propagarlo verso domini esterni) è un problema che avevo già affrontato più volte in ambito professionale, ed è questa esperienza pregressa ad avermi permesso di implementarlo qui senza tentativi ed errori. Ho inoltre applicato le guardie di instradamento (route guard) per riflettere lato client le stesse regole di RBAC già imposte lato server, così da offrire un feedback immediato all’utente senza però mai considerarlo un sostituto del controllo server-side, che resta l’unica barriera di sicurezza realmente affidabile — una distinzione, tra sicurezza “percepita” lato client e sicurezza reale lato server, che ritengo di aver interiorizzato proprio grazie al lavoro più che allo studio teorico.</w:t>
-            </w:r>
-          </w:p>
-          <w:p>
-            <w:pPr>
-              <w:spacing w:after="160"/>
-              <w:jc w:val="both"/>
-              <w:rPr>
-                <w:rFonts w:ascii="Times New Roman" w:hAnsi="Times New Roman" w:cs="Times New Roman"/>
-                <w:sz w:val="28"/>
-                <w:szCs w:val="28"/>
-                <w:lang w:val="it-IT"/>
-              </w:rPr>
-            </w:pPr>
-            <w:r>
-              <w:rPr>
-                <w:rFonts w:ascii="Times New Roman" w:hAnsi="Times New Roman" w:cs="Times New Roman"/>
-                <w:sz w:val="28"/>
-                <w:szCs w:val="28"/>
-                <w:lang w:val="it-IT"/>
-              </w:rPr>
-              <w:t xml:space="preserve">Infine, dagli insegnamenti di metodologie di sviluppo Agile ho ripreso l’approccio incrementale a fasi verificabili, con l’adozione di una pipeline di integrazione continua (GitHub Actions) che automatizza build e test ad ogni modifica, e l’abitudine a mantenere allineati codice e documentazione ad ogni cambiamento significativo: quest’ultima abitudine si è rivelata particolarmente utile quando ho rimosso un’integrazione esterna non più necessaria (descritta più avanti), poiché mi ha imposto di verificare sistematicamente, file per file, quali altre parti del sistema la referenziassero prima di poterla considerare rimossa senza lasciare riferimenti pendenti.</w:t>
+              <w:t xml:space="preserve">Per realizzare l’elaborato ho usato le conoscenze maturate durante il percorso di studio, integrandole con competenze acquisite nella mia attività lavorativa. Le indico di seguito per ambito.</w:t>
+            </w:r>
+          </w:p>
+          <w:p>
+            <w:pPr>
+              <w:spacing w:after="80"/>
+              <w:ind w:left="360" w:hanging="360"/>
+              <w:jc w:val="both"/>
+              <w:rPr>
+                <w:rFonts w:ascii="Times New Roman" w:hAnsi="Times New Roman" w:cs="Times New Roman"/>
+                <w:sz w:val="28"/>
+                <w:szCs w:val="28"/>
+                <w:lang w:val="it-IT"/>
+              </w:rPr>
+            </w:pPr>
+            <w:r>
+              <w:rPr>
+                <w:rFonts w:ascii="Times New Roman" w:hAnsi="Times New Roman" w:cs="Times New Roman"/>
+                <w:sz w:val="28"/>
+                <w:szCs w:val="28"/>
+                <w:lang w:val="it-IT"/>
+              </w:rPr>
+              <w:t xml:space="preserve">– </w:t>
+            </w:r>
+            <w:r>
+              <w:rPr>
+                <w:rFonts w:ascii="Times New Roman" w:hAnsi="Times New Roman" w:cs="Times New Roman"/>
+                <w:b/>
+                <w:sz w:val="28"/>
+                <w:szCs w:val="28"/>
+                <w:lang w:val="it-IT"/>
+              </w:rPr>
+              <w:t xml:space="preserve">Basi di Dati.</w:t>
+            </w:r>
+            <w:r>
+              <w:rPr>
+                <w:rFonts w:ascii="Times New Roman" w:hAnsi="Times New Roman" w:cs="Times New Roman"/>
+                <w:sz w:val="28"/>
+                <w:szCs w:val="28"/>
+                <w:lang w:val="it-IT"/>
+              </w:rPr>
+              <w:t xml:space="preserve"> Ho modellato il dominio clinico (pazienti, medici, appuntamenti, referti, terapie, ticket, slot orari) con il modello Entità-Relazione e ne ho definito i vincoli di integrità referenziale, poi tradotti in entità JPA. Due scelte nascono da qui: la relazione tra terapia e appuntamento, inizialmente obbligatoria e resa facoltativa dopo aver considerato il caso di una terapia prescritta senza una visita precisa; e la disponibilità degli slot, che non è salvata ma calcolata a lettura, per non avere due tabelle da tenere allineate.</w:t>
+            </w:r>
+          </w:p>
+          <w:p>
+            <w:pPr>
+              <w:spacing w:after="80"/>
+              <w:ind w:left="360" w:hanging="360"/>
+              <w:jc w:val="both"/>
+              <w:rPr>
+                <w:rFonts w:ascii="Times New Roman" w:hAnsi="Times New Roman" w:cs="Times New Roman"/>
+                <w:sz w:val="28"/>
+                <w:szCs w:val="28"/>
+                <w:lang w:val="it-IT"/>
+              </w:rPr>
+            </w:pPr>
+            <w:r>
+              <w:rPr>
+                <w:rFonts w:ascii="Times New Roman" w:hAnsi="Times New Roman" w:cs="Times New Roman"/>
+                <w:sz w:val="28"/>
+                <w:szCs w:val="28"/>
+                <w:lang w:val="it-IT"/>
+              </w:rPr>
+              <w:t xml:space="preserve">– </w:t>
+            </w:r>
+            <w:r>
+              <w:rPr>
+                <w:rFonts w:ascii="Times New Roman" w:hAnsi="Times New Roman" w:cs="Times New Roman"/>
+                <w:b/>
+                <w:sz w:val="28"/>
+                <w:szCs w:val="28"/>
+                <w:lang w:val="it-IT"/>
+              </w:rPr>
+              <w:t xml:space="preserve">Ingegneria del software e Programmazione a oggetti.</w:t>
+            </w:r>
+            <w:r>
+              <w:rPr>
+                <w:rFonts w:ascii="Times New Roman" w:hAnsi="Times New Roman" w:cs="Times New Roman"/>
+                <w:sz w:val="28"/>
+                <w:szCs w:val="28"/>
+                <w:lang w:val="it-IT"/>
+              </w:rPr>
+              <w:t xml:space="preserve"> Ho progettato il backend a livelli (Controller → Service → Repository, con i Data Transfer Object come confine tra REST e persistenza). Ho usato lo Strategy pattern per le transizioni di stato di appuntamenti e ticket, così che un nuovo stato si aggiunga senza modificare il codice esistente (Open/Closed Principle), e ho raccolto in un solo componente (OwnershipService) le regole di autorizzazione a grana fine, invece di duplicarle nei servizi.</w:t>
+            </w:r>
+          </w:p>
+          <w:p>
+            <w:pPr>
+              <w:spacing w:after="80"/>
+              <w:ind w:left="360" w:hanging="360"/>
+              <w:jc w:val="both"/>
+              <w:rPr>
+                <w:rFonts w:ascii="Times New Roman" w:hAnsi="Times New Roman" w:cs="Times New Roman"/>
+                <w:sz w:val="28"/>
+                <w:szCs w:val="28"/>
+                <w:lang w:val="it-IT"/>
+              </w:rPr>
+            </w:pPr>
+            <w:r>
+              <w:rPr>
+                <w:rFonts w:ascii="Times New Roman" w:hAnsi="Times New Roman" w:cs="Times New Roman"/>
+                <w:sz w:val="28"/>
+                <w:szCs w:val="28"/>
+                <w:lang w:val="it-IT"/>
+              </w:rPr>
+              <w:t xml:space="preserve">– </w:t>
+            </w:r>
+            <w:r>
+              <w:rPr>
+                <w:rFonts w:ascii="Times New Roman" w:hAnsi="Times New Roman" w:cs="Times New Roman"/>
+                <w:b/>
+                <w:sz w:val="28"/>
+                <w:szCs w:val="28"/>
+                <w:lang w:val="it-IT"/>
+              </w:rPr>
+              <w:t xml:space="preserve">Sicurezza.</w:t>
+            </w:r>
+            <w:r>
+              <w:rPr>
+                <w:rFonts w:ascii="Times New Roman" w:hAnsi="Times New Roman" w:cs="Times New Roman"/>
+                <w:sz w:val="28"/>
+                <w:szCs w:val="28"/>
+                <w:lang w:val="it-IT"/>
+              </w:rPr>
+              <w:t xml:space="preserve"> Ho applicato l’autenticazione stateless con JSON Web Token, l’autenticazione a due fattori con TOTP (RFC 6238) e il controllo degli accessi per ruolo, esteso con un controllo di proprietà della singola risorsa. Le basi teoriche vengono dal percorso di studio; la capacità di applicarle a un caso reale l’ho maturata soprattutto sul lavoro, ed è stata questa esperienza a farmi riconoscere, in una revisione del codice, un endpoint di scrittura rimasto senza controlli di autorizzazione (descritto nella Parte Seconda).</w:t>
+            </w:r>
+          </w:p>
+          <w:p>
+            <w:pPr>
+              <w:spacing w:after="80"/>
+              <w:ind w:left="360" w:hanging="360"/>
+              <w:jc w:val="both"/>
+              <w:rPr>
+                <w:rFonts w:ascii="Times New Roman" w:hAnsi="Times New Roman" w:cs="Times New Roman"/>
+                <w:sz w:val="28"/>
+                <w:szCs w:val="28"/>
+                <w:lang w:val="it-IT"/>
+              </w:rPr>
+            </w:pPr>
+            <w:r>
+              <w:rPr>
+                <w:rFonts w:ascii="Times New Roman" w:hAnsi="Times New Roman" w:cs="Times New Roman"/>
+                <w:sz w:val="28"/>
+                <w:szCs w:val="28"/>
+                <w:lang w:val="it-IT"/>
+              </w:rPr>
+              <w:t xml:space="preserve">– </w:t>
+            </w:r>
+            <w:r>
+              <w:rPr>
+                <w:rFonts w:ascii="Times New Roman" w:hAnsi="Times New Roman" w:cs="Times New Roman"/>
+                <w:b/>
+                <w:sz w:val="28"/>
+                <w:szCs w:val="28"/>
+                <w:lang w:val="it-IT"/>
+              </w:rPr>
+              <w:t xml:space="preserve">Metodologie Agile (esperienza lavorativa).</w:t>
+            </w:r>
+            <w:r>
+              <w:rPr>
+                <w:rFonts w:ascii="Times New Roman" w:hAnsi="Times New Roman" w:cs="Times New Roman"/>
+                <w:sz w:val="28"/>
+                <w:szCs w:val="28"/>
+                <w:lang w:val="it-IT"/>
+              </w:rPr>
+              <w:t xml:space="preserve"> Ho applicato ciò che uso sul lavoro: un approccio incrementale a fasi verificabili e una pipeline di integrazione continua (GitHub Actions) che esegue build e test a ogni modifica, mantenendo allineati codice e documentazione a ogni cambiamento significativo.</w:t>
+            </w:r>
+          </w:p>
+          <w:p>
+            <w:pPr>
+              <w:spacing w:after="80"/>
+              <w:ind w:left="360" w:hanging="360"/>
+              <w:jc w:val="both"/>
+              <w:rPr>
+                <w:rFonts w:ascii="Times New Roman" w:hAnsi="Times New Roman" w:cs="Times New Roman"/>
+                <w:sz w:val="28"/>
+                <w:szCs w:val="28"/>
+                <w:lang w:val="it-IT"/>
+              </w:rPr>
+            </w:pPr>
+            <w:r>
+              <w:rPr>
+                <w:rFonts w:ascii="Times New Roman" w:hAnsi="Times New Roman" w:cs="Times New Roman"/>
+                <w:sz w:val="28"/>
+                <w:szCs w:val="28"/>
+                <w:lang w:val="it-IT"/>
+              </w:rPr>
+              <w:t xml:space="preserve">– </w:t>
+            </w:r>
+            <w:r>
+              <w:rPr>
+                <w:rFonts w:ascii="Times New Roman" w:hAnsi="Times New Roman" w:cs="Times New Roman"/>
+                <w:b/>
+                <w:sz w:val="28"/>
+                <w:szCs w:val="28"/>
+                <w:lang w:val="it-IT"/>
+              </w:rPr>
+              <w:t xml:space="preserve">Angular (esperienza lavorativa).</w:t>
+            </w:r>
+            <w:r>
+              <w:rPr>
+                <w:rFonts w:ascii="Times New Roman" w:hAnsi="Times New Roman" w:cs="Times New Roman"/>
+                <w:sz w:val="28"/>
+                <w:szCs w:val="28"/>
+                <w:lang w:val="it-IT"/>
+              </w:rPr>
+              <w:t xml:space="preserve"> Ho applicato ciò che uso sul lavoro: componenti standalone, RxJS e interceptor HTTP per autenticazione, errori e stato di caricamento. Le guardie di instradamento rispecchiano i permessi del server solo per dare un riscontro immediato all’utente, perché il controllo affidabile resta lato server.</w:t>
+            </w:r>
+          </w:p>
+          <w:p>
+            <w:pPr>
+              <w:spacing w:after="80"/>
+              <w:ind w:left="360" w:hanging="360"/>
+              <w:jc w:val="both"/>
+              <w:rPr>
+                <w:rFonts w:ascii="Times New Roman" w:hAnsi="Times New Roman" w:cs="Times New Roman"/>
+                <w:sz w:val="28"/>
+                <w:szCs w:val="28"/>
+                <w:lang w:val="it-IT"/>
+              </w:rPr>
+            </w:pPr>
+            <w:r>
+              <w:rPr>
+                <w:rFonts w:ascii="Times New Roman" w:hAnsi="Times New Roman" w:cs="Times New Roman"/>
+                <w:sz w:val="28"/>
+                <w:szCs w:val="28"/>
+                <w:lang w:val="it-IT"/>
+              </w:rPr>
+              <w:t xml:space="preserve">– </w:t>
+            </w:r>
+            <w:r>
+              <w:rPr>
+                <w:rFonts w:ascii="Times New Roman" w:hAnsi="Times New Roman" w:cs="Times New Roman"/>
+                <w:b/>
+                <w:sz w:val="28"/>
+                <w:szCs w:val="28"/>
+                <w:lang w:val="it-IT"/>
+              </w:rPr>
+              <w:t xml:space="preserve">Docker e Swagger (esperienza lavorativa).</w:t>
+            </w:r>
+            <w:r>
+              <w:rPr>
+                <w:rFonts w:ascii="Times New Roman" w:hAnsi="Times New Roman" w:cs="Times New Roman"/>
+                <w:sz w:val="28"/>
+                <w:szCs w:val="28"/>
+                <w:lang w:val="it-IT"/>
+              </w:rPr>
+              <w:t xml:space="preserve"> Ho usato Docker con build multi-stage e Compose per rendere l’ambiente riproducibile, e Swagger/OpenAPI per documentare le API direttamente dal codice.</w:t>
             </w:r>
           </w:p>
           <w:p>
@@ -1708,7 +1849,7 @@
                 <w:szCs w:val="28"/>
                 <w:lang w:val="it-IT"/>
               </w:rPr>
-              <w:t xml:space="preserve">Fase 5 – Documentazione finale (3 giorni): ho scritto la relazione tecnica completa (i nove capitoli disponibili in doc/) e ho effettuato una revisione di coerenza tra la documentazione e il codice realmente presente nel repository, correggendo alcuni riferimenti che nel frattempo erano diventati obsoleti a seguito delle modifiche descritte più avanti. Un ultimo aggiornamento, il 20 settembre 2026, ha ripetuto le verifiche sull’applicazione in esecuzione (test automatici, 45 chiamate end-to-end con utenti di ruoli diversi, screenshot reali) e ha portato alla luce alcuni difetti, descritti tra i limiti nella sezione finale.</w:t>
+              <w:t xml:space="preserve">Fase 5 – Documentazione finale (3 giorni): ho scritto la relazione tecnica completa (i nove capitoli disponibili in doc/) e ho effettuato una revisione di coerenza tra la documentazione e il codice realmente presente nel repository.</w:t>
             </w:r>
           </w:p>
           <w:p>
@@ -1725,11 +1866,21 @@
             <w:r>
               <w:rPr>
                 <w:rFonts w:ascii="Times New Roman" w:hAnsi="Times New Roman" w:cs="Times New Roman"/>
-                <w:sz w:val="28"/>
-                <w:szCs w:val="28"/>
-                <w:lang w:val="it-IT"/>
-              </w:rPr>
-              <w:t xml:space="preserve">Sul metodo di test adottato nella Fase 4 vale la pena una precisazione, poiché riflette una scelta consapevole e non un’omissione: i test dei controller (@WebMvcTest) verificano il comportamento REST — codici di stato, corpo della risposta, validazione dei DTO in ingresso — con i filtri di Spring Security disattivati (addFilters = false), quindi non valutano le regole di autorizzazione (@PreAuthorize). Ho mantenuto questa convenzione, uniforme su tutti i test dei controller, e ho compensato la lacuna in due modi: una classe di test di integrazione (SecurityRbacIntegrationTest, 9 test con contesto Spring completo, filtro di sicurezza e method security attivi) che verifica accesso senza token, ruolo errato, ownership e rotte pubbliche, e verifiche end-to-end eseguite chiamando l’API reale con utenti di ruoli diversi, che tentano di accedere a risorse altrui (45 verifiche, riassunte nella sezione dei test funzionali). Una copertura automatica sistematica di tutte le regole @PreAuthorize resta un’estensione naturale.</w:t>
+                <w:b/>
+                <w:sz w:val="28"/>
+                <w:szCs w:val="28"/>
+                <w:lang w:val="it-IT"/>
+              </w:rPr>
+              <w:t xml:space="preserve">Dipendenze tra le fasi. </w:t>
+            </w:r>
+            <w:r>
+              <w:rPr>
+                <w:rFonts w:ascii="Times New Roman" w:hAnsi="Times New Roman" w:cs="Times New Roman"/>
+                <w:sz w:val="28"/>
+                <w:szCs w:val="28"/>
+                <w:lang w:val="it-IT"/>
+              </w:rPr>
+              <w:t xml:space="preserve">Le fasi non sono indipendenti: la Fase 2 (sicurezza) blocca la Fase 3 (frontend), perché i componenti Angular dipendono da login e token JWT per l’instradamento autenticato; la Fase 4 dipende da tutte le precedenti, poiché i test funzionali richiedono l’intero stack in esecuzione; la Fase 5 va ripetuta a ogni modifica sostanziale del codice per non far divergere la documentazione. Le durate indicate, in totale circa 33 giorni-persona, sono stime di pianificazione per un progetto individuale part-time.</w:t>
             </w:r>
           </w:p>
           <w:p>
@@ -1746,11 +1897,21 @@
             <w:r>
               <w:rPr>
                 <w:rFonts w:ascii="Times New Roman" w:hAnsi="Times New Roman" w:cs="Times New Roman"/>
-                <w:sz w:val="28"/>
-                <w:szCs w:val="28"/>
-                <w:lang w:val="it-IT"/>
-              </w:rPr>
-              <w:t xml:space="preserve">La difficoltà più significativa incontrata durante lo sviluppo è stata di natura architetturale piuttosto che puramente implementativa: nelle fasi iniziali del progetto avevo previsto anche un’integrazione con un servizio esterno, incaricato di aprire automaticamente ticket di supporto per conto dell’utente. Per permettere a questo servizio esterno di aprire ticket per conto dell’utente senza propagare un token JWT delegato, l’endpoint POST /api/tickets era stato lasciato volutamente privo di qualunque restrizione di ruolo (nessuna annotazione @PreAuthorize).</w:t>
+                <w:b/>
+                <w:sz w:val="28"/>
+                <w:szCs w:val="28"/>
+                <w:lang w:val="it-IT"/>
+              </w:rPr>
+              <w:t xml:space="preserve">Calendario effettivo. </w:t>
+            </w:r>
+            <w:r>
+              <w:rPr>
+                <w:rFonts w:ascii="Times New Roman" w:hAnsi="Times New Roman" w:cs="Times New Roman"/>
+                <w:sz w:val="28"/>
+                <w:szCs w:val="28"/>
+                <w:lang w:val="it-IT"/>
+              </w:rPr>
+              <w:t xml:space="preserve">Lo storico Git colloca la prima consegna nel repository al 10 luglio 2026 e l’ultimo aggiornamento al 20 settembre 2026, con 39 commit e 8 pull request integrate. Dopo la prima versione il lavoro è proseguito per iterazioni: integrazione continua e release il 29–31 luglio; controlli di autorizzazione completi, correzione di un accesso non autorizzato ai referti e nuove funzioni per il medico tra il 31 luglio e il 1 agosto; revisione grafica il 13 settembre; verifica finale e aggiornamento della documentazione il 20 settembre. Lo storico registra quando il codice è stato consegnato, non le ore dedicate: il tempo effettivo per ciascuna fase non è ricostruibile con precisione.</w:t>
             </w:r>
           </w:p>
           <w:p>
@@ -1767,11 +1928,21 @@
             <w:r>
               <w:rPr>
                 <w:rFonts w:ascii="Times New Roman" w:hAnsi="Times New Roman" w:cs="Times New Roman"/>
-                <w:sz w:val="28"/>
-                <w:szCs w:val="28"/>
-                <w:lang w:val="it-IT"/>
-              </w:rPr>
-              <w:t xml:space="preserve">Ho successivamente deciso di rimuovere quell’integrazione per concentrare l’elaborato sul nucleo RESTful e di sicurezza effettivamente richiesto dalla traccia, evitando di disperdere l’attenzione della relazione su una funzionalità accessoria. La rimozione ha però reso evidente che quell’endpoint sarebbe rimasto un varco di scrittura non autenticato, utilizzabile da chiunque per creare ticket a nome di un paziente qualsiasi: un rischio concreto che prima era “nascosto” dal fatto che, nella pratica, solo quel servizio lo chiamava. Ho risolto il problema ripristinando un controllo di autorizzazione esplicito (@PreAuthorize con verifica di ownership, descritto nel dettaglio nella Parte Seconda), un intervento che mi ha insegnato quanto un’eccezione di sicurezza introdotta per accomodare un’integrazione esterna debba sempre essere rivista non appena quell’integrazione cambia forma o viene rimossa, e non lasciata semplicemente “com’era”.</w:t>
+                <w:b/>
+                <w:sz w:val="28"/>
+                <w:szCs w:val="28"/>
+                <w:lang w:val="it-IT"/>
+              </w:rPr>
+              <w:t xml:space="preserve">Difficoltà incontrate e come sono state superate.</w:t>
+            </w:r>
+            <w:r>
+              <w:rPr>
+                <w:rFonts w:ascii="Times New Roman" w:hAnsi="Times New Roman" w:cs="Times New Roman"/>
+                <w:sz w:val="28"/>
+                <w:szCs w:val="28"/>
+                <w:lang w:val="it-IT"/>
+              </w:rPr>
+              <w:t xml:space="preserve"> Ne riporto quattro.</w:t>
             </w:r>
           </w:p>
           <w:p>
@@ -1788,11 +1959,114 @@
             <w:r>
               <w:rPr>
                 <w:rFonts w:ascii="Times New Roman" w:hAnsi="Times New Roman" w:cs="Times New Roman"/>
-                <w:sz w:val="28"/>
-                <w:szCs w:val="28"/>
-                <w:lang w:val="it-IT"/>
-              </w:rPr>
-              <w:t xml:space="preserve">Una seconda difficoltà, più circoscritta ma comunque istruttiva, è stata l’effetto “lento” percepito dall’interfaccia a causa delle chiamate HTTP asincrone verso il backend: ogni singola richiesta, anche se completata in pochi millisecondi, faceva comparire e sparire istantaneamente lo spinner di caricamento, dando una sensazione di instabilità visiva. Ho risolto il problema introducendo un LoadingService con un ritardo di attivazione di 300 millisecondi (si veda il codice riportato nella Parte Seconda), così che lo spinner globale compaia solo per le richieste realmente lente, eliminando lo sfarfallio sulle chiamate rapide senza nascondere il feedback di caricamento quando è realmente necessario.</w:t>
+                <w:b/>
+                <w:sz w:val="28"/>
+                <w:szCs w:val="28"/>
+                <w:lang w:val="it-IT"/>
+              </w:rPr>
+              <w:t xml:space="preserve">1) Un endpoint rimasto aperto dopo la rimozione di un’integrazione. </w:t>
+            </w:r>
+            <w:r>
+              <w:rPr>
+                <w:rFonts w:ascii="Times New Roman" w:hAnsi="Times New Roman" w:cs="Times New Roman"/>
+                <w:sz w:val="28"/>
+                <w:szCs w:val="28"/>
+                <w:lang w:val="it-IT"/>
+              </w:rPr>
+              <w:t xml:space="preserve">Nelle fasi iniziali POST /api/tickets era stato lasciato senza restrizioni di ruolo per consentire a un servizio esterno di aprire ticket per conto dell’utente. Quando ho rimosso quell’integrazione per concentrare l’elaborato sul nucleo richiesto dalla traccia, l’endpoint sarebbe rimasto un varco di scrittura aperto a chiunque. L’ho risolto ripristinando un controllo con @PreAuthorize e verifica di ownership e ho controllato una per una tutte le annotazioni dei controller (dettaglio nella descrizione degli aspetti progettuali).</w:t>
+            </w:r>
+          </w:p>
+          <w:p>
+            <w:pPr>
+              <w:spacing w:after="160"/>
+              <w:jc w:val="both"/>
+              <w:rPr>
+                <w:rFonts w:ascii="Times New Roman" w:hAnsi="Times New Roman" w:cs="Times New Roman"/>
+                <w:sz w:val="28"/>
+                <w:szCs w:val="28"/>
+                <w:lang w:val="it-IT"/>
+              </w:rPr>
+            </w:pPr>
+            <w:r>
+              <w:rPr>
+                <w:rFonts w:ascii="Times New Roman" w:hAnsi="Times New Roman" w:cs="Times New Roman"/>
+                <w:b/>
+                <w:sz w:val="28"/>
+                <w:szCs w:val="28"/>
+                <w:lang w:val="it-IT"/>
+              </w:rPr>
+              <w:t xml:space="preserve">2) Uno spinner di caricamento che «sfarfalla». </w:t>
+            </w:r>
+            <w:r>
+              <w:rPr>
+                <w:rFonts w:ascii="Times New Roman" w:hAnsi="Times New Roman" w:cs="Times New Roman"/>
+                <w:sz w:val="28"/>
+                <w:szCs w:val="28"/>
+                <w:lang w:val="it-IT"/>
+              </w:rPr>
+              <w:t xml:space="preserve">Ogni chiamata HTTP, anche veloce, faceva comparire e sparire lo spinner, dando l’impressione di un’interfaccia lenta e instabile. L’ho risolto con un LoadingService che attende 300 ms prima di mostrarlo, così compare solo per le richieste realmente lente.</w:t>
+            </w:r>
+          </w:p>
+          <w:p>
+            <w:pPr>
+              <w:spacing w:after="160"/>
+              <w:jc w:val="both"/>
+              <w:rPr>
+                <w:rFonts w:ascii="Times New Roman" w:hAnsi="Times New Roman" w:cs="Times New Roman"/>
+                <w:sz w:val="28"/>
+                <w:szCs w:val="28"/>
+                <w:lang w:val="it-IT"/>
+              </w:rPr>
+            </w:pPr>
+            <w:r>
+              <w:rPr>
+                <w:rFonts w:ascii="Times New Roman" w:hAnsi="Times New Roman" w:cs="Times New Roman"/>
+                <w:b/>
+                <w:sz w:val="28"/>
+                <w:szCs w:val="28"/>
+                <w:lang w:val="it-IT"/>
+              </w:rPr>
+              <w:t xml:space="preserve">3) L’autenticazione a due fattori senza sessione. </w:t>
+            </w:r>
+            <w:r>
+              <w:rPr>
+                <w:rFonts w:ascii="Times New Roman" w:hAnsi="Times New Roman" w:cs="Times New Roman"/>
+                <w:sz w:val="28"/>
+                <w:szCs w:val="28"/>
+                <w:lang w:val="it-IT"/>
+              </w:rPr>
+              <w:t xml:space="preserve">Senza una sessione lato server i due passaggi del login non si possono collegare come si farebbe di solito. Ho usato due endpoint distinti: il primo verifica la password e non emette token, il secondo verifica il codice TOTP. Il compromesso, cioè che il secondo passaggio non ripresenta la password, è dichiarato tra i limiti e la soluzione (un token di pre-autenticazione) è indicata come sviluppo.</w:t>
+            </w:r>
+          </w:p>
+          <w:p>
+            <w:pPr>
+              <w:spacing w:after="160"/>
+              <w:jc w:val="both"/>
+              <w:rPr>
+                <w:rFonts w:ascii="Times New Roman" w:hAnsi="Times New Roman" w:cs="Times New Roman"/>
+                <w:sz w:val="28"/>
+                <w:szCs w:val="28"/>
+                <w:lang w:val="it-IT"/>
+              </w:rPr>
+            </w:pPr>
+            <w:r>
+              <w:rPr>
+                <w:rFonts w:ascii="Times New Roman" w:hAnsi="Times New Roman" w:cs="Times New Roman"/>
+                <w:b/>
+                <w:sz w:val="28"/>
+                <w:szCs w:val="28"/>
+                <w:lang w:val="it-IT"/>
+              </w:rPr>
+              <w:t xml:space="preserve">4) Una regressione non intercettata dai test. </w:t>
+            </w:r>
+            <w:r>
+              <w:rPr>
+                <w:rFonts w:ascii="Times New Roman" w:hAnsi="Times New Roman" w:cs="Times New Roman"/>
+                <w:sz w:val="28"/>
+                <w:szCs w:val="28"/>
+                <w:lang w:val="it-IT"/>
+              </w:rPr>
+              <w:t xml:space="preserve">Alla verifica finale quattro test del frontend fallivano dopo una revisione grafica della schermata di login, perché il componente usava un collegamento di navigazione senza che il test fornisse il Router. Li ho corretti e ho verificato che la suite tornasse interamente verde.</w:t>
             </w:r>
           </w:p>
           <w:p>
@@ -1907,6 +2181,37 @@
           </w:p>
           <w:p>
             <w:pPr>
+              <w:spacing w:after="160"/>
+              <w:jc w:val="both"/>
+              <w:rPr>
+                <w:rFonts w:ascii="Times New Roman" w:hAnsi="Times New Roman" w:cs="Times New Roman"/>
+                <w:sz w:val="28"/>
+                <w:szCs w:val="28"/>
+                <w:lang w:val="it-IT"/>
+              </w:rPr>
+            </w:pPr>
+            <w:r>
+              <w:rPr>
+                <w:rFonts w:ascii="Times New Roman" w:hAnsi="Times New Roman" w:cs="Times New Roman"/>
+                <w:b/>
+                <w:sz w:val="28"/>
+                <w:szCs w:val="28"/>
+                <w:lang w:val="it-IT"/>
+              </w:rPr>
+              <w:t xml:space="preserve">Individuazione e reperimento. </w:t>
+            </w:r>
+            <w:r>
+              <w:rPr>
+                <w:rFonts w:ascii="Times New Roman" w:hAnsi="Times New Roman" w:cs="Times New Roman"/>
+                <w:sz w:val="28"/>
+                <w:szCs w:val="28"/>
+                <w:lang w:val="it-IT"/>
+              </w:rPr>
+              <w:t xml:space="preserve">Ho individuato le risorse partendo dalla documentazione ufficiale di ciascuna tecnologia (i siti sono riportati nella sitografia in fondo a questa sezione) e ho scelto le versioni correnti o a supporto a lungo termine, verificandole poi con la compilazione e con la suite di test. Le difficoltà sono state soprattutto di compatibilità: Lombok e MapStruct richiedono un binding esplicito (lombok-mapstruct-binding) per non entrare in conflitto durante l’elaborazione delle annotazioni, e il backend richiede Java 21, quindi non si costruisce con versioni precedenti. Per la 2FA la libreria TOTP genera e verifica i codici ma non offre il flusso di login, che ho progettato io come descritto nella descrizione degli aspetti progettuali.</w:t>
+            </w:r>
+          </w:p>
+          <w:p>
+            <w:pPr>
               <w:spacing w:before="120" w:after="80"/>
               <w:rPr>
                 <w:rFonts w:ascii="Times New Roman" w:hAnsi="Times New Roman" w:cs="Times New Roman"/>
@@ -2474,7 +2779,7 @@
                 <w:szCs w:val="28"/>
                 <w:lang w:val="it-IT"/>
               </w:rPr>
-              <w:t xml:space="preserve">– HttpInterceptorFn nativo di Angular per l’intercettazione centralizzata di autenticazione ed errori: un interceptor allega il token JWT alle sole richieste dirette al backend, un secondo intercetta le risposte di errore mostrando un messaggio Toast al posto dei tradizionali alert() di sistema e prevede il logout automatico sullo status 401 (il backend, però, oggi risponde 403 per token assente o scaduto: si veda la sezione finale). Riferimenti: </w:t>
+              <w:t xml:space="preserve">– HttpInterceptorFn nativo di Angular per l’intercettazione centralizzata di autenticazione ed errori: un interceptor allega il token JWT alle sole richieste dirette al backend, un secondo intercetta le risposte di errore mostrando un messaggio Toast al posto dei tradizionali alert() di sistema e prevede il logout automatico sullo status 401 (il backend, però, oggi risponde 403 per token assente o scaduto). Riferimenti: </w:t>
             </w:r>
             <w:hyperlink r:id="rId46" w:history="1">
               <w:r>
@@ -4656,7 +4961,7 @@
                 <w:szCs w:val="28"/>
                 <w:lang w:val="it-IT"/>
               </w:rPr>
-              <w:t xml:space="preserve">– 5) Produrre una relazione tracciabile 1:1 rispetto al codice realmente presente nel repository, senza funzionalità dichiarate ma non implementate né riferimenti a componenti nel frattempo rimossi — un vincolo che, come descritto più avanti, mi ha imposto una revisione sistematica della documentazione a seguito della rimozione di un’integrazione esterna non più necessaria.</w:t>
+              <w:t xml:space="preserve">– 5) Produrre una relazione tracciabile 1:1 rispetto al codice realmente presente nel repository, senza funzionalità dichiarate ma non implementate né riferimenti a componenti nel frattempo rimossi.</w:t>
             </w:r>
           </w:p>
           <w:p>
@@ -4678,6 +4983,68 @@
                 <w:lang w:val="it-IT"/>
               </w:rPr>
               <w:t xml:space="preserve">Questi obiettivi discendono direttamente dalla traccia del PW16 (servizio significativo per un’organizzazione sanitaria, architettura API-based, backend RESTful, interfaccia utente intuitiva) e sono stati resi più specifici e misurabili rispetto alla formulazione generica della traccia stessa, così da poter verificare oggettivamente, ad ogni fase, se l’elaborato stesse effettivamente rispondendo a quanto richiesto, invece di limitarmi a una verifica soggettiva a fine progetto.</w:t>
+            </w:r>
+          </w:p>
+          <w:p>
+            <w:pPr>
+              <w:spacing w:after="160"/>
+              <w:jc w:val="both"/>
+              <w:rPr>
+                <w:rFonts w:ascii="Times New Roman" w:hAnsi="Times New Roman" w:cs="Times New Roman"/>
+                <w:sz w:val="28"/>
+                <w:szCs w:val="28"/>
+                <w:lang w:val="it-IT"/>
+              </w:rPr>
+            </w:pPr>
+            <w:r>
+              <w:rPr>
+                <w:rFonts w:ascii="Times New Roman" w:hAnsi="Times New Roman" w:cs="Times New Roman"/>
+                <w:b/>
+                <w:sz w:val="28"/>
+                <w:szCs w:val="28"/>
+                <w:lang w:val="it-IT"/>
+              </w:rPr>
+              <w:t xml:space="preserve">Corrispondenza con la traccia. </w:t>
+            </w:r>
+            <w:r>
+              <w:rPr>
+                <w:rFonts w:ascii="Times New Roman" w:hAnsi="Times New Roman" w:cs="Times New Roman"/>
+                <w:sz w:val="28"/>
+                <w:szCs w:val="28"/>
+                <w:lang w:val="it-IT"/>
+              </w:rPr>
+              <w:t xml:space="preserve">La traccia chiede uno scenario d’uso in ambito sanitario, un’applicazione web con frontend in HTML, CSS e JavaScript (qualunque framework) e un backend API object-oriented, e un rapporto che contenga contesto, design (UML ed ER), documentazione delle API, codice su repository Git, resoconto del processo con snippet commentati e test funzionali con screenshot. Il frontend è in Angular (TypeScript, compilato in HTML, CSS e JavaScript) e il backend in Java con Spring Boot. Ogni elemento del rapporto ha la sua corrispondenza: il contesto e il servizio nella «Contestualizzazione»; UML ed ER e il link al repository Git nella descrizione degli aspetti progettuali; la documentazione Swagger e i test funzionali con screenshot nelle sezioni omonime; il resoconto del processo e gli snippet nella descrizione degli aspetti progettuali e nella sezione dedicata alle fasi di lavoro.</w:t>
+            </w:r>
+          </w:p>
+          <w:p>
+            <w:pPr>
+              <w:spacing w:after="160"/>
+              <w:jc w:val="both"/>
+              <w:rPr>
+                <w:rFonts w:ascii="Times New Roman" w:hAnsi="Times New Roman" w:cs="Times New Roman"/>
+                <w:sz w:val="28"/>
+                <w:szCs w:val="28"/>
+                <w:lang w:val="it-IT"/>
+              </w:rPr>
+            </w:pPr>
+            <w:r>
+              <w:rPr>
+                <w:rFonts w:ascii="Times New Roman" w:hAnsi="Times New Roman" w:cs="Times New Roman"/>
+                <w:b/>
+                <w:sz w:val="28"/>
+                <w:szCs w:val="28"/>
+                <w:lang w:val="it-IT"/>
+              </w:rPr>
+              <w:t xml:space="preserve">Esito rispetto agli obiettivi specifici. </w:t>
+            </w:r>
+            <w:r>
+              <w:rPr>
+                <w:rFonts w:ascii="Times New Roman" w:hAnsi="Times New Roman" w:cs="Times New Roman"/>
+                <w:sz w:val="28"/>
+                <w:szCs w:val="28"/>
+                <w:lang w:val="it-IT"/>
+              </w:rPr>
+              <w:t xml:space="preserve">(1) L’API espone 9 controller e 40 operazioni documentate da Swagger. (2) Le regole di ruolo e ownership sono verificate da 9 test di integrazione e da 45 verifiche end-to-end, con l’eccezione, dichiarata tra i limiti, del token scaduto che produce 403 anziché 401. (3) Il flusso di prenotazione si completa sulla disponibilità reale degli slot, ma il backend non impedisce ancora la doppia prenotazione dello stesso orario. (4) La copertura di test è misurata: 82,3 % delle righe sul backend e 38,6 % sul frontend. (5) La relazione è stata riallineata al codice e alle verifiche eseguite il 20 settembre 2026.</w:t>
             </w:r>
           </w:p>
           <w:p>
@@ -4853,6 +5220,68 @@
           </w:p>
           <w:p>
             <w:pPr>
+              <w:spacing w:after="160"/>
+              <w:jc w:val="both"/>
+              <w:rPr>
+                <w:rFonts w:ascii="Times New Roman" w:hAnsi="Times New Roman" w:cs="Times New Roman"/>
+                <w:sz w:val="28"/>
+                <w:szCs w:val="28"/>
+                <w:lang w:val="it-IT"/>
+              </w:rPr>
+            </w:pPr>
+            <w:r>
+              <w:rPr>
+                <w:rFonts w:ascii="Times New Roman" w:hAnsi="Times New Roman" w:cs="Times New Roman"/>
+                <w:b/>
+                <w:sz w:val="28"/>
+                <w:szCs w:val="28"/>
+                <w:lang w:val="it-IT"/>
+              </w:rPr>
+              <w:t xml:space="preserve">Valore per l’impresa. </w:t>
+            </w:r>
+            <w:r>
+              <w:rPr>
+                <w:rFonts w:ascii="Times New Roman" w:hAnsi="Times New Roman" w:cs="Times New Roman"/>
+                <w:sz w:val="28"/>
+                <w:szCs w:val="28"/>
+                <w:lang w:val="it-IT"/>
+              </w:rPr>
+              <w:t xml:space="preserve">Dal punto di vista della digitalizzazione, la piattaforma sposta su un canale unico attività che in una clinica tradizionale passano da telefonate e documenti cartacei: il paziente vede la disponibilità reale dei medici e prenota senza intermediari, i referti sono raccolti in un archivio consultabile e associato alla visita, le richieste di assistenza sono tracciate con uno stato (aperta o chiusa) invece di disperdersi. Sono vantaggi attesi per il personale, che dedica meno tempo alla gestione telefonica di prenotazioni e richieste e riduce il rischio di errori di trascrizione, e per la clinica, che può contenere i costi di gestione senza sostenere le licenze di una suite gestionale enterprise. Non li ho misurati in un contesto reale: sono benefici attesi, non risultati.</w:t>
+            </w:r>
+          </w:p>
+          <w:p>
+            <w:pPr>
+              <w:spacing w:after="160"/>
+              <w:jc w:val="both"/>
+              <w:rPr>
+                <w:rFonts w:ascii="Times New Roman" w:hAnsi="Times New Roman" w:cs="Times New Roman"/>
+                <w:sz w:val="28"/>
+                <w:szCs w:val="28"/>
+                <w:lang w:val="it-IT"/>
+              </w:rPr>
+            </w:pPr>
+            <w:r>
+              <w:rPr>
+                <w:rFonts w:ascii="Times New Roman" w:hAnsi="Times New Roman" w:cs="Times New Roman"/>
+                <w:b/>
+                <w:sz w:val="28"/>
+                <w:szCs w:val="28"/>
+                <w:lang w:val="it-IT"/>
+              </w:rPr>
+              <w:t xml:space="preserve">Indicatori. </w:t>
+            </w:r>
+            <w:r>
+              <w:rPr>
+                <w:rFonts w:ascii="Times New Roman" w:hAnsi="Times New Roman" w:cs="Times New Roman"/>
+                <w:sz w:val="28"/>
+                <w:szCs w:val="28"/>
+                <w:lang w:val="it-IT"/>
+              </w:rPr>
+              <w:t xml:space="preserve">Il pannello statistiche, riservato a medici e supporto, fornisce già indicatori operativi ricavati dai dati: numero di pazienti e di medici, visite programmate, completate e cancellate, ticket aperti e chiusi. Il rapporto tra visite cancellate e programmate, ad esempio, indica il tasso di disdette, e quello tra ticket chiusi e aperti l’efficacia del supporto. Sono la base di partenza per una dashboard economico-gestionale più ampia (ricavi per specialità, tempi di attesa), che non ho sviluppato.</w:t>
+            </w:r>
+          </w:p>
+          <w:p>
+            <w:pPr>
               <w:jc w:val="both"/>
               <w:rPr>
                 <w:rFonts w:ascii="Times New Roman" w:hAnsi="Times New Roman" w:cs="Times New Roman"/>
@@ -4981,6 +5410,136 @@
                 <w:szCs w:val="28"/>
                 <w:lang w:val="it-IT"/>
               </w:rPr>
+              <w:t xml:space="preserve">Il codice sorgente completo dell’applicazione (backend, frontend, pipeline di integrazione continua e documentazione tecnica estesa nella cartella doc/) è disponibile nel repository Git: </w:t>
+            </w:r>
+            <w:hyperlink r:id="rId85" w:history="1">
+              <w:r>
+                <w:rPr>
+                  <w:rFonts w:ascii="Times New Roman" w:hAnsi="Times New Roman" w:cs="Times New Roman"/>
+                  <w:color w:val="0563C1"/>
+                  <w:sz w:val="28"/>
+                  <w:szCs w:val="28"/>
+                  <w:u w:val="single"/>
+                  <w:lang w:val="it-IT"/>
+                </w:rPr>
+                <w:t xml:space="preserve">https://github.com/acapodanno/project-work-l-31</w:t>
+              </w:r>
+            </w:hyperlink>
+            <w:r>
+              <w:rPr>
+                <w:rFonts w:ascii="Times New Roman" w:hAnsi="Times New Roman" w:cs="Times New Roman"/>
+                <w:sz w:val="28"/>
+                <w:szCs w:val="28"/>
+                <w:lang w:val="it-IT"/>
+              </w:rPr>
+              <w:t xml:space="preserve">.</w:t>
+            </w:r>
+          </w:p>
+          <w:p>
+            <w:pPr>
+              <w:spacing w:after="160"/>
+              <w:jc w:val="both"/>
+              <w:rPr>
+                <w:rFonts w:ascii="Times New Roman" w:hAnsi="Times New Roman" w:cs="Times New Roman"/>
+                <w:sz w:val="28"/>
+                <w:szCs w:val="28"/>
+                <w:lang w:val="it-IT"/>
+              </w:rPr>
+            </w:pPr>
+            <w:r>
+              <w:rPr>
+                <w:rFonts w:ascii="Times New Roman" w:hAnsi="Times New Roman" w:cs="Times New Roman"/>
+                <w:sz w:val="28"/>
+                <w:szCs w:val="28"/>
+                <w:lang w:val="it-IT"/>
+              </w:rPr>
+              <w:t xml:space="preserve">Gli aspetti di design sono documentati con diagrammi UML (casi d’uso, classi e sequenza) e con il diagramma Entità-Relazione. Il diagramma dei casi d’uso riassume le funzioni offerte a ciascun ruolo:</w:t>
+            </w:r>
+          </w:p>
+          <w:p>
+            <w:pPr>
+              <w:keepNext/>
+              <w:spacing w:before="120" w:after="0"/>
+              <w:jc w:val="center"/>
+            </w:pPr>
+            <w:r>
+              <w:drawing>
+                <wp:inline distT="0" distB="0" distL="0" distR="0">
+                  <wp:extent cx="3400000" cy="6327354"/>
+                  <wp:effectExtent l="0" t="0" r="0" b="0"/>
+                  <wp:docPr id="5101" name="Immagine 5101" descr="Diagramma dei casi d’uso UML di HealthCare Plus"/>
+                  <wp:cNvGraphicFramePr>
+                    <a:graphicFrameLocks xmlns:a="http://schemas.openxmlformats.org/drawingml/2006/main" noChangeAspect="1"/>
+                  </wp:cNvGraphicFramePr>
+                  <a:graphic xmlns:a="http://schemas.openxmlformats.org/drawingml/2006/main">
+                    <a:graphicData uri="http://schemas.openxmlformats.org/drawingml/2006/picture">
+                      <pic:pic xmlns:pic="http://schemas.openxmlformats.org/drawingml/2006/picture">
+                        <pic:nvPicPr>
+                          <pic:cNvPr id="0" name="image38.png"/>
+                          <pic:cNvPicPr/>
+                        </pic:nvPicPr>
+                        <pic:blipFill>
+                          <a:blip r:embed="rId86"/>
+                          <a:stretch>
+                            <a:fillRect/>
+                          </a:stretch>
+                        </pic:blipFill>
+                        <pic:spPr>
+                          <a:xfrm>
+                            <a:off x="0" y="0"/>
+                            <a:ext cx="3400000" cy="6327354"/>
+                          </a:xfrm>
+                          <a:prstGeom prst="rect">
+                            <a:avLst/>
+                          </a:prstGeom>
+                        </pic:spPr>
+                      </pic:pic>
+                    </a:graphicData>
+                  </a:graphic>
+                </wp:inline>
+              </w:drawing>
+            </w:r>
+          </w:p>
+          <w:p>
+            <w:pPr>
+              <w:spacing w:before="40" w:after="200"/>
+              <w:rPr>
+                <w:rFonts w:ascii="Times New Roman" w:hAnsi="Times New Roman" w:cs="Times New Roman"/>
+                <w:i/>
+                <w:sz w:val="22"/>
+                <w:szCs w:val="22"/>
+                <w:lang w:val="it-IT"/>
+              </w:rPr>
+            </w:pPr>
+            <w:r>
+              <w:rPr>
+                <w:rFonts w:ascii="Times New Roman" w:hAnsi="Times New Roman" w:cs="Times New Roman"/>
+                <w:i/>
+                <w:sz w:val="22"/>
+                <w:szCs w:val="22"/>
+                <w:lang w:val="it-IT"/>
+              </w:rPr>
+              <w:t xml:space="preserve">Diagramma dei casi d’uso UML: le funzioni di Paziente, Medico e Supporto. Tutti e tre accedono con login (con 2FA opzionale); solo i pazienti si registrano in autonomia.</w:t>
+            </w:r>
+          </w:p>
+          <w:p>
+            <w:pPr>
+              <w:spacing w:after="160"/>
+              <w:jc w:val="both"/>
+              <w:rPr>
+                <w:rFonts w:ascii="Times New Roman" w:hAnsi="Times New Roman" w:cs="Times New Roman"/>
+                <w:sz w:val="28"/>
+                <w:szCs w:val="28"/>
+                <w:lang w:val="it-IT"/>
+              </w:rPr>
+            </w:pPr>
+            <w:r>
+              <w:rPr>
+                <w:rFonts w:ascii="Times New Roman" w:hAnsi="Times New Roman" w:cs="Times New Roman"/>
+                <w:sz w:val="28"/>
+                <w:szCs w:val="28"/>
+                <w:lang w:val="it-IT"/>
+              </w:rPr>
               <w:t xml:space="preserve">Il modello dati è costruito attorno all’utente base (AppUser), da cui derivano a livello di ruolo il Paziente, il Medico e il personale di Supporto tramite un enumeratore Role, e comprende le entità Appointment, MedicalReport, Therapy, Ticket e Slot, con i relativi vincoli di integrità referenziale. In fase di progettazione ho dovuto decidere come rappresentare la relazione tra Therapy e Appointment: ho scelto di renderla facoltativa (appointment_id nullable), poiché un medico deve poter prescrivere una terapia anche senza che essa derivi da una visita puntuale già registrata nel sistema, mantenendo però un controllo a livello di servizio che, quando il collegamento è presente, verifica che l’appuntamento indicato appartenga effettivamente allo stesso paziente e allo stesso medico della terapia.</w:t>
             </w:r>
           </w:p>
@@ -5191,7 +5750,7 @@
                 <w:szCs w:val="22"/>
                 <w:lang w:val="it-IT"/>
               </w:rPr>
-              <w:t xml:space="preserve">Diagramma di sequenza della prenotazione di una visita: il paziente sceglie il medico, la data e uno slot libero; il backend verifica ruolo e proprietà e registra l’appuntamento.</w:t>
+              <w:t xml:space="preserve">Diagramma di sequenza UML della prenotazione di una visita: il paziente sceglie il medico, la data e uno slot libero; il backend verifica ruolo e proprietà e registra l’appuntamento.</w:t>
             </w:r>
           </w:p>
           <w:p>
@@ -5288,7 +5847,7 @@
                 <w:szCs w:val="22"/>
                 <w:lang w:val="it-IT"/>
               </w:rPr>
-              <w:t xml:space="preserve">Diagramma di sequenza dell’apertura di un ticket con verifica di ownership: se il patientId non coincide con l’utente autenticato il backend risponde 403.</w:t>
+              <w:t xml:space="preserve">Diagramma di sequenza UML dell’apertura di un ticket con verifica di ownership: se il patientId non coincide con l’utente autenticato il backend risponde 403.</w:t>
             </w:r>
           </w:p>
           <w:p>
@@ -5385,7 +5944,7 @@
                 <w:szCs w:val="22"/>
                 <w:lang w:val="it-IT"/>
               </w:rPr>
-              <w:t xml:space="preserve">Diagramma di sequenza del login in due passaggi con autenticazione a due fattori: il primo passaggio non emette alcun token, il secondo verifica il codice TOTP ed emette il JWT.</w:t>
+              <w:t xml:space="preserve">Diagramma di sequenza UML del login in due passaggi con autenticazione a due fattori: il primo passaggio non emette alcun token, il secondo verifica il codice TOTP ed emette il JWT.</w:t>
             </w:r>
           </w:p>
           <w:p>
@@ -5432,7 +5991,7 @@
                 <w:szCs w:val="28"/>
                 <w:lang w:val="it-IT"/>
               </w:rPr>
-              <w:t xml:space="preserve">Sempre lato frontend, la gestione centralizzata degli errori tramite HttpInterceptorFn mi ha permesso di sostituire gli alert() nativi del browser con un componente Toast condiviso per gli errori HTTP (restano solo alcuni alert() di conferma in tre componenti): un interceptor intercetta ogni risposta HTTP in errore, prevede il logout automatico e il reindirizzamento al login per lo status 401 e mostra gli altri errori applicativi come notifica non bloccante, evitando di dover gestire singolarmente ogni possibile fallimento in ciascun componente. La verifica finale ha però mostrato che Spring Security risponde 403, e non 401, in caso di token assente o scaduto: il logout automatico, così com’è, non si attiva. La correzione (un AuthenticationEntryPoint che risponda 401) è indicata tra i limiti.</w:t>
+              <w:t xml:space="preserve">Sempre lato frontend, la gestione centralizzata degli errori tramite HttpInterceptorFn mi ha permesso di sostituire gli alert() nativi del browser con un componente Toast condiviso per gli errori HTTP (restano solo alcuni alert() di conferma in tre componenti): un interceptor intercetta ogni risposta HTTP in errore, prevede il logout automatico e il reindirizzamento al login per lo status 401 e mostra gli altri errori applicativi come notifica non bloccante, evitando di dover gestire singolarmente ogni possibile fallimento in ciascun componente. La verifica finale ha però mostrato che Spring Security risponde 403, e non 401, in caso di token assente o scaduto: il logout automatico, così com’è, non si attiva.</w:t>
             </w:r>
           </w:p>
           <w:p>
@@ -5518,6 +6077,72 @@
                 <w:lang w:val="it-IT"/>
               </w:rPr>
               <w:t xml:space="preserve">Ho quindi rifattorizzato la logica applicando lo Strategy Pattern: ogni stato ha una propria implementazione dell’interfaccia AppointmentStatusStrategy (o TicketStatusStrategy per i ticket), e una Factory inietta automaticamente tutte le implementazioni disponibili in una mappa indicizzata per stato, sfruttando l’iniezione delle dipendenze di Spring su una List&lt;AppointmentStatusStrategy&gt;: Spring individua da solo, a runtime, tutti i bean che implementano l’interfaccia, senza che io debba registrarli manualmente uno per uno nella Factory.</w:t>
+            </w:r>
+          </w:p>
+          <w:p>
+            <w:pPr>
+              <w:keepNext/>
+              <w:spacing w:before="120" w:after="0"/>
+              <w:jc w:val="center"/>
+            </w:pPr>
+            <w:r>
+              <w:drawing>
+                <wp:inline distT="0" distB="0" distL="0" distR="0">
+                  <wp:extent cx="5300000" cy="3634574"/>
+                  <wp:effectExtent l="0" t="0" r="0" b="0"/>
+                  <wp:docPr id="5102" name="Immagine 5102" descr="Diagramma delle classi UML dello Strategy pattern"/>
+                  <wp:cNvGraphicFramePr>
+                    <a:graphicFrameLocks xmlns:a="http://schemas.openxmlformats.org/drawingml/2006/main" noChangeAspect="1"/>
+                  </wp:cNvGraphicFramePr>
+                  <a:graphic xmlns:a="http://schemas.openxmlformats.org/drawingml/2006/main">
+                    <a:graphicData uri="http://schemas.openxmlformats.org/drawingml/2006/picture">
+                      <pic:pic xmlns:pic="http://schemas.openxmlformats.org/drawingml/2006/picture">
+                        <pic:nvPicPr>
+                          <pic:cNvPr id="0" name="image39.png"/>
+                          <pic:cNvPicPr/>
+                        </pic:nvPicPr>
+                        <pic:blipFill>
+                          <a:blip r:embed="rId87"/>
+                          <a:stretch>
+                            <a:fillRect/>
+                          </a:stretch>
+                        </pic:blipFill>
+                        <pic:spPr>
+                          <a:xfrm>
+                            <a:off x="0" y="0"/>
+                            <a:ext cx="5300000" cy="3634574"/>
+                          </a:xfrm>
+                          <a:prstGeom prst="rect">
+                            <a:avLst/>
+                          </a:prstGeom>
+                        </pic:spPr>
+                      </pic:pic>
+                    </a:graphicData>
+                  </a:graphic>
+                </wp:inline>
+              </w:drawing>
+            </w:r>
+          </w:p>
+          <w:p>
+            <w:pPr>
+              <w:spacing w:before="40" w:after="200"/>
+              <w:rPr>
+                <w:rFonts w:ascii="Times New Roman" w:hAnsi="Times New Roman" w:cs="Times New Roman"/>
+                <w:i/>
+                <w:sz w:val="22"/>
+                <w:szCs w:val="22"/>
+                <w:lang w:val="it-IT"/>
+              </w:rPr>
+            </w:pPr>
+            <w:r>
+              <w:rPr>
+                <w:rFonts w:ascii="Times New Roman" w:hAnsi="Times New Roman" w:cs="Times New Roman"/>
+                <w:i/>
+                <w:sz w:val="22"/>
+                <w:szCs w:val="22"/>
+                <w:lang w:val="it-IT"/>
+              </w:rPr>
+              <w:t xml:space="preserve">Diagramma delle classi UML dello Strategy pattern: ogni servizio delega a una Factory, che raccoglie tutte le strategie disponibili (interfaccia e implementazioni per stato) tramite l’iniezione delle dipendenze di Spring.</w:t>
             </w:r>
           </w:p>
           <w:p>
@@ -10317,7 +10942,7 @@
                 <w:szCs w:val="28"/>
                 <w:lang w:val="it-IT"/>
               </w:rPr>
-              <w:t xml:space="preserve">Un terzo limite riguarda il deployment. Sono disponibili tre modalità di esecuzione: sviluppo con backend e frontend separati, Docker Compose con il frontend servito da Nginx e un’immagine unica in cui il backend serve anche la SPA incorporata. Le due configurazioni Docker sono state rilette e allineate al codice ma non ricostruite durante la verifica finale (Docker non era disponibile nell’ambiente), e l’immagine unica non gestisce il refresh del browser sulle rotte profonde di Angular, che richiederebbe un forward lato Spring o una regola di rewrite.</w:t>
+              <w:t xml:space="preserve">Un terzo gruppo di limiti riguarda difetti emersi eseguendo l’applicazione, che dichiaro come tali e non come scelte di progetto, con la gravità che attribuisco loro. Gravità media: Spring Security risponde 403 e non 401 per un token assente o scaduto, quindi il logout automatico dell’interceptor Angular non si attiva; l’anteprima e il download del PDF del referto non funzionano dal browser, perché puntano all’URL dell’endpoint senza l’header Authorization; la creazione di un appuntamento non impedisce la doppia prenotazione dello stesso orario, perché la disponibilità degli slot è verificata solo in lettura; il secondo passaggio della 2FA non richiede la password e la configurazione della 2FA sostituisce il segreto senza chiedere il codice corrente. Gravità alta in vista di un uso reale: la configurazione è quella di sviluppo (CORS aperto a qualunque origine, chiave di firma JWT di default, console H2 raggiungibile, nessun limite ai tentativi di accesso). Ciascun difetto ha una correzione circoscritta, descritta con la relativa gravità nel capitolo 9 della documentazione tecnica del repository.</w:t>
             </w:r>
           </w:p>
           <w:p>
@@ -10338,7 +10963,7 @@
                 <w:szCs w:val="28"/>
                 <w:lang w:val="it-IT"/>
               </w:rPr>
-              <w:t xml:space="preserve">Infine, la pipeline di integrazione continua copre build e test automatizzati di backend e frontend ma non un deploy automatico (Continuous Deployment) verso un ambiente di staging o produzione, in assenza di un’infrastruttura di hosting dedicata per un progetto a carattere didattico: un’estensione naturale sarebbe un deploy containerizzato su un servizio PaaS (ad esempio Render, Railway o Azure Container Apps) attivato automaticamente al merge sul branch principale.</w:t>
+              <w:t xml:space="preserve">Infine non è implementato il Continuous Deployment: la pipeline di integrazione continua compila, collauda e pubblica gli artefatti ma non li distribuisce su un ambiente di staging o produzione, non essendoci un’infrastruttura di hosting dedicata a un progetto didattico. Un’estensione naturale è un deploy containerizzato su un servizio PaaS al merge sul ramo principale. Le immagini Docker, inoltre, sono descritte ma non le ho ricostruite nella verifica finale, perché Docker non era disponibile nell’ambiente.</w:t>
             </w:r>
           </w:p>
           <w:p>
@@ -10359,28 +10984,7 @@
                 <w:szCs w:val="28"/>
                 <w:lang w:val="it-IT"/>
               </w:rPr>
-              <w:t xml:space="preserve">Durante la verifica finale, eseguendo l’applicazione e non solo i test, sono emersi anche difetti che vanno dichiarati come tali e non presentati come scelte progettuali. Primo: Spring Security risponde 403 anziché 401 per un token assente o scaduto, per cui il logout automatico dell’interceptor Angular non si attiva. Secondo: l’anteprima e il download del PDF del referto dal browser non funzionano, perché puntano direttamente all’URL dell’endpoint, che richiede l’header Authorization che una semplice navigazione non invia. Terzo: la creazione di un appuntamento non impedisce la doppia prenotazione dello stesso orario, perché la disponibilità degli slot è controllata solo in lettura. Quarto: la generazione del segreto della 2FA sostituisce quello esistente senza richiedere il codice corrente e la 2FA non può essere disattivata. Si aggiunge che la configurazione è quella di sviluppo (CORS aperto a qualunque origine, chiave di firma JWT di default, console H2 raggiungibile) e va resa più rigorosa prima di un uso reale. Ciascun difetto ha una correzione circoscritta, descritta con la relativa gravità nel capitolo 9 della documentazione tecnica (doc/9-Valutazione_Risultati.md).</w:t>
-            </w:r>
-          </w:p>
-          <w:p>
-            <w:pPr>
-              <w:spacing w:after="160"/>
-              <w:jc w:val="both"/>
-              <w:rPr>
-                <w:rFonts w:ascii="Times New Roman" w:hAnsi="Times New Roman" w:cs="Times New Roman"/>
-                <w:sz w:val="28"/>
-                <w:szCs w:val="28"/>
-                <w:lang w:val="it-IT"/>
-              </w:rPr>
-            </w:pPr>
-            <w:r>
-              <w:rPr>
-                <w:rFonts w:ascii="Times New Roman" w:hAnsi="Times New Roman" w:cs="Times New Roman"/>
-                <w:sz w:val="28"/>
-                <w:szCs w:val="28"/>
-                <w:lang w:val="it-IT"/>
-              </w:rPr>
-              <w:t xml:space="preserve">Nel complesso, ritengo che il prodotto rispetti ed estenda le richieste essenziali della traccia, aggiungendo un livello di sicurezza (autenticazione a due fattori, RBAC con ownership a grana fine) superiore al minimo richiesto dalla consegna, e che i limiti individuati siano per lo più conseguenze consapevoli di scelte di scope appropriate a un progetto universitario (database in-memory, mock di estrazione dati, assenza di deploy continuo) piuttosto che difetti di progettazione. Ho scelto di dichiararli esplicitamente in questa sezione, invece di ometterli, proprio per dimostrare la consapevolezza critica maturata rispetto al lavoro svolto: riconoscere i limiti di ciò che si è realizzato è parte integrante, a mio avviso, della competenza tecnica che questo Project Work intende valutare. Fanno eccezione i difetti elencati poco sopra, emersi solo eseguendo l’applicazione: sono errori da correggere, non scelte di scope.</w:t>
+              <w:t xml:space="preserve">Nel complesso, ritengo che il prodotto rispetti ed estenda le richieste essenziali della traccia, aggiungendo un livello di sicurezza (autenticazione a due fattori, RBAC con ownership a grana fine) superiore al minimo richiesto dalla consegna, e che i limiti individuati siano per lo più conseguenze consapevoli di scelte di scope appropriate a un progetto universitario (database in-memory, mock di estrazione dati, assenza di deploy continuo) piuttosto che difetti di progettazione, con l’eccezione dei difetti elencati poco sopra, emersi solo eseguendo l’applicazione: quelli sono errori da correggere, non scelte di scope. Ho scelto di dichiararli esplicitamente in questa sezione, invece di ometterli, proprio per dimostrare la consapevolezza critica maturata rispetto al lavoro svolto: riconoscere i limiti di ciò che si è realizzato è parte integrante, a mio avviso, della competenza tecnica che questo Project Work intende valutare.</w:t>
             </w:r>
           </w:p>
         </w:tc>

</xml_diff>

<commit_message>
fix: update documentation and Docker configurations for improved container execution and health checks
</commit_message>
<xml_diff>
--- a/HealthCarePlus_ProjectWork_L31.docx
+++ b/HealthCarePlus_ProjectWork_L31.docx
@@ -2845,7 +2845,1395 @@
                 <w:szCs w:val="28"/>
                 <w:lang w:val="it-IT"/>
               </w:rPr>
-              <w:t xml:space="preserve">– Docker con build multi-stage: ciascun servizio (backend, frontend) ha un proprio Dockerfile con uno stage test dedicato al calcolo del code coverage, separato dallo stage runtime finale, così che l’immagine di produzione non porti con sé le dipendenze di test. Un docker-compose.yml orchestra backend e frontend (servito da Nginx) e un Dockerfile in radice produce un’unica immagine in cui il backend serve anche la SPA incorporata. Riferimenti: </w:t>
+              <w:t xml:space="preserve">– Docker con build multi-stage: ciascun servizio (backend, frontend) ha un proprio Dockerfile con uno stage test dedicato al calcolo del code coverage, separato dallo stage runtime finale, così che l’immagine di produzione non porti con sé le dipendenze di test. Un docker-compose.yml avvia i due container (backend Spring Boot e frontend servito da Nginx) con un solo comando e con controlli di salute su entrambi. Riferimenti: </w:t>
+            </w:r>
+            <w:hyperlink r:id="rId88" w:history="1">
+              <w:r>
+                <w:rPr>
+                  <w:rFonts w:ascii="Times New Roman" w:hAnsi="Times New Roman" w:cs="Times New Roman"/>
+                  <w:color w:val="0563C1"/>
+                  <w:sz w:val="28"/>
+                  <w:szCs w:val="28"/>
+                  <w:u w:val="single"/>
+                  <w:lang w:val="it-IT"/>
+                </w:rPr>
+                <w:t xml:space="preserve">https://www.docker.com</w:t>
+              </w:r>
+            </w:hyperlink>
+            <w:r>
+              <w:rPr>
+                <w:rFonts w:ascii="Times New Roman" w:hAnsi="Times New Roman" w:cs="Times New Roman"/>
+                <w:sz w:val="28"/>
+                <w:szCs w:val="28"/>
+                <w:lang w:val="it-IT"/>
+              </w:rPr>
+              <w:t xml:space="preserve">; </w:t>
+            </w:r>
+            <w:hyperlink r:id="rId89" w:history="1">
+              <w:r>
+                <w:rPr>
+                  <w:rFonts w:ascii="Times New Roman" w:hAnsi="Times New Roman" w:cs="Times New Roman"/>
+                  <w:color w:val="0563C1"/>
+                  <w:sz w:val="28"/>
+                  <w:szCs w:val="28"/>
+                  <w:u w:val="single"/>
+                  <w:lang w:val="it-IT"/>
+                </w:rPr>
+                <w:t xml:space="preserve">https://docs.docker.com/compose/</w:t>
+              </w:r>
+            </w:hyperlink>
+            <w:r>
+              <w:rPr>
+                <w:rFonts w:ascii="Times New Roman" w:hAnsi="Times New Roman" w:cs="Times New Roman"/>
+                <w:sz w:val="28"/>
+                <w:szCs w:val="28"/>
+                <w:lang w:val="it-IT"/>
+              </w:rPr>
+              <w:t xml:space="preserve">; </w:t>
+            </w:r>
+            <w:hyperlink r:id="rId90" w:history="1">
+              <w:r>
+                <w:rPr>
+                  <w:rFonts w:ascii="Times New Roman" w:hAnsi="Times New Roman" w:cs="Times New Roman"/>
+                  <w:color w:val="0563C1"/>
+                  <w:sz w:val="28"/>
+                  <w:szCs w:val="28"/>
+                  <w:u w:val="single"/>
+                  <w:lang w:val="it-IT"/>
+                </w:rPr>
+                <w:t xml:space="preserve">https://nginx.org</w:t>
+              </w:r>
+            </w:hyperlink>
+            <w:r>
+              <w:rPr>
+                <w:rFonts w:ascii="Times New Roman" w:hAnsi="Times New Roman" w:cs="Times New Roman"/>
+                <w:sz w:val="28"/>
+                <w:szCs w:val="28"/>
+                <w:lang w:val="it-IT"/>
+              </w:rPr>
+              <w:t xml:space="preserve">.</w:t>
+            </w:r>
+          </w:p>
+          <w:p>
+            <w:pPr>
+              <w:spacing w:after="80"/>
+              <w:ind w:left="360" w:hanging="360"/>
+              <w:jc w:val="both"/>
+              <w:rPr>
+                <w:rFonts w:ascii="Times New Roman" w:hAnsi="Times New Roman" w:cs="Times New Roman"/>
+                <w:sz w:val="28"/>
+                <w:szCs w:val="28"/>
+                <w:lang w:val="it-IT"/>
+              </w:rPr>
+            </w:pPr>
+            <w:r>
+              <w:rPr>
+                <w:rFonts w:ascii="Times New Roman" w:hAnsi="Times New Roman" w:cs="Times New Roman"/>
+                <w:sz w:val="28"/>
+                <w:szCs w:val="28"/>
+                <w:lang w:val="it-IT"/>
+              </w:rPr>
+              <w:t xml:space="preserve">– GitHub Actions per l’integrazione continua, definita in .github/workflows/ci.yml: un job iniziale (basato su dorny/paths-filter) rileva quali moduli sono stati modificati, così che backend e frontend procedano in build → test → release in modo indipendente e solo quando contengono effettivamente modifiche, evitando esecuzioni superflue della pipeline. Riferimenti: </w:t>
+            </w:r>
+            <w:hyperlink r:id="rId50" w:history="1">
+              <w:r>
+                <w:rPr>
+                  <w:rFonts w:ascii="Times New Roman" w:hAnsi="Times New Roman" w:cs="Times New Roman"/>
+                  <w:color w:val="0563C1"/>
+                  <w:sz w:val="28"/>
+                  <w:szCs w:val="28"/>
+                  <w:u w:val="single"/>
+                  <w:lang w:val="it-IT"/>
+                </w:rPr>
+                <w:t xml:space="preserve">https://docs.github.com/actions</w:t>
+              </w:r>
+            </w:hyperlink>
+            <w:r>
+              <w:rPr>
+                <w:rFonts w:ascii="Times New Roman" w:hAnsi="Times New Roman" w:cs="Times New Roman"/>
+                <w:sz w:val="28"/>
+                <w:szCs w:val="28"/>
+                <w:lang w:val="it-IT"/>
+              </w:rPr>
+              <w:t xml:space="preserve">; </w:t>
+            </w:r>
+            <w:hyperlink r:id="rId51" w:history="1">
+              <w:r>
+                <w:rPr>
+                  <w:rFonts w:ascii="Times New Roman" w:hAnsi="Times New Roman" w:cs="Times New Roman"/>
+                  <w:color w:val="0563C1"/>
+                  <w:sz w:val="28"/>
+                  <w:szCs w:val="28"/>
+                  <w:u w:val="single"/>
+                  <w:lang w:val="it-IT"/>
+                </w:rPr>
+                <w:t xml:space="preserve">https://github.com/dorny/paths-filter</w:t>
+              </w:r>
+            </w:hyperlink>
+            <w:r>
+              <w:rPr>
+                <w:rFonts w:ascii="Times New Roman" w:hAnsi="Times New Roman" w:cs="Times New Roman"/>
+                <w:sz w:val="28"/>
+                <w:szCs w:val="28"/>
+                <w:lang w:val="it-IT"/>
+              </w:rPr>
+              <w:t xml:space="preserve">.</w:t>
+            </w:r>
+          </w:p>
+          <w:p>
+            <w:pPr>
+              <w:spacing w:before="120" w:after="80"/>
+              <w:rPr>
+                <w:rFonts w:ascii="Times New Roman" w:hAnsi="Times New Roman" w:cs="Times New Roman"/>
+                <w:b/>
+                <w:sz w:val="26"/>
+                <w:szCs w:val="26"/>
+                <w:lang w:val="it-IT"/>
+              </w:rPr>
+            </w:pPr>
+            <w:r>
+              <w:rPr>
+                <w:rFonts w:ascii="Times New Roman" w:hAnsi="Times New Roman" w:cs="Times New Roman"/>
+                <w:b/>
+                <w:sz w:val="26"/>
+                <w:szCs w:val="26"/>
+                <w:lang w:val="it-IT"/>
+              </w:rPr>
+              <w:t xml:space="preserve">Sviluppo assistito da intelligenza artificiale</w:t>
+            </w:r>
+          </w:p>
+          <w:p>
+            <w:pPr>
+              <w:spacing w:after="80"/>
+              <w:ind w:left="360" w:hanging="360"/>
+              <w:jc w:val="both"/>
+              <w:rPr>
+                <w:rFonts w:ascii="Times New Roman" w:hAnsi="Times New Roman" w:cs="Times New Roman"/>
+                <w:sz w:val="28"/>
+                <w:szCs w:val="28"/>
+                <w:lang w:val="it-IT"/>
+              </w:rPr>
+            </w:pPr>
+            <w:r>
+              <w:rPr>
+                <w:rFonts w:ascii="Times New Roman" w:hAnsi="Times New Roman" w:cs="Times New Roman"/>
+                <w:sz w:val="28"/>
+                <w:szCs w:val="28"/>
+                <w:lang w:val="it-IT"/>
+              </w:rPr>
+              <w:t xml:space="preserve">– Claude (Anthropic), utilizzato come assistente di pair-programming per velocizzare la scrittura di codice ripetitivo e a basso rischio (DTO, mapper, configurazione boilerplate) e per la stesura della suite di test JUnit e Karma/Jasmine a partire dai casi di test che ho individuato io stesso: le decisioni di architettura, design pattern, modellazione del dominio e le scelte di sicurezza restano mie, mentre lo strumento ha permesso di dedicare più tempo a queste ultime riducendo il tempo speso a scrivere codice ripetitivo. Ogni suggerimento generato è stato rivisto e compreso prima di essere integrato, ed è proprio in questa fase di revisione che ho individuato la lacuna di sicurezza sull’endpoint dei ticket descritta nella Parte Seconda. Riferimenti: </w:t>
+            </w:r>
+            <w:hyperlink r:id="rId53" w:history="1">
+              <w:r>
+                <w:rPr>
+                  <w:rFonts w:ascii="Times New Roman" w:hAnsi="Times New Roman" w:cs="Times New Roman"/>
+                  <w:color w:val="0563C1"/>
+                  <w:sz w:val="28"/>
+                  <w:szCs w:val="28"/>
+                  <w:u w:val="single"/>
+                  <w:lang w:val="it-IT"/>
+                </w:rPr>
+                <w:t xml:space="preserve">https://www.anthropic.com/claude</w:t>
+              </w:r>
+            </w:hyperlink>
+            <w:r>
+              <w:rPr>
+                <w:rFonts w:ascii="Times New Roman" w:hAnsi="Times New Roman" w:cs="Times New Roman"/>
+                <w:sz w:val="28"/>
+                <w:szCs w:val="28"/>
+                <w:lang w:val="it-IT"/>
+              </w:rPr>
+              <w:t xml:space="preserve">.</w:t>
+            </w:r>
+          </w:p>
+          <w:p>
+            <w:pPr>
+              <w:spacing w:before="120" w:after="80"/>
+              <w:rPr>
+                <w:rFonts w:ascii="Times New Roman" w:hAnsi="Times New Roman" w:cs="Times New Roman"/>
+                <w:b/>
+                <w:sz w:val="26"/>
+                <w:szCs w:val="26"/>
+                <w:lang w:val="it-IT"/>
+              </w:rPr>
+            </w:pPr>
+            <w:r>
+              <w:rPr>
+                <w:rFonts w:ascii="Times New Roman" w:hAnsi="Times New Roman" w:cs="Times New Roman"/>
+                <w:b/>
+                <w:sz w:val="26"/>
+                <w:szCs w:val="26"/>
+                <w:lang w:val="it-IT"/>
+              </w:rPr>
+              <w:t xml:space="preserve">Sitografia: siti ufficiali delle tecnologie utilizzate</w:t>
+            </w:r>
+          </w:p>
+          <w:p>
+            <w:pPr>
+              <w:spacing w:after="160"/>
+              <w:jc w:val="both"/>
+              <w:rPr>
+                <w:rFonts w:ascii="Times New Roman" w:hAnsi="Times New Roman" w:cs="Times New Roman"/>
+                <w:sz w:val="28"/>
+                <w:szCs w:val="28"/>
+                <w:lang w:val="it-IT"/>
+              </w:rPr>
+            </w:pPr>
+            <w:r>
+              <w:rPr>
+                <w:rFonts w:ascii="Times New Roman" w:hAnsi="Times New Roman" w:cs="Times New Roman"/>
+                <w:sz w:val="28"/>
+                <w:szCs w:val="28"/>
+                <w:lang w:val="it-IT"/>
+              </w:rPr>
+              <w:t xml:space="preserve">Di seguito i riferimenti web ufficiali delle tecnologie, degli standard e degli strumenti citati nell’elaborato, raggruppati per area. Gli indirizzi sono stati verificati il 20 settembre 2026.</w:t>
+            </w:r>
+          </w:p>
+          <w:p>
+            <w:pPr>
+              <w:spacing w:before="120" w:after="80"/>
+              <w:rPr>
+                <w:rFonts w:ascii="Times New Roman" w:hAnsi="Times New Roman" w:cs="Times New Roman"/>
+                <w:b/>
+                <w:sz w:val="26"/>
+                <w:szCs w:val="26"/>
+                <w:lang w:val="it-IT"/>
+              </w:rPr>
+            </w:pPr>
+            <w:r>
+              <w:rPr>
+                <w:rFonts w:ascii="Times New Roman" w:hAnsi="Times New Roman" w:cs="Times New Roman"/>
+                <w:b/>
+                <w:sz w:val="26"/>
+                <w:szCs w:val="26"/>
+                <w:lang w:val="it-IT"/>
+              </w:rPr>
+              <w:t xml:space="preserve">Backend (Java)</w:t>
+            </w:r>
+          </w:p>
+          <w:p>
+            <w:pPr>
+              <w:spacing w:after="80"/>
+              <w:ind w:left="360" w:hanging="360"/>
+              <w:jc w:val="both"/>
+              <w:rPr>
+                <w:rFonts w:ascii="Times New Roman" w:hAnsi="Times New Roman" w:cs="Times New Roman"/>
+                <w:sz w:val="28"/>
+                <w:szCs w:val="28"/>
+                <w:lang w:val="it-IT"/>
+              </w:rPr>
+            </w:pPr>
+            <w:r>
+              <w:rPr>
+                <w:rFonts w:ascii="Times New Roman" w:hAnsi="Times New Roman" w:cs="Times New Roman"/>
+                <w:sz w:val="28"/>
+                <w:szCs w:val="28"/>
+                <w:lang w:val="it-IT"/>
+              </w:rPr>
+              <w:t xml:space="preserve">– OpenJDK 21: </w:t>
+            </w:r>
+            <w:hyperlink r:id="rId32" w:history="1">
+              <w:r>
+                <w:rPr>
+                  <w:rFonts w:ascii="Times New Roman" w:hAnsi="Times New Roman" w:cs="Times New Roman"/>
+                  <w:color w:val="0563C1"/>
+                  <w:sz w:val="28"/>
+                  <w:szCs w:val="28"/>
+                  <w:u w:val="single"/>
+                  <w:lang w:val="it-IT"/>
+                </w:rPr>
+                <w:t xml:space="preserve">https://openjdk.org/projects/jdk/21/</w:t>
+              </w:r>
+            </w:hyperlink>
+          </w:p>
+          <w:p>
+            <w:pPr>
+              <w:spacing w:after="80"/>
+              <w:ind w:left="360" w:hanging="360"/>
+              <w:jc w:val="both"/>
+              <w:rPr>
+                <w:rFonts w:ascii="Times New Roman" w:hAnsi="Times New Roman" w:cs="Times New Roman"/>
+                <w:sz w:val="28"/>
+                <w:szCs w:val="28"/>
+                <w:lang w:val="it-IT"/>
+              </w:rPr>
+            </w:pPr>
+            <w:r>
+              <w:rPr>
+                <w:rFonts w:ascii="Times New Roman" w:hAnsi="Times New Roman" w:cs="Times New Roman"/>
+                <w:sz w:val="28"/>
+                <w:szCs w:val="28"/>
+                <w:lang w:val="it-IT"/>
+              </w:rPr>
+              <w:t xml:space="preserve">– Spring Boot: </w:t>
+            </w:r>
+            <w:hyperlink r:id="rId31" w:history="1">
+              <w:r>
+                <w:rPr>
+                  <w:rFonts w:ascii="Times New Roman" w:hAnsi="Times New Roman" w:cs="Times New Roman"/>
+                  <w:color w:val="0563C1"/>
+                  <w:sz w:val="28"/>
+                  <w:szCs w:val="28"/>
+                  <w:u w:val="single"/>
+                  <w:lang w:val="it-IT"/>
+                </w:rPr>
+                <w:t xml:space="preserve">https://spring.io/projects/spring-boot</w:t>
+              </w:r>
+            </w:hyperlink>
+          </w:p>
+          <w:p>
+            <w:pPr>
+              <w:spacing w:after="80"/>
+              <w:ind w:left="360" w:hanging="360"/>
+              <w:jc w:val="both"/>
+              <w:rPr>
+                <w:rFonts w:ascii="Times New Roman" w:hAnsi="Times New Roman" w:cs="Times New Roman"/>
+                <w:sz w:val="28"/>
+                <w:szCs w:val="28"/>
+                <w:lang w:val="it-IT"/>
+              </w:rPr>
+            </w:pPr>
+            <w:r>
+              <w:rPr>
+                <w:rFonts w:ascii="Times New Roman" w:hAnsi="Times New Roman" w:cs="Times New Roman"/>
+                <w:sz w:val="28"/>
+                <w:szCs w:val="28"/>
+                <w:lang w:val="it-IT"/>
+              </w:rPr>
+              <w:t xml:space="preserve">– Spring Security: </w:t>
+            </w:r>
+            <w:hyperlink r:id="rId33" w:history="1">
+              <w:r>
+                <w:rPr>
+                  <w:rFonts w:ascii="Times New Roman" w:hAnsi="Times New Roman" w:cs="Times New Roman"/>
+                  <w:color w:val="0563C1"/>
+                  <w:sz w:val="28"/>
+                  <w:szCs w:val="28"/>
+                  <w:u w:val="single"/>
+                  <w:lang w:val="it-IT"/>
+                </w:rPr>
+                <w:t xml:space="preserve">https://spring.io/projects/spring-security</w:t>
+              </w:r>
+            </w:hyperlink>
+          </w:p>
+          <w:p>
+            <w:pPr>
+              <w:spacing w:after="80"/>
+              <w:ind w:left="360" w:hanging="360"/>
+              <w:jc w:val="both"/>
+              <w:rPr>
+                <w:rFonts w:ascii="Times New Roman" w:hAnsi="Times New Roman" w:cs="Times New Roman"/>
+                <w:sz w:val="28"/>
+                <w:szCs w:val="28"/>
+                <w:lang w:val="it-IT"/>
+              </w:rPr>
+            </w:pPr>
+            <w:r>
+              <w:rPr>
+                <w:rFonts w:ascii="Times New Roman" w:hAnsi="Times New Roman" w:cs="Times New Roman"/>
+                <w:sz w:val="28"/>
+                <w:szCs w:val="28"/>
+                <w:lang w:val="it-IT"/>
+              </w:rPr>
+              <w:t xml:space="preserve">– Spring Data JPA: </w:t>
+            </w:r>
+            <w:hyperlink r:id="rId34" w:history="1">
+              <w:r>
+                <w:rPr>
+                  <w:rFonts w:ascii="Times New Roman" w:hAnsi="Times New Roman" w:cs="Times New Roman"/>
+                  <w:color w:val="0563C1"/>
+                  <w:sz w:val="28"/>
+                  <w:szCs w:val="28"/>
+                  <w:u w:val="single"/>
+                  <w:lang w:val="it-IT"/>
+                </w:rPr>
+                <w:t xml:space="preserve">https://spring.io/projects/spring-data-jpa</w:t>
+              </w:r>
+            </w:hyperlink>
+          </w:p>
+          <w:p>
+            <w:pPr>
+              <w:spacing w:after="80"/>
+              <w:ind w:left="360" w:hanging="360"/>
+              <w:jc w:val="both"/>
+              <w:rPr>
+                <w:rFonts w:ascii="Times New Roman" w:hAnsi="Times New Roman" w:cs="Times New Roman"/>
+                <w:sz w:val="28"/>
+                <w:szCs w:val="28"/>
+                <w:lang w:val="it-IT"/>
+              </w:rPr>
+            </w:pPr>
+            <w:r>
+              <w:rPr>
+                <w:rFonts w:ascii="Times New Roman" w:hAnsi="Times New Roman" w:cs="Times New Roman"/>
+                <w:sz w:val="28"/>
+                <w:szCs w:val="28"/>
+                <w:lang w:val="it-IT"/>
+              </w:rPr>
+              <w:t xml:space="preserve">– Hibernate ORM: </w:t>
+            </w:r>
+            <w:hyperlink r:id="rId54" w:history="1">
+              <w:r>
+                <w:rPr>
+                  <w:rFonts w:ascii="Times New Roman" w:hAnsi="Times New Roman" w:cs="Times New Roman"/>
+                  <w:color w:val="0563C1"/>
+                  <w:sz w:val="28"/>
+                  <w:szCs w:val="28"/>
+                  <w:u w:val="single"/>
+                  <w:lang w:val="it-IT"/>
+                </w:rPr>
+                <w:t xml:space="preserve">https://hibernate.org/orm/</w:t>
+              </w:r>
+            </w:hyperlink>
+          </w:p>
+          <w:p>
+            <w:pPr>
+              <w:spacing w:after="80"/>
+              <w:ind w:left="360" w:hanging="360"/>
+              <w:jc w:val="both"/>
+              <w:rPr>
+                <w:rFonts w:ascii="Times New Roman" w:hAnsi="Times New Roman" w:cs="Times New Roman"/>
+                <w:sz w:val="28"/>
+                <w:szCs w:val="28"/>
+                <w:lang w:val="it-IT"/>
+              </w:rPr>
+            </w:pPr>
+            <w:r>
+              <w:rPr>
+                <w:rFonts w:ascii="Times New Roman" w:hAnsi="Times New Roman" w:cs="Times New Roman"/>
+                <w:sz w:val="28"/>
+                <w:szCs w:val="28"/>
+                <w:lang w:val="it-IT"/>
+              </w:rPr>
+              <w:t xml:space="preserve">– MapStruct: </w:t>
+            </w:r>
+            <w:hyperlink r:id="rId35" w:history="1">
+              <w:r>
+                <w:rPr>
+                  <w:rFonts w:ascii="Times New Roman" w:hAnsi="Times New Roman" w:cs="Times New Roman"/>
+                  <w:color w:val="0563C1"/>
+                  <w:sz w:val="28"/>
+                  <w:szCs w:val="28"/>
+                  <w:u w:val="single"/>
+                  <w:lang w:val="it-IT"/>
+                </w:rPr>
+                <w:t xml:space="preserve">https://mapstruct.org</w:t>
+              </w:r>
+            </w:hyperlink>
+          </w:p>
+          <w:p>
+            <w:pPr>
+              <w:spacing w:after="80"/>
+              <w:ind w:left="360" w:hanging="360"/>
+              <w:jc w:val="both"/>
+              <w:rPr>
+                <w:rFonts w:ascii="Times New Roman" w:hAnsi="Times New Roman" w:cs="Times New Roman"/>
+                <w:sz w:val="28"/>
+                <w:szCs w:val="28"/>
+                <w:lang w:val="it-IT"/>
+              </w:rPr>
+            </w:pPr>
+            <w:r>
+              <w:rPr>
+                <w:rFonts w:ascii="Times New Roman" w:hAnsi="Times New Roman" w:cs="Times New Roman"/>
+                <w:sz w:val="28"/>
+                <w:szCs w:val="28"/>
+                <w:lang w:val="it-IT"/>
+              </w:rPr>
+              <w:t xml:space="preserve">– Project Lombok: </w:t>
+            </w:r>
+            <w:hyperlink r:id="rId36" w:history="1">
+              <w:r>
+                <w:rPr>
+                  <w:rFonts w:ascii="Times New Roman" w:hAnsi="Times New Roman" w:cs="Times New Roman"/>
+                  <w:color w:val="0563C1"/>
+                  <w:sz w:val="28"/>
+                  <w:szCs w:val="28"/>
+                  <w:u w:val="single"/>
+                  <w:lang w:val="it-IT"/>
+                </w:rPr>
+                <w:t xml:space="preserve">https://projectlombok.org</w:t>
+              </w:r>
+            </w:hyperlink>
+          </w:p>
+          <w:p>
+            <w:pPr>
+              <w:spacing w:after="80"/>
+              <w:ind w:left="360" w:hanging="360"/>
+              <w:jc w:val="both"/>
+              <w:rPr>
+                <w:rFonts w:ascii="Times New Roman" w:hAnsi="Times New Roman" w:cs="Times New Roman"/>
+                <w:sz w:val="28"/>
+                <w:szCs w:val="28"/>
+                <w:lang w:val="it-IT"/>
+              </w:rPr>
+            </w:pPr>
+            <w:r>
+              <w:rPr>
+                <w:rFonts w:ascii="Times New Roman" w:hAnsi="Times New Roman" w:cs="Times New Roman"/>
+                <w:sz w:val="28"/>
+                <w:szCs w:val="28"/>
+                <w:lang w:val="it-IT"/>
+              </w:rPr>
+              <w:t xml:space="preserve">– springdoc-openapi: </w:t>
+            </w:r>
+            <w:hyperlink r:id="rId40" w:history="1">
+              <w:r>
+                <w:rPr>
+                  <w:rFonts w:ascii="Times New Roman" w:hAnsi="Times New Roman" w:cs="Times New Roman"/>
+                  <w:color w:val="0563C1"/>
+                  <w:sz w:val="28"/>
+                  <w:szCs w:val="28"/>
+                  <w:u w:val="single"/>
+                  <w:lang w:val="it-IT"/>
+                </w:rPr>
+                <w:t xml:space="preserve">https://springdoc.org</w:t>
+              </w:r>
+            </w:hyperlink>
+          </w:p>
+          <w:p>
+            <w:pPr>
+              <w:spacing w:after="80"/>
+              <w:ind w:left="360" w:hanging="360"/>
+              <w:jc w:val="both"/>
+              <w:rPr>
+                <w:rFonts w:ascii="Times New Roman" w:hAnsi="Times New Roman" w:cs="Times New Roman"/>
+                <w:sz w:val="28"/>
+                <w:szCs w:val="28"/>
+                <w:lang w:val="it-IT"/>
+              </w:rPr>
+            </w:pPr>
+            <w:r>
+              <w:rPr>
+                <w:rFonts w:ascii="Times New Roman" w:hAnsi="Times New Roman" w:cs="Times New Roman"/>
+                <w:sz w:val="28"/>
+                <w:szCs w:val="28"/>
+                <w:lang w:val="it-IT"/>
+              </w:rPr>
+              <w:t xml:space="preserve">– OpenAPI Initiative: </w:t>
+            </w:r>
+            <w:hyperlink r:id="rId41" w:history="1">
+              <w:r>
+                <w:rPr>
+                  <w:rFonts w:ascii="Times New Roman" w:hAnsi="Times New Roman" w:cs="Times New Roman"/>
+                  <w:color w:val="0563C1"/>
+                  <w:sz w:val="28"/>
+                  <w:szCs w:val="28"/>
+                  <w:u w:val="single"/>
+                  <w:lang w:val="it-IT"/>
+                </w:rPr>
+                <w:t xml:space="preserve">https://www.openapis.org</w:t>
+              </w:r>
+            </w:hyperlink>
+          </w:p>
+          <w:p>
+            <w:pPr>
+              <w:spacing w:after="80"/>
+              <w:ind w:left="360" w:hanging="360"/>
+              <w:jc w:val="both"/>
+              <w:rPr>
+                <w:rFonts w:ascii="Times New Roman" w:hAnsi="Times New Roman" w:cs="Times New Roman"/>
+                <w:sz w:val="28"/>
+                <w:szCs w:val="28"/>
+                <w:lang w:val="it-IT"/>
+              </w:rPr>
+            </w:pPr>
+            <w:r>
+              <w:rPr>
+                <w:rFonts w:ascii="Times New Roman" w:hAnsi="Times New Roman" w:cs="Times New Roman"/>
+                <w:sz w:val="28"/>
+                <w:szCs w:val="28"/>
+                <w:lang w:val="it-IT"/>
+              </w:rPr>
+              <w:t xml:space="preserve">– Swagger UI: </w:t>
+            </w:r>
+            <w:hyperlink r:id="rId55" w:history="1">
+              <w:r>
+                <w:rPr>
+                  <w:rFonts w:ascii="Times New Roman" w:hAnsi="Times New Roman" w:cs="Times New Roman"/>
+                  <w:color w:val="0563C1"/>
+                  <w:sz w:val="28"/>
+                  <w:szCs w:val="28"/>
+                  <w:u w:val="single"/>
+                  <w:lang w:val="it-IT"/>
+                </w:rPr>
+                <w:t xml:space="preserve">https://swagger.io/tools/swagger-ui/</w:t>
+              </w:r>
+            </w:hyperlink>
+          </w:p>
+          <w:p>
+            <w:pPr>
+              <w:spacing w:after="80"/>
+              <w:ind w:left="360" w:hanging="360"/>
+              <w:jc w:val="both"/>
+              <w:rPr>
+                <w:rFonts w:ascii="Times New Roman" w:hAnsi="Times New Roman" w:cs="Times New Roman"/>
+                <w:sz w:val="28"/>
+                <w:szCs w:val="28"/>
+                <w:lang w:val="it-IT"/>
+              </w:rPr>
+            </w:pPr>
+            <w:r>
+              <w:rPr>
+                <w:rFonts w:ascii="Times New Roman" w:hAnsi="Times New Roman" w:cs="Times New Roman"/>
+                <w:sz w:val="28"/>
+                <w:szCs w:val="28"/>
+                <w:lang w:val="it-IT"/>
+              </w:rPr>
+              <w:t xml:space="preserve">– jjwt (JSON Web Token per Java): </w:t>
+            </w:r>
+            <w:hyperlink r:id="rId37" w:history="1">
+              <w:r>
+                <w:rPr>
+                  <w:rFonts w:ascii="Times New Roman" w:hAnsi="Times New Roman" w:cs="Times New Roman"/>
+                  <w:color w:val="0563C1"/>
+                  <w:sz w:val="28"/>
+                  <w:szCs w:val="28"/>
+                  <w:u w:val="single"/>
+                  <w:lang w:val="it-IT"/>
+                </w:rPr>
+                <w:t xml:space="preserve">https://github.com/jwtk/jjwt</w:t>
+              </w:r>
+            </w:hyperlink>
+          </w:p>
+          <w:p>
+            <w:pPr>
+              <w:spacing w:after="80"/>
+              <w:ind w:left="360" w:hanging="360"/>
+              <w:jc w:val="both"/>
+              <w:rPr>
+                <w:rFonts w:ascii="Times New Roman" w:hAnsi="Times New Roman" w:cs="Times New Roman"/>
+                <w:sz w:val="28"/>
+                <w:szCs w:val="28"/>
+                <w:lang w:val="it-IT"/>
+              </w:rPr>
+            </w:pPr>
+            <w:r>
+              <w:rPr>
+                <w:rFonts w:ascii="Times New Roman" w:hAnsi="Times New Roman" w:cs="Times New Roman"/>
+                <w:sz w:val="28"/>
+                <w:szCs w:val="28"/>
+                <w:lang w:val="it-IT"/>
+              </w:rPr>
+              <w:t xml:space="preserve">– java-totp (libreria alla base di totp-spring-boot-starter): </w:t>
+            </w:r>
+            <w:hyperlink r:id="rId38" w:history="1">
+              <w:r>
+                <w:rPr>
+                  <w:rFonts w:ascii="Times New Roman" w:hAnsi="Times New Roman" w:cs="Times New Roman"/>
+                  <w:color w:val="0563C1"/>
+                  <w:sz w:val="28"/>
+                  <w:szCs w:val="28"/>
+                  <w:u w:val="single"/>
+                  <w:lang w:val="it-IT"/>
+                </w:rPr>
+                <w:t xml:space="preserve">https://github.com/samdjstevens/java-totp</w:t>
+              </w:r>
+            </w:hyperlink>
+          </w:p>
+          <w:p>
+            <w:pPr>
+              <w:spacing w:after="80"/>
+              <w:ind w:left="360" w:hanging="360"/>
+              <w:jc w:val="both"/>
+              <w:rPr>
+                <w:rFonts w:ascii="Times New Roman" w:hAnsi="Times New Roman" w:cs="Times New Roman"/>
+                <w:sz w:val="28"/>
+                <w:szCs w:val="28"/>
+                <w:lang w:val="it-IT"/>
+              </w:rPr>
+            </w:pPr>
+            <w:r>
+              <w:rPr>
+                <w:rFonts w:ascii="Times New Roman" w:hAnsi="Times New Roman" w:cs="Times New Roman"/>
+                <w:sz w:val="28"/>
+                <w:szCs w:val="28"/>
+                <w:lang w:val="it-IT"/>
+              </w:rPr>
+              <w:t xml:space="preserve">– H2 Database: </w:t>
+            </w:r>
+            <w:hyperlink r:id="rId42" w:history="1">
+              <w:r>
+                <w:rPr>
+                  <w:rFonts w:ascii="Times New Roman" w:hAnsi="Times New Roman" w:cs="Times New Roman"/>
+                  <w:color w:val="0563C1"/>
+                  <w:sz w:val="28"/>
+                  <w:szCs w:val="28"/>
+                  <w:u w:val="single"/>
+                  <w:lang w:val="it-IT"/>
+                </w:rPr>
+                <w:t xml:space="preserve">https://www.h2database.com</w:t>
+              </w:r>
+            </w:hyperlink>
+          </w:p>
+          <w:p>
+            <w:pPr>
+              <w:spacing w:after="80"/>
+              <w:ind w:left="360" w:hanging="360"/>
+              <w:jc w:val="both"/>
+              <w:rPr>
+                <w:rFonts w:ascii="Times New Roman" w:hAnsi="Times New Roman" w:cs="Times New Roman"/>
+                <w:sz w:val="28"/>
+                <w:szCs w:val="28"/>
+                <w:lang w:val="it-IT"/>
+              </w:rPr>
+            </w:pPr>
+            <w:r>
+              <w:rPr>
+                <w:rFonts w:ascii="Times New Roman" w:hAnsi="Times New Roman" w:cs="Times New Roman"/>
+                <w:sz w:val="28"/>
+                <w:szCs w:val="28"/>
+                <w:lang w:val="it-IT"/>
+              </w:rPr>
+              <w:t xml:space="preserve">– Apache Maven: </w:t>
+            </w:r>
+            <w:hyperlink r:id="rId56" w:history="1">
+              <w:r>
+                <w:rPr>
+                  <w:rFonts w:ascii="Times New Roman" w:hAnsi="Times New Roman" w:cs="Times New Roman"/>
+                  <w:color w:val="0563C1"/>
+                  <w:sz w:val="28"/>
+                  <w:szCs w:val="28"/>
+                  <w:u w:val="single"/>
+                  <w:lang w:val="it-IT"/>
+                </w:rPr>
+                <w:t xml:space="preserve">https://maven.apache.org</w:t>
+              </w:r>
+            </w:hyperlink>
+          </w:p>
+          <w:p>
+            <w:pPr>
+              <w:spacing w:before="120" w:after="80"/>
+              <w:rPr>
+                <w:rFonts w:ascii="Times New Roman" w:hAnsi="Times New Roman" w:cs="Times New Roman"/>
+                <w:b/>
+                <w:sz w:val="26"/>
+                <w:szCs w:val="26"/>
+                <w:lang w:val="it-IT"/>
+              </w:rPr>
+            </w:pPr>
+            <w:r>
+              <w:rPr>
+                <w:rFonts w:ascii="Times New Roman" w:hAnsi="Times New Roman" w:cs="Times New Roman"/>
+                <w:b/>
+                <w:sz w:val="26"/>
+                <w:szCs w:val="26"/>
+                <w:lang w:val="it-IT"/>
+              </w:rPr>
+              <w:t xml:space="preserve">Standard e specifiche</w:t>
+            </w:r>
+          </w:p>
+          <w:p>
+            <w:pPr>
+              <w:spacing w:after="80"/>
+              <w:ind w:left="360" w:hanging="360"/>
+              <w:jc w:val="both"/>
+              <w:rPr>
+                <w:rFonts w:ascii="Times New Roman" w:hAnsi="Times New Roman" w:cs="Times New Roman"/>
+                <w:sz w:val="28"/>
+                <w:szCs w:val="28"/>
+                <w:lang w:val="it-IT"/>
+              </w:rPr>
+            </w:pPr>
+            <w:r>
+              <w:rPr>
+                <w:rFonts w:ascii="Times New Roman" w:hAnsi="Times New Roman" w:cs="Times New Roman"/>
+                <w:sz w:val="28"/>
+                <w:szCs w:val="28"/>
+                <w:lang w:val="it-IT"/>
+              </w:rPr>
+              <w:t xml:space="preserve">– RFC 7519 – JSON Web Token (JWT): </w:t>
+            </w:r>
+            <w:hyperlink r:id="rId57" w:history="1">
+              <w:r>
+                <w:rPr>
+                  <w:rFonts w:ascii="Times New Roman" w:hAnsi="Times New Roman" w:cs="Times New Roman"/>
+                  <w:color w:val="0563C1"/>
+                  <w:sz w:val="28"/>
+                  <w:szCs w:val="28"/>
+                  <w:u w:val="single"/>
+                  <w:lang w:val="it-IT"/>
+                </w:rPr>
+                <w:t xml:space="preserve">https://datatracker.ietf.org/doc/html/rfc7519</w:t>
+              </w:r>
+            </w:hyperlink>
+          </w:p>
+          <w:p>
+            <w:pPr>
+              <w:spacing w:after="80"/>
+              <w:ind w:left="360" w:hanging="360"/>
+              <w:jc w:val="both"/>
+              <w:rPr>
+                <w:rFonts w:ascii="Times New Roman" w:hAnsi="Times New Roman" w:cs="Times New Roman"/>
+                <w:sz w:val="28"/>
+                <w:szCs w:val="28"/>
+                <w:lang w:val="it-IT"/>
+              </w:rPr>
+            </w:pPr>
+            <w:r>
+              <w:rPr>
+                <w:rFonts w:ascii="Times New Roman" w:hAnsi="Times New Roman" w:cs="Times New Roman"/>
+                <w:sz w:val="28"/>
+                <w:szCs w:val="28"/>
+                <w:lang w:val="it-IT"/>
+              </w:rPr>
+              <w:t xml:space="preserve">– RFC 6238 – TOTP: </w:t>
+            </w:r>
+            <w:hyperlink r:id="rId39" w:history="1">
+              <w:r>
+                <w:rPr>
+                  <w:rFonts w:ascii="Times New Roman" w:hAnsi="Times New Roman" w:cs="Times New Roman"/>
+                  <w:color w:val="0563C1"/>
+                  <w:sz w:val="28"/>
+                  <w:szCs w:val="28"/>
+                  <w:u w:val="single"/>
+                  <w:lang w:val="it-IT"/>
+                </w:rPr>
+                <w:t xml:space="preserve">https://datatracker.ietf.org/doc/html/rfc6238</w:t>
+              </w:r>
+            </w:hyperlink>
+          </w:p>
+          <w:p>
+            <w:pPr>
+              <w:spacing w:after="80"/>
+              <w:ind w:left="360" w:hanging="360"/>
+              <w:jc w:val="both"/>
+              <w:rPr>
+                <w:rFonts w:ascii="Times New Roman" w:hAnsi="Times New Roman" w:cs="Times New Roman"/>
+                <w:sz w:val="28"/>
+                <w:szCs w:val="28"/>
+                <w:lang w:val="it-IT"/>
+              </w:rPr>
+            </w:pPr>
+            <w:r>
+              <w:rPr>
+                <w:rFonts w:ascii="Times New Roman" w:hAnsi="Times New Roman" w:cs="Times New Roman"/>
+                <w:sz w:val="28"/>
+                <w:szCs w:val="28"/>
+                <w:lang w:val="it-IT"/>
+              </w:rPr>
+              <w:t xml:space="preserve">– RFC 7807 – Problem Details for HTTP APIs: </w:t>
+            </w:r>
+            <w:hyperlink r:id="rId58" w:history="1">
+              <w:r>
+                <w:rPr>
+                  <w:rFonts w:ascii="Times New Roman" w:hAnsi="Times New Roman" w:cs="Times New Roman"/>
+                  <w:color w:val="0563C1"/>
+                  <w:sz w:val="28"/>
+                  <w:szCs w:val="28"/>
+                  <w:u w:val="single"/>
+                  <w:lang w:val="it-IT"/>
+                </w:rPr>
+                <w:t xml:space="preserve">https://datatracker.ietf.org/doc/html/rfc7807</w:t>
+              </w:r>
+            </w:hyperlink>
+          </w:p>
+          <w:p>
+            <w:pPr>
+              <w:spacing w:before="120" w:after="80"/>
+              <w:rPr>
+                <w:rFonts w:ascii="Times New Roman" w:hAnsi="Times New Roman" w:cs="Times New Roman"/>
+                <w:b/>
+                <w:sz w:val="26"/>
+                <w:szCs w:val="26"/>
+                <w:lang w:val="it-IT"/>
+              </w:rPr>
+            </w:pPr>
+            <w:r>
+              <w:rPr>
+                <w:rFonts w:ascii="Times New Roman" w:hAnsi="Times New Roman" w:cs="Times New Roman"/>
+                <w:b/>
+                <w:sz w:val="26"/>
+                <w:szCs w:val="26"/>
+                <w:lang w:val="it-IT"/>
+              </w:rPr>
+              <w:t xml:space="preserve">Test e qualità</w:t>
+            </w:r>
+          </w:p>
+          <w:p>
+            <w:pPr>
+              <w:spacing w:after="80"/>
+              <w:ind w:left="360" w:hanging="360"/>
+              <w:jc w:val="both"/>
+              <w:rPr>
+                <w:rFonts w:ascii="Times New Roman" w:hAnsi="Times New Roman" w:cs="Times New Roman"/>
+                <w:sz w:val="28"/>
+                <w:szCs w:val="28"/>
+                <w:lang w:val="it-IT"/>
+              </w:rPr>
+            </w:pPr>
+            <w:r>
+              <w:rPr>
+                <w:rFonts w:ascii="Times New Roman" w:hAnsi="Times New Roman" w:cs="Times New Roman"/>
+                <w:sz w:val="28"/>
+                <w:szCs w:val="28"/>
+                <w:lang w:val="it-IT"/>
+              </w:rPr>
+              <w:t xml:space="preserve">– JUnit 5: </w:t>
+            </w:r>
+            <w:hyperlink r:id="rId59" w:history="1">
+              <w:r>
+                <w:rPr>
+                  <w:rFonts w:ascii="Times New Roman" w:hAnsi="Times New Roman" w:cs="Times New Roman"/>
+                  <w:color w:val="0563C1"/>
+                  <w:sz w:val="28"/>
+                  <w:szCs w:val="28"/>
+                  <w:u w:val="single"/>
+                  <w:lang w:val="it-IT"/>
+                </w:rPr>
+                <w:t xml:space="preserve">https://junit.org/junit5/</w:t>
+              </w:r>
+            </w:hyperlink>
+          </w:p>
+          <w:p>
+            <w:pPr>
+              <w:spacing w:after="80"/>
+              <w:ind w:left="360" w:hanging="360"/>
+              <w:jc w:val="both"/>
+              <w:rPr>
+                <w:rFonts w:ascii="Times New Roman" w:hAnsi="Times New Roman" w:cs="Times New Roman"/>
+                <w:sz w:val="28"/>
+                <w:szCs w:val="28"/>
+                <w:lang w:val="it-IT"/>
+              </w:rPr>
+            </w:pPr>
+            <w:r>
+              <w:rPr>
+                <w:rFonts w:ascii="Times New Roman" w:hAnsi="Times New Roman" w:cs="Times New Roman"/>
+                <w:sz w:val="28"/>
+                <w:szCs w:val="28"/>
+                <w:lang w:val="it-IT"/>
+              </w:rPr>
+              <w:t xml:space="preserve">– Mockito: </w:t>
+            </w:r>
+            <w:hyperlink r:id="rId60" w:history="1">
+              <w:r>
+                <w:rPr>
+                  <w:rFonts w:ascii="Times New Roman" w:hAnsi="Times New Roman" w:cs="Times New Roman"/>
+                  <w:color w:val="0563C1"/>
+                  <w:sz w:val="28"/>
+                  <w:szCs w:val="28"/>
+                  <w:u w:val="single"/>
+                  <w:lang w:val="it-IT"/>
+                </w:rPr>
+                <w:t xml:space="preserve">https://site.mockito.org</w:t>
+              </w:r>
+            </w:hyperlink>
+          </w:p>
+          <w:p>
+            <w:pPr>
+              <w:spacing w:after="80"/>
+              <w:ind w:left="360" w:hanging="360"/>
+              <w:jc w:val="both"/>
+              <w:rPr>
+                <w:rFonts w:ascii="Times New Roman" w:hAnsi="Times New Roman" w:cs="Times New Roman"/>
+                <w:sz w:val="28"/>
+                <w:szCs w:val="28"/>
+                <w:lang w:val="it-IT"/>
+              </w:rPr>
+            </w:pPr>
+            <w:r>
+              <w:rPr>
+                <w:rFonts w:ascii="Times New Roman" w:hAnsi="Times New Roman" w:cs="Times New Roman"/>
+                <w:sz w:val="28"/>
+                <w:szCs w:val="28"/>
+                <w:lang w:val="it-IT"/>
+              </w:rPr>
+              <w:t xml:space="preserve">– JaCoCo: </w:t>
+            </w:r>
+            <w:hyperlink r:id="rId43" w:history="1">
+              <w:r>
+                <w:rPr>
+                  <w:rFonts w:ascii="Times New Roman" w:hAnsi="Times New Roman" w:cs="Times New Roman"/>
+                  <w:color w:val="0563C1"/>
+                  <w:sz w:val="28"/>
+                  <w:szCs w:val="28"/>
+                  <w:u w:val="single"/>
+                  <w:lang w:val="it-IT"/>
+                </w:rPr>
+                <w:t xml:space="preserve">https://www.jacoco.org/jacoco/</w:t>
+              </w:r>
+            </w:hyperlink>
+          </w:p>
+          <w:p>
+            <w:pPr>
+              <w:spacing w:after="80"/>
+              <w:ind w:left="360" w:hanging="360"/>
+              <w:jc w:val="both"/>
+              <w:rPr>
+                <w:rFonts w:ascii="Times New Roman" w:hAnsi="Times New Roman" w:cs="Times New Roman"/>
+                <w:sz w:val="28"/>
+                <w:szCs w:val="28"/>
+                <w:lang w:val="it-IT"/>
+              </w:rPr>
+            </w:pPr>
+            <w:r>
+              <w:rPr>
+                <w:rFonts w:ascii="Times New Roman" w:hAnsi="Times New Roman" w:cs="Times New Roman"/>
+                <w:sz w:val="28"/>
+                <w:szCs w:val="28"/>
+                <w:lang w:val="it-IT"/>
+              </w:rPr>
+              <w:t xml:space="preserve">– Karma: </w:t>
+            </w:r>
+            <w:hyperlink r:id="rId61" w:history="1">
+              <w:r>
+                <w:rPr>
+                  <w:rFonts w:ascii="Times New Roman" w:hAnsi="Times New Roman" w:cs="Times New Roman"/>
+                  <w:color w:val="0563C1"/>
+                  <w:sz w:val="28"/>
+                  <w:szCs w:val="28"/>
+                  <w:u w:val="single"/>
+                  <w:lang w:val="it-IT"/>
+                </w:rPr>
+                <w:t xml:space="preserve">https://karma-runner.github.io</w:t>
+              </w:r>
+            </w:hyperlink>
+          </w:p>
+          <w:p>
+            <w:pPr>
+              <w:spacing w:after="80"/>
+              <w:ind w:left="360" w:hanging="360"/>
+              <w:jc w:val="both"/>
+              <w:rPr>
+                <w:rFonts w:ascii="Times New Roman" w:hAnsi="Times New Roman" w:cs="Times New Roman"/>
+                <w:sz w:val="28"/>
+                <w:szCs w:val="28"/>
+                <w:lang w:val="it-IT"/>
+              </w:rPr>
+            </w:pPr>
+            <w:r>
+              <w:rPr>
+                <w:rFonts w:ascii="Times New Roman" w:hAnsi="Times New Roman" w:cs="Times New Roman"/>
+                <w:sz w:val="28"/>
+                <w:szCs w:val="28"/>
+                <w:lang w:val="it-IT"/>
+              </w:rPr>
+              <w:t xml:space="preserve">– Jasmine: </w:t>
+            </w:r>
+            <w:hyperlink r:id="rId62" w:history="1">
+              <w:r>
+                <w:rPr>
+                  <w:rFonts w:ascii="Times New Roman" w:hAnsi="Times New Roman" w:cs="Times New Roman"/>
+                  <w:color w:val="0563C1"/>
+                  <w:sz w:val="28"/>
+                  <w:szCs w:val="28"/>
+                  <w:u w:val="single"/>
+                  <w:lang w:val="it-IT"/>
+                </w:rPr>
+                <w:t xml:space="preserve">https://jasmine.github.io</w:t>
+              </w:r>
+            </w:hyperlink>
+          </w:p>
+          <w:p>
+            <w:pPr>
+              <w:spacing w:before="120" w:after="80"/>
+              <w:rPr>
+                <w:rFonts w:ascii="Times New Roman" w:hAnsi="Times New Roman" w:cs="Times New Roman"/>
+                <w:b/>
+                <w:sz w:val="26"/>
+                <w:szCs w:val="26"/>
+                <w:lang w:val="it-IT"/>
+              </w:rPr>
+            </w:pPr>
+            <w:r>
+              <w:rPr>
+                <w:rFonts w:ascii="Times New Roman" w:hAnsi="Times New Roman" w:cs="Times New Roman"/>
+                <w:b/>
+                <w:sz w:val="26"/>
+                <w:szCs w:val="26"/>
+                <w:lang w:val="it-IT"/>
+              </w:rPr>
+              <w:t xml:space="preserve">Frontend (Angular)</w:t>
+            </w:r>
+          </w:p>
+          <w:p>
+            <w:pPr>
+              <w:spacing w:after="80"/>
+              <w:ind w:left="360" w:hanging="360"/>
+              <w:jc w:val="both"/>
+              <w:rPr>
+                <w:rFonts w:ascii="Times New Roman" w:hAnsi="Times New Roman" w:cs="Times New Roman"/>
+                <w:sz w:val="28"/>
+                <w:szCs w:val="28"/>
+                <w:lang w:val="it-IT"/>
+              </w:rPr>
+            </w:pPr>
+            <w:r>
+              <w:rPr>
+                <w:rFonts w:ascii="Times New Roman" w:hAnsi="Times New Roman" w:cs="Times New Roman"/>
+                <w:sz w:val="28"/>
+                <w:szCs w:val="28"/>
+                <w:lang w:val="it-IT"/>
+              </w:rPr>
+              <w:t xml:space="preserve">– Angular: </w:t>
+            </w:r>
+            <w:hyperlink r:id="rId44" w:history="1">
+              <w:r>
+                <w:rPr>
+                  <w:rFonts w:ascii="Times New Roman" w:hAnsi="Times New Roman" w:cs="Times New Roman"/>
+                  <w:color w:val="0563C1"/>
+                  <w:sz w:val="28"/>
+                  <w:szCs w:val="28"/>
+                  <w:u w:val="single"/>
+                  <w:lang w:val="it-IT"/>
+                </w:rPr>
+                <w:t xml:space="preserve">https://angular.dev</w:t>
+              </w:r>
+            </w:hyperlink>
+          </w:p>
+          <w:p>
+            <w:pPr>
+              <w:spacing w:after="80"/>
+              <w:ind w:left="360" w:hanging="360"/>
+              <w:jc w:val="both"/>
+              <w:rPr>
+                <w:rFonts w:ascii="Times New Roman" w:hAnsi="Times New Roman" w:cs="Times New Roman"/>
+                <w:sz w:val="28"/>
+                <w:szCs w:val="28"/>
+                <w:lang w:val="it-IT"/>
+              </w:rPr>
+            </w:pPr>
+            <w:r>
+              <w:rPr>
+                <w:rFonts w:ascii="Times New Roman" w:hAnsi="Times New Roman" w:cs="Times New Roman"/>
+                <w:sz w:val="28"/>
+                <w:szCs w:val="28"/>
+                <w:lang w:val="it-IT"/>
+              </w:rPr>
+              <w:t xml:space="preserve">– Angular – HTTP interceptor: </w:t>
+            </w:r>
+            <w:hyperlink r:id="rId46" w:history="1">
+              <w:r>
+                <w:rPr>
+                  <w:rFonts w:ascii="Times New Roman" w:hAnsi="Times New Roman" w:cs="Times New Roman"/>
+                  <w:color w:val="0563C1"/>
+                  <w:sz w:val="28"/>
+                  <w:szCs w:val="28"/>
+                  <w:u w:val="single"/>
+                  <w:lang w:val="it-IT"/>
+                </w:rPr>
+                <w:t xml:space="preserve">https://angular.dev/guide/http/interceptors</w:t>
+              </w:r>
+            </w:hyperlink>
+          </w:p>
+          <w:p>
+            <w:pPr>
+              <w:spacing w:after="80"/>
+              <w:ind w:left="360" w:hanging="360"/>
+              <w:jc w:val="both"/>
+              <w:rPr>
+                <w:rFonts w:ascii="Times New Roman" w:hAnsi="Times New Roman" w:cs="Times New Roman"/>
+                <w:sz w:val="28"/>
+                <w:szCs w:val="28"/>
+                <w:lang w:val="it-IT"/>
+              </w:rPr>
+            </w:pPr>
+            <w:r>
+              <w:rPr>
+                <w:rFonts w:ascii="Times New Roman" w:hAnsi="Times New Roman" w:cs="Times New Roman"/>
+                <w:sz w:val="28"/>
+                <w:szCs w:val="28"/>
+                <w:lang w:val="it-IT"/>
+              </w:rPr>
+              <w:t xml:space="preserve">– TypeScript: </w:t>
+            </w:r>
+            <w:hyperlink r:id="rId63" w:history="1">
+              <w:r>
+                <w:rPr>
+                  <w:rFonts w:ascii="Times New Roman" w:hAnsi="Times New Roman" w:cs="Times New Roman"/>
+                  <w:color w:val="0563C1"/>
+                  <w:sz w:val="28"/>
+                  <w:szCs w:val="28"/>
+                  <w:u w:val="single"/>
+                  <w:lang w:val="it-IT"/>
+                </w:rPr>
+                <w:t xml:space="preserve">https://www.typescriptlang.org</w:t>
+              </w:r>
+            </w:hyperlink>
+          </w:p>
+          <w:p>
+            <w:pPr>
+              <w:spacing w:after="80"/>
+              <w:ind w:left="360" w:hanging="360"/>
+              <w:jc w:val="both"/>
+              <w:rPr>
+                <w:rFonts w:ascii="Times New Roman" w:hAnsi="Times New Roman" w:cs="Times New Roman"/>
+                <w:sz w:val="28"/>
+                <w:szCs w:val="28"/>
+                <w:lang w:val="it-IT"/>
+              </w:rPr>
+            </w:pPr>
+            <w:r>
+              <w:rPr>
+                <w:rFonts w:ascii="Times New Roman" w:hAnsi="Times New Roman" w:cs="Times New Roman"/>
+                <w:sz w:val="28"/>
+                <w:szCs w:val="28"/>
+                <w:lang w:val="it-IT"/>
+              </w:rPr>
+              <w:t xml:space="preserve">– RxJS: </w:t>
+            </w:r>
+            <w:hyperlink r:id="rId45" w:history="1">
+              <w:r>
+                <w:rPr>
+                  <w:rFonts w:ascii="Times New Roman" w:hAnsi="Times New Roman" w:cs="Times New Roman"/>
+                  <w:color w:val="0563C1"/>
+                  <w:sz w:val="28"/>
+                  <w:szCs w:val="28"/>
+                  <w:u w:val="single"/>
+                  <w:lang w:val="it-IT"/>
+                </w:rPr>
+                <w:t xml:space="preserve">https://rxjs.dev</w:t>
+              </w:r>
+            </w:hyperlink>
+          </w:p>
+          <w:p>
+            <w:pPr>
+              <w:spacing w:after="80"/>
+              <w:ind w:left="360" w:hanging="360"/>
+              <w:jc w:val="both"/>
+              <w:rPr>
+                <w:rFonts w:ascii="Times New Roman" w:hAnsi="Times New Roman" w:cs="Times New Roman"/>
+                <w:sz w:val="28"/>
+                <w:szCs w:val="28"/>
+                <w:lang w:val="it-IT"/>
+              </w:rPr>
+            </w:pPr>
+            <w:r>
+              <w:rPr>
+                <w:rFonts w:ascii="Times New Roman" w:hAnsi="Times New Roman" w:cs="Times New Roman"/>
+                <w:sz w:val="28"/>
+                <w:szCs w:val="28"/>
+                <w:lang w:val="it-IT"/>
+              </w:rPr>
+              <w:t xml:space="preserve">– Tailwind CSS: </w:t>
+            </w:r>
+            <w:hyperlink r:id="rId64" w:history="1">
+              <w:r>
+                <w:rPr>
+                  <w:rFonts w:ascii="Times New Roman" w:hAnsi="Times New Roman" w:cs="Times New Roman"/>
+                  <w:color w:val="0563C1"/>
+                  <w:sz w:val="28"/>
+                  <w:szCs w:val="28"/>
+                  <w:u w:val="single"/>
+                  <w:lang w:val="it-IT"/>
+                </w:rPr>
+                <w:t xml:space="preserve">https://tailwindcss.com</w:t>
+              </w:r>
+            </w:hyperlink>
+          </w:p>
+          <w:p>
+            <w:pPr>
+              <w:spacing w:after="80"/>
+              <w:ind w:left="360" w:hanging="360"/>
+              <w:jc w:val="both"/>
+              <w:rPr>
+                <w:rFonts w:ascii="Times New Roman" w:hAnsi="Times New Roman" w:cs="Times New Roman"/>
+                <w:sz w:val="28"/>
+                <w:szCs w:val="28"/>
+                <w:lang w:val="it-IT"/>
+              </w:rPr>
+            </w:pPr>
+            <w:r>
+              <w:rPr>
+                <w:rFonts w:ascii="Times New Roman" w:hAnsi="Times New Roman" w:cs="Times New Roman"/>
+                <w:sz w:val="28"/>
+                <w:szCs w:val="28"/>
+                <w:lang w:val="it-IT"/>
+              </w:rPr>
+              <w:t xml:space="preserve">– Google Fonts: </w:t>
+            </w:r>
+            <w:hyperlink r:id="rId65" w:history="1">
+              <w:r>
+                <w:rPr>
+                  <w:rFonts w:ascii="Times New Roman" w:hAnsi="Times New Roman" w:cs="Times New Roman"/>
+                  <w:color w:val="0563C1"/>
+                  <w:sz w:val="28"/>
+                  <w:szCs w:val="28"/>
+                  <w:u w:val="single"/>
+                  <w:lang w:val="it-IT"/>
+                </w:rPr>
+                <w:t xml:space="preserve">https://fonts.google.com</w:t>
+              </w:r>
+            </w:hyperlink>
+          </w:p>
+          <w:p>
+            <w:pPr>
+              <w:spacing w:after="80"/>
+              <w:ind w:left="360" w:hanging="360"/>
+              <w:jc w:val="both"/>
+              <w:rPr>
+                <w:rFonts w:ascii="Times New Roman" w:hAnsi="Times New Roman" w:cs="Times New Roman"/>
+                <w:sz w:val="28"/>
+                <w:szCs w:val="28"/>
+                <w:lang w:val="it-IT"/>
+              </w:rPr>
+            </w:pPr>
+            <w:r>
+              <w:rPr>
+                <w:rFonts w:ascii="Times New Roman" w:hAnsi="Times New Roman" w:cs="Times New Roman"/>
+                <w:sz w:val="28"/>
+                <w:szCs w:val="28"/>
+                <w:lang w:val="it-IT"/>
+              </w:rPr>
+              <w:t xml:space="preserve">– Node.js: </w:t>
+            </w:r>
+            <w:hyperlink r:id="rId66" w:history="1">
+              <w:r>
+                <w:rPr>
+                  <w:rFonts w:ascii="Times New Roman" w:hAnsi="Times New Roman" w:cs="Times New Roman"/>
+                  <w:color w:val="0563C1"/>
+                  <w:sz w:val="28"/>
+                  <w:szCs w:val="28"/>
+                  <w:u w:val="single"/>
+                  <w:lang w:val="it-IT"/>
+                </w:rPr>
+                <w:t xml:space="preserve">https://nodejs.org</w:t>
+              </w:r>
+            </w:hyperlink>
+          </w:p>
+          <w:p>
+            <w:pPr>
+              <w:spacing w:before="120" w:after="80"/>
+              <w:rPr>
+                <w:rFonts w:ascii="Times New Roman" w:hAnsi="Times New Roman" w:cs="Times New Roman"/>
+                <w:b/>
+                <w:sz w:val="26"/>
+                <w:szCs w:val="26"/>
+                <w:lang w:val="it-IT"/>
+              </w:rPr>
+            </w:pPr>
+            <w:r>
+              <w:rPr>
+                <w:rFonts w:ascii="Times New Roman" w:hAnsi="Times New Roman" w:cs="Times New Roman"/>
+                <w:b/>
+                <w:sz w:val="26"/>
+                <w:szCs w:val="26"/>
+                <w:lang w:val="it-IT"/>
+              </w:rPr>
+              <w:t xml:space="preserve">DevOps e versionamento</w:t>
+            </w:r>
+          </w:p>
+          <w:p>
+            <w:pPr>
+              <w:spacing w:after="80"/>
+              <w:ind w:left="360" w:hanging="360"/>
+              <w:jc w:val="both"/>
+              <w:rPr>
+                <w:rFonts w:ascii="Times New Roman" w:hAnsi="Times New Roman" w:cs="Times New Roman"/>
+                <w:sz w:val="28"/>
+                <w:szCs w:val="28"/>
+                <w:lang w:val="it-IT"/>
+              </w:rPr>
+            </w:pPr>
+            <w:r>
+              <w:rPr>
+                <w:rFonts w:ascii="Times New Roman" w:hAnsi="Times New Roman" w:cs="Times New Roman"/>
+                <w:sz w:val="28"/>
+                <w:szCs w:val="28"/>
+                <w:lang w:val="it-IT"/>
+              </w:rPr>
+              <w:t xml:space="preserve">– Docker: </w:t>
             </w:r>
             <w:hyperlink r:id="rId47" w:history="1">
               <w:r>
@@ -2860,14 +4248,62 @@
                 <w:t xml:space="preserve">https://www.docker.com</w:t>
               </w:r>
             </w:hyperlink>
-            <w:r>
-              <w:rPr>
-                <w:rFonts w:ascii="Times New Roman" w:hAnsi="Times New Roman" w:cs="Times New Roman"/>
-                <w:sz w:val="28"/>
-                <w:szCs w:val="28"/>
-                <w:lang w:val="it-IT"/>
-              </w:rPr>
-              <w:t xml:space="preserve">; </w:t>
+          </w:p>
+          <w:p>
+            <w:pPr>
+              <w:spacing w:after="80"/>
+              <w:ind w:left="360" w:hanging="360"/>
+              <w:jc w:val="both"/>
+              <w:rPr>
+                <w:rFonts w:ascii="Times New Roman" w:hAnsi="Times New Roman" w:cs="Times New Roman"/>
+                <w:sz w:val="28"/>
+                <w:szCs w:val="28"/>
+                <w:lang w:val="it-IT"/>
+              </w:rPr>
+            </w:pPr>
+            <w:r>
+              <w:rPr>
+                <w:rFonts w:ascii="Times New Roman" w:hAnsi="Times New Roman" w:cs="Times New Roman"/>
+                <w:sz w:val="28"/>
+                <w:szCs w:val="28"/>
+                <w:lang w:val="it-IT"/>
+              </w:rPr>
+              <w:t xml:space="preserve">– Docker – build multi-stage: </w:t>
+            </w:r>
+            <w:hyperlink r:id="rId67" w:history="1">
+              <w:r>
+                <w:rPr>
+                  <w:rFonts w:ascii="Times New Roman" w:hAnsi="Times New Roman" w:cs="Times New Roman"/>
+                  <w:color w:val="0563C1"/>
+                  <w:sz w:val="28"/>
+                  <w:szCs w:val="28"/>
+                  <w:u w:val="single"/>
+                  <w:lang w:val="it-IT"/>
+                </w:rPr>
+                <w:t xml:space="preserve">https://docs.docker.com/build/building/multi-stage/</w:t>
+              </w:r>
+            </w:hyperlink>
+          </w:p>
+          <w:p>
+            <w:pPr>
+              <w:spacing w:after="80"/>
+              <w:ind w:left="360" w:hanging="360"/>
+              <w:jc w:val="both"/>
+              <w:rPr>
+                <w:rFonts w:ascii="Times New Roman" w:hAnsi="Times New Roman" w:cs="Times New Roman"/>
+                <w:sz w:val="28"/>
+                <w:szCs w:val="28"/>
+                <w:lang w:val="it-IT"/>
+              </w:rPr>
+            </w:pPr>
+            <w:r>
+              <w:rPr>
+                <w:rFonts w:ascii="Times New Roman" w:hAnsi="Times New Roman" w:cs="Times New Roman"/>
+                <w:sz w:val="28"/>
+                <w:szCs w:val="28"/>
+                <w:lang w:val="it-IT"/>
+              </w:rPr>
+              <w:t xml:space="preserve">– Docker Compose: </w:t>
             </w:r>
             <w:hyperlink r:id="rId48" w:history="1">
               <w:r>
@@ -2882,14 +4318,27 @@
                 <w:t xml:space="preserve">https://docs.docker.com/compose/</w:t>
               </w:r>
             </w:hyperlink>
-            <w:r>
-              <w:rPr>
-                <w:rFonts w:ascii="Times New Roman" w:hAnsi="Times New Roman" w:cs="Times New Roman"/>
-                <w:sz w:val="28"/>
-                <w:szCs w:val="28"/>
-                <w:lang w:val="it-IT"/>
-              </w:rPr>
-              <w:t xml:space="preserve">; </w:t>
+          </w:p>
+          <w:p>
+            <w:pPr>
+              <w:spacing w:after="80"/>
+              <w:ind w:left="360" w:hanging="360"/>
+              <w:jc w:val="both"/>
+              <w:rPr>
+                <w:rFonts w:ascii="Times New Roman" w:hAnsi="Times New Roman" w:cs="Times New Roman"/>
+                <w:sz w:val="28"/>
+                <w:szCs w:val="28"/>
+                <w:lang w:val="it-IT"/>
+              </w:rPr>
+            </w:pPr>
+            <w:r>
+              <w:rPr>
+                <w:rFonts w:ascii="Times New Roman" w:hAnsi="Times New Roman" w:cs="Times New Roman"/>
+                <w:sz w:val="28"/>
+                <w:szCs w:val="28"/>
+                <w:lang w:val="it-IT"/>
+              </w:rPr>
+              <w:t xml:space="preserve">– Nginx: </w:t>
             </w:r>
             <w:hyperlink r:id="rId49" w:history="1">
               <w:r>
@@ -2904,15 +4353,6 @@
                 <w:t xml:space="preserve">https://nginx.org</w:t>
               </w:r>
             </w:hyperlink>
-            <w:r>
-              <w:rPr>
-                <w:rFonts w:ascii="Times New Roman" w:hAnsi="Times New Roman" w:cs="Times New Roman"/>
-                <w:sz w:val="28"/>
-                <w:szCs w:val="28"/>
-                <w:lang w:val="it-IT"/>
-              </w:rPr>
-              <w:t xml:space="preserve">.</w:t>
-            </w:r>
           </w:p>
           <w:p>
             <w:pPr>
@@ -2933,7 +4373,7 @@
                 <w:szCs w:val="28"/>
                 <w:lang w:val="it-IT"/>
               </w:rPr>
-              <w:t xml:space="preserve">– GitHub Actions per l’integrazione continua, definita in .github/workflows/ci.yml: un job iniziale (basato su dorny/paths-filter) rileva quali moduli sono stati modificati, così che backend e frontend procedano in build → test → release in modo indipendente e solo quando contengono effettivamente modifiche, evitando esecuzioni superflue della pipeline. Riferimenti: </w:t>
+              <w:t xml:space="preserve">– GitHub Actions: </w:t>
             </w:r>
             <w:hyperlink r:id="rId50" w:history="1">
               <w:r>
@@ -2948,14 +4388,27 @@
                 <w:t xml:space="preserve">https://docs.github.com/actions</w:t>
               </w:r>
             </w:hyperlink>
-            <w:r>
-              <w:rPr>
-                <w:rFonts w:ascii="Times New Roman" w:hAnsi="Times New Roman" w:cs="Times New Roman"/>
-                <w:sz w:val="28"/>
-                <w:szCs w:val="28"/>
-                <w:lang w:val="it-IT"/>
-              </w:rPr>
-              <w:t xml:space="preserve">; </w:t>
+          </w:p>
+          <w:p>
+            <w:pPr>
+              <w:spacing w:after="80"/>
+              <w:ind w:left="360" w:hanging="360"/>
+              <w:jc w:val="both"/>
+              <w:rPr>
+                <w:rFonts w:ascii="Times New Roman" w:hAnsi="Times New Roman" w:cs="Times New Roman"/>
+                <w:sz w:val="28"/>
+                <w:szCs w:val="28"/>
+                <w:lang w:val="it-IT"/>
+              </w:rPr>
+            </w:pPr>
+            <w:r>
+              <w:rPr>
+                <w:rFonts w:ascii="Times New Roman" w:hAnsi="Times New Roman" w:cs="Times New Roman"/>
+                <w:sz w:val="28"/>
+                <w:szCs w:val="28"/>
+                <w:lang w:val="it-IT"/>
+              </w:rPr>
+              <w:t xml:space="preserve">– dorny/paths-filter: </w:t>
             </w:r>
             <w:hyperlink r:id="rId51" w:history="1">
               <w:r>
@@ -2968,1494 +4421,6 @@
                   <w:lang w:val="it-IT"/>
                 </w:rPr>
                 <w:t xml:space="preserve">https://github.com/dorny/paths-filter</w:t>
-              </w:r>
-            </w:hyperlink>
-            <w:r>
-              <w:rPr>
-                <w:rFonts w:ascii="Times New Roman" w:hAnsi="Times New Roman" w:cs="Times New Roman"/>
-                <w:sz w:val="28"/>
-                <w:szCs w:val="28"/>
-                <w:lang w:val="it-IT"/>
-              </w:rPr>
-              <w:t xml:space="preserve">.</w:t>
-            </w:r>
-          </w:p>
-          <w:p>
-            <w:pPr>
-              <w:spacing w:before="120" w:after="80"/>
-              <w:rPr>
-                <w:rFonts w:ascii="Times New Roman" w:hAnsi="Times New Roman" w:cs="Times New Roman"/>
-                <w:b/>
-                <w:sz w:val="26"/>
-                <w:szCs w:val="26"/>
-                <w:lang w:val="it-IT"/>
-              </w:rPr>
-            </w:pPr>
-            <w:r>
-              <w:rPr>
-                <w:rFonts w:ascii="Times New Roman" w:hAnsi="Times New Roman" w:cs="Times New Roman"/>
-                <w:b/>
-                <w:sz w:val="26"/>
-                <w:szCs w:val="26"/>
-                <w:lang w:val="it-IT"/>
-              </w:rPr>
-              <w:t xml:space="preserve">Sviluppo assistito da intelligenza artificiale</w:t>
-            </w:r>
-          </w:p>
-          <w:p>
-            <w:pPr>
-              <w:spacing w:after="80"/>
-              <w:ind w:left="360" w:hanging="360"/>
-              <w:jc w:val="both"/>
-              <w:rPr>
-                <w:rFonts w:ascii="Times New Roman" w:hAnsi="Times New Roman" w:cs="Times New Roman"/>
-                <w:sz w:val="28"/>
-                <w:szCs w:val="28"/>
-                <w:lang w:val="it-IT"/>
-              </w:rPr>
-            </w:pPr>
-            <w:r>
-              <w:rPr>
-                <w:rFonts w:ascii="Times New Roman" w:hAnsi="Times New Roman" w:cs="Times New Roman"/>
-                <w:sz w:val="28"/>
-                <w:szCs w:val="28"/>
-                <w:lang w:val="it-IT"/>
-              </w:rPr>
-              <w:t xml:space="preserve">– Claude (Anthropic), utilizzato come assistente di pair-programming per velocizzare la scrittura di codice ripetitivo e a basso rischio (DTO, mapper, configurazione boilerplate) e per la stesura della suite di test JUnit e Karma/Jasmine a partire dai casi di test che ho individuato io stesso: le decisioni di architettura, design pattern, modellazione del dominio e le scelte di sicurezza restano mie, mentre lo strumento ha permesso di dedicare più tempo a queste ultime riducendo il tempo speso a scrivere codice ripetitivo. Ogni suggerimento generato è stato rivisto e compreso prima di essere integrato, ed è proprio in questa fase di revisione che ho individuato la lacuna di sicurezza sull’endpoint dei ticket descritta nella Parte Seconda. Riferimenti: </w:t>
-            </w:r>
-            <w:hyperlink r:id="rId53" w:history="1">
-              <w:r>
-                <w:rPr>
-                  <w:rFonts w:ascii="Times New Roman" w:hAnsi="Times New Roman" w:cs="Times New Roman"/>
-                  <w:color w:val="0563C1"/>
-                  <w:sz w:val="28"/>
-                  <w:szCs w:val="28"/>
-                  <w:u w:val="single"/>
-                  <w:lang w:val="it-IT"/>
-                </w:rPr>
-                <w:t xml:space="preserve">https://www.anthropic.com/claude</w:t>
-              </w:r>
-            </w:hyperlink>
-            <w:r>
-              <w:rPr>
-                <w:rFonts w:ascii="Times New Roman" w:hAnsi="Times New Roman" w:cs="Times New Roman"/>
-                <w:sz w:val="28"/>
-                <w:szCs w:val="28"/>
-                <w:lang w:val="it-IT"/>
-              </w:rPr>
-              <w:t xml:space="preserve">.</w:t>
-            </w:r>
-          </w:p>
-          <w:p>
-            <w:pPr>
-              <w:spacing w:before="120" w:after="80"/>
-              <w:rPr>
-                <w:rFonts w:ascii="Times New Roman" w:hAnsi="Times New Roman" w:cs="Times New Roman"/>
-                <w:b/>
-                <w:sz w:val="26"/>
-                <w:szCs w:val="26"/>
-                <w:lang w:val="it-IT"/>
-              </w:rPr>
-            </w:pPr>
-            <w:r>
-              <w:rPr>
-                <w:rFonts w:ascii="Times New Roman" w:hAnsi="Times New Roman" w:cs="Times New Roman"/>
-                <w:b/>
-                <w:sz w:val="26"/>
-                <w:szCs w:val="26"/>
-                <w:lang w:val="it-IT"/>
-              </w:rPr>
-              <w:t xml:space="preserve">Sitografia: siti ufficiali delle tecnologie utilizzate</w:t>
-            </w:r>
-          </w:p>
-          <w:p>
-            <w:pPr>
-              <w:spacing w:after="160"/>
-              <w:jc w:val="both"/>
-              <w:rPr>
-                <w:rFonts w:ascii="Times New Roman" w:hAnsi="Times New Roman" w:cs="Times New Roman"/>
-                <w:sz w:val="28"/>
-                <w:szCs w:val="28"/>
-                <w:lang w:val="it-IT"/>
-              </w:rPr>
-            </w:pPr>
-            <w:r>
-              <w:rPr>
-                <w:rFonts w:ascii="Times New Roman" w:hAnsi="Times New Roman" w:cs="Times New Roman"/>
-                <w:sz w:val="28"/>
-                <w:szCs w:val="28"/>
-                <w:lang w:val="it-IT"/>
-              </w:rPr>
-              <w:t xml:space="preserve">Di seguito i riferimenti web ufficiali delle tecnologie, degli standard e degli strumenti citati nell’elaborato, raggruppati per area. Gli indirizzi sono stati verificati il 20 settembre 2026.</w:t>
-            </w:r>
-          </w:p>
-          <w:p>
-            <w:pPr>
-              <w:spacing w:before="120" w:after="80"/>
-              <w:rPr>
-                <w:rFonts w:ascii="Times New Roman" w:hAnsi="Times New Roman" w:cs="Times New Roman"/>
-                <w:b/>
-                <w:sz w:val="26"/>
-                <w:szCs w:val="26"/>
-                <w:lang w:val="it-IT"/>
-              </w:rPr>
-            </w:pPr>
-            <w:r>
-              <w:rPr>
-                <w:rFonts w:ascii="Times New Roman" w:hAnsi="Times New Roman" w:cs="Times New Roman"/>
-                <w:b/>
-                <w:sz w:val="26"/>
-                <w:szCs w:val="26"/>
-                <w:lang w:val="it-IT"/>
-              </w:rPr>
-              <w:t xml:space="preserve">Backend (Java)</w:t>
-            </w:r>
-          </w:p>
-          <w:p>
-            <w:pPr>
-              <w:spacing w:after="80"/>
-              <w:ind w:left="360" w:hanging="360"/>
-              <w:jc w:val="both"/>
-              <w:rPr>
-                <w:rFonts w:ascii="Times New Roman" w:hAnsi="Times New Roman" w:cs="Times New Roman"/>
-                <w:sz w:val="28"/>
-                <w:szCs w:val="28"/>
-                <w:lang w:val="it-IT"/>
-              </w:rPr>
-            </w:pPr>
-            <w:r>
-              <w:rPr>
-                <w:rFonts w:ascii="Times New Roman" w:hAnsi="Times New Roman" w:cs="Times New Roman"/>
-                <w:sz w:val="28"/>
-                <w:szCs w:val="28"/>
-                <w:lang w:val="it-IT"/>
-              </w:rPr>
-              <w:t xml:space="preserve">– OpenJDK 21: </w:t>
-            </w:r>
-            <w:hyperlink r:id="rId32" w:history="1">
-              <w:r>
-                <w:rPr>
-                  <w:rFonts w:ascii="Times New Roman" w:hAnsi="Times New Roman" w:cs="Times New Roman"/>
-                  <w:color w:val="0563C1"/>
-                  <w:sz w:val="28"/>
-                  <w:szCs w:val="28"/>
-                  <w:u w:val="single"/>
-                  <w:lang w:val="it-IT"/>
-                </w:rPr>
-                <w:t xml:space="preserve">https://openjdk.org/projects/jdk/21/</w:t>
-              </w:r>
-            </w:hyperlink>
-          </w:p>
-          <w:p>
-            <w:pPr>
-              <w:spacing w:after="80"/>
-              <w:ind w:left="360" w:hanging="360"/>
-              <w:jc w:val="both"/>
-              <w:rPr>
-                <w:rFonts w:ascii="Times New Roman" w:hAnsi="Times New Roman" w:cs="Times New Roman"/>
-                <w:sz w:val="28"/>
-                <w:szCs w:val="28"/>
-                <w:lang w:val="it-IT"/>
-              </w:rPr>
-            </w:pPr>
-            <w:r>
-              <w:rPr>
-                <w:rFonts w:ascii="Times New Roman" w:hAnsi="Times New Roman" w:cs="Times New Roman"/>
-                <w:sz w:val="28"/>
-                <w:szCs w:val="28"/>
-                <w:lang w:val="it-IT"/>
-              </w:rPr>
-              <w:t xml:space="preserve">– Spring Boot: </w:t>
-            </w:r>
-            <w:hyperlink r:id="rId31" w:history="1">
-              <w:r>
-                <w:rPr>
-                  <w:rFonts w:ascii="Times New Roman" w:hAnsi="Times New Roman" w:cs="Times New Roman"/>
-                  <w:color w:val="0563C1"/>
-                  <w:sz w:val="28"/>
-                  <w:szCs w:val="28"/>
-                  <w:u w:val="single"/>
-                  <w:lang w:val="it-IT"/>
-                </w:rPr>
-                <w:t xml:space="preserve">https://spring.io/projects/spring-boot</w:t>
-              </w:r>
-            </w:hyperlink>
-          </w:p>
-          <w:p>
-            <w:pPr>
-              <w:spacing w:after="80"/>
-              <w:ind w:left="360" w:hanging="360"/>
-              <w:jc w:val="both"/>
-              <w:rPr>
-                <w:rFonts w:ascii="Times New Roman" w:hAnsi="Times New Roman" w:cs="Times New Roman"/>
-                <w:sz w:val="28"/>
-                <w:szCs w:val="28"/>
-                <w:lang w:val="it-IT"/>
-              </w:rPr>
-            </w:pPr>
-            <w:r>
-              <w:rPr>
-                <w:rFonts w:ascii="Times New Roman" w:hAnsi="Times New Roman" w:cs="Times New Roman"/>
-                <w:sz w:val="28"/>
-                <w:szCs w:val="28"/>
-                <w:lang w:val="it-IT"/>
-              </w:rPr>
-              <w:t xml:space="preserve">– Spring Security: </w:t>
-            </w:r>
-            <w:hyperlink r:id="rId33" w:history="1">
-              <w:r>
-                <w:rPr>
-                  <w:rFonts w:ascii="Times New Roman" w:hAnsi="Times New Roman" w:cs="Times New Roman"/>
-                  <w:color w:val="0563C1"/>
-                  <w:sz w:val="28"/>
-                  <w:szCs w:val="28"/>
-                  <w:u w:val="single"/>
-                  <w:lang w:val="it-IT"/>
-                </w:rPr>
-                <w:t xml:space="preserve">https://spring.io/projects/spring-security</w:t>
-              </w:r>
-            </w:hyperlink>
-          </w:p>
-          <w:p>
-            <w:pPr>
-              <w:spacing w:after="80"/>
-              <w:ind w:left="360" w:hanging="360"/>
-              <w:jc w:val="both"/>
-              <w:rPr>
-                <w:rFonts w:ascii="Times New Roman" w:hAnsi="Times New Roman" w:cs="Times New Roman"/>
-                <w:sz w:val="28"/>
-                <w:szCs w:val="28"/>
-                <w:lang w:val="it-IT"/>
-              </w:rPr>
-            </w:pPr>
-            <w:r>
-              <w:rPr>
-                <w:rFonts w:ascii="Times New Roman" w:hAnsi="Times New Roman" w:cs="Times New Roman"/>
-                <w:sz w:val="28"/>
-                <w:szCs w:val="28"/>
-                <w:lang w:val="it-IT"/>
-              </w:rPr>
-              <w:t xml:space="preserve">– Spring Data JPA: </w:t>
-            </w:r>
-            <w:hyperlink r:id="rId34" w:history="1">
-              <w:r>
-                <w:rPr>
-                  <w:rFonts w:ascii="Times New Roman" w:hAnsi="Times New Roman" w:cs="Times New Roman"/>
-                  <w:color w:val="0563C1"/>
-                  <w:sz w:val="28"/>
-                  <w:szCs w:val="28"/>
-                  <w:u w:val="single"/>
-                  <w:lang w:val="it-IT"/>
-                </w:rPr>
-                <w:t xml:space="preserve">https://spring.io/projects/spring-data-jpa</w:t>
-              </w:r>
-            </w:hyperlink>
-          </w:p>
-          <w:p>
-            <w:pPr>
-              <w:spacing w:after="80"/>
-              <w:ind w:left="360" w:hanging="360"/>
-              <w:jc w:val="both"/>
-              <w:rPr>
-                <w:rFonts w:ascii="Times New Roman" w:hAnsi="Times New Roman" w:cs="Times New Roman"/>
-                <w:sz w:val="28"/>
-                <w:szCs w:val="28"/>
-                <w:lang w:val="it-IT"/>
-              </w:rPr>
-            </w:pPr>
-            <w:r>
-              <w:rPr>
-                <w:rFonts w:ascii="Times New Roman" w:hAnsi="Times New Roman" w:cs="Times New Roman"/>
-                <w:sz w:val="28"/>
-                <w:szCs w:val="28"/>
-                <w:lang w:val="it-IT"/>
-              </w:rPr>
-              <w:t xml:space="preserve">– Hibernate ORM: </w:t>
-            </w:r>
-            <w:hyperlink r:id="rId54" w:history="1">
-              <w:r>
-                <w:rPr>
-                  <w:rFonts w:ascii="Times New Roman" w:hAnsi="Times New Roman" w:cs="Times New Roman"/>
-                  <w:color w:val="0563C1"/>
-                  <w:sz w:val="28"/>
-                  <w:szCs w:val="28"/>
-                  <w:u w:val="single"/>
-                  <w:lang w:val="it-IT"/>
-                </w:rPr>
-                <w:t xml:space="preserve">https://hibernate.org/orm/</w:t>
-              </w:r>
-            </w:hyperlink>
-          </w:p>
-          <w:p>
-            <w:pPr>
-              <w:spacing w:after="80"/>
-              <w:ind w:left="360" w:hanging="360"/>
-              <w:jc w:val="both"/>
-              <w:rPr>
-                <w:rFonts w:ascii="Times New Roman" w:hAnsi="Times New Roman" w:cs="Times New Roman"/>
-                <w:sz w:val="28"/>
-                <w:szCs w:val="28"/>
-                <w:lang w:val="it-IT"/>
-              </w:rPr>
-            </w:pPr>
-            <w:r>
-              <w:rPr>
-                <w:rFonts w:ascii="Times New Roman" w:hAnsi="Times New Roman" w:cs="Times New Roman"/>
-                <w:sz w:val="28"/>
-                <w:szCs w:val="28"/>
-                <w:lang w:val="it-IT"/>
-              </w:rPr>
-              <w:t xml:space="preserve">– MapStruct: </w:t>
-            </w:r>
-            <w:hyperlink r:id="rId35" w:history="1">
-              <w:r>
-                <w:rPr>
-                  <w:rFonts w:ascii="Times New Roman" w:hAnsi="Times New Roman" w:cs="Times New Roman"/>
-                  <w:color w:val="0563C1"/>
-                  <w:sz w:val="28"/>
-                  <w:szCs w:val="28"/>
-                  <w:u w:val="single"/>
-                  <w:lang w:val="it-IT"/>
-                </w:rPr>
-                <w:t xml:space="preserve">https://mapstruct.org</w:t>
-              </w:r>
-            </w:hyperlink>
-          </w:p>
-          <w:p>
-            <w:pPr>
-              <w:spacing w:after="80"/>
-              <w:ind w:left="360" w:hanging="360"/>
-              <w:jc w:val="both"/>
-              <w:rPr>
-                <w:rFonts w:ascii="Times New Roman" w:hAnsi="Times New Roman" w:cs="Times New Roman"/>
-                <w:sz w:val="28"/>
-                <w:szCs w:val="28"/>
-                <w:lang w:val="it-IT"/>
-              </w:rPr>
-            </w:pPr>
-            <w:r>
-              <w:rPr>
-                <w:rFonts w:ascii="Times New Roman" w:hAnsi="Times New Roman" w:cs="Times New Roman"/>
-                <w:sz w:val="28"/>
-                <w:szCs w:val="28"/>
-                <w:lang w:val="it-IT"/>
-              </w:rPr>
-              <w:t xml:space="preserve">– Project Lombok: </w:t>
-            </w:r>
-            <w:hyperlink r:id="rId36" w:history="1">
-              <w:r>
-                <w:rPr>
-                  <w:rFonts w:ascii="Times New Roman" w:hAnsi="Times New Roman" w:cs="Times New Roman"/>
-                  <w:color w:val="0563C1"/>
-                  <w:sz w:val="28"/>
-                  <w:szCs w:val="28"/>
-                  <w:u w:val="single"/>
-                  <w:lang w:val="it-IT"/>
-                </w:rPr>
-                <w:t xml:space="preserve">https://projectlombok.org</w:t>
-              </w:r>
-            </w:hyperlink>
-          </w:p>
-          <w:p>
-            <w:pPr>
-              <w:spacing w:after="80"/>
-              <w:ind w:left="360" w:hanging="360"/>
-              <w:jc w:val="both"/>
-              <w:rPr>
-                <w:rFonts w:ascii="Times New Roman" w:hAnsi="Times New Roman" w:cs="Times New Roman"/>
-                <w:sz w:val="28"/>
-                <w:szCs w:val="28"/>
-                <w:lang w:val="it-IT"/>
-              </w:rPr>
-            </w:pPr>
-            <w:r>
-              <w:rPr>
-                <w:rFonts w:ascii="Times New Roman" w:hAnsi="Times New Roman" w:cs="Times New Roman"/>
-                <w:sz w:val="28"/>
-                <w:szCs w:val="28"/>
-                <w:lang w:val="it-IT"/>
-              </w:rPr>
-              <w:t xml:space="preserve">– springdoc-openapi: </w:t>
-            </w:r>
-            <w:hyperlink r:id="rId40" w:history="1">
-              <w:r>
-                <w:rPr>
-                  <w:rFonts w:ascii="Times New Roman" w:hAnsi="Times New Roman" w:cs="Times New Roman"/>
-                  <w:color w:val="0563C1"/>
-                  <w:sz w:val="28"/>
-                  <w:szCs w:val="28"/>
-                  <w:u w:val="single"/>
-                  <w:lang w:val="it-IT"/>
-                </w:rPr>
-                <w:t xml:space="preserve">https://springdoc.org</w:t>
-              </w:r>
-            </w:hyperlink>
-          </w:p>
-          <w:p>
-            <w:pPr>
-              <w:spacing w:after="80"/>
-              <w:ind w:left="360" w:hanging="360"/>
-              <w:jc w:val="both"/>
-              <w:rPr>
-                <w:rFonts w:ascii="Times New Roman" w:hAnsi="Times New Roman" w:cs="Times New Roman"/>
-                <w:sz w:val="28"/>
-                <w:szCs w:val="28"/>
-                <w:lang w:val="it-IT"/>
-              </w:rPr>
-            </w:pPr>
-            <w:r>
-              <w:rPr>
-                <w:rFonts w:ascii="Times New Roman" w:hAnsi="Times New Roman" w:cs="Times New Roman"/>
-                <w:sz w:val="28"/>
-                <w:szCs w:val="28"/>
-                <w:lang w:val="it-IT"/>
-              </w:rPr>
-              <w:t xml:space="preserve">– OpenAPI Initiative: </w:t>
-            </w:r>
-            <w:hyperlink r:id="rId41" w:history="1">
-              <w:r>
-                <w:rPr>
-                  <w:rFonts w:ascii="Times New Roman" w:hAnsi="Times New Roman" w:cs="Times New Roman"/>
-                  <w:color w:val="0563C1"/>
-                  <w:sz w:val="28"/>
-                  <w:szCs w:val="28"/>
-                  <w:u w:val="single"/>
-                  <w:lang w:val="it-IT"/>
-                </w:rPr>
-                <w:t xml:space="preserve">https://www.openapis.org</w:t>
-              </w:r>
-            </w:hyperlink>
-          </w:p>
-          <w:p>
-            <w:pPr>
-              <w:spacing w:after="80"/>
-              <w:ind w:left="360" w:hanging="360"/>
-              <w:jc w:val="both"/>
-              <w:rPr>
-                <w:rFonts w:ascii="Times New Roman" w:hAnsi="Times New Roman" w:cs="Times New Roman"/>
-                <w:sz w:val="28"/>
-                <w:szCs w:val="28"/>
-                <w:lang w:val="it-IT"/>
-              </w:rPr>
-            </w:pPr>
-            <w:r>
-              <w:rPr>
-                <w:rFonts w:ascii="Times New Roman" w:hAnsi="Times New Roman" w:cs="Times New Roman"/>
-                <w:sz w:val="28"/>
-                <w:szCs w:val="28"/>
-                <w:lang w:val="it-IT"/>
-              </w:rPr>
-              <w:t xml:space="preserve">– Swagger UI: </w:t>
-            </w:r>
-            <w:hyperlink r:id="rId55" w:history="1">
-              <w:r>
-                <w:rPr>
-                  <w:rFonts w:ascii="Times New Roman" w:hAnsi="Times New Roman" w:cs="Times New Roman"/>
-                  <w:color w:val="0563C1"/>
-                  <w:sz w:val="28"/>
-                  <w:szCs w:val="28"/>
-                  <w:u w:val="single"/>
-                  <w:lang w:val="it-IT"/>
-                </w:rPr>
-                <w:t xml:space="preserve">https://swagger.io/tools/swagger-ui/</w:t>
-              </w:r>
-            </w:hyperlink>
-          </w:p>
-          <w:p>
-            <w:pPr>
-              <w:spacing w:after="80"/>
-              <w:ind w:left="360" w:hanging="360"/>
-              <w:jc w:val="both"/>
-              <w:rPr>
-                <w:rFonts w:ascii="Times New Roman" w:hAnsi="Times New Roman" w:cs="Times New Roman"/>
-                <w:sz w:val="28"/>
-                <w:szCs w:val="28"/>
-                <w:lang w:val="it-IT"/>
-              </w:rPr>
-            </w:pPr>
-            <w:r>
-              <w:rPr>
-                <w:rFonts w:ascii="Times New Roman" w:hAnsi="Times New Roman" w:cs="Times New Roman"/>
-                <w:sz w:val="28"/>
-                <w:szCs w:val="28"/>
-                <w:lang w:val="it-IT"/>
-              </w:rPr>
-              <w:t xml:space="preserve">– jjwt (JSON Web Token per Java): </w:t>
-            </w:r>
-            <w:hyperlink r:id="rId37" w:history="1">
-              <w:r>
-                <w:rPr>
-                  <w:rFonts w:ascii="Times New Roman" w:hAnsi="Times New Roman" w:cs="Times New Roman"/>
-                  <w:color w:val="0563C1"/>
-                  <w:sz w:val="28"/>
-                  <w:szCs w:val="28"/>
-                  <w:u w:val="single"/>
-                  <w:lang w:val="it-IT"/>
-                </w:rPr>
-                <w:t xml:space="preserve">https://github.com/jwtk/jjwt</w:t>
-              </w:r>
-            </w:hyperlink>
-          </w:p>
-          <w:p>
-            <w:pPr>
-              <w:spacing w:after="80"/>
-              <w:ind w:left="360" w:hanging="360"/>
-              <w:jc w:val="both"/>
-              <w:rPr>
-                <w:rFonts w:ascii="Times New Roman" w:hAnsi="Times New Roman" w:cs="Times New Roman"/>
-                <w:sz w:val="28"/>
-                <w:szCs w:val="28"/>
-                <w:lang w:val="it-IT"/>
-              </w:rPr>
-            </w:pPr>
-            <w:r>
-              <w:rPr>
-                <w:rFonts w:ascii="Times New Roman" w:hAnsi="Times New Roman" w:cs="Times New Roman"/>
-                <w:sz w:val="28"/>
-                <w:szCs w:val="28"/>
-                <w:lang w:val="it-IT"/>
-              </w:rPr>
-              <w:t xml:space="preserve">– java-totp (libreria alla base di totp-spring-boot-starter): </w:t>
-            </w:r>
-            <w:hyperlink r:id="rId38" w:history="1">
-              <w:r>
-                <w:rPr>
-                  <w:rFonts w:ascii="Times New Roman" w:hAnsi="Times New Roman" w:cs="Times New Roman"/>
-                  <w:color w:val="0563C1"/>
-                  <w:sz w:val="28"/>
-                  <w:szCs w:val="28"/>
-                  <w:u w:val="single"/>
-                  <w:lang w:val="it-IT"/>
-                </w:rPr>
-                <w:t xml:space="preserve">https://github.com/samdjstevens/java-totp</w:t>
-              </w:r>
-            </w:hyperlink>
-          </w:p>
-          <w:p>
-            <w:pPr>
-              <w:spacing w:after="80"/>
-              <w:ind w:left="360" w:hanging="360"/>
-              <w:jc w:val="both"/>
-              <w:rPr>
-                <w:rFonts w:ascii="Times New Roman" w:hAnsi="Times New Roman" w:cs="Times New Roman"/>
-                <w:sz w:val="28"/>
-                <w:szCs w:val="28"/>
-                <w:lang w:val="it-IT"/>
-              </w:rPr>
-            </w:pPr>
-            <w:r>
-              <w:rPr>
-                <w:rFonts w:ascii="Times New Roman" w:hAnsi="Times New Roman" w:cs="Times New Roman"/>
-                <w:sz w:val="28"/>
-                <w:szCs w:val="28"/>
-                <w:lang w:val="it-IT"/>
-              </w:rPr>
-              <w:t xml:space="preserve">– H2 Database: </w:t>
-            </w:r>
-            <w:hyperlink r:id="rId42" w:history="1">
-              <w:r>
-                <w:rPr>
-                  <w:rFonts w:ascii="Times New Roman" w:hAnsi="Times New Roman" w:cs="Times New Roman"/>
-                  <w:color w:val="0563C1"/>
-                  <w:sz w:val="28"/>
-                  <w:szCs w:val="28"/>
-                  <w:u w:val="single"/>
-                  <w:lang w:val="it-IT"/>
-                </w:rPr>
-                <w:t xml:space="preserve">https://www.h2database.com</w:t>
-              </w:r>
-            </w:hyperlink>
-          </w:p>
-          <w:p>
-            <w:pPr>
-              <w:spacing w:after="80"/>
-              <w:ind w:left="360" w:hanging="360"/>
-              <w:jc w:val="both"/>
-              <w:rPr>
-                <w:rFonts w:ascii="Times New Roman" w:hAnsi="Times New Roman" w:cs="Times New Roman"/>
-                <w:sz w:val="28"/>
-                <w:szCs w:val="28"/>
-                <w:lang w:val="it-IT"/>
-              </w:rPr>
-            </w:pPr>
-            <w:r>
-              <w:rPr>
-                <w:rFonts w:ascii="Times New Roman" w:hAnsi="Times New Roman" w:cs="Times New Roman"/>
-                <w:sz w:val="28"/>
-                <w:szCs w:val="28"/>
-                <w:lang w:val="it-IT"/>
-              </w:rPr>
-              <w:t xml:space="preserve">– Apache Maven: </w:t>
-            </w:r>
-            <w:hyperlink r:id="rId56" w:history="1">
-              <w:r>
-                <w:rPr>
-                  <w:rFonts w:ascii="Times New Roman" w:hAnsi="Times New Roman" w:cs="Times New Roman"/>
-                  <w:color w:val="0563C1"/>
-                  <w:sz w:val="28"/>
-                  <w:szCs w:val="28"/>
-                  <w:u w:val="single"/>
-                  <w:lang w:val="it-IT"/>
-                </w:rPr>
-                <w:t xml:space="preserve">https://maven.apache.org</w:t>
-              </w:r>
-            </w:hyperlink>
-          </w:p>
-          <w:p>
-            <w:pPr>
-              <w:spacing w:before="120" w:after="80"/>
-              <w:rPr>
-                <w:rFonts w:ascii="Times New Roman" w:hAnsi="Times New Roman" w:cs="Times New Roman"/>
-                <w:b/>
-                <w:sz w:val="26"/>
-                <w:szCs w:val="26"/>
-                <w:lang w:val="it-IT"/>
-              </w:rPr>
-            </w:pPr>
-            <w:r>
-              <w:rPr>
-                <w:rFonts w:ascii="Times New Roman" w:hAnsi="Times New Roman" w:cs="Times New Roman"/>
-                <w:b/>
-                <w:sz w:val="26"/>
-                <w:szCs w:val="26"/>
-                <w:lang w:val="it-IT"/>
-              </w:rPr>
-              <w:t xml:space="preserve">Standard e specifiche</w:t>
-            </w:r>
-          </w:p>
-          <w:p>
-            <w:pPr>
-              <w:spacing w:after="80"/>
-              <w:ind w:left="360" w:hanging="360"/>
-              <w:jc w:val="both"/>
-              <w:rPr>
-                <w:rFonts w:ascii="Times New Roman" w:hAnsi="Times New Roman" w:cs="Times New Roman"/>
-                <w:sz w:val="28"/>
-                <w:szCs w:val="28"/>
-                <w:lang w:val="it-IT"/>
-              </w:rPr>
-            </w:pPr>
-            <w:r>
-              <w:rPr>
-                <w:rFonts w:ascii="Times New Roman" w:hAnsi="Times New Roman" w:cs="Times New Roman"/>
-                <w:sz w:val="28"/>
-                <w:szCs w:val="28"/>
-                <w:lang w:val="it-IT"/>
-              </w:rPr>
-              <w:t xml:space="preserve">– RFC 7519 – JSON Web Token (JWT): </w:t>
-            </w:r>
-            <w:hyperlink r:id="rId57" w:history="1">
-              <w:r>
-                <w:rPr>
-                  <w:rFonts w:ascii="Times New Roman" w:hAnsi="Times New Roman" w:cs="Times New Roman"/>
-                  <w:color w:val="0563C1"/>
-                  <w:sz w:val="28"/>
-                  <w:szCs w:val="28"/>
-                  <w:u w:val="single"/>
-                  <w:lang w:val="it-IT"/>
-                </w:rPr>
-                <w:t xml:space="preserve">https://datatracker.ietf.org/doc/html/rfc7519</w:t>
-              </w:r>
-            </w:hyperlink>
-          </w:p>
-          <w:p>
-            <w:pPr>
-              <w:spacing w:after="80"/>
-              <w:ind w:left="360" w:hanging="360"/>
-              <w:jc w:val="both"/>
-              <w:rPr>
-                <w:rFonts w:ascii="Times New Roman" w:hAnsi="Times New Roman" w:cs="Times New Roman"/>
-                <w:sz w:val="28"/>
-                <w:szCs w:val="28"/>
-                <w:lang w:val="it-IT"/>
-              </w:rPr>
-            </w:pPr>
-            <w:r>
-              <w:rPr>
-                <w:rFonts w:ascii="Times New Roman" w:hAnsi="Times New Roman" w:cs="Times New Roman"/>
-                <w:sz w:val="28"/>
-                <w:szCs w:val="28"/>
-                <w:lang w:val="it-IT"/>
-              </w:rPr>
-              <w:t xml:space="preserve">– RFC 6238 – TOTP: </w:t>
-            </w:r>
-            <w:hyperlink r:id="rId39" w:history="1">
-              <w:r>
-                <w:rPr>
-                  <w:rFonts w:ascii="Times New Roman" w:hAnsi="Times New Roman" w:cs="Times New Roman"/>
-                  <w:color w:val="0563C1"/>
-                  <w:sz w:val="28"/>
-                  <w:szCs w:val="28"/>
-                  <w:u w:val="single"/>
-                  <w:lang w:val="it-IT"/>
-                </w:rPr>
-                <w:t xml:space="preserve">https://datatracker.ietf.org/doc/html/rfc6238</w:t>
-              </w:r>
-            </w:hyperlink>
-          </w:p>
-          <w:p>
-            <w:pPr>
-              <w:spacing w:after="80"/>
-              <w:ind w:left="360" w:hanging="360"/>
-              <w:jc w:val="both"/>
-              <w:rPr>
-                <w:rFonts w:ascii="Times New Roman" w:hAnsi="Times New Roman" w:cs="Times New Roman"/>
-                <w:sz w:val="28"/>
-                <w:szCs w:val="28"/>
-                <w:lang w:val="it-IT"/>
-              </w:rPr>
-            </w:pPr>
-            <w:r>
-              <w:rPr>
-                <w:rFonts w:ascii="Times New Roman" w:hAnsi="Times New Roman" w:cs="Times New Roman"/>
-                <w:sz w:val="28"/>
-                <w:szCs w:val="28"/>
-                <w:lang w:val="it-IT"/>
-              </w:rPr>
-              <w:t xml:space="preserve">– RFC 7807 – Problem Details for HTTP APIs: </w:t>
-            </w:r>
-            <w:hyperlink r:id="rId58" w:history="1">
-              <w:r>
-                <w:rPr>
-                  <w:rFonts w:ascii="Times New Roman" w:hAnsi="Times New Roman" w:cs="Times New Roman"/>
-                  <w:color w:val="0563C1"/>
-                  <w:sz w:val="28"/>
-                  <w:szCs w:val="28"/>
-                  <w:u w:val="single"/>
-                  <w:lang w:val="it-IT"/>
-                </w:rPr>
-                <w:t xml:space="preserve">https://datatracker.ietf.org/doc/html/rfc7807</w:t>
-              </w:r>
-            </w:hyperlink>
-          </w:p>
-          <w:p>
-            <w:pPr>
-              <w:spacing w:before="120" w:after="80"/>
-              <w:rPr>
-                <w:rFonts w:ascii="Times New Roman" w:hAnsi="Times New Roman" w:cs="Times New Roman"/>
-                <w:b/>
-                <w:sz w:val="26"/>
-                <w:szCs w:val="26"/>
-                <w:lang w:val="it-IT"/>
-              </w:rPr>
-            </w:pPr>
-            <w:r>
-              <w:rPr>
-                <w:rFonts w:ascii="Times New Roman" w:hAnsi="Times New Roman" w:cs="Times New Roman"/>
-                <w:b/>
-                <w:sz w:val="26"/>
-                <w:szCs w:val="26"/>
-                <w:lang w:val="it-IT"/>
-              </w:rPr>
-              <w:t xml:space="preserve">Test e qualità</w:t>
-            </w:r>
-          </w:p>
-          <w:p>
-            <w:pPr>
-              <w:spacing w:after="80"/>
-              <w:ind w:left="360" w:hanging="360"/>
-              <w:jc w:val="both"/>
-              <w:rPr>
-                <w:rFonts w:ascii="Times New Roman" w:hAnsi="Times New Roman" w:cs="Times New Roman"/>
-                <w:sz w:val="28"/>
-                <w:szCs w:val="28"/>
-                <w:lang w:val="it-IT"/>
-              </w:rPr>
-            </w:pPr>
-            <w:r>
-              <w:rPr>
-                <w:rFonts w:ascii="Times New Roman" w:hAnsi="Times New Roman" w:cs="Times New Roman"/>
-                <w:sz w:val="28"/>
-                <w:szCs w:val="28"/>
-                <w:lang w:val="it-IT"/>
-              </w:rPr>
-              <w:t xml:space="preserve">– JUnit 5: </w:t>
-            </w:r>
-            <w:hyperlink r:id="rId59" w:history="1">
-              <w:r>
-                <w:rPr>
-                  <w:rFonts w:ascii="Times New Roman" w:hAnsi="Times New Roman" w:cs="Times New Roman"/>
-                  <w:color w:val="0563C1"/>
-                  <w:sz w:val="28"/>
-                  <w:szCs w:val="28"/>
-                  <w:u w:val="single"/>
-                  <w:lang w:val="it-IT"/>
-                </w:rPr>
-                <w:t xml:space="preserve">https://junit.org/junit5/</w:t>
-              </w:r>
-            </w:hyperlink>
-          </w:p>
-          <w:p>
-            <w:pPr>
-              <w:spacing w:after="80"/>
-              <w:ind w:left="360" w:hanging="360"/>
-              <w:jc w:val="both"/>
-              <w:rPr>
-                <w:rFonts w:ascii="Times New Roman" w:hAnsi="Times New Roman" w:cs="Times New Roman"/>
-                <w:sz w:val="28"/>
-                <w:szCs w:val="28"/>
-                <w:lang w:val="it-IT"/>
-              </w:rPr>
-            </w:pPr>
-            <w:r>
-              <w:rPr>
-                <w:rFonts w:ascii="Times New Roman" w:hAnsi="Times New Roman" w:cs="Times New Roman"/>
-                <w:sz w:val="28"/>
-                <w:szCs w:val="28"/>
-                <w:lang w:val="it-IT"/>
-              </w:rPr>
-              <w:t xml:space="preserve">– Mockito: </w:t>
-            </w:r>
-            <w:hyperlink r:id="rId60" w:history="1">
-              <w:r>
-                <w:rPr>
-                  <w:rFonts w:ascii="Times New Roman" w:hAnsi="Times New Roman" w:cs="Times New Roman"/>
-                  <w:color w:val="0563C1"/>
-                  <w:sz w:val="28"/>
-                  <w:szCs w:val="28"/>
-                  <w:u w:val="single"/>
-                  <w:lang w:val="it-IT"/>
-                </w:rPr>
-                <w:t xml:space="preserve">https://site.mockito.org</w:t>
-              </w:r>
-            </w:hyperlink>
-          </w:p>
-          <w:p>
-            <w:pPr>
-              <w:spacing w:after="80"/>
-              <w:ind w:left="360" w:hanging="360"/>
-              <w:jc w:val="both"/>
-              <w:rPr>
-                <w:rFonts w:ascii="Times New Roman" w:hAnsi="Times New Roman" w:cs="Times New Roman"/>
-                <w:sz w:val="28"/>
-                <w:szCs w:val="28"/>
-                <w:lang w:val="it-IT"/>
-              </w:rPr>
-            </w:pPr>
-            <w:r>
-              <w:rPr>
-                <w:rFonts w:ascii="Times New Roman" w:hAnsi="Times New Roman" w:cs="Times New Roman"/>
-                <w:sz w:val="28"/>
-                <w:szCs w:val="28"/>
-                <w:lang w:val="it-IT"/>
-              </w:rPr>
-              <w:t xml:space="preserve">– JaCoCo: </w:t>
-            </w:r>
-            <w:hyperlink r:id="rId43" w:history="1">
-              <w:r>
-                <w:rPr>
-                  <w:rFonts w:ascii="Times New Roman" w:hAnsi="Times New Roman" w:cs="Times New Roman"/>
-                  <w:color w:val="0563C1"/>
-                  <w:sz w:val="28"/>
-                  <w:szCs w:val="28"/>
-                  <w:u w:val="single"/>
-                  <w:lang w:val="it-IT"/>
-                </w:rPr>
-                <w:t xml:space="preserve">https://www.jacoco.org/jacoco/</w:t>
-              </w:r>
-            </w:hyperlink>
-          </w:p>
-          <w:p>
-            <w:pPr>
-              <w:spacing w:after="80"/>
-              <w:ind w:left="360" w:hanging="360"/>
-              <w:jc w:val="both"/>
-              <w:rPr>
-                <w:rFonts w:ascii="Times New Roman" w:hAnsi="Times New Roman" w:cs="Times New Roman"/>
-                <w:sz w:val="28"/>
-                <w:szCs w:val="28"/>
-                <w:lang w:val="it-IT"/>
-              </w:rPr>
-            </w:pPr>
-            <w:r>
-              <w:rPr>
-                <w:rFonts w:ascii="Times New Roman" w:hAnsi="Times New Roman" w:cs="Times New Roman"/>
-                <w:sz w:val="28"/>
-                <w:szCs w:val="28"/>
-                <w:lang w:val="it-IT"/>
-              </w:rPr>
-              <w:t xml:space="preserve">– Karma: </w:t>
-            </w:r>
-            <w:hyperlink r:id="rId61" w:history="1">
-              <w:r>
-                <w:rPr>
-                  <w:rFonts w:ascii="Times New Roman" w:hAnsi="Times New Roman" w:cs="Times New Roman"/>
-                  <w:color w:val="0563C1"/>
-                  <w:sz w:val="28"/>
-                  <w:szCs w:val="28"/>
-                  <w:u w:val="single"/>
-                  <w:lang w:val="it-IT"/>
-                </w:rPr>
-                <w:t xml:space="preserve">https://karma-runner.github.io</w:t>
-              </w:r>
-            </w:hyperlink>
-          </w:p>
-          <w:p>
-            <w:pPr>
-              <w:spacing w:after="80"/>
-              <w:ind w:left="360" w:hanging="360"/>
-              <w:jc w:val="both"/>
-              <w:rPr>
-                <w:rFonts w:ascii="Times New Roman" w:hAnsi="Times New Roman" w:cs="Times New Roman"/>
-                <w:sz w:val="28"/>
-                <w:szCs w:val="28"/>
-                <w:lang w:val="it-IT"/>
-              </w:rPr>
-            </w:pPr>
-            <w:r>
-              <w:rPr>
-                <w:rFonts w:ascii="Times New Roman" w:hAnsi="Times New Roman" w:cs="Times New Roman"/>
-                <w:sz w:val="28"/>
-                <w:szCs w:val="28"/>
-                <w:lang w:val="it-IT"/>
-              </w:rPr>
-              <w:t xml:space="preserve">– Jasmine: </w:t>
-            </w:r>
-            <w:hyperlink r:id="rId62" w:history="1">
-              <w:r>
-                <w:rPr>
-                  <w:rFonts w:ascii="Times New Roman" w:hAnsi="Times New Roman" w:cs="Times New Roman"/>
-                  <w:color w:val="0563C1"/>
-                  <w:sz w:val="28"/>
-                  <w:szCs w:val="28"/>
-                  <w:u w:val="single"/>
-                  <w:lang w:val="it-IT"/>
-                </w:rPr>
-                <w:t xml:space="preserve">https://jasmine.github.io</w:t>
-              </w:r>
-            </w:hyperlink>
-          </w:p>
-          <w:p>
-            <w:pPr>
-              <w:spacing w:before="120" w:after="80"/>
-              <w:rPr>
-                <w:rFonts w:ascii="Times New Roman" w:hAnsi="Times New Roman" w:cs="Times New Roman"/>
-                <w:b/>
-                <w:sz w:val="26"/>
-                <w:szCs w:val="26"/>
-                <w:lang w:val="it-IT"/>
-              </w:rPr>
-            </w:pPr>
-            <w:r>
-              <w:rPr>
-                <w:rFonts w:ascii="Times New Roman" w:hAnsi="Times New Roman" w:cs="Times New Roman"/>
-                <w:b/>
-                <w:sz w:val="26"/>
-                <w:szCs w:val="26"/>
-                <w:lang w:val="it-IT"/>
-              </w:rPr>
-              <w:t xml:space="preserve">Frontend (Angular)</w:t>
-            </w:r>
-          </w:p>
-          <w:p>
-            <w:pPr>
-              <w:spacing w:after="80"/>
-              <w:ind w:left="360" w:hanging="360"/>
-              <w:jc w:val="both"/>
-              <w:rPr>
-                <w:rFonts w:ascii="Times New Roman" w:hAnsi="Times New Roman" w:cs="Times New Roman"/>
-                <w:sz w:val="28"/>
-                <w:szCs w:val="28"/>
-                <w:lang w:val="it-IT"/>
-              </w:rPr>
-            </w:pPr>
-            <w:r>
-              <w:rPr>
-                <w:rFonts w:ascii="Times New Roman" w:hAnsi="Times New Roman" w:cs="Times New Roman"/>
-                <w:sz w:val="28"/>
-                <w:szCs w:val="28"/>
-                <w:lang w:val="it-IT"/>
-              </w:rPr>
-              <w:t xml:space="preserve">– Angular: </w:t>
-            </w:r>
-            <w:hyperlink r:id="rId44" w:history="1">
-              <w:r>
-                <w:rPr>
-                  <w:rFonts w:ascii="Times New Roman" w:hAnsi="Times New Roman" w:cs="Times New Roman"/>
-                  <w:color w:val="0563C1"/>
-                  <w:sz w:val="28"/>
-                  <w:szCs w:val="28"/>
-                  <w:u w:val="single"/>
-                  <w:lang w:val="it-IT"/>
-                </w:rPr>
-                <w:t xml:space="preserve">https://angular.dev</w:t>
-              </w:r>
-            </w:hyperlink>
-          </w:p>
-          <w:p>
-            <w:pPr>
-              <w:spacing w:after="80"/>
-              <w:ind w:left="360" w:hanging="360"/>
-              <w:jc w:val="both"/>
-              <w:rPr>
-                <w:rFonts w:ascii="Times New Roman" w:hAnsi="Times New Roman" w:cs="Times New Roman"/>
-                <w:sz w:val="28"/>
-                <w:szCs w:val="28"/>
-                <w:lang w:val="it-IT"/>
-              </w:rPr>
-            </w:pPr>
-            <w:r>
-              <w:rPr>
-                <w:rFonts w:ascii="Times New Roman" w:hAnsi="Times New Roman" w:cs="Times New Roman"/>
-                <w:sz w:val="28"/>
-                <w:szCs w:val="28"/>
-                <w:lang w:val="it-IT"/>
-              </w:rPr>
-              <w:t xml:space="preserve">– Angular – HTTP interceptor: </w:t>
-            </w:r>
-            <w:hyperlink r:id="rId46" w:history="1">
-              <w:r>
-                <w:rPr>
-                  <w:rFonts w:ascii="Times New Roman" w:hAnsi="Times New Roman" w:cs="Times New Roman"/>
-                  <w:color w:val="0563C1"/>
-                  <w:sz w:val="28"/>
-                  <w:szCs w:val="28"/>
-                  <w:u w:val="single"/>
-                  <w:lang w:val="it-IT"/>
-                </w:rPr>
-                <w:t xml:space="preserve">https://angular.dev/guide/http/interceptors</w:t>
-              </w:r>
-            </w:hyperlink>
-          </w:p>
-          <w:p>
-            <w:pPr>
-              <w:spacing w:after="80"/>
-              <w:ind w:left="360" w:hanging="360"/>
-              <w:jc w:val="both"/>
-              <w:rPr>
-                <w:rFonts w:ascii="Times New Roman" w:hAnsi="Times New Roman" w:cs="Times New Roman"/>
-                <w:sz w:val="28"/>
-                <w:szCs w:val="28"/>
-                <w:lang w:val="it-IT"/>
-              </w:rPr>
-            </w:pPr>
-            <w:r>
-              <w:rPr>
-                <w:rFonts w:ascii="Times New Roman" w:hAnsi="Times New Roman" w:cs="Times New Roman"/>
-                <w:sz w:val="28"/>
-                <w:szCs w:val="28"/>
-                <w:lang w:val="it-IT"/>
-              </w:rPr>
-              <w:t xml:space="preserve">– TypeScript: </w:t>
-            </w:r>
-            <w:hyperlink r:id="rId63" w:history="1">
-              <w:r>
-                <w:rPr>
-                  <w:rFonts w:ascii="Times New Roman" w:hAnsi="Times New Roman" w:cs="Times New Roman"/>
-                  <w:color w:val="0563C1"/>
-                  <w:sz w:val="28"/>
-                  <w:szCs w:val="28"/>
-                  <w:u w:val="single"/>
-                  <w:lang w:val="it-IT"/>
-                </w:rPr>
-                <w:t xml:space="preserve">https://www.typescriptlang.org</w:t>
-              </w:r>
-            </w:hyperlink>
-          </w:p>
-          <w:p>
-            <w:pPr>
-              <w:spacing w:after="80"/>
-              <w:ind w:left="360" w:hanging="360"/>
-              <w:jc w:val="both"/>
-              <w:rPr>
-                <w:rFonts w:ascii="Times New Roman" w:hAnsi="Times New Roman" w:cs="Times New Roman"/>
-                <w:sz w:val="28"/>
-                <w:szCs w:val="28"/>
-                <w:lang w:val="it-IT"/>
-              </w:rPr>
-            </w:pPr>
-            <w:r>
-              <w:rPr>
-                <w:rFonts w:ascii="Times New Roman" w:hAnsi="Times New Roman" w:cs="Times New Roman"/>
-                <w:sz w:val="28"/>
-                <w:szCs w:val="28"/>
-                <w:lang w:val="it-IT"/>
-              </w:rPr>
-              <w:t xml:space="preserve">– RxJS: </w:t>
-            </w:r>
-            <w:hyperlink r:id="rId45" w:history="1">
-              <w:r>
-                <w:rPr>
-                  <w:rFonts w:ascii="Times New Roman" w:hAnsi="Times New Roman" w:cs="Times New Roman"/>
-                  <w:color w:val="0563C1"/>
-                  <w:sz w:val="28"/>
-                  <w:szCs w:val="28"/>
-                  <w:u w:val="single"/>
-                  <w:lang w:val="it-IT"/>
-                </w:rPr>
-                <w:t xml:space="preserve">https://rxjs.dev</w:t>
-              </w:r>
-            </w:hyperlink>
-          </w:p>
-          <w:p>
-            <w:pPr>
-              <w:spacing w:after="80"/>
-              <w:ind w:left="360" w:hanging="360"/>
-              <w:jc w:val="both"/>
-              <w:rPr>
-                <w:rFonts w:ascii="Times New Roman" w:hAnsi="Times New Roman" w:cs="Times New Roman"/>
-                <w:sz w:val="28"/>
-                <w:szCs w:val="28"/>
-                <w:lang w:val="it-IT"/>
-              </w:rPr>
-            </w:pPr>
-            <w:r>
-              <w:rPr>
-                <w:rFonts w:ascii="Times New Roman" w:hAnsi="Times New Roman" w:cs="Times New Roman"/>
-                <w:sz w:val="28"/>
-                <w:szCs w:val="28"/>
-                <w:lang w:val="it-IT"/>
-              </w:rPr>
-              <w:t xml:space="preserve">– Tailwind CSS: </w:t>
-            </w:r>
-            <w:hyperlink r:id="rId64" w:history="1">
-              <w:r>
-                <w:rPr>
-                  <w:rFonts w:ascii="Times New Roman" w:hAnsi="Times New Roman" w:cs="Times New Roman"/>
-                  <w:color w:val="0563C1"/>
-                  <w:sz w:val="28"/>
-                  <w:szCs w:val="28"/>
-                  <w:u w:val="single"/>
-                  <w:lang w:val="it-IT"/>
-                </w:rPr>
-                <w:t xml:space="preserve">https://tailwindcss.com</w:t>
-              </w:r>
-            </w:hyperlink>
-          </w:p>
-          <w:p>
-            <w:pPr>
-              <w:spacing w:after="80"/>
-              <w:ind w:left="360" w:hanging="360"/>
-              <w:jc w:val="both"/>
-              <w:rPr>
-                <w:rFonts w:ascii="Times New Roman" w:hAnsi="Times New Roman" w:cs="Times New Roman"/>
-                <w:sz w:val="28"/>
-                <w:szCs w:val="28"/>
-                <w:lang w:val="it-IT"/>
-              </w:rPr>
-            </w:pPr>
-            <w:r>
-              <w:rPr>
-                <w:rFonts w:ascii="Times New Roman" w:hAnsi="Times New Roman" w:cs="Times New Roman"/>
-                <w:sz w:val="28"/>
-                <w:szCs w:val="28"/>
-                <w:lang w:val="it-IT"/>
-              </w:rPr>
-              <w:t xml:space="preserve">– Google Fonts: </w:t>
-            </w:r>
-            <w:hyperlink r:id="rId65" w:history="1">
-              <w:r>
-                <w:rPr>
-                  <w:rFonts w:ascii="Times New Roman" w:hAnsi="Times New Roman" w:cs="Times New Roman"/>
-                  <w:color w:val="0563C1"/>
-                  <w:sz w:val="28"/>
-                  <w:szCs w:val="28"/>
-                  <w:u w:val="single"/>
-                  <w:lang w:val="it-IT"/>
-                </w:rPr>
-                <w:t xml:space="preserve">https://fonts.google.com</w:t>
-              </w:r>
-            </w:hyperlink>
-          </w:p>
-          <w:p>
-            <w:pPr>
-              <w:spacing w:after="80"/>
-              <w:ind w:left="360" w:hanging="360"/>
-              <w:jc w:val="both"/>
-              <w:rPr>
-                <w:rFonts w:ascii="Times New Roman" w:hAnsi="Times New Roman" w:cs="Times New Roman"/>
-                <w:sz w:val="28"/>
-                <w:szCs w:val="28"/>
-                <w:lang w:val="it-IT"/>
-              </w:rPr>
-            </w:pPr>
-            <w:r>
-              <w:rPr>
-                <w:rFonts w:ascii="Times New Roman" w:hAnsi="Times New Roman" w:cs="Times New Roman"/>
-                <w:sz w:val="28"/>
-                <w:szCs w:val="28"/>
-                <w:lang w:val="it-IT"/>
-              </w:rPr>
-              <w:t xml:space="preserve">– Node.js: </w:t>
-            </w:r>
-            <w:hyperlink r:id="rId66" w:history="1">
-              <w:r>
-                <w:rPr>
-                  <w:rFonts w:ascii="Times New Roman" w:hAnsi="Times New Roman" w:cs="Times New Roman"/>
-                  <w:color w:val="0563C1"/>
-                  <w:sz w:val="28"/>
-                  <w:szCs w:val="28"/>
-                  <w:u w:val="single"/>
-                  <w:lang w:val="it-IT"/>
-                </w:rPr>
-                <w:t xml:space="preserve">https://nodejs.org</w:t>
-              </w:r>
-            </w:hyperlink>
-          </w:p>
-          <w:p>
-            <w:pPr>
-              <w:spacing w:before="120" w:after="80"/>
-              <w:rPr>
-                <w:rFonts w:ascii="Times New Roman" w:hAnsi="Times New Roman" w:cs="Times New Roman"/>
-                <w:b/>
-                <w:sz w:val="26"/>
-                <w:szCs w:val="26"/>
-                <w:lang w:val="it-IT"/>
-              </w:rPr>
-            </w:pPr>
-            <w:r>
-              <w:rPr>
-                <w:rFonts w:ascii="Times New Roman" w:hAnsi="Times New Roman" w:cs="Times New Roman"/>
-                <w:b/>
-                <w:sz w:val="26"/>
-                <w:szCs w:val="26"/>
-                <w:lang w:val="it-IT"/>
-              </w:rPr>
-              <w:t xml:space="preserve">DevOps e versionamento</w:t>
-            </w:r>
-          </w:p>
-          <w:p>
-            <w:pPr>
-              <w:spacing w:after="80"/>
-              <w:ind w:left="360" w:hanging="360"/>
-              <w:jc w:val="both"/>
-              <w:rPr>
-                <w:rFonts w:ascii="Times New Roman" w:hAnsi="Times New Roman" w:cs="Times New Roman"/>
-                <w:sz w:val="28"/>
-                <w:szCs w:val="28"/>
-                <w:lang w:val="it-IT"/>
-              </w:rPr>
-            </w:pPr>
-            <w:r>
-              <w:rPr>
-                <w:rFonts w:ascii="Times New Roman" w:hAnsi="Times New Roman" w:cs="Times New Roman"/>
-                <w:sz w:val="28"/>
-                <w:szCs w:val="28"/>
-                <w:lang w:val="it-IT"/>
-              </w:rPr>
-              <w:t xml:space="preserve">– Docker: </w:t>
-            </w:r>
-            <w:hyperlink r:id="rId47" w:history="1">
-              <w:r>
-                <w:rPr>
-                  <w:rFonts w:ascii="Times New Roman" w:hAnsi="Times New Roman" w:cs="Times New Roman"/>
-                  <w:color w:val="0563C1"/>
-                  <w:sz w:val="28"/>
-                  <w:szCs w:val="28"/>
-                  <w:u w:val="single"/>
-                  <w:lang w:val="it-IT"/>
-                </w:rPr>
-                <w:t xml:space="preserve">https://www.docker.com</w:t>
-              </w:r>
-            </w:hyperlink>
-          </w:p>
-          <w:p>
-            <w:pPr>
-              <w:spacing w:after="80"/>
-              <w:ind w:left="360" w:hanging="360"/>
-              <w:jc w:val="both"/>
-              <w:rPr>
-                <w:rFonts w:ascii="Times New Roman" w:hAnsi="Times New Roman" w:cs="Times New Roman"/>
-                <w:sz w:val="28"/>
-                <w:szCs w:val="28"/>
-                <w:lang w:val="it-IT"/>
-              </w:rPr>
-            </w:pPr>
-            <w:r>
-              <w:rPr>
-                <w:rFonts w:ascii="Times New Roman" w:hAnsi="Times New Roman" w:cs="Times New Roman"/>
-                <w:sz w:val="28"/>
-                <w:szCs w:val="28"/>
-                <w:lang w:val="it-IT"/>
-              </w:rPr>
-              <w:t xml:space="preserve">– Docker – build multi-stage: </w:t>
-            </w:r>
-            <w:hyperlink r:id="rId67" w:history="1">
-              <w:r>
-                <w:rPr>
-                  <w:rFonts w:ascii="Times New Roman" w:hAnsi="Times New Roman" w:cs="Times New Roman"/>
-                  <w:color w:val="0563C1"/>
-                  <w:sz w:val="28"/>
-                  <w:szCs w:val="28"/>
-                  <w:u w:val="single"/>
-                  <w:lang w:val="it-IT"/>
-                </w:rPr>
-                <w:t xml:space="preserve">https://docs.docker.com/build/building/multi-stage/</w:t>
-              </w:r>
-            </w:hyperlink>
-          </w:p>
-          <w:p>
-            <w:pPr>
-              <w:spacing w:after="80"/>
-              <w:ind w:left="360" w:hanging="360"/>
-              <w:jc w:val="both"/>
-              <w:rPr>
-                <w:rFonts w:ascii="Times New Roman" w:hAnsi="Times New Roman" w:cs="Times New Roman"/>
-                <w:sz w:val="28"/>
-                <w:szCs w:val="28"/>
-                <w:lang w:val="it-IT"/>
-              </w:rPr>
-            </w:pPr>
-            <w:r>
-              <w:rPr>
-                <w:rFonts w:ascii="Times New Roman" w:hAnsi="Times New Roman" w:cs="Times New Roman"/>
-                <w:sz w:val="28"/>
-                <w:szCs w:val="28"/>
-                <w:lang w:val="it-IT"/>
-              </w:rPr>
-              <w:t xml:space="preserve">– Docker Compose: </w:t>
-            </w:r>
-            <w:hyperlink r:id="rId48" w:history="1">
-              <w:r>
-                <w:rPr>
-                  <w:rFonts w:ascii="Times New Roman" w:hAnsi="Times New Roman" w:cs="Times New Roman"/>
-                  <w:color w:val="0563C1"/>
-                  <w:sz w:val="28"/>
-                  <w:szCs w:val="28"/>
-                  <w:u w:val="single"/>
-                  <w:lang w:val="it-IT"/>
-                </w:rPr>
-                <w:t xml:space="preserve">https://docs.docker.com/compose/</w:t>
-              </w:r>
-            </w:hyperlink>
-          </w:p>
-          <w:p>
-            <w:pPr>
-              <w:spacing w:after="80"/>
-              <w:ind w:left="360" w:hanging="360"/>
-              <w:jc w:val="both"/>
-              <w:rPr>
-                <w:rFonts w:ascii="Times New Roman" w:hAnsi="Times New Roman" w:cs="Times New Roman"/>
-                <w:sz w:val="28"/>
-                <w:szCs w:val="28"/>
-                <w:lang w:val="it-IT"/>
-              </w:rPr>
-            </w:pPr>
-            <w:r>
-              <w:rPr>
-                <w:rFonts w:ascii="Times New Roman" w:hAnsi="Times New Roman" w:cs="Times New Roman"/>
-                <w:sz w:val="28"/>
-                <w:szCs w:val="28"/>
-                <w:lang w:val="it-IT"/>
-              </w:rPr>
-              <w:t xml:space="preserve">– Nginx: </w:t>
-            </w:r>
-            <w:hyperlink r:id="rId49" w:history="1">
-              <w:r>
-                <w:rPr>
-                  <w:rFonts w:ascii="Times New Roman" w:hAnsi="Times New Roman" w:cs="Times New Roman"/>
-                  <w:color w:val="0563C1"/>
-                  <w:sz w:val="28"/>
-                  <w:szCs w:val="28"/>
-                  <w:u w:val="single"/>
-                  <w:lang w:val="it-IT"/>
-                </w:rPr>
-                <w:t xml:space="preserve">https://nginx.org</w:t>
-              </w:r>
-            </w:hyperlink>
-          </w:p>
-          <w:p>
-            <w:pPr>
-              <w:spacing w:after="80"/>
-              <w:ind w:left="360" w:hanging="360"/>
-              <w:jc w:val="both"/>
-              <w:rPr>
-                <w:rFonts w:ascii="Times New Roman" w:hAnsi="Times New Roman" w:cs="Times New Roman"/>
-                <w:sz w:val="28"/>
-                <w:szCs w:val="28"/>
-                <w:lang w:val="it-IT"/>
-              </w:rPr>
-            </w:pPr>
-            <w:r>
-              <w:rPr>
-                <w:rFonts w:ascii="Times New Roman" w:hAnsi="Times New Roman" w:cs="Times New Roman"/>
-                <w:sz w:val="28"/>
-                <w:szCs w:val="28"/>
-                <w:lang w:val="it-IT"/>
-              </w:rPr>
-              <w:t xml:space="preserve">– GitHub Actions: </w:t>
-            </w:r>
-            <w:hyperlink r:id="rId50" w:history="1">
-              <w:r>
-                <w:rPr>
-                  <w:rFonts w:ascii="Times New Roman" w:hAnsi="Times New Roman" w:cs="Times New Roman"/>
-                  <w:color w:val="0563C1"/>
-                  <w:sz w:val="28"/>
-                  <w:szCs w:val="28"/>
-                  <w:u w:val="single"/>
-                  <w:lang w:val="it-IT"/>
-                </w:rPr>
-                <w:t xml:space="preserve">https://docs.github.com/actions</w:t>
-              </w:r>
-            </w:hyperlink>
-          </w:p>
-          <w:p>
-            <w:pPr>
-              <w:spacing w:after="80"/>
-              <w:ind w:left="360" w:hanging="360"/>
-              <w:jc w:val="both"/>
-              <w:rPr>
-                <w:rFonts w:ascii="Times New Roman" w:hAnsi="Times New Roman" w:cs="Times New Roman"/>
-                <w:sz w:val="28"/>
-                <w:szCs w:val="28"/>
-                <w:lang w:val="it-IT"/>
-              </w:rPr>
-            </w:pPr>
-            <w:r>
-              <w:rPr>
-                <w:rFonts w:ascii="Times New Roman" w:hAnsi="Times New Roman" w:cs="Times New Roman"/>
-                <w:sz w:val="28"/>
-                <w:szCs w:val="28"/>
-                <w:lang w:val="it-IT"/>
-              </w:rPr>
-              <w:t xml:space="preserve">– dorny/paths-filter: </w:t>
-            </w:r>
-            <w:hyperlink r:id="rId51" w:history="1">
-              <w:r>
-                <w:rPr>
-                  <w:rFonts w:ascii="Times New Roman" w:hAnsi="Times New Roman" w:cs="Times New Roman"/>
-                  <w:color w:val="0563C1"/>
-                  <w:sz w:val="28"/>
-                  <w:szCs w:val="28"/>
-                  <w:u w:val="single"/>
-                  <w:lang w:val="it-IT"/>
-                </w:rPr>
-                <w:t xml:space="preserve">https://github.com/dorny/paths-filter</w:t>
-              </w:r>
-            </w:hyperlink>
-          </w:p>
-          <w:p>
-            <w:pPr>
-              <w:spacing w:after="80"/>
-              <w:ind w:left="360" w:hanging="360"/>
-              <w:jc w:val="both"/>
-              <w:rPr>
-                <w:rFonts w:ascii="Times New Roman" w:hAnsi="Times New Roman" w:cs="Times New Roman"/>
-                <w:sz w:val="28"/>
-                <w:szCs w:val="28"/>
-                <w:lang w:val="it-IT"/>
-              </w:rPr>
-            </w:pPr>
-            <w:r>
-              <w:rPr>
-                <w:rFonts w:ascii="Times New Roman" w:hAnsi="Times New Roman" w:cs="Times New Roman"/>
-                <w:sz w:val="28"/>
-                <w:szCs w:val="28"/>
-                <w:lang w:val="it-IT"/>
-              </w:rPr>
-              <w:t xml:space="preserve">– frontend-maven-plugin: </w:t>
-            </w:r>
-            <w:hyperlink r:id="rId68" w:history="1">
-              <w:r>
-                <w:rPr>
-                  <w:rFonts w:ascii="Times New Roman" w:hAnsi="Times New Roman" w:cs="Times New Roman"/>
-                  <w:color w:val="0563C1"/>
-                  <w:sz w:val="28"/>
-                  <w:szCs w:val="28"/>
-                  <w:u w:val="single"/>
-                  <w:lang w:val="it-IT"/>
-                </w:rPr>
-                <w:t xml:space="preserve">https://github.com/eirslett/frontend-maven-plugin</w:t>
               </w:r>
             </w:hyperlink>
           </w:p>
@@ -10564,6 +10529,77 @@
           </w:p>
           <w:p>
             <w:pPr>
+              <w:spacing w:after="160"/>
+              <w:jc w:val="both"/>
+              <w:rPr>
+                <w:rFonts w:ascii="Times New Roman" w:hAnsi="Times New Roman" w:cs="Times New Roman"/>
+                <w:sz w:val="28"/>
+                <w:szCs w:val="28"/>
+                <w:lang w:val="it-IT"/>
+              </w:rPr>
+            </w:pPr>
+            <w:r>
+              <w:rPr>
+                <w:rFonts w:ascii="Times New Roman" w:hAnsi="Times New Roman" w:cs="Times New Roman"/>
+                <w:b/>
+                <w:sz w:val="28"/>
+                <w:szCs w:val="28"/>
+                <w:lang w:val="it-IT"/>
+              </w:rPr>
+              <w:t xml:space="preserve">Esecuzione in container. </w:t>
+            </w:r>
+            <w:r>
+              <w:rPr>
+                <w:rFonts w:ascii="Times New Roman" w:hAnsi="Times New Roman" w:cs="Times New Roman"/>
+                <w:sz w:val="28"/>
+                <w:szCs w:val="28"/>
+                <w:lang w:val="it-IT"/>
+              </w:rPr>
+              <w:t xml:space="preserve">L’applicazione si avvia anche in due container Docker, uno per il backend Spring Boot e uno per il frontend servito da Nginx, con un solo comando eseguito dalla radice del repository:</w:t>
+            </w:r>
+          </w:p>
+          <w:p>
+            <w:pPr>
+              <w:shd w:val="clear" w:color="auto" w:fill="F2F2F2"/>
+              <w:spacing w:after="0"/>
+              <w:rPr>
+                <w:rFonts w:ascii="Consolas" w:hAnsi="Consolas" w:cs="Consolas"/>
+                <w:sz w:val="18"/>
+                <w:szCs w:val="18"/>
+              </w:rPr>
+            </w:pPr>
+            <w:r>
+              <w:rPr>
+                <w:rFonts w:ascii="Consolas" w:hAnsi="Consolas" w:cs="Consolas"/>
+                <w:sz w:val="18"/>
+                <w:szCs w:val="18"/>
+              </w:rPr>
+              <w:t xml:space="preserve">docker compose up --build</w:t>
+            </w:r>
+          </w:p>
+          <w:p>
+            <w:pPr>
+              <w:spacing w:after="160"/>
+              <w:jc w:val="both"/>
+              <w:rPr>
+                <w:rFonts w:ascii="Times New Roman" w:hAnsi="Times New Roman" w:cs="Times New Roman"/>
+                <w:sz w:val="28"/>
+                <w:szCs w:val="28"/>
+                <w:lang w:val="it-IT"/>
+              </w:rPr>
+            </w:pPr>
+            <w:r>
+              <w:rPr>
+                <w:rFonts w:ascii="Times New Roman" w:hAnsi="Times New Roman" w:cs="Times New Roman"/>
+                <w:sz w:val="28"/>
+                <w:szCs w:val="28"/>
+                <w:lang w:val="it-IT"/>
+              </w:rPr>
+              <w:t xml:space="preserve">Al termine della costruzione delle immagini il frontend è raggiungibile su http://localhost:4200 e il backend su http://localhost:8080 (con Swagger su /swagger-ui.html). Sui container ho verificato che il backend risulti «healthy», che l’endpoint /v3/api-docs e il frontend rispondano con stato 200 e che il login con l’utente di prova restituisca il ruolo del paziente. Provando questa modalità sono emersi e ho corretto due difetti dei Dockerfile: il backend non partiva perché l’utente non privilegiato del container non poteva creare la cartella uploads/ dove salvare i referti (errore AccessDeniedException su /app/uploads), e il controllo di salute del frontend risultava sempre «unhealthy» perché usava localhost, che nel container viene risolto prima in IPv6 mentre Nginx ascolta solo su IPv4.</w:t>
+            </w:r>
+          </w:p>
+          <w:p>
+            <w:pPr>
               <w:jc w:val="both"/>
               <w:rPr>
                 <w:rFonts w:ascii="Times New Roman" w:hAnsi="Times New Roman" w:cs="Times New Roman"/>
@@ -10963,7 +10999,7 @@
                 <w:szCs w:val="28"/>
                 <w:lang w:val="it-IT"/>
               </w:rPr>
-              <w:t xml:space="preserve">Infine non è implementato il Continuous Deployment: la pipeline di integrazione continua compila, collauda e pubblica gli artefatti ma non li distribuisce su un ambiente di staging o produzione, non essendoci un’infrastruttura di hosting dedicata a un progetto didattico. Un’estensione naturale è un deploy containerizzato su un servizio PaaS al merge sul ramo principale. Le immagini Docker, inoltre, sono descritte ma non le ho ricostruite nella verifica finale, perché Docker non era disponibile nell’ambiente.</w:t>
+              <w:t xml:space="preserve">Infine non è implementato il Continuous Deployment: la pipeline di integrazione continua compila, collauda e pubblica gli artefatti ma non li distribuisce su un ambiente di staging o produzione, non essendoci un’infrastruttura di hosting dedicata a un progetto didattico. Un’estensione naturale è un deploy containerizzato su un servizio PaaS al merge sul ramo principale. Nei container, inoltre, i referti caricati sono salvati nella cartella /app/uploads interna al container e si perdono quando lo si ricrea, perché non è previsto un volume.</w:t>
             </w:r>
           </w:p>
           <w:p>

</xml_diff>

<commit_message>
fix: update documentation to clarify user roles and API functionality; add images for Docker setup
</commit_message>
<xml_diff>
--- a/HealthCarePlus_ProjectWork_L31.docx
+++ b/HealthCarePlus_ProjectWork_L31.docx
@@ -748,12 +748,12 @@
             <w:r>
               <w:rPr>
                 <w:rFonts w:ascii="Times New Roman" w:hAnsi="Times New Roman" w:cs="Times New Roman"/>
-                <w:color w:val="FF0000"/>
+                <w:color w:val="000000"/>
                 <w:sz w:val="24"/>
                 <w:szCs w:val="24"/>
                 <w:lang w:val="it-IT"/>
               </w:rPr>
-              <w:t xml:space="preserve">[INSERIRE NUMERO DI MATRICOLA]</w:t>
+              <w:t xml:space="preserve">0312400513</w:t>
             </w:r>
           </w:p>
         </w:tc>
@@ -5180,7 +5180,7 @@
                 <w:szCs w:val="28"/>
                 <w:lang w:val="it-IT"/>
               </w:rPr>
-              <w:t xml:space="preserve">Sul piano applicativo, il portale copre due aree di servizio complementari, entrambe pensate per ridurre l’attrito operativo quotidiano della clinica: la gestione clinica di pazienti e medici (prenotazione delle visite in base alla disponibilità reale del medico calcolata dinamicamente, gestione delle terapie con data di inizio e fine, caricamento e consultazione dei referti, esportazione della cartella clinica in formato stampabile) e il sistema di ticket IT, attraverso cui il personale di supporto può monitorare, prendere in carico e risolvere le segnalazioni tecniche aperte dai pazienti stessi tramite un form dedicato nella propria dashboard.</w:t>
+              <w:t xml:space="preserve">Sul piano applicativo, il portale copre due aree di servizio complementari, entrambe pensate per ridurre l’attrito operativo quotidiano della clinica: la gestione clinica di pazienti e medici (prenotazione delle visite in base alla disponibilità reale del medico calcolata dinamicamente, gestione delle terapie con data di inizio e fine, caricamento e consultazione dei referti, esportazione della cartella clinica in formato stampabile) e il sistema di ticket IT, attraverso cui il personale di supporto può monitorare, prendere in carico e risolvere le segnalazioni tecniche aperte dai pazienti stessi tramite un form dedicato nella propria dashboard. Il personale di supporto, inoltre, vede e gestisce le visite di tutti i pazienti (le completa o le annulla) e consulta le statistiche; a livello di API può anche creare visite per conto di un paziente, mentre l’interfaccia, come indicato tra i limiti, non prevede ancora la scelta del paziente nel form di prenotazione.</w:t>
             </w:r>
           </w:p>
           <w:p>
@@ -10600,6 +10600,138 @@
           </w:p>
           <w:p>
             <w:pPr>
+              <w:keepNext/>
+              <w:spacing w:before="120" w:after="0"/>
+              <w:jc w:val="center"/>
+            </w:pPr>
+            <w:r>
+              <w:drawing>
+                <wp:inline distT="0" distB="0" distL="0" distR="0">
+                  <wp:extent cx="5500000" cy="2999036"/>
+                  <wp:effectExtent l="0" t="0" r="0" b="0"/>
+                  <wp:docPr id="5501" name="Immagine 5501" descr="Terminale: docker compose up --build"/>
+                  <wp:cNvGraphicFramePr>
+                    <a:graphicFrameLocks xmlns:a="http://schemas.openxmlformats.org/drawingml/2006/main" noChangeAspect="1"/>
+                  </wp:cNvGraphicFramePr>
+                  <a:graphic xmlns:a="http://schemas.openxmlformats.org/drawingml/2006/main">
+                    <a:graphicData uri="http://schemas.openxmlformats.org/drawingml/2006/picture">
+                      <pic:pic xmlns:pic="http://schemas.openxmlformats.org/drawingml/2006/picture">
+                        <pic:nvPicPr>
+                          <pic:cNvPr id="0" name="image40.png"/>
+                          <pic:cNvPicPr/>
+                        </pic:nvPicPr>
+                        <pic:blipFill>
+                          <a:blip r:embed="rId91"/>
+                          <a:stretch>
+                            <a:fillRect/>
+                          </a:stretch>
+                        </pic:blipFill>
+                        <pic:spPr>
+                          <a:xfrm>
+                            <a:off x="0" y="0"/>
+                            <a:ext cx="5500000" cy="2999036"/>
+                          </a:xfrm>
+                          <a:prstGeom prst="rect">
+                            <a:avLst/>
+                          </a:prstGeom>
+                        </pic:spPr>
+                      </pic:pic>
+                    </a:graphicData>
+                  </a:graphic>
+                </wp:inline>
+              </w:drawing>
+            </w:r>
+          </w:p>
+          <w:p>
+            <w:pPr>
+              <w:spacing w:before="40" w:after="200"/>
+              <w:rPr>
+                <w:rFonts w:ascii="Times New Roman" w:hAnsi="Times New Roman" w:cs="Times New Roman"/>
+                <w:i/>
+                <w:sz w:val="22"/>
+                <w:szCs w:val="22"/>
+                <w:lang w:val="it-IT"/>
+              </w:rPr>
+            </w:pPr>
+            <w:r>
+              <w:rPr>
+                <w:rFonts w:ascii="Times New Roman" w:hAnsi="Times New Roman" w:cs="Times New Roman"/>
+                <w:i/>
+                <w:sz w:val="22"/>
+                <w:szCs w:val="22"/>
+                <w:lang w:val="it-IT"/>
+              </w:rPr>
+              <w:t xml:space="preserve">Avvio con docker compose up --build: costruzione delle due immagini (backend e frontend) e creazione dei container.</w:t>
+            </w:r>
+          </w:p>
+          <w:p>
+            <w:pPr>
+              <w:keepNext/>
+              <w:spacing w:before="120" w:after="0"/>
+              <w:jc w:val="center"/>
+            </w:pPr>
+            <w:r>
+              <w:drawing>
+                <wp:inline distT="0" distB="0" distL="0" distR="0">
+                  <wp:extent cx="3700000" cy="3980769"/>
+                  <wp:effectExtent l="0" t="0" r="0" b="0"/>
+                  <wp:docPr id="5502" name="Immagine 5502" descr="Docker Desktop: i due container attivi"/>
+                  <wp:cNvGraphicFramePr>
+                    <a:graphicFrameLocks xmlns:a="http://schemas.openxmlformats.org/drawingml/2006/main" noChangeAspect="1"/>
+                  </wp:cNvGraphicFramePr>
+                  <a:graphic xmlns:a="http://schemas.openxmlformats.org/drawingml/2006/main">
+                    <a:graphicData uri="http://schemas.openxmlformats.org/drawingml/2006/picture">
+                      <pic:pic xmlns:pic="http://schemas.openxmlformats.org/drawingml/2006/picture">
+                        <pic:nvPicPr>
+                          <pic:cNvPr id="0" name="image41.png"/>
+                          <pic:cNvPicPr/>
+                        </pic:nvPicPr>
+                        <pic:blipFill>
+                          <a:blip r:embed="rId92"/>
+                          <a:stretch>
+                            <a:fillRect/>
+                          </a:stretch>
+                        </pic:blipFill>
+                        <pic:spPr>
+                          <a:xfrm>
+                            <a:off x="0" y="0"/>
+                            <a:ext cx="3700000" cy="3980769"/>
+                          </a:xfrm>
+                          <a:prstGeom prst="rect">
+                            <a:avLst/>
+                          </a:prstGeom>
+                        </pic:spPr>
+                      </pic:pic>
+                    </a:graphicData>
+                  </a:graphic>
+                </wp:inline>
+              </w:drawing>
+            </w:r>
+          </w:p>
+          <w:p>
+            <w:pPr>
+              <w:spacing w:before="40" w:after="200"/>
+              <w:rPr>
+                <w:rFonts w:ascii="Times New Roman" w:hAnsi="Times New Roman" w:cs="Times New Roman"/>
+                <w:i/>
+                <w:sz w:val="22"/>
+                <w:szCs w:val="22"/>
+                <w:lang w:val="it-IT"/>
+              </w:rPr>
+            </w:pPr>
+            <w:r>
+              <w:rPr>
+                <w:rFonts w:ascii="Times New Roman" w:hAnsi="Times New Roman" w:cs="Times New Roman"/>
+                <w:i/>
+                <w:sz w:val="22"/>
+                <w:szCs w:val="22"/>
+                <w:lang w:val="it-IT"/>
+              </w:rPr>
+              <w:t xml:space="preserve">Docker Desktop: il progetto con i container frontend-1 (porta 4200→80) e backend-1 (porta 8080) attivi.</w:t>
+            </w:r>
+          </w:p>
+          <w:p>
+            <w:pPr>
               <w:jc w:val="both"/>
               <w:rPr>
                 <w:rFonts w:ascii="Times New Roman" w:hAnsi="Times New Roman" w:cs="Times New Roman"/>
@@ -10978,7 +11110,7 @@
                 <w:szCs w:val="28"/>
                 <w:lang w:val="it-IT"/>
               </w:rPr>
-              <w:t xml:space="preserve">Un terzo gruppo di limiti riguarda difetti emersi eseguendo l’applicazione, che dichiaro come tali e non come scelte di progetto, con la gravità che attribuisco loro. Gravità media: Spring Security risponde 403 e non 401 per un token assente o scaduto, quindi il logout automatico dell’interceptor Angular non si attiva; l’anteprima e il download del PDF del referto non funzionano dal browser, perché puntano all’URL dell’endpoint senza l’header Authorization; la creazione di un appuntamento non impedisce la doppia prenotazione dello stesso orario, perché la disponibilità degli slot è verificata solo in lettura; il secondo passaggio della 2FA non richiede la password e la configurazione della 2FA sostituisce il segreto senza chiedere il codice corrente. Gravità alta in vista di un uso reale: la configurazione è quella di sviluppo (CORS aperto a qualunque origine, chiave di firma JWT di default, console H2 raggiungibile, nessun limite ai tentativi di accesso). Ciascun difetto ha una correzione circoscritta, descritta con la relativa gravità nel capitolo 9 della documentazione tecnica del repository.</w:t>
+              <w:t xml:space="preserve">Un terzo gruppo di limiti riguarda difetti emersi eseguendo l’applicazione, che dichiaro come tali e non come scelte di progetto, con la gravità che attribuisco loro. Gravità media: Spring Security risponde 403 e non 401 per un token assente o scaduto, quindi il logout automatico dell’interceptor Angular non si attiva; l’anteprima e il download del PDF del referto non funzionano dal browser, perché puntano all’URL dell’endpoint senza l’header Authorization; la creazione di un appuntamento non impedisce la doppia prenotazione dello stesso orario, perché la disponibilità degli slot è verificata solo in lettura; il secondo passaggio della 2FA non richiede la password e la configurazione della 2FA sostituisce il segreto senza chiedere il codice corrente; la voce «Prenota Visita» è visibile anche al Supporto, ma il form prenota sempre per il profilo dell’utente collegato e il Supporto, non avendone uno, non riesce a completare la prenotazione, benché l’API gli consenta di creare visite per un paziente. Gravità alta in vista di un uso reale: la configurazione è quella di sviluppo (CORS aperto a qualunque origine, chiave di firma JWT di default, console H2 raggiungibile, nessun limite ai tentativi di accesso). Ciascun difetto ha una correzione circoscritta, descritta con la relativa gravità nel capitolo 9 della documentazione tecnica del repository.</w:t>
             </w:r>
           </w:p>
           <w:p>

</xml_diff>

<commit_message>
fix: update phase planning documentation to clarify time estimates and restructure testing phases
</commit_message>
<xml_diff>
--- a/HealthCarePlus_ProjectWork_L31.docx
+++ b/HealthCarePlus_ProjectWork_L31.docx
@@ -1723,7 +1723,7 @@
                 <w:szCs w:val="28"/>
                 <w:lang w:val="it-IT"/>
               </w:rPr>
-              <w:t xml:space="preserve">Lo sviluppo è stato pianificato secondo un approccio incrementale a fasi, ciascuna con un obiettivo di uscita verificabile (entità/DB coerenti, endpoint funzionanti, build che compila, test verdi) prima di passare alla fase successiva, per un totale stimato di circa 33 giorni-persona distribuiti su un impegno individuale part-time, compatibile con un percorso di studio parallelo.</w:t>
+              <w:t xml:space="preserve">Lo sviluppo è stato pianificato secondo un approccio incrementale a fasi, ciascuna con un obiettivo di uscita verificabile (entità/DB coerenti, endpoint funzionanti, build che compila, test verdi).</w:t>
             </w:r>
           </w:p>
           <w:p>
@@ -1828,7 +1828,7 @@
                 <w:szCs w:val="28"/>
                 <w:lang w:val="it-IT"/>
               </w:rPr>
-              <w:t xml:space="preserve">Fase 4 – Test e qualità (5 giorni): ho scritto la suite di test unitari e di integrazione lato backend con JUnit e Mockito, misurandone la copertura tramite JaCoCo, e la suite di test lato frontend con Karma e Jasmine, entrambe integrate nella pipeline di integrazione continua così da bloccare automaticamente l’introduzione di regressioni ad ogni push. In questa fase ho utilizzato Claude come assistente per velocizzare la stesura materiale dei test a partire dai casi che avevo individuato (percorso positivo, input non validi, accessi non autorizzati), rivedendo ogni test generato prima di includerlo nella suite. Al termine di questa fase la suite di backend conta 137 test automatici, tutti superati, mentre quella di frontend ne conta 99, anch’essi tutti superati. Alla verifica finale la copertura misurata è dell’82,3 % delle righe sul backend (JaCoCo) e del 38,6 % sul frontend, concentrata su servizi, guardie e interceptor più che sui componenti di presentazione; in quell’occasione ho anche corretto quattro test del frontend che fallivano dopo l’ultima revisione grafica della schermata di login.</w:t>
+              <w:t xml:space="preserve">Fase 4 – Test e qualità (3 giorni): ho scritto la suite di test unitari e di integrazione lato backend con JUnit e Mockito, misurandone la copertura tramite JaCoCo, e la suite di test lato frontend con Karma e Jasmine, entrambe integrate nella pipeline di integrazione continua così da bloccare automaticamente l’introduzione di regressioni ad ogni push. In questa fase ho utilizzato Claude come assistente per velocizzare la stesura materiale dei test a partire dai casi che avevo individuato (percorso positivo, input non validi, accessi non autorizzati), rivedendo ogni test generato prima di includerlo nella suite. Al termine di questa fase la suite di backend conta 137 test automatici, tutti superati, mentre quella di frontend ne conta 99, anch’essi tutti superati. Alla verifica finale la copertura misurata è dell’82,3 % delle righe sul backend (JaCoCo) e del 38,6 % sul frontend, concentrata su servizi, guardie e interceptor più che sui componenti di presentazione; in quell’occasione ho anche corretto quattro test del frontend che fallivano dopo l’ultima revisione grafica della schermata di login.</w:t>
             </w:r>
           </w:p>
           <w:p>
@@ -1849,7 +1849,7 @@
                 <w:szCs w:val="28"/>
                 <w:lang w:val="it-IT"/>
               </w:rPr>
-              <w:t xml:space="preserve">Fase 5 – Documentazione finale (3 giorni): ho scritto la relazione tecnica completa (i nove capitoli disponibili in doc/) e ho effettuato una revisione di coerenza tra la documentazione e il codice realmente presente nel repository.</w:t>
+              <w:t xml:space="preserve">Fase 5 – Test funzionali e bug fix incrementali (2 giorni): ho provato l’applicazione in esecuzione con utenti dei tre ruoli, acquisendo gli screenshot dei flussi principali e verificando con chiamate dirette all’API i casi di accesso a risorse altrui e i due passaggi della 2FA (45 verifiche). Le correzioni sono state incrementali, a piccoli passi dopo ogni evidenza: durante lo sviluppo il completamento dei controlli di autorizzazione e la correzione di un accesso non autorizzato ai referti, le validazioni e le operazioni di modifica e cancellazione; alla verifica finale la correzione dei test del login e di due difetti dei Dockerfile (permessi della cartella dei referti e controllo di salute del frontend). I difetti non ancora risolti sono dichiarati tra i limiti.</w:t>
             </w:r>
           </w:p>
           <w:p>
@@ -1866,11 +1866,63 @@
             <w:r>
               <w:rPr>
                 <w:rFonts w:ascii="Times New Roman" w:hAnsi="Times New Roman" w:cs="Times New Roman"/>
+                <w:sz w:val="28"/>
+                <w:szCs w:val="28"/>
+                <w:lang w:val="it-IT"/>
+              </w:rPr>
+              <w:t xml:space="preserve">Fase 6 – Documentazione finale (3 giorni): ho scritto la relazione tecnica completa (i nove capitoli disponibili in doc/) e ho effettuato una revisione di coerenza tra la documentazione e il codice realmente presente nel repository.</w:t>
+            </w:r>
+          </w:p>
+          <w:p>
+            <w:pPr>
+              <w:spacing w:after="160"/>
+              <w:jc w:val="both"/>
+              <w:rPr>
+                <w:rFonts w:ascii="Times New Roman" w:hAnsi="Times New Roman" w:cs="Times New Roman"/>
+                <w:sz w:val="28"/>
+                <w:szCs w:val="28"/>
+                <w:lang w:val="it-IT"/>
+              </w:rPr>
+            </w:pPr>
+            <w:r>
+              <w:rPr>
+                <w:rFonts w:ascii="Times New Roman" w:hAnsi="Times New Roman" w:cs="Times New Roman"/>
                 <w:b/>
                 <w:sz w:val="28"/>
                 <w:szCs w:val="28"/>
                 <w:lang w:val="it-IT"/>
               </w:rPr>
+              <w:t xml:space="preserve">Tempi. </w:t>
+            </w:r>
+            <w:r>
+              <w:rPr>
+                <w:rFonts w:ascii="Times New Roman" w:hAnsi="Times New Roman" w:cs="Times New Roman"/>
+                <w:sz w:val="28"/>
+                <w:szCs w:val="28"/>
+                <w:lang w:val="it-IT"/>
+              </w:rPr>
+              <w:t xml:space="preserve">Le durate indicate nei titoli delle fasi sono stime in giorni di lavoro part-time: il progetto è individuale ed è stato svolto con circa un’ora la sera e alcune ore nei giorni di weekend. Per questo un «giorno» equivale a circa quattro-cinque ore, non a una giornata intera da otto ore.</w:t>
+            </w:r>
+          </w:p>
+          <w:p>
+            <w:pPr>
+              <w:spacing w:after="160"/>
+              <w:jc w:val="both"/>
+              <w:rPr>
+                <w:rFonts w:ascii="Times New Roman" w:hAnsi="Times New Roman" w:cs="Times New Roman"/>
+                <w:sz w:val="28"/>
+                <w:szCs w:val="28"/>
+                <w:lang w:val="it-IT"/>
+              </w:rPr>
+            </w:pPr>
+            <w:r>
+              <w:rPr>
+                <w:rFonts w:ascii="Times New Roman" w:hAnsi="Times New Roman" w:cs="Times New Roman"/>
+                <w:b/>
+                <w:sz w:val="28"/>
+                <w:szCs w:val="28"/>
+                <w:lang w:val="it-IT"/>
+              </w:rPr>
               <w:t xml:space="preserve">Dipendenze tra le fasi. </w:t>
             </w:r>
             <w:r>
@@ -1880,38 +1932,7 @@
                 <w:szCs w:val="28"/>
                 <w:lang w:val="it-IT"/>
               </w:rPr>
-              <w:t xml:space="preserve">Le fasi non sono indipendenti: la Fase 2 (sicurezza) blocca la Fase 3 (frontend), perché i componenti Angular dipendono da login e token JWT per l’instradamento autenticato; la Fase 4 dipende da tutte le precedenti, poiché i test funzionali richiedono l’intero stack in esecuzione; la Fase 5 va ripetuta a ogni modifica sostanziale del codice per non far divergere la documentazione. Le durate indicate, in totale circa 33 giorni-persona, sono stime di pianificazione per un progetto individuale part-time.</w:t>
-            </w:r>
-          </w:p>
-          <w:p>
-            <w:pPr>
-              <w:spacing w:after="160"/>
-              <w:jc w:val="both"/>
-              <w:rPr>
-                <w:rFonts w:ascii="Times New Roman" w:hAnsi="Times New Roman" w:cs="Times New Roman"/>
-                <w:sz w:val="28"/>
-                <w:szCs w:val="28"/>
-                <w:lang w:val="it-IT"/>
-              </w:rPr>
-            </w:pPr>
-            <w:r>
-              <w:rPr>
-                <w:rFonts w:ascii="Times New Roman" w:hAnsi="Times New Roman" w:cs="Times New Roman"/>
-                <w:b/>
-                <w:sz w:val="28"/>
-                <w:szCs w:val="28"/>
-                <w:lang w:val="it-IT"/>
-              </w:rPr>
-              <w:t xml:space="preserve">Calendario effettivo. </w:t>
-            </w:r>
-            <w:r>
-              <w:rPr>
-                <w:rFonts w:ascii="Times New Roman" w:hAnsi="Times New Roman" w:cs="Times New Roman"/>
-                <w:sz w:val="28"/>
-                <w:szCs w:val="28"/>
-                <w:lang w:val="it-IT"/>
-              </w:rPr>
-              <w:t xml:space="preserve">Lo storico Git colloca la prima consegna nel repository al 10 luglio 2026 e l’ultimo aggiornamento al 20 settembre 2026, con 39 commit e 8 pull request integrate. Dopo la prima versione il lavoro è proseguito per iterazioni: integrazione continua e release il 29–31 luglio; controlli di autorizzazione completi, correzione di un accesso non autorizzato ai referti e nuove funzioni per il medico tra il 31 luglio e il 1 agosto; revisione grafica il 13 settembre; verifica finale e aggiornamento della documentazione il 20 settembre. Lo storico registra quando il codice è stato consegnato, non le ore dedicate: il tempo effettivo per ciascuna fase non è ricostruibile con precisione.</w:t>
+              <w:t xml:space="preserve">Le fasi non sono indipendenti: la Fase 2 (sicurezza) blocca la Fase 3 (frontend), perché i componenti Angular dipendono da login e token JWT per l’instradamento autenticato; la Fase 5 (test funzionali) dipende da tutte le precedenti, poiché richiede l’intero stack in esecuzione; la Fase 6 va ripetuta a ogni modifica sostanziale del codice per non far divergere la documentazione.</w:t>
             </w:r>
           </w:p>
           <w:p>
@@ -3108,6 +3129,63 @@
                 <w:szCs w:val="26"/>
                 <w:lang w:val="it-IT"/>
               </w:rPr>
+              <w:t xml:space="preserve">Repository del progetto</w:t>
+            </w:r>
+          </w:p>
+          <w:p>
+            <w:pPr>
+              <w:spacing w:after="80"/>
+              <w:ind w:left="360" w:hanging="360"/>
+              <w:jc w:val="both"/>
+              <w:rPr>
+                <w:rFonts w:ascii="Times New Roman" w:hAnsi="Times New Roman" w:cs="Times New Roman"/>
+                <w:sz w:val="28"/>
+                <w:szCs w:val="28"/>
+                <w:lang w:val="it-IT"/>
+              </w:rPr>
+            </w:pPr>
+            <w:r>
+              <w:rPr>
+                <w:rFonts w:ascii="Times New Roman" w:hAnsi="Times New Roman" w:cs="Times New Roman"/>
+                <w:sz w:val="28"/>
+                <w:szCs w:val="28"/>
+                <w:lang w:val="it-IT"/>
+              </w:rPr>
+              <w:t xml:space="preserve">– Repository Git di HealthCare Plus (codice sorgente e documentazione): </w:t>
+            </w:r>
+            <w:hyperlink r:id="rId85" w:history="1">
+              <w:r>
+                <w:rPr>
+                  <w:rFonts w:ascii="Times New Roman" w:hAnsi="Times New Roman" w:cs="Times New Roman"/>
+                  <w:color w:val="0563C1"/>
+                  <w:sz w:val="28"/>
+                  <w:szCs w:val="28"/>
+                  <w:u w:val="single"/>
+                  <w:lang w:val="it-IT"/>
+                </w:rPr>
+                <w:t xml:space="preserve">https://github.com/acapodanno/project-work-l-31</w:t>
+              </w:r>
+            </w:hyperlink>
+          </w:p>
+          <w:p>
+            <w:pPr>
+              <w:spacing w:before="120" w:after="80"/>
+              <w:rPr>
+                <w:rFonts w:ascii="Times New Roman" w:hAnsi="Times New Roman" w:cs="Times New Roman"/>
+                <w:b/>
+                <w:sz w:val="26"/>
+                <w:szCs w:val="26"/>
+                <w:lang w:val="it-IT"/>
+              </w:rPr>
+            </w:pPr>
+            <w:r>
+              <w:rPr>
+                <w:rFonts w:ascii="Times New Roman" w:hAnsi="Times New Roman" w:cs="Times New Roman"/>
+                <w:b/>
+                <w:sz w:val="26"/>
+                <w:szCs w:val="26"/>
+                <w:lang w:val="it-IT"/>
+              </w:rPr>
               <w:t xml:space="preserve">Backend (Java)</w:t>
             </w:r>
           </w:p>
@@ -5371,11 +5449,12 @@
             <w:r>
               <w:rPr>
                 <w:rFonts w:ascii="Times New Roman" w:hAnsi="Times New Roman" w:cs="Times New Roman"/>
-                <w:sz w:val="28"/>
-                <w:szCs w:val="28"/>
-                <w:lang w:val="it-IT"/>
-              </w:rPr>
-              <w:t xml:space="preserve">Il codice sorgente completo dell’applicazione (backend, frontend, pipeline di integrazione continua e documentazione tecnica estesa nella cartella doc/) è disponibile nel repository Git: </w:t>
+                <w:b/>
+                <w:sz w:val="28"/>
+                <w:szCs w:val="28"/>
+                <w:lang w:val="it-IT"/>
+              </w:rPr>
+              <w:t xml:space="preserve">Repository Git del progetto: </w:t>
             </w:r>
             <w:hyperlink r:id="rId85" w:history="1">
               <w:r>
@@ -5397,7 +5476,7 @@
                 <w:szCs w:val="28"/>
                 <w:lang w:val="it-IT"/>
               </w:rPr>
-              <w:t xml:space="preserve">.</w:t>
+              <w:t xml:space="preserve">. Contiene il codice sorgente completo (backend, frontend e pipeline di integrazione continua) e la documentazione tecnica estesa nella cartella doc/.</w:t>
             </w:r>
           </w:p>
           <w:p>

</xml_diff>